<commit_message>
fix: cast post_karma to integer in UserResource and update documentation examples
</commit_message>
<xml_diff>
--- a/zarovizsga.docx
+++ b/zarovizsga.docx
@@ -68,21 +68,7 @@
         <w:rPr>
           <w:lang w:val="hu-HU"/>
         </w:rPr>
-        <w:t xml:space="preserve">Ide majd szöveg </w:t>
-      </w:r>
-      <w:proofErr w:type="gramStart"/>
-      <w:r>
-        <w:rPr>
-          <w:lang w:val="hu-HU"/>
-        </w:rPr>
-        <w:t>arról</w:t>
-      </w:r>
-      <w:proofErr w:type="gramEnd"/>
-      <w:r>
-        <w:rPr>
-          <w:lang w:val="hu-HU"/>
-        </w:rPr>
-        <w:t xml:space="preserve"> hogy melyik végpontok milyen jogosultsággal érhetőek el</w:t>
+        <w:t>Ide majd szöveg arról hogy melyik végpontok milyen jogosultsággal érhetőek el</w:t>
       </w:r>
     </w:p>
     <w:p>
@@ -114,17 +100,7 @@
             <w:u w:val="none"/>
             <w:lang w:val="hu-HU"/>
           </w:rPr>
-          <w:t>https://jedligrambackend-gehermarcell.jcloud.jedlik.cloud/</w:t>
-        </w:r>
-        <w:r>
-          <w:rPr>
-            <w:rStyle w:val="Hiperhivatkozs"/>
-            <w:rFonts w:ascii="Courier New" w:hAnsi="Courier New" w:cs="Courier New"/>
-            <w:color w:val="auto"/>
-            <w:u w:val="none"/>
-            <w:lang w:val="hu-HU"/>
-          </w:rPr>
-          <w:t>api</w:t>
+          <w:t>https://jedligrambackend-gehermarcell.jcloud.jedlik.cloud/api</w:t>
         </w:r>
       </w:hyperlink>
     </w:p>
@@ -139,21 +115,7 @@
         <w:rPr>
           <w:lang w:val="hu-HU"/>
         </w:rPr>
-        <w:t xml:space="preserve">1.2.1 </w:t>
-      </w:r>
-      <w:proofErr w:type="spellStart"/>
-      <w:r>
-        <w:rPr>
-          <w:lang w:val="hu-HU"/>
-        </w:rPr>
-        <w:t>User</w:t>
-      </w:r>
-      <w:proofErr w:type="spellEnd"/>
-      <w:r>
-        <w:rPr>
-          <w:lang w:val="hu-HU"/>
-        </w:rPr>
-        <w:t xml:space="preserve"> kontroller</w:t>
+        <w:t>1.2.1 User kontroller</w:t>
       </w:r>
     </w:p>
     <w:p>
@@ -180,33 +142,17 @@
         </w:rPr>
         <w:t xml:space="preserve"> </w:t>
       </w:r>
-      <w:proofErr w:type="spellStart"/>
       <w:r>
         <w:rPr>
           <w:lang w:val="hu-HU"/>
         </w:rPr>
         <w:t>Users</w:t>
       </w:r>
-      <w:proofErr w:type="spellEnd"/>
-      <w:r>
-        <w:rPr>
-          <w:lang w:val="hu-HU"/>
-        </w:rPr>
-        <w:t xml:space="preserve"> (</w:t>
-      </w:r>
-      <w:proofErr w:type="spellStart"/>
-      <w:r>
-        <w:rPr>
-          <w:lang w:val="hu-HU"/>
-        </w:rPr>
-        <w:t>All</w:t>
-      </w:r>
-      <w:proofErr w:type="spellEnd"/>
-      <w:r>
-        <w:rPr>
-          <w:lang w:val="hu-HU"/>
-        </w:rPr>
-        <w:t>)</w:t>
+      <w:r>
+        <w:rPr>
+          <w:lang w:val="hu-HU"/>
+        </w:rPr>
+        <w:t xml:space="preserve"> (All)</w:t>
       </w:r>
     </w:p>
     <w:p>
@@ -289,46 +235,115 @@
           <w:rFonts w:ascii="Courier New" w:hAnsi="Courier New" w:cs="Courier New"/>
           <w:lang w:val="hu-HU"/>
         </w:rPr>
-        <w:t>GET | /</w:t>
-      </w:r>
-      <w:proofErr w:type="spellStart"/>
+        <w:t>GET | /api/users</w:t>
+      </w:r>
+      <w:r>
+        <w:rPr>
+          <w:lang w:val="hu-HU"/>
+        </w:rPr>
+        <w:br/>
+      </w:r>
+      <w:r>
+        <w:rPr>
+          <w:b/>
+          <w:bCs/>
+          <w:lang w:val="hu-HU"/>
+        </w:rPr>
+        <w:t>Body:</w:t>
+      </w:r>
+      <w:r>
+        <w:rPr>
+          <w:b/>
+          <w:bCs/>
+          <w:lang w:val="hu-HU"/>
+        </w:rPr>
+        <w:t xml:space="preserve"> </w:t>
+      </w:r>
+      <w:r>
+        <w:rPr>
+          <w:lang w:val="hu-HU"/>
+        </w:rPr>
+        <w:t>-</w:t>
+      </w:r>
+      <w:r>
+        <w:rPr>
+          <w:lang w:val="hu-HU"/>
+        </w:rPr>
+        <w:br/>
+      </w:r>
+      <w:r>
+        <w:rPr>
+          <w:b/>
+          <w:bCs/>
+          <w:lang w:val="hu-HU"/>
+        </w:rPr>
+        <w:t>Támogatott paraméterek:</w:t>
+      </w:r>
+      <w:r>
+        <w:rPr>
+          <w:b/>
+          <w:bCs/>
+          <w:lang w:val="hu-HU"/>
+        </w:rPr>
+        <w:t xml:space="preserve"> </w:t>
+      </w:r>
       <w:r>
         <w:rPr>
           <w:rFonts w:ascii="Courier New" w:hAnsi="Courier New" w:cs="Courier New"/>
-          <w:lang w:val="hu-HU"/>
-        </w:rPr>
-        <w:t>api</w:t>
-      </w:r>
-      <w:proofErr w:type="spellEnd"/>
+          <w:b/>
+          <w:bCs/>
+          <w:lang w:val="hu-HU"/>
+        </w:rPr>
+        <w:t>?search=</w:t>
+      </w:r>
       <w:r>
         <w:rPr>
           <w:rFonts w:ascii="Courier New" w:hAnsi="Courier New" w:cs="Courier New"/>
-          <w:lang w:val="hu-HU"/>
-        </w:rPr>
-        <w:t>/</w:t>
-      </w:r>
-      <w:proofErr w:type="spellStart"/>
-      <w:r>
-        <w:rPr>
-          <w:rFonts w:ascii="Courier New" w:hAnsi="Courier New" w:cs="Courier New"/>
-          <w:lang w:val="hu-HU"/>
-        </w:rPr>
-        <w:t>users</w:t>
-      </w:r>
-      <w:proofErr w:type="spellEnd"/>
-      <w:r>
-        <w:rPr>
+          <w:b/>
+          <w:bCs/>
           <w:lang w:val="hu-HU"/>
         </w:rPr>
         <w:br/>
       </w:r>
       <w:r>
         <w:rPr>
-          <w:b/>
-          <w:bCs/>
-          <w:lang w:val="hu-HU"/>
-        </w:rPr>
-        <w:t>Body:</w:t>
+          <w:lang w:val="hu-HU"/>
+        </w:rPr>
+        <w:t>Támogatja a szűrést a felhasználó azonosítója, neve, vagy email címe alapján</w:t>
+      </w:r>
+      <w:r>
+        <w:rPr>
+          <w:lang w:val="hu-HU"/>
+        </w:rPr>
+        <w:br/>
+      </w:r>
+      <w:r>
+        <w:rPr>
+          <w:b/>
+          <w:bCs/>
+          <w:lang w:val="hu-HU"/>
+        </w:rPr>
+        <w:t>Korlátozás:</w:t>
+      </w:r>
+      <w:r>
+        <w:rPr>
+          <w:lang w:val="hu-HU"/>
+        </w:rPr>
+        <w:t xml:space="preserve"> Minden felhasználónak elérhető </w:t>
+      </w:r>
+      <w:r>
+        <w:rPr>
+          <w:lang w:val="hu-HU"/>
+        </w:rPr>
+        <w:br/>
+      </w:r>
+      <w:r>
+        <w:rPr>
+          <w:b/>
+          <w:bCs/>
+          <w:lang w:val="hu-HU"/>
+        </w:rPr>
+        <w:t>Példa válasz:</w:t>
       </w:r>
       <w:r>
         <w:rPr>
@@ -342,144 +357,6 @@
         <w:rPr>
           <w:lang w:val="hu-HU"/>
         </w:rPr>
-        <w:t>-</w:t>
-      </w:r>
-      <w:r>
-        <w:rPr>
-          <w:lang w:val="hu-HU"/>
-        </w:rPr>
-        <w:br/>
-      </w:r>
-      <w:r>
-        <w:rPr>
-          <w:b/>
-          <w:bCs/>
-          <w:lang w:val="hu-HU"/>
-        </w:rPr>
-        <w:t>Támogatott paraméterek</w:t>
-      </w:r>
-      <w:proofErr w:type="gramStart"/>
-      <w:r>
-        <w:rPr>
-          <w:b/>
-          <w:bCs/>
-          <w:lang w:val="hu-HU"/>
-        </w:rPr>
-        <w:t>:</w:t>
-      </w:r>
-      <w:r>
-        <w:rPr>
-          <w:b/>
-          <w:bCs/>
-          <w:lang w:val="hu-HU"/>
-        </w:rPr>
-        <w:t xml:space="preserve"> </w:t>
-      </w:r>
-      <w:r>
-        <w:rPr>
-          <w:rFonts w:ascii="Courier New" w:hAnsi="Courier New" w:cs="Courier New"/>
-          <w:b/>
-          <w:bCs/>
-          <w:lang w:val="hu-HU"/>
-        </w:rPr>
-        <w:t>?</w:t>
-      </w:r>
-      <w:proofErr w:type="spellStart"/>
-      <w:r>
-        <w:rPr>
-          <w:rFonts w:ascii="Courier New" w:hAnsi="Courier New" w:cs="Courier New"/>
-          <w:b/>
-          <w:bCs/>
-          <w:lang w:val="hu-HU"/>
-        </w:rPr>
-        <w:t>search</w:t>
-      </w:r>
-      <w:proofErr w:type="spellEnd"/>
-      <w:proofErr w:type="gramEnd"/>
-      <w:r>
-        <w:rPr>
-          <w:rFonts w:ascii="Courier New" w:hAnsi="Courier New" w:cs="Courier New"/>
-          <w:b/>
-          <w:bCs/>
-          <w:lang w:val="hu-HU"/>
-        </w:rPr>
-        <w:t>=</w:t>
-      </w:r>
-      <w:r>
-        <w:rPr>
-          <w:rFonts w:ascii="Courier New" w:hAnsi="Courier New" w:cs="Courier New"/>
-          <w:b/>
-          <w:bCs/>
-          <w:lang w:val="hu-HU"/>
-        </w:rPr>
-        <w:br/>
-      </w:r>
-      <w:r>
-        <w:rPr>
-          <w:lang w:val="hu-HU"/>
-        </w:rPr>
-        <w:t xml:space="preserve">Támogatja a szűrést a felhasználó azonosítója, </w:t>
-      </w:r>
-      <w:proofErr w:type="gramStart"/>
-      <w:r>
-        <w:rPr>
-          <w:lang w:val="hu-HU"/>
-        </w:rPr>
-        <w:t>neve,</w:t>
-      </w:r>
-      <w:proofErr w:type="gramEnd"/>
-      <w:r>
-        <w:rPr>
-          <w:lang w:val="hu-HU"/>
-        </w:rPr>
-        <w:t xml:space="preserve"> vagy email címe alapján</w:t>
-      </w:r>
-      <w:r>
-        <w:rPr>
-          <w:lang w:val="hu-HU"/>
-        </w:rPr>
-        <w:br/>
-      </w:r>
-      <w:r>
-        <w:rPr>
-          <w:b/>
-          <w:bCs/>
-          <w:lang w:val="hu-HU"/>
-        </w:rPr>
-        <w:t>Korlátozás:</w:t>
-      </w:r>
-      <w:r>
-        <w:rPr>
-          <w:lang w:val="hu-HU"/>
-        </w:rPr>
-        <w:t xml:space="preserve"> Minden felhasználónak elérhető </w:t>
-      </w:r>
-      <w:r>
-        <w:rPr>
-          <w:lang w:val="hu-HU"/>
-        </w:rPr>
-        <w:br/>
-      </w:r>
-      <w:r>
-        <w:rPr>
-          <w:b/>
-          <w:bCs/>
-          <w:lang w:val="hu-HU"/>
-        </w:rPr>
-        <w:t>Példa válasz:</w:t>
-      </w:r>
-      <w:r>
-        <w:rPr>
-          <w:b/>
-          <w:bCs/>
-          <w:lang w:val="hu-HU"/>
-        </w:rPr>
-        <w:t xml:space="preserve"> </w:t>
-      </w:r>
-      <w:r>
-        <w:rPr>
-          <w:lang w:val="hu-HU"/>
-        </w:rPr>
         <w:t>(200 OK)</w:t>
       </w:r>
     </w:p>
@@ -539,20 +416,7 @@
         <w:pStyle w:val="Kdblokk"/>
       </w:pPr>
       <w:r>
-        <w:t xml:space="preserve">    "</w:t>
-      </w:r>
-      <w:proofErr w:type="spellStart"/>
-      <w:proofErr w:type="gramStart"/>
-      <w:r>
-        <w:t>image</w:t>
-      </w:r>
-      <w:proofErr w:type="gramEnd"/>
-      <w:r>
-        <w:t>_url</w:t>
-      </w:r>
-      <w:proofErr w:type="spellEnd"/>
-      <w:r>
-        <w:t>": "http://127.0.0.1:8000/images/default_pfp.png",</w:t>
+        <w:t xml:space="preserve">    "image_url": "http://127.0.0.1:8000/images/default_pfp.png",</w:t>
       </w:r>
     </w:p>
     <w:p>
@@ -561,6 +425,20 @@
       </w:pPr>
       <w:r>
         <w:t xml:space="preserve">    "bio": null</w:t>
+      </w:r>
+      <w:r>
+        <w:t>,</w:t>
+      </w:r>
+    </w:p>
+    <w:p>
+      <w:pPr>
+        <w:pStyle w:val="Kdblokk"/>
+      </w:pPr>
+      <w:r>
+        <w:t xml:space="preserve">    </w:t>
+      </w:r>
+      <w:r>
+        <w:t>"post_karma": 0</w:t>
       </w:r>
     </w:p>
     <w:p>
@@ -607,7 +485,6 @@
           <w:bCs/>
           <w:lang w:val="hu-HU"/>
         </w:rPr>
-        <w:lastRenderedPageBreak/>
         <w:t>GET</w:t>
       </w:r>
       <w:r>
@@ -618,33 +495,17 @@
         </w:rPr>
         <w:t xml:space="preserve"> </w:t>
       </w:r>
-      <w:proofErr w:type="spellStart"/>
       <w:r>
         <w:rPr>
           <w:lang w:val="hu-HU"/>
         </w:rPr>
         <w:t>Users</w:t>
       </w:r>
-      <w:proofErr w:type="spellEnd"/>
-      <w:r>
-        <w:rPr>
-          <w:lang w:val="hu-HU"/>
-        </w:rPr>
-        <w:t xml:space="preserve"> (</w:t>
-      </w:r>
-      <w:proofErr w:type="spellStart"/>
-      <w:r>
-        <w:rPr>
-          <w:lang w:val="hu-HU"/>
-        </w:rPr>
-        <w:t>Single</w:t>
-      </w:r>
-      <w:proofErr w:type="spellEnd"/>
-      <w:r>
-        <w:rPr>
-          <w:lang w:val="hu-HU"/>
-        </w:rPr>
-        <w:t>)</w:t>
+      <w:r>
+        <w:rPr>
+          <w:lang w:val="hu-HU"/>
+        </w:rPr>
+        <w:t xml:space="preserve"> (Single)</w:t>
       </w:r>
     </w:p>
     <w:p>
@@ -727,38 +588,13 @@
           <w:rFonts w:ascii="Courier New" w:hAnsi="Courier New" w:cs="Courier New"/>
           <w:lang w:val="hu-HU"/>
         </w:rPr>
-        <w:t>GET | /</w:t>
-      </w:r>
-      <w:proofErr w:type="spellStart"/>
+        <w:t>GET | /api/users</w:t>
+      </w:r>
       <w:r>
         <w:rPr>
           <w:rFonts w:ascii="Courier New" w:hAnsi="Courier New" w:cs="Courier New"/>
           <w:lang w:val="hu-HU"/>
         </w:rPr>
-        <w:t>api</w:t>
-      </w:r>
-      <w:proofErr w:type="spellEnd"/>
-      <w:r>
-        <w:rPr>
-          <w:rFonts w:ascii="Courier New" w:hAnsi="Courier New" w:cs="Courier New"/>
-          <w:lang w:val="hu-HU"/>
-        </w:rPr>
-        <w:t>/</w:t>
-      </w:r>
-      <w:proofErr w:type="spellStart"/>
-      <w:r>
-        <w:rPr>
-          <w:rFonts w:ascii="Courier New" w:hAnsi="Courier New" w:cs="Courier New"/>
-          <w:lang w:val="hu-HU"/>
-        </w:rPr>
-        <w:t>users</w:t>
-      </w:r>
-      <w:proofErr w:type="spellEnd"/>
-      <w:r>
-        <w:rPr>
-          <w:rFonts w:ascii="Courier New" w:hAnsi="Courier New" w:cs="Courier New"/>
-          <w:lang w:val="hu-HU"/>
-        </w:rPr>
         <w:t>/2</w:t>
       </w:r>
       <w:r>
@@ -883,20 +719,7 @@
         <w:pStyle w:val="Kdblokk"/>
       </w:pPr>
       <w:r>
-        <w:t xml:space="preserve">    "</w:t>
-      </w:r>
-      <w:proofErr w:type="spellStart"/>
-      <w:proofErr w:type="gramStart"/>
-      <w:r>
-        <w:t>image</w:t>
-      </w:r>
-      <w:proofErr w:type="gramEnd"/>
-      <w:r>
-        <w:t>_url</w:t>
-      </w:r>
-      <w:proofErr w:type="spellEnd"/>
-      <w:r>
-        <w:t>": "http://127.0.0.1:8000/images/default_pfp.png",</w:t>
+        <w:t xml:space="preserve">    "image_url": "http://127.0.0.1:8000/images/default_pfp.png",</w:t>
       </w:r>
     </w:p>
     <w:p>
@@ -906,6 +729,20 @@
       <w:r>
         <w:t xml:space="preserve">    "bio": null</w:t>
       </w:r>
+      <w:r>
+        <w:t>,</w:t>
+      </w:r>
+    </w:p>
+    <w:p>
+      <w:pPr>
+        <w:pStyle w:val="Kdblokk"/>
+      </w:pPr>
+      <w:r>
+        <w:t xml:space="preserve">    </w:t>
+      </w:r>
+      <w:r>
+        <w:t>"post_karma": 0</w:t>
+      </w:r>
     </w:p>
     <w:p>
       <w:pPr>
@@ -947,7 +784,6 @@
         </w:rPr>
         <w:t xml:space="preserve"> </w:t>
       </w:r>
-      <w:proofErr w:type="spellStart"/>
       <w:r>
         <w:rPr>
           <w:lang w:val="hu-HU"/>
@@ -958,23 +794,8 @@
         <w:rPr>
           <w:lang w:val="hu-HU"/>
         </w:rPr>
-        <w:t>’s</w:t>
-      </w:r>
-      <w:proofErr w:type="spellEnd"/>
-      <w:r>
-        <w:rPr>
-          <w:lang w:val="hu-HU"/>
-        </w:rPr>
-        <w:t xml:space="preserve"> </w:t>
-      </w:r>
-      <w:proofErr w:type="spellStart"/>
-      <w:r>
-        <w:rPr>
-          <w:lang w:val="hu-HU"/>
-        </w:rPr>
-        <w:t>threads</w:t>
-      </w:r>
-      <w:proofErr w:type="spellEnd"/>
+        <w:t>’s threads</w:t>
+      </w:r>
     </w:p>
     <w:p>
       <w:pPr>
@@ -1056,56 +877,15 @@
           <w:rFonts w:ascii="Courier New" w:hAnsi="Courier New" w:cs="Courier New"/>
           <w:lang w:val="hu-HU"/>
         </w:rPr>
-        <w:t>GET | /</w:t>
-      </w:r>
-      <w:proofErr w:type="spellStart"/>
+        <w:t>GET | /api/users</w:t>
+      </w:r>
       <w:r>
         <w:rPr>
           <w:rFonts w:ascii="Courier New" w:hAnsi="Courier New" w:cs="Courier New"/>
           <w:lang w:val="hu-HU"/>
         </w:rPr>
-        <w:t>api</w:t>
-      </w:r>
-      <w:proofErr w:type="spellEnd"/>
-      <w:r>
-        <w:rPr>
-          <w:rFonts w:ascii="Courier New" w:hAnsi="Courier New" w:cs="Courier New"/>
-          <w:lang w:val="hu-HU"/>
-        </w:rPr>
-        <w:t>/</w:t>
-      </w:r>
-      <w:proofErr w:type="spellStart"/>
-      <w:r>
-        <w:rPr>
-          <w:rFonts w:ascii="Courier New" w:hAnsi="Courier New" w:cs="Courier New"/>
-          <w:lang w:val="hu-HU"/>
-        </w:rPr>
-        <w:t>users</w:t>
-      </w:r>
-      <w:proofErr w:type="spellEnd"/>
-      <w:r>
-        <w:rPr>
-          <w:rFonts w:ascii="Courier New" w:hAnsi="Courier New" w:cs="Courier New"/>
-          <w:lang w:val="hu-HU"/>
-        </w:rPr>
-        <w:t>/2</w:t>
-      </w:r>
-      <w:r>
-        <w:rPr>
-          <w:rFonts w:ascii="Courier New" w:hAnsi="Courier New" w:cs="Courier New"/>
-          <w:lang w:val="hu-HU"/>
-        </w:rPr>
-        <w:t>/</w:t>
-      </w:r>
-      <w:proofErr w:type="spellStart"/>
-      <w:r>
-        <w:rPr>
-          <w:rFonts w:ascii="Courier New" w:hAnsi="Courier New" w:cs="Courier New"/>
-          <w:lang w:val="hu-HU"/>
-        </w:rPr>
-        <w:t>threads</w:t>
-      </w:r>
-      <w:proofErr w:type="spellEnd"/>
+        <w:t>/2/threads</w:t>
+      </w:r>
       <w:r>
         <w:rPr>
           <w:lang w:val="hu-HU"/>
@@ -1212,152 +992,38 @@
         <w:pStyle w:val="Kdblokk"/>
       </w:pPr>
       <w:r>
-        <w:t xml:space="preserve">    "name": "Eos </w:t>
-      </w:r>
-      <w:proofErr w:type="spellStart"/>
-      <w:r>
-        <w:t>voluptas</w:t>
-      </w:r>
-      <w:proofErr w:type="spellEnd"/>
-      <w:r>
-        <w:t xml:space="preserve"> </w:t>
-      </w:r>
-      <w:proofErr w:type="spellStart"/>
-      <w:r>
-        <w:t>eaque</w:t>
-      </w:r>
-      <w:proofErr w:type="spellEnd"/>
-      <w:r>
-        <w:t xml:space="preserve"> ipsum.",</w:t>
-      </w:r>
-    </w:p>
-    <w:p>
-      <w:pPr>
-        <w:pStyle w:val="Kdblokk"/>
-      </w:pPr>
-      <w:r>
-        <w:t xml:space="preserve">    "description": "</w:t>
-      </w:r>
-      <w:proofErr w:type="spellStart"/>
-      <w:r>
-        <w:t>Dolorum</w:t>
-      </w:r>
-      <w:proofErr w:type="spellEnd"/>
-      <w:r>
-        <w:t xml:space="preserve"> </w:t>
-      </w:r>
-      <w:proofErr w:type="spellStart"/>
-      <w:r>
-        <w:t>aut</w:t>
-      </w:r>
-      <w:proofErr w:type="spellEnd"/>
-      <w:r>
-        <w:t xml:space="preserve"> </w:t>
-      </w:r>
-      <w:proofErr w:type="spellStart"/>
-      <w:r>
-        <w:t>eveniet</w:t>
-      </w:r>
-      <w:proofErr w:type="spellEnd"/>
-      <w:r>
-        <w:t xml:space="preserve"> fugit". </w:t>
-      </w:r>
-    </w:p>
-    <w:p>
-      <w:pPr>
-        <w:pStyle w:val="Kdblokk"/>
-      </w:pPr>
-      <w:r>
         <w:lastRenderedPageBreak/>
-        <w:t xml:space="preserve">    "rules": "</w:t>
-      </w:r>
-      <w:proofErr w:type="spellStart"/>
-      <w:r>
-        <w:t>Aut</w:t>
-      </w:r>
-      <w:proofErr w:type="spellEnd"/>
-      <w:r>
-        <w:t xml:space="preserve"> </w:t>
-      </w:r>
-      <w:proofErr w:type="spellStart"/>
-      <w:r>
-        <w:t>voluptatum</w:t>
-      </w:r>
-      <w:proofErr w:type="spellEnd"/>
-      <w:r>
-        <w:t xml:space="preserve"> </w:t>
-      </w:r>
-      <w:proofErr w:type="spellStart"/>
-      <w:r>
-        <w:t>tempora</w:t>
-      </w:r>
-      <w:proofErr w:type="spellEnd"/>
-      <w:r>
-        <w:t xml:space="preserve"> </w:t>
-      </w:r>
-      <w:proofErr w:type="spellStart"/>
-      <w:r>
-        <w:t>iure</w:t>
-      </w:r>
-      <w:proofErr w:type="spellEnd"/>
-      <w:r>
-        <w:t xml:space="preserve"> sunt id minima.\n </w:t>
-      </w:r>
-      <w:proofErr w:type="spellStart"/>
-      <w:r>
-        <w:t>Sequi</w:t>
-      </w:r>
-      <w:proofErr w:type="spellEnd"/>
-      <w:r>
-        <w:t xml:space="preserve"> </w:t>
+        <w:t xml:space="preserve">    "name": "Eos voluptas eaque ipsum.",</w:t>
+      </w:r>
+    </w:p>
+    <w:p>
+      <w:pPr>
+        <w:pStyle w:val="Kdblokk"/>
+      </w:pPr>
+      <w:r>
+        <w:t xml:space="preserve">    "description": "Dolorum aut eveniet fugit". </w:t>
+      </w:r>
+    </w:p>
+    <w:p>
+      <w:pPr>
+        <w:pStyle w:val="Kdblokk"/>
+      </w:pPr>
+      <w:r>
+        <w:t xml:space="preserve">    "rules": "Aut voluptatum tempora iure sunt id minima.\n Sequi </w:t>
       </w:r>
       <w:r>
         <w:tab/>
       </w:r>
-      <w:proofErr w:type="spellStart"/>
-      <w:r>
-        <w:t>iure</w:t>
-      </w:r>
-      <w:proofErr w:type="spellEnd"/>
-      <w:r>
-        <w:t xml:space="preserve"> </w:t>
-      </w:r>
-      <w:proofErr w:type="spellStart"/>
-      <w:r>
-        <w:t>saepe</w:t>
-      </w:r>
-      <w:proofErr w:type="spellEnd"/>
-      <w:r>
-        <w:t xml:space="preserve"> </w:t>
-      </w:r>
-      <w:proofErr w:type="spellStart"/>
-      <w:r>
-        <w:t>vero</w:t>
-      </w:r>
-      <w:proofErr w:type="spellEnd"/>
-      <w:r>
-        <w:t>.",</w:t>
-      </w:r>
-    </w:p>
-    <w:p>
-      <w:pPr>
-        <w:pStyle w:val="Kdblokk"/>
-      </w:pPr>
-      <w:r>
-        <w:t xml:space="preserve">    "</w:t>
-      </w:r>
-      <w:proofErr w:type="spellStart"/>
-      <w:proofErr w:type="gramStart"/>
-      <w:r>
-        <w:t>users</w:t>
-      </w:r>
-      <w:proofErr w:type="gramEnd"/>
-      <w:r>
-        <w:t>_count</w:t>
-      </w:r>
-      <w:proofErr w:type="spellEnd"/>
-      <w:r>
-        <w:t>": 7</w:t>
+      <w:r>
+        <w:t>iure saepe vero.",</w:t>
+      </w:r>
+    </w:p>
+    <w:p>
+      <w:pPr>
+        <w:pStyle w:val="Kdblokk"/>
+      </w:pPr>
+      <w:r>
+        <w:t xml:space="preserve">    "users_count": 7</w:t>
       </w:r>
     </w:p>
     <w:p>
@@ -1401,14 +1067,12 @@
         </w:rPr>
         <w:t xml:space="preserve">Login </w:t>
       </w:r>
-      <w:proofErr w:type="spellStart"/>
       <w:r>
         <w:rPr>
           <w:lang w:val="hu-HU"/>
         </w:rPr>
         <w:t>User</w:t>
       </w:r>
-      <w:proofErr w:type="spellEnd"/>
     </w:p>
     <w:p>
       <w:pPr>
@@ -1499,29 +1163,13 @@
           <w:rFonts w:ascii="Courier New" w:hAnsi="Courier New" w:cs="Courier New"/>
           <w:lang w:val="hu-HU"/>
         </w:rPr>
-        <w:t xml:space="preserve"> | /</w:t>
-      </w:r>
-      <w:proofErr w:type="spellStart"/>
+        <w:t xml:space="preserve"> | /api/</w:t>
+      </w:r>
       <w:r>
         <w:rPr>
           <w:rFonts w:ascii="Courier New" w:hAnsi="Courier New" w:cs="Courier New"/>
           <w:lang w:val="hu-HU"/>
         </w:rPr>
-        <w:t>api</w:t>
-      </w:r>
-      <w:proofErr w:type="spellEnd"/>
-      <w:r>
-        <w:rPr>
-          <w:rFonts w:ascii="Courier New" w:hAnsi="Courier New" w:cs="Courier New"/>
-          <w:lang w:val="hu-HU"/>
-        </w:rPr>
-        <w:t>/</w:t>
-      </w:r>
-      <w:r>
-        <w:rPr>
-          <w:rFonts w:ascii="Courier New" w:hAnsi="Courier New" w:cs="Courier New"/>
-          <w:lang w:val="hu-HU"/>
-        </w:rPr>
         <w:t>login</w:t>
       </w:r>
       <w:r>
@@ -1572,351 +1220,252 @@
         <w:rPr>
           <w:lang w:val="hu-HU"/>
         </w:rPr>
-        <w:t xml:space="preserve">  "</w:t>
-      </w:r>
-      <w:proofErr w:type="spellStart"/>
-      <w:r>
-        <w:rPr>
-          <w:lang w:val="hu-HU"/>
-        </w:rPr>
-        <w:t>username</w:t>
-      </w:r>
-      <w:proofErr w:type="spellEnd"/>
-      <w:r>
-        <w:rPr>
-          <w:lang w:val="hu-HU"/>
-        </w:rPr>
-        <w:t>": "</w:t>
-      </w:r>
-      <w:proofErr w:type="spellStart"/>
-      <w:r>
-        <w:rPr>
-          <w:lang w:val="hu-HU"/>
-        </w:rPr>
-        <w:t>string</w:t>
-      </w:r>
-      <w:proofErr w:type="spellEnd"/>
-      <w:r>
-        <w:rPr>
-          <w:lang w:val="hu-HU"/>
-        </w:rPr>
+        <w:t xml:space="preserve">  "username": "string",</w:t>
+      </w:r>
+    </w:p>
+    <w:p>
+      <w:pPr>
+        <w:pStyle w:val="Kdblokk"/>
+        <w:rPr>
+          <w:lang w:val="hu-HU"/>
+        </w:rPr>
+      </w:pPr>
+      <w:r>
+        <w:rPr>
+          <w:lang w:val="hu-HU"/>
+        </w:rPr>
+        <w:t xml:space="preserve">  "password": "string"</w:t>
+      </w:r>
+    </w:p>
+    <w:p>
+      <w:pPr>
+        <w:pStyle w:val="Kdblokk"/>
+        <w:rPr>
+          <w:lang w:val="hu-HU"/>
+        </w:rPr>
+      </w:pPr>
+      <w:r>
+        <w:rPr>
+          <w:lang w:val="hu-HU"/>
+        </w:rPr>
+        <w:t>}</w:t>
+      </w:r>
+    </w:p>
+    <w:p>
+      <w:pPr>
+        <w:jc w:val="left"/>
+        <w:rPr>
+          <w:lang w:val="hu-HU"/>
+        </w:rPr>
+      </w:pPr>
+      <w:r>
+        <w:rPr>
+          <w:b/>
+          <w:bCs/>
+          <w:lang w:val="hu-HU"/>
+        </w:rPr>
+        <w:t>Korlátozás:</w:t>
+      </w:r>
+      <w:r>
+        <w:rPr>
+          <w:lang w:val="hu-HU"/>
+        </w:rPr>
+        <w:t xml:space="preserve"> Minden felhasználónak elérhető </w:t>
+      </w:r>
+      <w:r>
+        <w:rPr>
+          <w:lang w:val="hu-HU"/>
+        </w:rPr>
+        <w:br/>
+      </w:r>
+      <w:r>
+        <w:rPr>
+          <w:b/>
+          <w:bCs/>
+          <w:lang w:val="hu-HU"/>
+        </w:rPr>
+        <w:t>Példa válasz:</w:t>
+      </w:r>
+      <w:r>
+        <w:rPr>
+          <w:b/>
+          <w:bCs/>
+          <w:lang w:val="hu-HU"/>
+        </w:rPr>
+        <w:t xml:space="preserve"> </w:t>
+      </w:r>
+      <w:r>
+        <w:rPr>
+          <w:lang w:val="hu-HU"/>
+        </w:rPr>
+        <w:t>(200 OK)</w:t>
+      </w:r>
+    </w:p>
+    <w:p>
+      <w:pPr>
+        <w:pStyle w:val="Kdblokk"/>
+      </w:pPr>
+      <w:r>
+        <w:t>{</w:t>
+      </w:r>
+    </w:p>
+    <w:p>
+      <w:pPr>
+        <w:pStyle w:val="Kdblokk"/>
+      </w:pPr>
+      <w:r>
+        <w:t xml:space="preserve">  "message": "Login successful",</w:t>
+      </w:r>
+    </w:p>
+    <w:p>
+      <w:pPr>
+        <w:pStyle w:val="Kdblokk"/>
+      </w:pPr>
+      <w:r>
+        <w:t xml:space="preserve">  "access_token"</w:t>
+      </w:r>
+      <w:r>
+        <w:t>:</w:t>
+      </w:r>
+      <w:r>
+        <w:t>"</w:t>
+      </w:r>
+      <w:r>
+        <w:t>1</w:t>
+      </w:r>
+      <w:r>
+        <w:t>|QUaojZDjn0J6bfFoRzLdT7gh8xWWNedPSvkv</w:t>
+      </w:r>
+      <w:r>
+        <w:t>…</w:t>
+      </w:r>
+      <w:r>
         <w:t>",</w:t>
       </w:r>
     </w:p>
     <w:p>
       <w:pPr>
         <w:pStyle w:val="Kdblokk"/>
-        <w:rPr>
-          <w:lang w:val="hu-HU"/>
-        </w:rPr>
-      </w:pPr>
-      <w:r>
-        <w:rPr>
-          <w:lang w:val="hu-HU"/>
-        </w:rPr>
-        <w:t xml:space="preserve">  "</w:t>
-      </w:r>
-      <w:proofErr w:type="spellStart"/>
-      <w:r>
-        <w:rPr>
-          <w:lang w:val="hu-HU"/>
-        </w:rPr>
-        <w:t>password</w:t>
-      </w:r>
-      <w:proofErr w:type="spellEnd"/>
-      <w:r>
-        <w:rPr>
-          <w:lang w:val="hu-HU"/>
-        </w:rPr>
-        <w:t>": "</w:t>
-      </w:r>
-      <w:proofErr w:type="spellStart"/>
-      <w:r>
-        <w:rPr>
-          <w:lang w:val="hu-HU"/>
-        </w:rPr>
-        <w:t>string</w:t>
-      </w:r>
-      <w:proofErr w:type="spellEnd"/>
-      <w:r>
-        <w:rPr>
-          <w:lang w:val="hu-HU"/>
-        </w:rPr>
-        <w:t>"</w:t>
-      </w:r>
-    </w:p>
-    <w:p>
-      <w:pPr>
-        <w:pStyle w:val="Kdblokk"/>
-        <w:rPr>
-          <w:lang w:val="hu-HU"/>
-        </w:rPr>
-      </w:pPr>
-      <w:r>
-        <w:rPr>
-          <w:lang w:val="hu-HU"/>
-        </w:rPr>
+      </w:pPr>
+      <w:r>
+        <w:t xml:space="preserve">  "token_type": "Bearer",</w:t>
+      </w:r>
+    </w:p>
+    <w:p>
+      <w:pPr>
+        <w:pStyle w:val="Kdblokk"/>
+      </w:pPr>
+      <w:r>
+        <w:t xml:space="preserve">  "user": {</w:t>
+      </w:r>
+    </w:p>
+    <w:p>
+      <w:pPr>
+        <w:pStyle w:val="Kdblokk"/>
+      </w:pPr>
+      <w:r>
+        <w:t xml:space="preserve">    "id": 5,</w:t>
+      </w:r>
+    </w:p>
+    <w:p>
+      <w:pPr>
+        <w:pStyle w:val="Kdblokk"/>
+      </w:pPr>
+      <w:r>
+        <w:t xml:space="preserve">    "name": "</w:t>
+      </w:r>
+      <w:r>
+        <w:t>Johann Schulist</w:t>
+      </w:r>
+      <w:r>
+        <w:t>",</w:t>
+      </w:r>
+    </w:p>
+    <w:p>
+      <w:pPr>
+        <w:pStyle w:val="Kdblokk"/>
+      </w:pPr>
+      <w:r>
+        <w:t xml:space="preserve">    "email": "</w:t>
+      </w:r>
+      <w:r>
+        <w:t>vladimir.wisozk@example.com</w:t>
+      </w:r>
+      <w:r>
+        <w:t>",</w:t>
+      </w:r>
+    </w:p>
+    <w:p>
+      <w:pPr>
+        <w:pStyle w:val="Kdblokk"/>
+      </w:pPr>
+      <w:r>
+        <w:t xml:space="preserve">    "image_url": "https://jedligrambackend-</w:t>
+      </w:r>
+      <w:r>
+        <w:tab/>
+      </w:r>
+      <w:r>
+        <w:t>gehermarcell.jcloud.jedlik.cloud/images/default_pfp.png",</w:t>
+      </w:r>
+    </w:p>
+    <w:p>
+      <w:pPr>
+        <w:pStyle w:val="Kdblokk"/>
+      </w:pPr>
+      <w:r>
+        <w:lastRenderedPageBreak/>
+        <w:t xml:space="preserve">    "bio": null</w:t>
+      </w:r>
+      <w:r>
+        <w:t>,</w:t>
+      </w:r>
+    </w:p>
+    <w:p>
+      <w:pPr>
+        <w:pStyle w:val="Kdblokk"/>
+      </w:pPr>
+      <w:r>
+        <w:t xml:space="preserve">    </w:t>
+      </w:r>
+      <w:r>
+        <w:t>"post_karma": 0</w:t>
+      </w:r>
+    </w:p>
+    <w:p>
+      <w:pPr>
+        <w:pStyle w:val="Kdblokk"/>
+      </w:pPr>
+      <w:r>
+        <w:t xml:space="preserve">  }</w:t>
+      </w:r>
+      <w:r>
+        <w:br/>
+      </w:r>
+      <w:r>
         <w:t>}</w:t>
       </w:r>
     </w:p>
     <w:p>
       <w:pPr>
-        <w:jc w:val="left"/>
-        <w:rPr>
-          <w:lang w:val="hu-HU"/>
-        </w:rPr>
-      </w:pPr>
-      <w:r>
-        <w:rPr>
-          <w:b/>
-          <w:bCs/>
-          <w:lang w:val="hu-HU"/>
-        </w:rPr>
-        <w:t>Korlátozás:</w:t>
-      </w:r>
-      <w:r>
-        <w:rPr>
-          <w:lang w:val="hu-HU"/>
-        </w:rPr>
-        <w:t xml:space="preserve"> Minden felhasználónak elérhető </w:t>
-      </w:r>
-      <w:r>
-        <w:rPr>
-          <w:lang w:val="hu-HU"/>
-        </w:rPr>
-        <w:br/>
-      </w:r>
-      <w:r>
-        <w:rPr>
-          <w:b/>
-          <w:bCs/>
-          <w:lang w:val="hu-HU"/>
-        </w:rPr>
-        <w:t>Példa válasz:</w:t>
-      </w:r>
-      <w:r>
-        <w:rPr>
-          <w:b/>
-          <w:bCs/>
-          <w:lang w:val="hu-HU"/>
-        </w:rPr>
-        <w:t xml:space="preserve"> </w:t>
-      </w:r>
-      <w:r>
-        <w:rPr>
-          <w:lang w:val="hu-HU"/>
-        </w:rPr>
-        <w:t>(200 OK)</w:t>
-      </w:r>
-    </w:p>
-    <w:p>
-      <w:pPr>
-        <w:pStyle w:val="Kdblokk"/>
-      </w:pPr>
-      <w:r>
-        <w:t>{</w:t>
-      </w:r>
-    </w:p>
-    <w:p>
-      <w:pPr>
-        <w:pStyle w:val="Kdblokk"/>
-      </w:pPr>
-      <w:r>
-        <w:t xml:space="preserve">  "message": "Login successful",</w:t>
-      </w:r>
-    </w:p>
-    <w:p>
-      <w:pPr>
-        <w:pStyle w:val="Kdblokk"/>
-      </w:pPr>
-      <w:r>
-        <w:t xml:space="preserve">  "</w:t>
-      </w:r>
-      <w:proofErr w:type="gramStart"/>
-      <w:r>
-        <w:t>access</w:t>
-      </w:r>
-      <w:proofErr w:type="gramEnd"/>
-      <w:r>
-        <w:t>_token"</w:t>
-      </w:r>
-      <w:r>
-        <w:t>:</w:t>
-      </w:r>
-      <w:r>
-        <w:t>"</w:t>
-      </w:r>
-      <w:r>
-        <w:t>1</w:t>
-      </w:r>
-      <w:r>
-        <w:t>|QUaojZDjn0J6bfFoRzLdT7gh8xWWNedPSvkv</w:t>
-      </w:r>
-      <w:r>
-        <w:t>…</w:t>
-      </w:r>
-      <w:r>
-        <w:t>",</w:t>
-      </w:r>
-    </w:p>
-    <w:p>
-      <w:pPr>
-        <w:pStyle w:val="Kdblokk"/>
-      </w:pPr>
-      <w:r>
-        <w:t xml:space="preserve">  "</w:t>
-      </w:r>
-      <w:proofErr w:type="spellStart"/>
-      <w:proofErr w:type="gramStart"/>
-      <w:r>
-        <w:t>token</w:t>
-      </w:r>
-      <w:proofErr w:type="gramEnd"/>
-      <w:r>
-        <w:t>_type</w:t>
-      </w:r>
-      <w:proofErr w:type="spellEnd"/>
-      <w:r>
-        <w:t>": "Bearer",</w:t>
-      </w:r>
-    </w:p>
-    <w:p>
-      <w:pPr>
-        <w:pStyle w:val="Kdblokk"/>
-      </w:pPr>
-      <w:r>
-        <w:t xml:space="preserve">  "user": {</w:t>
-      </w:r>
-    </w:p>
-    <w:p>
-      <w:pPr>
-        <w:pStyle w:val="Kdblokk"/>
-      </w:pPr>
-      <w:r>
-        <w:t xml:space="preserve">    "id": 5,</w:t>
-      </w:r>
-    </w:p>
-    <w:p>
-      <w:pPr>
-        <w:pStyle w:val="Kdblokk"/>
-      </w:pPr>
-      <w:r>
-        <w:t xml:space="preserve">    "name": "</w:t>
-      </w:r>
-      <w:r>
-        <w:t>Johann Schulist</w:t>
-      </w:r>
-      <w:r>
-        <w:t>",</w:t>
-      </w:r>
-    </w:p>
-    <w:p>
-      <w:pPr>
-        <w:pStyle w:val="Kdblokk"/>
-      </w:pPr>
-      <w:r>
-        <w:t xml:space="preserve">    "email": "</w:t>
-      </w:r>
-      <w:r>
-        <w:t>vladimir.wisozk@example.com</w:t>
-      </w:r>
-      <w:r>
-        <w:t>",</w:t>
-      </w:r>
-    </w:p>
-    <w:p>
-      <w:pPr>
-        <w:pStyle w:val="Kdblokk"/>
-      </w:pPr>
-      <w:r>
-        <w:t xml:space="preserve">    "</w:t>
-      </w:r>
-      <w:proofErr w:type="spellStart"/>
-      <w:proofErr w:type="gramStart"/>
-      <w:r>
-        <w:t>image</w:t>
-      </w:r>
-      <w:proofErr w:type="gramEnd"/>
-      <w:r>
-        <w:t>_url</w:t>
-      </w:r>
-      <w:proofErr w:type="spellEnd"/>
-      <w:r>
-        <w:t>": "https://jedligrambackend-</w:t>
-      </w:r>
-      <w:r>
-        <w:tab/>
-      </w:r>
-      <w:proofErr w:type="spellStart"/>
-      <w:r>
-        <w:t>gehermarcell.jcloud.jedlik.cloud</w:t>
-      </w:r>
-      <w:proofErr w:type="spellEnd"/>
-      <w:r>
-        <w:t>/images/default_pfp.png",</w:t>
-      </w:r>
-    </w:p>
-    <w:p>
-      <w:pPr>
-        <w:pStyle w:val="Kdblokk"/>
-      </w:pPr>
-      <w:r>
-        <w:t xml:space="preserve">    "bio": null</w:t>
-      </w:r>
-    </w:p>
-    <w:p>
-      <w:pPr>
-        <w:pStyle w:val="Kdblokk"/>
-      </w:pPr>
-      <w:r>
-        <w:t xml:space="preserve">  }</w:t>
-      </w:r>
-      <w:r>
-        <w:br/>
-      </w:r>
-      <w:r>
-        <w:t>}</w:t>
-      </w:r>
-    </w:p>
-    <w:p>
-      <w:pPr>
-        <w:rPr>
-          <w:lang w:val="hu-HU"/>
-        </w:rPr>
-      </w:pPr>
-      <w:r>
-        <w:rPr>
-          <w:b/>
-          <w:bCs/>
-          <w:lang w:val="hu-HU"/>
-        </w:rPr>
-        <w:lastRenderedPageBreak/>
-        <w:t>Log</w:t>
-      </w:r>
-      <w:r>
-        <w:rPr>
-          <w:b/>
-          <w:bCs/>
-          <w:lang w:val="hu-HU"/>
-        </w:rPr>
-        <w:t>out</w:t>
-      </w:r>
-      <w:r>
-        <w:rPr>
-          <w:b/>
-          <w:bCs/>
-          <w:lang w:val="hu-HU"/>
-        </w:rPr>
-        <w:t xml:space="preserve"> </w:t>
-      </w:r>
-      <w:proofErr w:type="spellStart"/>
+        <w:rPr>
+          <w:lang w:val="hu-HU"/>
+        </w:rPr>
+      </w:pPr>
+      <w:r>
+        <w:rPr>
+          <w:b/>
+          <w:bCs/>
+          <w:lang w:val="hu-HU"/>
+        </w:rPr>
+        <w:t xml:space="preserve">Logout </w:t>
+      </w:r>
       <w:r>
         <w:rPr>
           <w:lang w:val="hu-HU"/>
         </w:rPr>
         <w:t>User</w:t>
       </w:r>
-      <w:proofErr w:type="spellEnd"/>
     </w:p>
     <w:p>
       <w:pPr>
@@ -2007,37 +1556,14 @@
           <w:rFonts w:ascii="Courier New" w:hAnsi="Courier New" w:cs="Courier New"/>
           <w:lang w:val="hu-HU"/>
         </w:rPr>
-        <w:t xml:space="preserve"> | /</w:t>
-      </w:r>
-      <w:proofErr w:type="spellStart"/>
+        <w:t xml:space="preserve"> | /api/</w:t>
+      </w:r>
       <w:r>
         <w:rPr>
           <w:rFonts w:ascii="Courier New" w:hAnsi="Courier New" w:cs="Courier New"/>
           <w:lang w:val="hu-HU"/>
         </w:rPr>
-        <w:t>api</w:t>
-      </w:r>
-      <w:proofErr w:type="spellEnd"/>
-      <w:r>
-        <w:rPr>
-          <w:rFonts w:ascii="Courier New" w:hAnsi="Courier New" w:cs="Courier New"/>
-          <w:lang w:val="hu-HU"/>
-        </w:rPr>
-        <w:t>/</w:t>
-      </w:r>
-      <w:r>
-        <w:rPr>
-          <w:rFonts w:ascii="Courier New" w:hAnsi="Courier New" w:cs="Courier New"/>
-          <w:lang w:val="hu-HU"/>
-        </w:rPr>
-        <w:t>lo</w:t>
-      </w:r>
-      <w:r>
-        <w:rPr>
-          <w:rFonts w:ascii="Courier New" w:hAnsi="Courier New" w:cs="Courier New"/>
-          <w:lang w:val="hu-HU"/>
-        </w:rPr>
-        <w:t>gout</w:t>
+        <w:t>logout</w:t>
       </w:r>
       <w:r>
         <w:rPr>
@@ -2095,13 +1621,7 @@
         <w:rPr>
           <w:lang w:val="hu-HU"/>
         </w:rPr>
-        <w:t>Bejelentkezett felhasználóknak</w:t>
-      </w:r>
-      <w:r>
-        <w:rPr>
-          <w:lang w:val="hu-HU"/>
-        </w:rPr>
-        <w:t xml:space="preserve"> elérhető </w:t>
+        <w:t xml:space="preserve">Bejelentkezett felhasználóknak elérhető </w:t>
       </w:r>
       <w:r>
         <w:rPr>
@@ -2186,42 +1706,12 @@
         </w:rPr>
         <w:t xml:space="preserve"> </w:t>
       </w:r>
-      <w:proofErr w:type="spellStart"/>
-      <w:r>
-        <w:rPr>
-          <w:lang w:val="hu-HU"/>
-        </w:rPr>
-        <w:t>User’s</w:t>
-      </w:r>
-      <w:proofErr w:type="spellEnd"/>
-      <w:r>
-        <w:rPr>
-          <w:lang w:val="hu-HU"/>
-        </w:rPr>
-        <w:t xml:space="preserve"> </w:t>
-      </w:r>
-      <w:proofErr w:type="spellStart"/>
-      <w:r>
-        <w:rPr>
-          <w:lang w:val="hu-HU"/>
-        </w:rPr>
-        <w:t>profile</w:t>
-      </w:r>
-      <w:proofErr w:type="spellEnd"/>
-      <w:r>
-        <w:rPr>
-          <w:lang w:val="hu-HU"/>
-        </w:rPr>
-        <w:t xml:space="preserve"> </w:t>
-      </w:r>
-      <w:proofErr w:type="spellStart"/>
-      <w:r>
-        <w:rPr>
-          <w:lang w:val="hu-HU"/>
-        </w:rPr>
-        <w:t>picture</w:t>
-      </w:r>
-      <w:proofErr w:type="spellEnd"/>
+      <w:r>
+        <w:rPr>
+          <w:lang w:val="hu-HU"/>
+        </w:rPr>
+        <w:t>User’s profile picture</w:t>
+      </w:r>
     </w:p>
     <w:p>
       <w:pPr>
@@ -2312,49 +1802,15 @@
           <w:rFonts w:ascii="Courier New" w:hAnsi="Courier New" w:cs="Courier New"/>
           <w:lang w:val="hu-HU"/>
         </w:rPr>
-        <w:t xml:space="preserve"> | /</w:t>
-      </w:r>
-      <w:proofErr w:type="spellStart"/>
+        <w:t xml:space="preserve"> | /api/</w:t>
+      </w:r>
       <w:r>
         <w:rPr>
           <w:rFonts w:ascii="Courier New" w:hAnsi="Courier New" w:cs="Courier New"/>
           <w:lang w:val="hu-HU"/>
         </w:rPr>
-        <w:t>api</w:t>
-      </w:r>
-      <w:proofErr w:type="spellEnd"/>
-      <w:r>
-        <w:rPr>
-          <w:rFonts w:ascii="Courier New" w:hAnsi="Courier New" w:cs="Courier New"/>
-          <w:lang w:val="hu-HU"/>
-        </w:rPr>
-        <w:t>/</w:t>
-      </w:r>
-      <w:proofErr w:type="spellStart"/>
-      <w:r>
-        <w:rPr>
-          <w:rFonts w:ascii="Courier New" w:hAnsi="Courier New" w:cs="Courier New"/>
-          <w:lang w:val="hu-HU"/>
-        </w:rPr>
-        <w:t>users</w:t>
-      </w:r>
-      <w:proofErr w:type="spellEnd"/>
-      <w:r>
-        <w:rPr>
-          <w:rFonts w:ascii="Courier New" w:hAnsi="Courier New" w:cs="Courier New"/>
-          <w:lang w:val="hu-HU"/>
-        </w:rPr>
-        <w:t>/</w:t>
-      </w:r>
-      <w:proofErr w:type="spellStart"/>
-      <w:r>
-        <w:rPr>
-          <w:rFonts w:ascii="Courier New" w:hAnsi="Courier New" w:cs="Courier New"/>
-          <w:lang w:val="hu-HU"/>
-        </w:rPr>
-        <w:t>profile-picture</w:t>
-      </w:r>
-      <w:proofErr w:type="spellEnd"/>
+        <w:t>users/profile-picture</w:t>
+      </w:r>
       <w:r>
         <w:rPr>
           <w:lang w:val="hu-HU"/>
@@ -2513,49 +1969,13 @@
         <w:pStyle w:val="Kdblokk"/>
       </w:pPr>
       <w:r>
-        <w:t xml:space="preserve">    "</w:t>
-      </w:r>
-      <w:proofErr w:type="spellStart"/>
-      <w:proofErr w:type="gramStart"/>
-      <w:r>
-        <w:t>image</w:t>
-      </w:r>
-      <w:proofErr w:type="gramEnd"/>
-      <w:r>
-        <w:t>_url</w:t>
-      </w:r>
-      <w:proofErr w:type="spellEnd"/>
-      <w:r>
-        <w:t>": "https://jedligrambackend-</w:t>
+        <w:t xml:space="preserve">    "image_url": "https://jedligrambackend-</w:t>
       </w:r>
       <w:r>
         <w:tab/>
       </w:r>
-      <w:proofErr w:type="spellStart"/>
-      <w:proofErr w:type="gramStart"/>
-      <w:r>
-        <w:t>gehermarcell.jcloud</w:t>
-      </w:r>
-      <w:proofErr w:type="gramEnd"/>
-      <w:r>
-        <w:t>.</w:t>
-      </w:r>
-      <w:proofErr w:type="gramStart"/>
-      <w:r>
-        <w:t>jedlik.cloud</w:t>
-      </w:r>
-      <w:proofErr w:type="spellEnd"/>
-      <w:proofErr w:type="gramEnd"/>
-      <w:r>
-        <w:t>/storage/</w:t>
-      </w:r>
-      <w:proofErr w:type="spellStart"/>
-      <w:r>
-        <w:t>pfps</w:t>
-      </w:r>
-      <w:proofErr w:type="spellEnd"/>
-      <w:r>
-        <w:t>/W0q9tKPsk2kbP4</w:t>
+      <w:r>
+        <w:t>gehermarcell.jcloud.jedlik.cloud/storage/pfps/W0q9tKPsk2kbP4</w:t>
       </w:r>
       <w:r>
         <w:tab/>
@@ -2569,8 +1989,23 @@
         <w:pStyle w:val="Kdblokk"/>
       </w:pPr>
       <w:r>
+        <w:lastRenderedPageBreak/>
         <w:t xml:space="preserve">    "bio": null</w:t>
       </w:r>
+      <w:r>
+        <w:t>,</w:t>
+      </w:r>
+    </w:p>
+    <w:p>
+      <w:pPr>
+        <w:pStyle w:val="Kdblokk"/>
+      </w:pPr>
+      <w:r>
+        <w:t xml:space="preserve">    </w:t>
+      </w:r>
+      <w:r>
+        <w:t>"post_karma": 0</w:t>
+      </w:r>
     </w:p>
     <w:p>
       <w:pPr>
@@ -2601,28 +2036,13 @@
           <w:bCs/>
           <w:lang w:val="hu-HU"/>
         </w:rPr>
-        <w:lastRenderedPageBreak/>
         <w:t>PUT</w:t>
       </w:r>
       <w:r>
         <w:rPr>
           <w:lang w:val="hu-HU"/>
         </w:rPr>
-        <w:t xml:space="preserve"> </w:t>
-      </w:r>
-      <w:proofErr w:type="spellStart"/>
-      <w:r>
-        <w:rPr>
-          <w:lang w:val="hu-HU"/>
-        </w:rPr>
-        <w:t>Users</w:t>
-      </w:r>
-      <w:proofErr w:type="spellEnd"/>
-      <w:r>
-        <w:rPr>
-          <w:lang w:val="hu-HU"/>
-        </w:rPr>
-        <w:t xml:space="preserve"> </w:t>
+        <w:t xml:space="preserve"> Users </w:t>
       </w:r>
     </w:p>
     <w:p>
@@ -2714,46 +2134,14 @@
           <w:rFonts w:ascii="Courier New" w:hAnsi="Courier New" w:cs="Courier New"/>
           <w:lang w:val="hu-HU"/>
         </w:rPr>
-        <w:t xml:space="preserve"> | /</w:t>
-      </w:r>
-      <w:proofErr w:type="spellStart"/>
+        <w:t xml:space="preserve"> | /api/</w:t>
+      </w:r>
       <w:r>
         <w:rPr>
           <w:rFonts w:ascii="Courier New" w:hAnsi="Courier New" w:cs="Courier New"/>
           <w:lang w:val="hu-HU"/>
         </w:rPr>
-        <w:t>api</w:t>
-      </w:r>
-      <w:proofErr w:type="spellEnd"/>
-      <w:r>
-        <w:rPr>
-          <w:rFonts w:ascii="Courier New" w:hAnsi="Courier New" w:cs="Courier New"/>
-          <w:lang w:val="hu-HU"/>
-        </w:rPr>
-        <w:t>/</w:t>
-      </w:r>
-      <w:proofErr w:type="spellStart"/>
-      <w:r>
-        <w:rPr>
-          <w:rFonts w:ascii="Courier New" w:hAnsi="Courier New" w:cs="Courier New"/>
-          <w:lang w:val="hu-HU"/>
-        </w:rPr>
-        <w:t>users</w:t>
-      </w:r>
-      <w:proofErr w:type="spellEnd"/>
-      <w:r>
-        <w:rPr>
-          <w:rFonts w:ascii="Courier New" w:hAnsi="Courier New" w:cs="Courier New"/>
-          <w:lang w:val="hu-HU"/>
-        </w:rPr>
-        <w:t>/</w:t>
-      </w:r>
-      <w:r>
-        <w:rPr>
-          <w:rFonts w:ascii="Courier New" w:hAnsi="Courier New" w:cs="Courier New"/>
-          <w:lang w:val="hu-HU"/>
-        </w:rPr>
-        <w:t>2</w:t>
+        <w:t>users/2</w:t>
       </w:r>
       <w:r>
         <w:rPr>
@@ -2803,35 +2191,7 @@
         <w:rPr>
           <w:lang w:val="hu-HU"/>
         </w:rPr>
-        <w:t xml:space="preserve">  "</w:t>
-      </w:r>
-      <w:proofErr w:type="spellStart"/>
-      <w:r>
-        <w:rPr>
-          <w:lang w:val="hu-HU"/>
-        </w:rPr>
-        <w:t>name</w:t>
-      </w:r>
-      <w:proofErr w:type="spellEnd"/>
-      <w:r>
-        <w:rPr>
-          <w:lang w:val="hu-HU"/>
-        </w:rPr>
-        <w:t>": "</w:t>
-      </w:r>
-      <w:proofErr w:type="spellStart"/>
-      <w:r>
-        <w:rPr>
-          <w:lang w:val="hu-HU"/>
-        </w:rPr>
-        <w:t>string</w:t>
-      </w:r>
-      <w:proofErr w:type="spellEnd"/>
-      <w:r>
-        <w:rPr>
-          <w:lang w:val="hu-HU"/>
-        </w:rPr>
-        <w:t>",</w:t>
+        <w:t xml:space="preserve">  "name": "string",</w:t>
       </w:r>
     </w:p>
     <w:p>
@@ -2859,35 +2219,7 @@
         <w:rPr>
           <w:lang w:val="hu-HU"/>
         </w:rPr>
-        <w:t xml:space="preserve">  "</w:t>
-      </w:r>
-      <w:proofErr w:type="spellStart"/>
-      <w:r>
-        <w:rPr>
-          <w:lang w:val="hu-HU"/>
-        </w:rPr>
-        <w:t>bio</w:t>
-      </w:r>
-      <w:proofErr w:type="spellEnd"/>
-      <w:r>
-        <w:rPr>
-          <w:lang w:val="hu-HU"/>
-        </w:rPr>
-        <w:t>": "</w:t>
-      </w:r>
-      <w:proofErr w:type="spellStart"/>
-      <w:r>
-        <w:rPr>
-          <w:lang w:val="hu-HU"/>
-        </w:rPr>
-        <w:t>string</w:t>
-      </w:r>
-      <w:proofErr w:type="spellEnd"/>
-      <w:r>
-        <w:rPr>
-          <w:lang w:val="hu-HU"/>
-        </w:rPr>
-        <w:t>"</w:t>
+        <w:t xml:space="preserve">  "bio": "string"</w:t>
       </w:r>
     </w:p>
     <w:p>
@@ -3007,20 +2339,7 @@
         <w:pStyle w:val="Kdblokk"/>
       </w:pPr>
       <w:r>
-        <w:t xml:space="preserve">  "</w:t>
-      </w:r>
-      <w:proofErr w:type="spellStart"/>
-      <w:proofErr w:type="gramStart"/>
-      <w:r>
-        <w:t>image</w:t>
-      </w:r>
-      <w:proofErr w:type="gramEnd"/>
-      <w:r>
-        <w:t>_url</w:t>
-      </w:r>
-      <w:proofErr w:type="spellEnd"/>
-      <w:r>
-        <w:t>": "string",</w:t>
+        <w:t xml:space="preserve">  "image_url": "string",</w:t>
       </w:r>
     </w:p>
     <w:p>
@@ -3029,6 +2348,20 @@
       </w:pPr>
       <w:r>
         <w:t xml:space="preserve">  "bio": "string"</w:t>
+      </w:r>
+      <w:r>
+        <w:t>,</w:t>
+      </w:r>
+    </w:p>
+    <w:p>
+      <w:pPr>
+        <w:pStyle w:val="Kdblokk"/>
+      </w:pPr>
+      <w:r>
+        <w:t xml:space="preserve">  </w:t>
+      </w:r>
+      <w:r>
+        <w:t>"post_karma": 0</w:t>
       </w:r>
     </w:p>
     <w:p>
@@ -4717,6 +4050,36 @@
       <w:shd w:val="clear" w:color="auto" w:fill="D9D9D9" w:themeFill="background1" w:themeFillShade="D9"/>
     </w:rPr>
   </w:style>
+  <w:style w:type="paragraph" w:styleId="HTML-kntformzott">
+    <w:name w:val="HTML Preformatted"/>
+    <w:basedOn w:val="Norml"/>
+    <w:link w:val="HTML-kntformzottChar"/>
+    <w:uiPriority w:val="99"/>
+    <w:semiHidden/>
+    <w:unhideWhenUsed/>
+    <w:rsid w:val="003E6666"/>
+    <w:pPr>
+      <w:spacing w:before="0" w:after="0" w:line="240" w:lineRule="auto"/>
+    </w:pPr>
+    <w:rPr>
+      <w:rFonts w:ascii="Consolas" w:hAnsi="Consolas"/>
+      <w:sz w:val="20"/>
+      <w:szCs w:val="20"/>
+    </w:rPr>
+  </w:style>
+  <w:style w:type="character" w:customStyle="1" w:styleId="HTML-kntformzottChar">
+    <w:name w:val="HTML-ként formázott Char"/>
+    <w:basedOn w:val="Bekezdsalapbettpusa"/>
+    <w:link w:val="HTML-kntformzott"/>
+    <w:uiPriority w:val="99"/>
+    <w:semiHidden/>
+    <w:rsid w:val="003E6666"/>
+    <w:rPr>
+      <w:rFonts w:ascii="Consolas" w:hAnsi="Consolas"/>
+      <w:sz w:val="20"/>
+      <w:szCs w:val="20"/>
+    </w:rPr>
+  </w:style>
 </w:styles>
 </file>
 

</xml_diff>

<commit_message>
docs: add API documentation for Threads endpoints
</commit_message>
<xml_diff>
--- a/zarovizsga.docx
+++ b/zarovizsga.docx
@@ -115,7 +115,21 @@
         <w:rPr>
           <w:lang w:val="hu-HU"/>
         </w:rPr>
-        <w:t>1.2.1 User kontroller</w:t>
+        <w:t xml:space="preserve">1.2.1 </w:t>
+      </w:r>
+      <w:proofErr w:type="spellStart"/>
+      <w:r>
+        <w:rPr>
+          <w:lang w:val="hu-HU"/>
+        </w:rPr>
+        <w:t>User</w:t>
+      </w:r>
+      <w:proofErr w:type="spellEnd"/>
+      <w:r>
+        <w:rPr>
+          <w:lang w:val="hu-HU"/>
+        </w:rPr>
+        <w:t xml:space="preserve"> kontroller</w:t>
       </w:r>
     </w:p>
     <w:p>
@@ -142,17 +156,33 @@
         </w:rPr>
         <w:t xml:space="preserve"> </w:t>
       </w:r>
+      <w:proofErr w:type="spellStart"/>
       <w:r>
         <w:rPr>
           <w:lang w:val="hu-HU"/>
         </w:rPr>
         <w:t>Users</w:t>
       </w:r>
-      <w:r>
-        <w:rPr>
-          <w:lang w:val="hu-HU"/>
-        </w:rPr>
-        <w:t xml:space="preserve"> (All)</w:t>
+      <w:proofErr w:type="spellEnd"/>
+      <w:r>
+        <w:rPr>
+          <w:lang w:val="hu-HU"/>
+        </w:rPr>
+        <w:t xml:space="preserve"> (</w:t>
+      </w:r>
+      <w:proofErr w:type="spellStart"/>
+      <w:r>
+        <w:rPr>
+          <w:lang w:val="hu-HU"/>
+        </w:rPr>
+        <w:t>All</w:t>
+      </w:r>
+      <w:proofErr w:type="spellEnd"/>
+      <w:r>
+        <w:rPr>
+          <w:lang w:val="hu-HU"/>
+        </w:rPr>
+        <w:t>)</w:t>
       </w:r>
     </w:p>
     <w:p>
@@ -235,8 +265,33 @@
           <w:rFonts w:ascii="Courier New" w:hAnsi="Courier New" w:cs="Courier New"/>
           <w:lang w:val="hu-HU"/>
         </w:rPr>
-        <w:t>GET | /api/users</w:t>
-      </w:r>
+        <w:t>GET | /</w:t>
+      </w:r>
+      <w:proofErr w:type="spellStart"/>
+      <w:r>
+        <w:rPr>
+          <w:rFonts w:ascii="Courier New" w:hAnsi="Courier New" w:cs="Courier New"/>
+          <w:lang w:val="hu-HU"/>
+        </w:rPr>
+        <w:t>api</w:t>
+      </w:r>
+      <w:proofErr w:type="spellEnd"/>
+      <w:r>
+        <w:rPr>
+          <w:rFonts w:ascii="Courier New" w:hAnsi="Courier New" w:cs="Courier New"/>
+          <w:lang w:val="hu-HU"/>
+        </w:rPr>
+        <w:t>/</w:t>
+      </w:r>
+      <w:proofErr w:type="spellStart"/>
+      <w:r>
+        <w:rPr>
+          <w:rFonts w:ascii="Courier New" w:hAnsi="Courier New" w:cs="Courier New"/>
+          <w:lang w:val="hu-HU"/>
+        </w:rPr>
+        <w:t>users</w:t>
+      </w:r>
+      <w:proofErr w:type="spellEnd"/>
       <w:r>
         <w:rPr>
           <w:lang w:val="hu-HU"/>
@@ -294,7 +349,27 @@
           <w:bCs/>
           <w:lang w:val="hu-HU"/>
         </w:rPr>
-        <w:t>?search=</w:t>
+        <w:t>?</w:t>
+      </w:r>
+      <w:proofErr w:type="spellStart"/>
+      <w:r>
+        <w:rPr>
+          <w:rFonts w:ascii="Courier New" w:hAnsi="Courier New" w:cs="Courier New"/>
+          <w:b/>
+          <w:bCs/>
+          <w:lang w:val="hu-HU"/>
+        </w:rPr>
+        <w:t>search</w:t>
+      </w:r>
+      <w:proofErr w:type="spellEnd"/>
+      <w:r>
+        <w:rPr>
+          <w:rFonts w:ascii="Courier New" w:hAnsi="Courier New" w:cs="Courier New"/>
+          <w:b/>
+          <w:bCs/>
+          <w:lang w:val="hu-HU"/>
+        </w:rPr>
+        <w:t>=</w:t>
       </w:r>
       <w:r>
         <w:rPr>
@@ -416,7 +491,15 @@
         <w:pStyle w:val="Kdblokk"/>
       </w:pPr>
       <w:r>
-        <w:t xml:space="preserve">    "image_url": "http://127.0.0.1:8000/images/default_pfp.png",</w:t>
+        <w:t xml:space="preserve">    "</w:t>
+      </w:r>
+      <w:proofErr w:type="spellStart"/>
+      <w:r>
+        <w:t>image_url</w:t>
+      </w:r>
+      <w:proofErr w:type="spellEnd"/>
+      <w:r>
+        <w:t>": "http://127.0.0.1:8000/images/default_pfp.png",</w:t>
       </w:r>
     </w:p>
     <w:p>
@@ -438,7 +521,15 @@
         <w:t xml:space="preserve">    </w:t>
       </w:r>
       <w:r>
-        <w:t>"post_karma": 0</w:t>
+        <w:t>"</w:t>
+      </w:r>
+      <w:proofErr w:type="spellStart"/>
+      <w:r>
+        <w:t>post_karma</w:t>
+      </w:r>
+      <w:proofErr w:type="spellEnd"/>
+      <w:r>
+        <w:t>": 0</w:t>
       </w:r>
     </w:p>
     <w:p>
@@ -495,17 +586,33 @@
         </w:rPr>
         <w:t xml:space="preserve"> </w:t>
       </w:r>
+      <w:proofErr w:type="spellStart"/>
       <w:r>
         <w:rPr>
           <w:lang w:val="hu-HU"/>
         </w:rPr>
         <w:t>Users</w:t>
       </w:r>
-      <w:r>
-        <w:rPr>
-          <w:lang w:val="hu-HU"/>
-        </w:rPr>
-        <w:t xml:space="preserve"> (Single)</w:t>
+      <w:proofErr w:type="spellEnd"/>
+      <w:r>
+        <w:rPr>
+          <w:lang w:val="hu-HU"/>
+        </w:rPr>
+        <w:t xml:space="preserve"> (</w:t>
+      </w:r>
+      <w:proofErr w:type="spellStart"/>
+      <w:r>
+        <w:rPr>
+          <w:lang w:val="hu-HU"/>
+        </w:rPr>
+        <w:t>Single</w:t>
+      </w:r>
+      <w:proofErr w:type="spellEnd"/>
+      <w:r>
+        <w:rPr>
+          <w:lang w:val="hu-HU"/>
+        </w:rPr>
+        <w:t>)</w:t>
       </w:r>
     </w:p>
     <w:p>
@@ -588,8 +695,33 @@
           <w:rFonts w:ascii="Courier New" w:hAnsi="Courier New" w:cs="Courier New"/>
           <w:lang w:val="hu-HU"/>
         </w:rPr>
-        <w:t>GET | /api/users</w:t>
-      </w:r>
+        <w:t>GET | /</w:t>
+      </w:r>
+      <w:proofErr w:type="spellStart"/>
+      <w:r>
+        <w:rPr>
+          <w:rFonts w:ascii="Courier New" w:hAnsi="Courier New" w:cs="Courier New"/>
+          <w:lang w:val="hu-HU"/>
+        </w:rPr>
+        <w:t>api</w:t>
+      </w:r>
+      <w:proofErr w:type="spellEnd"/>
+      <w:r>
+        <w:rPr>
+          <w:rFonts w:ascii="Courier New" w:hAnsi="Courier New" w:cs="Courier New"/>
+          <w:lang w:val="hu-HU"/>
+        </w:rPr>
+        <w:t>/</w:t>
+      </w:r>
+      <w:proofErr w:type="spellStart"/>
+      <w:r>
+        <w:rPr>
+          <w:rFonts w:ascii="Courier New" w:hAnsi="Courier New" w:cs="Courier New"/>
+          <w:lang w:val="hu-HU"/>
+        </w:rPr>
+        <w:t>users</w:t>
+      </w:r>
+      <w:proofErr w:type="spellEnd"/>
       <w:r>
         <w:rPr>
           <w:rFonts w:ascii="Courier New" w:hAnsi="Courier New" w:cs="Courier New"/>
@@ -719,7 +851,15 @@
         <w:pStyle w:val="Kdblokk"/>
       </w:pPr>
       <w:r>
-        <w:t xml:space="preserve">    "image_url": "http://127.0.0.1:8000/images/default_pfp.png",</w:t>
+        <w:t xml:space="preserve">    "</w:t>
+      </w:r>
+      <w:proofErr w:type="spellStart"/>
+      <w:r>
+        <w:t>image_url</w:t>
+      </w:r>
+      <w:proofErr w:type="spellEnd"/>
+      <w:r>
+        <w:t>": "http://127.0.0.1:8000/images/default_pfp.png",</w:t>
       </w:r>
     </w:p>
     <w:p>
@@ -741,7 +881,15 @@
         <w:t xml:space="preserve">    </w:t>
       </w:r>
       <w:r>
-        <w:t>"post_karma": 0</w:t>
+        <w:t>"</w:t>
+      </w:r>
+      <w:proofErr w:type="spellStart"/>
+      <w:r>
+        <w:t>post_karma</w:t>
+      </w:r>
+      <w:proofErr w:type="spellEnd"/>
+      <w:r>
+        <w:t>": 0</w:t>
       </w:r>
     </w:p>
     <w:p>
@@ -784,6 +932,7 @@
         </w:rPr>
         <w:t xml:space="preserve"> </w:t>
       </w:r>
+      <w:proofErr w:type="spellStart"/>
       <w:r>
         <w:rPr>
           <w:lang w:val="hu-HU"/>
@@ -794,8 +943,23 @@
         <w:rPr>
           <w:lang w:val="hu-HU"/>
         </w:rPr>
-        <w:t>’s threads</w:t>
-      </w:r>
+        <w:t>’s</w:t>
+      </w:r>
+      <w:proofErr w:type="spellEnd"/>
+      <w:r>
+        <w:rPr>
+          <w:lang w:val="hu-HU"/>
+        </w:rPr>
+        <w:t xml:space="preserve"> </w:t>
+      </w:r>
+      <w:proofErr w:type="spellStart"/>
+      <w:r>
+        <w:rPr>
+          <w:lang w:val="hu-HU"/>
+        </w:rPr>
+        <w:t>threads</w:t>
+      </w:r>
+      <w:proofErr w:type="spellEnd"/>
     </w:p>
     <w:p>
       <w:pPr>
@@ -877,15 +1041,49 @@
           <w:rFonts w:ascii="Courier New" w:hAnsi="Courier New" w:cs="Courier New"/>
           <w:lang w:val="hu-HU"/>
         </w:rPr>
-        <w:t>GET | /api/users</w:t>
-      </w:r>
-      <w:r>
-        <w:rPr>
-          <w:rFonts w:ascii="Courier New" w:hAnsi="Courier New" w:cs="Courier New"/>
-          <w:lang w:val="hu-HU"/>
-        </w:rPr>
-        <w:t>/2/threads</w:t>
-      </w:r>
+        <w:t>GET | /</w:t>
+      </w:r>
+      <w:proofErr w:type="spellStart"/>
+      <w:r>
+        <w:rPr>
+          <w:rFonts w:ascii="Courier New" w:hAnsi="Courier New" w:cs="Courier New"/>
+          <w:lang w:val="hu-HU"/>
+        </w:rPr>
+        <w:t>api</w:t>
+      </w:r>
+      <w:proofErr w:type="spellEnd"/>
+      <w:r>
+        <w:rPr>
+          <w:rFonts w:ascii="Courier New" w:hAnsi="Courier New" w:cs="Courier New"/>
+          <w:lang w:val="hu-HU"/>
+        </w:rPr>
+        <w:t>/</w:t>
+      </w:r>
+      <w:proofErr w:type="spellStart"/>
+      <w:r>
+        <w:rPr>
+          <w:rFonts w:ascii="Courier New" w:hAnsi="Courier New" w:cs="Courier New"/>
+          <w:lang w:val="hu-HU"/>
+        </w:rPr>
+        <w:t>users</w:t>
+      </w:r>
+      <w:proofErr w:type="spellEnd"/>
+      <w:r>
+        <w:rPr>
+          <w:rFonts w:ascii="Courier New" w:hAnsi="Courier New" w:cs="Courier New"/>
+          <w:lang w:val="hu-HU"/>
+        </w:rPr>
+        <w:t>/2/</w:t>
+      </w:r>
+      <w:proofErr w:type="spellStart"/>
+      <w:r>
+        <w:rPr>
+          <w:rFonts w:ascii="Courier New" w:hAnsi="Courier New" w:cs="Courier New"/>
+          <w:lang w:val="hu-HU"/>
+        </w:rPr>
+        <w:t>threads</w:t>
+      </w:r>
+      <w:proofErr w:type="spellEnd"/>
       <w:r>
         <w:rPr>
           <w:lang w:val="hu-HU"/>
@@ -993,37 +1191,146 @@
       </w:pPr>
       <w:r>
         <w:lastRenderedPageBreak/>
-        <w:t xml:space="preserve">    "name": "Eos voluptas eaque ipsum.",</w:t>
-      </w:r>
-    </w:p>
-    <w:p>
-      <w:pPr>
-        <w:pStyle w:val="Kdblokk"/>
-      </w:pPr>
-      <w:r>
-        <w:t xml:space="preserve">    "description": "Dolorum aut eveniet fugit". </w:t>
-      </w:r>
-    </w:p>
-    <w:p>
-      <w:pPr>
-        <w:pStyle w:val="Kdblokk"/>
-      </w:pPr>
-      <w:r>
-        <w:t xml:space="preserve">    "rules": "Aut voluptatum tempora iure sunt id minima.\n Sequi </w:t>
+        <w:t xml:space="preserve">    "name": "Eos </w:t>
+      </w:r>
+      <w:proofErr w:type="spellStart"/>
+      <w:r>
+        <w:t>voluptas</w:t>
+      </w:r>
+      <w:proofErr w:type="spellEnd"/>
+      <w:r>
+        <w:t xml:space="preserve"> </w:t>
+      </w:r>
+      <w:proofErr w:type="spellStart"/>
+      <w:r>
+        <w:t>eaque</w:t>
+      </w:r>
+      <w:proofErr w:type="spellEnd"/>
+      <w:r>
+        <w:t xml:space="preserve"> ipsum.",</w:t>
+      </w:r>
+    </w:p>
+    <w:p>
+      <w:pPr>
+        <w:pStyle w:val="Kdblokk"/>
+      </w:pPr>
+      <w:r>
+        <w:t xml:space="preserve">    "description": "</w:t>
+      </w:r>
+      <w:proofErr w:type="spellStart"/>
+      <w:r>
+        <w:t>Dolorum</w:t>
+      </w:r>
+      <w:proofErr w:type="spellEnd"/>
+      <w:r>
+        <w:t xml:space="preserve"> </w:t>
+      </w:r>
+      <w:proofErr w:type="spellStart"/>
+      <w:r>
+        <w:t>aut</w:t>
+      </w:r>
+      <w:proofErr w:type="spellEnd"/>
+      <w:r>
+        <w:t xml:space="preserve"> </w:t>
+      </w:r>
+      <w:proofErr w:type="spellStart"/>
+      <w:r>
+        <w:t>eveniet</w:t>
+      </w:r>
+      <w:proofErr w:type="spellEnd"/>
+      <w:r>
+        <w:t xml:space="preserve"> fugit". </w:t>
+      </w:r>
+    </w:p>
+    <w:p>
+      <w:pPr>
+        <w:pStyle w:val="Kdblokk"/>
+      </w:pPr>
+      <w:r>
+        <w:t xml:space="preserve">    "rules": "</w:t>
+      </w:r>
+      <w:proofErr w:type="spellStart"/>
+      <w:r>
+        <w:t>Aut</w:t>
+      </w:r>
+      <w:proofErr w:type="spellEnd"/>
+      <w:r>
+        <w:t xml:space="preserve"> </w:t>
+      </w:r>
+      <w:proofErr w:type="spellStart"/>
+      <w:r>
+        <w:t>voluptatum</w:t>
+      </w:r>
+      <w:proofErr w:type="spellEnd"/>
+      <w:r>
+        <w:t xml:space="preserve"> </w:t>
+      </w:r>
+      <w:proofErr w:type="spellStart"/>
+      <w:r>
+        <w:t>tempora</w:t>
+      </w:r>
+      <w:proofErr w:type="spellEnd"/>
+      <w:r>
+        <w:t xml:space="preserve"> </w:t>
+      </w:r>
+      <w:proofErr w:type="spellStart"/>
+      <w:r>
+        <w:t>iure</w:t>
+      </w:r>
+      <w:proofErr w:type="spellEnd"/>
+      <w:r>
+        <w:t xml:space="preserve"> sunt id minima.\n </w:t>
+      </w:r>
+      <w:proofErr w:type="spellStart"/>
+      <w:r>
+        <w:t>Sequi</w:t>
+      </w:r>
+      <w:proofErr w:type="spellEnd"/>
+      <w:r>
+        <w:t xml:space="preserve"> </w:t>
       </w:r>
       <w:r>
         <w:tab/>
       </w:r>
-      <w:r>
-        <w:t>iure saepe vero.",</w:t>
-      </w:r>
-    </w:p>
-    <w:p>
-      <w:pPr>
-        <w:pStyle w:val="Kdblokk"/>
-      </w:pPr>
-      <w:r>
-        <w:t xml:space="preserve">    "users_count": 7</w:t>
+      <w:proofErr w:type="spellStart"/>
+      <w:r>
+        <w:t>iure</w:t>
+      </w:r>
+      <w:proofErr w:type="spellEnd"/>
+      <w:r>
+        <w:t xml:space="preserve"> </w:t>
+      </w:r>
+      <w:proofErr w:type="spellStart"/>
+      <w:r>
+        <w:t>saepe</w:t>
+      </w:r>
+      <w:proofErr w:type="spellEnd"/>
+      <w:r>
+        <w:t xml:space="preserve"> </w:t>
+      </w:r>
+      <w:proofErr w:type="spellStart"/>
+      <w:r>
+        <w:t>vero</w:t>
+      </w:r>
+      <w:proofErr w:type="spellEnd"/>
+      <w:r>
+        <w:t>.",</w:t>
+      </w:r>
+    </w:p>
+    <w:p>
+      <w:pPr>
+        <w:pStyle w:val="Kdblokk"/>
+      </w:pPr>
+      <w:r>
+        <w:t xml:space="preserve">    "</w:t>
+      </w:r>
+      <w:proofErr w:type="spellStart"/>
+      <w:r>
+        <w:t>users_count</w:t>
+      </w:r>
+      <w:proofErr w:type="spellEnd"/>
+      <w:r>
+        <w:t>": 7</w:t>
       </w:r>
     </w:p>
     <w:p>
@@ -1067,12 +1374,14 @@
         </w:rPr>
         <w:t xml:space="preserve">Login </w:t>
       </w:r>
+      <w:proofErr w:type="spellStart"/>
       <w:r>
         <w:rPr>
           <w:lang w:val="hu-HU"/>
         </w:rPr>
         <w:t>User</w:t>
       </w:r>
+      <w:proofErr w:type="spellEnd"/>
     </w:p>
     <w:p>
       <w:pPr>
@@ -1163,7 +1472,23 @@
           <w:rFonts w:ascii="Courier New" w:hAnsi="Courier New" w:cs="Courier New"/>
           <w:lang w:val="hu-HU"/>
         </w:rPr>
-        <w:t xml:space="preserve"> | /api/</w:t>
+        <w:t xml:space="preserve"> | /</w:t>
+      </w:r>
+      <w:proofErr w:type="spellStart"/>
+      <w:r>
+        <w:rPr>
+          <w:rFonts w:ascii="Courier New" w:hAnsi="Courier New" w:cs="Courier New"/>
+          <w:lang w:val="hu-HU"/>
+        </w:rPr>
+        <w:t>api</w:t>
+      </w:r>
+      <w:proofErr w:type="spellEnd"/>
+      <w:r>
+        <w:rPr>
+          <w:rFonts w:ascii="Courier New" w:hAnsi="Courier New" w:cs="Courier New"/>
+          <w:lang w:val="hu-HU"/>
+        </w:rPr>
+        <w:t>/</w:t>
       </w:r>
       <w:r>
         <w:rPr>
@@ -1220,21 +1545,77 @@
         <w:rPr>
           <w:lang w:val="hu-HU"/>
         </w:rPr>
-        <w:t xml:space="preserve">  "username": "string",</w:t>
-      </w:r>
-    </w:p>
-    <w:p>
-      <w:pPr>
-        <w:pStyle w:val="Kdblokk"/>
-        <w:rPr>
-          <w:lang w:val="hu-HU"/>
-        </w:rPr>
-      </w:pPr>
-      <w:r>
-        <w:rPr>
-          <w:lang w:val="hu-HU"/>
-        </w:rPr>
-        <w:t xml:space="preserve">  "password": "string"</w:t>
+        <w:t xml:space="preserve">  "</w:t>
+      </w:r>
+      <w:proofErr w:type="spellStart"/>
+      <w:r>
+        <w:rPr>
+          <w:lang w:val="hu-HU"/>
+        </w:rPr>
+        <w:t>username</w:t>
+      </w:r>
+      <w:proofErr w:type="spellEnd"/>
+      <w:r>
+        <w:rPr>
+          <w:lang w:val="hu-HU"/>
+        </w:rPr>
+        <w:t>": "</w:t>
+      </w:r>
+      <w:proofErr w:type="spellStart"/>
+      <w:r>
+        <w:rPr>
+          <w:lang w:val="hu-HU"/>
+        </w:rPr>
+        <w:t>string</w:t>
+      </w:r>
+      <w:proofErr w:type="spellEnd"/>
+      <w:r>
+        <w:rPr>
+          <w:lang w:val="hu-HU"/>
+        </w:rPr>
+        <w:t>",</w:t>
+      </w:r>
+    </w:p>
+    <w:p>
+      <w:pPr>
+        <w:pStyle w:val="Kdblokk"/>
+        <w:rPr>
+          <w:lang w:val="hu-HU"/>
+        </w:rPr>
+      </w:pPr>
+      <w:r>
+        <w:rPr>
+          <w:lang w:val="hu-HU"/>
+        </w:rPr>
+        <w:t xml:space="preserve">  "</w:t>
+      </w:r>
+      <w:proofErr w:type="spellStart"/>
+      <w:r>
+        <w:rPr>
+          <w:lang w:val="hu-HU"/>
+        </w:rPr>
+        <w:t>password</w:t>
+      </w:r>
+      <w:proofErr w:type="spellEnd"/>
+      <w:r>
+        <w:rPr>
+          <w:lang w:val="hu-HU"/>
+        </w:rPr>
+        <w:t>": "</w:t>
+      </w:r>
+      <w:proofErr w:type="spellStart"/>
+      <w:r>
+        <w:rPr>
+          <w:lang w:val="hu-HU"/>
+        </w:rPr>
+        <w:t>string</w:t>
+      </w:r>
+      <w:proofErr w:type="spellEnd"/>
+      <w:r>
+        <w:rPr>
+          <w:lang w:val="hu-HU"/>
+        </w:rPr>
+        <w:t>"</w:t>
       </w:r>
     </w:p>
     <w:p>
@@ -1348,7 +1729,15 @@
         <w:pStyle w:val="Kdblokk"/>
       </w:pPr>
       <w:r>
-        <w:t xml:space="preserve">  "token_type": "Bearer",</w:t>
+        <w:t xml:space="preserve">  "</w:t>
+      </w:r>
+      <w:proofErr w:type="spellStart"/>
+      <w:r>
+        <w:t>token_type</w:t>
+      </w:r>
+      <w:proofErr w:type="spellEnd"/>
+      <w:r>
+        <w:t>": "Bearer",</w:t>
       </w:r>
     </w:p>
     <w:p>
@@ -1400,13 +1789,26 @@
         <w:pStyle w:val="Kdblokk"/>
       </w:pPr>
       <w:r>
-        <w:t xml:space="preserve">    "image_url": "https://jedligrambackend-</w:t>
+        <w:t xml:space="preserve">    "</w:t>
+      </w:r>
+      <w:proofErr w:type="spellStart"/>
+      <w:r>
+        <w:t>image_url</w:t>
+      </w:r>
+      <w:proofErr w:type="spellEnd"/>
+      <w:r>
+        <w:t>": "https://jedligrambackend-</w:t>
       </w:r>
       <w:r>
         <w:tab/>
       </w:r>
-      <w:r>
-        <w:t>gehermarcell.jcloud.jedlik.cloud/images/default_pfp.png",</w:t>
+      <w:proofErr w:type="spellStart"/>
+      <w:r>
+        <w:t>gehermarcell.jcloud.jedlik.cloud</w:t>
+      </w:r>
+      <w:proofErr w:type="spellEnd"/>
+      <w:r>
+        <w:t>/images/default_pfp.png",</w:t>
       </w:r>
     </w:p>
     <w:p>
@@ -1429,7 +1831,15 @@
         <w:t xml:space="preserve">    </w:t>
       </w:r>
       <w:r>
-        <w:t>"post_karma": 0</w:t>
+        <w:t>"</w:t>
+      </w:r>
+      <w:proofErr w:type="spellStart"/>
+      <w:r>
+        <w:t>post_karma</w:t>
+      </w:r>
+      <w:proofErr w:type="spellEnd"/>
+      <w:r>
+        <w:t>": 0</w:t>
       </w:r>
     </w:p>
     <w:p>
@@ -1460,12 +1870,14 @@
         </w:rPr>
         <w:t xml:space="preserve">Logout </w:t>
       </w:r>
+      <w:proofErr w:type="spellStart"/>
       <w:r>
         <w:rPr>
           <w:lang w:val="hu-HU"/>
         </w:rPr>
         <w:t>User</w:t>
       </w:r>
+      <w:proofErr w:type="spellEnd"/>
     </w:p>
     <w:p>
       <w:pPr>
@@ -1556,7 +1968,23 @@
           <w:rFonts w:ascii="Courier New" w:hAnsi="Courier New" w:cs="Courier New"/>
           <w:lang w:val="hu-HU"/>
         </w:rPr>
-        <w:t xml:space="preserve"> | /api/</w:t>
+        <w:t xml:space="preserve"> | /</w:t>
+      </w:r>
+      <w:proofErr w:type="spellStart"/>
+      <w:r>
+        <w:rPr>
+          <w:rFonts w:ascii="Courier New" w:hAnsi="Courier New" w:cs="Courier New"/>
+          <w:lang w:val="hu-HU"/>
+        </w:rPr>
+        <w:t>api</w:t>
+      </w:r>
+      <w:proofErr w:type="spellEnd"/>
+      <w:r>
+        <w:rPr>
+          <w:rFonts w:ascii="Courier New" w:hAnsi="Courier New" w:cs="Courier New"/>
+          <w:lang w:val="hu-HU"/>
+        </w:rPr>
+        <w:t>/</w:t>
       </w:r>
       <w:r>
         <w:rPr>
@@ -1706,12 +2134,42 @@
         </w:rPr>
         <w:t xml:space="preserve"> </w:t>
       </w:r>
-      <w:r>
-        <w:rPr>
-          <w:lang w:val="hu-HU"/>
-        </w:rPr>
-        <w:t>User’s profile picture</w:t>
-      </w:r>
+      <w:proofErr w:type="spellStart"/>
+      <w:r>
+        <w:rPr>
+          <w:lang w:val="hu-HU"/>
+        </w:rPr>
+        <w:t>User’s</w:t>
+      </w:r>
+      <w:proofErr w:type="spellEnd"/>
+      <w:r>
+        <w:rPr>
+          <w:lang w:val="hu-HU"/>
+        </w:rPr>
+        <w:t xml:space="preserve"> </w:t>
+      </w:r>
+      <w:proofErr w:type="spellStart"/>
+      <w:r>
+        <w:rPr>
+          <w:lang w:val="hu-HU"/>
+        </w:rPr>
+        <w:t>profile</w:t>
+      </w:r>
+      <w:proofErr w:type="spellEnd"/>
+      <w:r>
+        <w:rPr>
+          <w:lang w:val="hu-HU"/>
+        </w:rPr>
+        <w:t xml:space="preserve"> </w:t>
+      </w:r>
+      <w:proofErr w:type="spellStart"/>
+      <w:r>
+        <w:rPr>
+          <w:lang w:val="hu-HU"/>
+        </w:rPr>
+        <w:t>picture</w:t>
+      </w:r>
+      <w:proofErr w:type="spellEnd"/>
     </w:p>
     <w:p>
       <w:pPr>
@@ -1802,15 +2260,49 @@
           <w:rFonts w:ascii="Courier New" w:hAnsi="Courier New" w:cs="Courier New"/>
           <w:lang w:val="hu-HU"/>
         </w:rPr>
-        <w:t xml:space="preserve"> | /api/</w:t>
-      </w:r>
-      <w:r>
-        <w:rPr>
-          <w:rFonts w:ascii="Courier New" w:hAnsi="Courier New" w:cs="Courier New"/>
-          <w:lang w:val="hu-HU"/>
-        </w:rPr>
-        <w:t>users/profile-picture</w:t>
-      </w:r>
+        <w:t xml:space="preserve"> | /</w:t>
+      </w:r>
+      <w:proofErr w:type="spellStart"/>
+      <w:r>
+        <w:rPr>
+          <w:rFonts w:ascii="Courier New" w:hAnsi="Courier New" w:cs="Courier New"/>
+          <w:lang w:val="hu-HU"/>
+        </w:rPr>
+        <w:t>api</w:t>
+      </w:r>
+      <w:proofErr w:type="spellEnd"/>
+      <w:r>
+        <w:rPr>
+          <w:rFonts w:ascii="Courier New" w:hAnsi="Courier New" w:cs="Courier New"/>
+          <w:lang w:val="hu-HU"/>
+        </w:rPr>
+        <w:t>/</w:t>
+      </w:r>
+      <w:proofErr w:type="spellStart"/>
+      <w:r>
+        <w:rPr>
+          <w:rFonts w:ascii="Courier New" w:hAnsi="Courier New" w:cs="Courier New"/>
+          <w:lang w:val="hu-HU"/>
+        </w:rPr>
+        <w:t>users</w:t>
+      </w:r>
+      <w:proofErr w:type="spellEnd"/>
+      <w:r>
+        <w:rPr>
+          <w:rFonts w:ascii="Courier New" w:hAnsi="Courier New" w:cs="Courier New"/>
+          <w:lang w:val="hu-HU"/>
+        </w:rPr>
+        <w:t>/</w:t>
+      </w:r>
+      <w:proofErr w:type="spellStart"/>
+      <w:r>
+        <w:rPr>
+          <w:rFonts w:ascii="Courier New" w:hAnsi="Courier New" w:cs="Courier New"/>
+          <w:lang w:val="hu-HU"/>
+        </w:rPr>
+        <w:t>profile-picture</w:t>
+      </w:r>
+      <w:proofErr w:type="spellEnd"/>
       <w:r>
         <w:rPr>
           <w:lang w:val="hu-HU"/>
@@ -1969,13 +2461,34 @@
         <w:pStyle w:val="Kdblokk"/>
       </w:pPr>
       <w:r>
-        <w:t xml:space="preserve">    "image_url": "https://jedligrambackend-</w:t>
+        <w:t xml:space="preserve">    "</w:t>
+      </w:r>
+      <w:proofErr w:type="spellStart"/>
+      <w:r>
+        <w:t>image_url</w:t>
+      </w:r>
+      <w:proofErr w:type="spellEnd"/>
+      <w:r>
+        <w:t>": "https://jedligrambackend-</w:t>
       </w:r>
       <w:r>
         <w:tab/>
       </w:r>
-      <w:r>
-        <w:t>gehermarcell.jcloud.jedlik.cloud/storage/pfps/W0q9tKPsk2kbP4</w:t>
+      <w:proofErr w:type="spellStart"/>
+      <w:r>
+        <w:t>gehermarcell.jcloud.jedlik.cloud</w:t>
+      </w:r>
+      <w:proofErr w:type="spellEnd"/>
+      <w:r>
+        <w:t>/storage/</w:t>
+      </w:r>
+      <w:proofErr w:type="spellStart"/>
+      <w:r>
+        <w:t>pfps</w:t>
+      </w:r>
+      <w:proofErr w:type="spellEnd"/>
+      <w:r>
+        <w:t>/W0q9tKPsk2kbP4</w:t>
       </w:r>
       <w:r>
         <w:tab/>
@@ -2004,7 +2517,15 @@
         <w:t xml:space="preserve">    </w:t>
       </w:r>
       <w:r>
-        <w:t>"post_karma": 0</w:t>
+        <w:t>"</w:t>
+      </w:r>
+      <w:proofErr w:type="spellStart"/>
+      <w:r>
+        <w:t>post_karma</w:t>
+      </w:r>
+      <w:proofErr w:type="spellEnd"/>
+      <w:r>
+        <w:t>": 0</w:t>
       </w:r>
     </w:p>
     <w:p>
@@ -2042,7 +2563,21 @@
         <w:rPr>
           <w:lang w:val="hu-HU"/>
         </w:rPr>
-        <w:t xml:space="preserve"> Users </w:t>
+        <w:t xml:space="preserve"> </w:t>
+      </w:r>
+      <w:proofErr w:type="spellStart"/>
+      <w:r>
+        <w:rPr>
+          <w:lang w:val="hu-HU"/>
+        </w:rPr>
+        <w:t>Users</w:t>
+      </w:r>
+      <w:proofErr w:type="spellEnd"/>
+      <w:r>
+        <w:rPr>
+          <w:lang w:val="hu-HU"/>
+        </w:rPr>
+        <w:t xml:space="preserve"> </w:t>
       </w:r>
     </w:p>
     <w:p>
@@ -2134,14 +2669,39 @@
           <w:rFonts w:ascii="Courier New" w:hAnsi="Courier New" w:cs="Courier New"/>
           <w:lang w:val="hu-HU"/>
         </w:rPr>
-        <w:t xml:space="preserve"> | /api/</w:t>
-      </w:r>
-      <w:r>
-        <w:rPr>
-          <w:rFonts w:ascii="Courier New" w:hAnsi="Courier New" w:cs="Courier New"/>
-          <w:lang w:val="hu-HU"/>
-        </w:rPr>
-        <w:t>users/2</w:t>
+        <w:t xml:space="preserve"> | /</w:t>
+      </w:r>
+      <w:proofErr w:type="spellStart"/>
+      <w:r>
+        <w:rPr>
+          <w:rFonts w:ascii="Courier New" w:hAnsi="Courier New" w:cs="Courier New"/>
+          <w:lang w:val="hu-HU"/>
+        </w:rPr>
+        <w:t>api</w:t>
+      </w:r>
+      <w:proofErr w:type="spellEnd"/>
+      <w:r>
+        <w:rPr>
+          <w:rFonts w:ascii="Courier New" w:hAnsi="Courier New" w:cs="Courier New"/>
+          <w:lang w:val="hu-HU"/>
+        </w:rPr>
+        <w:t>/</w:t>
+      </w:r>
+      <w:proofErr w:type="spellStart"/>
+      <w:r>
+        <w:rPr>
+          <w:rFonts w:ascii="Courier New" w:hAnsi="Courier New" w:cs="Courier New"/>
+          <w:lang w:val="hu-HU"/>
+        </w:rPr>
+        <w:t>users</w:t>
+      </w:r>
+      <w:proofErr w:type="spellEnd"/>
+      <w:r>
+        <w:rPr>
+          <w:rFonts w:ascii="Courier New" w:hAnsi="Courier New" w:cs="Courier New"/>
+          <w:lang w:val="hu-HU"/>
+        </w:rPr>
+        <w:t>/2</w:t>
       </w:r>
       <w:r>
         <w:rPr>
@@ -2191,60 +2751,572 @@
         <w:rPr>
           <w:lang w:val="hu-HU"/>
         </w:rPr>
+        <w:t xml:space="preserve">  "</w:t>
+      </w:r>
+      <w:proofErr w:type="spellStart"/>
+      <w:r>
+        <w:rPr>
+          <w:lang w:val="hu-HU"/>
+        </w:rPr>
+        <w:t>name</w:t>
+      </w:r>
+      <w:proofErr w:type="spellEnd"/>
+      <w:r>
+        <w:rPr>
+          <w:lang w:val="hu-HU"/>
+        </w:rPr>
+        <w:t>": "</w:t>
+      </w:r>
+      <w:proofErr w:type="spellStart"/>
+      <w:r>
+        <w:rPr>
+          <w:lang w:val="hu-HU"/>
+        </w:rPr>
+        <w:t>string</w:t>
+      </w:r>
+      <w:proofErr w:type="spellEnd"/>
+      <w:r>
+        <w:rPr>
+          <w:lang w:val="hu-HU"/>
+        </w:rPr>
+        <w:t>",</w:t>
+      </w:r>
+    </w:p>
+    <w:p>
+      <w:pPr>
+        <w:pStyle w:val="Kdblokk"/>
+        <w:rPr>
+          <w:lang w:val="hu-HU"/>
+        </w:rPr>
+      </w:pPr>
+      <w:r>
+        <w:rPr>
+          <w:lang w:val="hu-HU"/>
+        </w:rPr>
+        <w:t xml:space="preserve">  "email": "user@example.com",</w:t>
+      </w:r>
+    </w:p>
+    <w:p>
+      <w:pPr>
+        <w:pStyle w:val="Kdblokk"/>
+        <w:rPr>
+          <w:lang w:val="hu-HU"/>
+        </w:rPr>
+      </w:pPr>
+      <w:r>
+        <w:rPr>
+          <w:lang w:val="hu-HU"/>
+        </w:rPr>
+        <w:t xml:space="preserve">  "</w:t>
+      </w:r>
+      <w:proofErr w:type="spellStart"/>
+      <w:r>
+        <w:rPr>
+          <w:lang w:val="hu-HU"/>
+        </w:rPr>
+        <w:t>bio</w:t>
+      </w:r>
+      <w:proofErr w:type="spellEnd"/>
+      <w:r>
+        <w:rPr>
+          <w:lang w:val="hu-HU"/>
+        </w:rPr>
+        <w:t>": "</w:t>
+      </w:r>
+      <w:proofErr w:type="spellStart"/>
+      <w:r>
+        <w:rPr>
+          <w:lang w:val="hu-HU"/>
+        </w:rPr>
+        <w:t>string</w:t>
+      </w:r>
+      <w:proofErr w:type="spellEnd"/>
+      <w:r>
+        <w:rPr>
+          <w:lang w:val="hu-HU"/>
+        </w:rPr>
+        <w:t>"</w:t>
+      </w:r>
+    </w:p>
+    <w:p>
+      <w:pPr>
+        <w:pStyle w:val="Kdblokk"/>
+        <w:rPr>
+          <w:lang w:val="hu-HU"/>
+        </w:rPr>
+      </w:pPr>
+      <w:r>
+        <w:rPr>
+          <w:lang w:val="hu-HU"/>
+        </w:rPr>
+        <w:t>}</w:t>
+      </w:r>
+    </w:p>
+    <w:p>
+      <w:pPr>
+        <w:jc w:val="left"/>
+        <w:rPr>
+          <w:b/>
+          <w:bCs/>
+          <w:lang w:val="hu-HU"/>
+        </w:rPr>
+      </w:pPr>
+      <w:r>
+        <w:rPr>
+          <w:b/>
+          <w:bCs/>
+          <w:lang w:val="hu-HU"/>
+        </w:rPr>
+        <w:t>Korlátozás:</w:t>
+      </w:r>
+      <w:r>
+        <w:rPr>
+          <w:b/>
+          <w:bCs/>
+          <w:lang w:val="hu-HU"/>
+        </w:rPr>
+        <w:t xml:space="preserve"> </w:t>
+      </w:r>
+      <w:r>
+        <w:rPr>
+          <w:lang w:val="hu-HU"/>
+        </w:rPr>
+        <w:t xml:space="preserve">Bejelentkezett felhasználóknak elérhető </w:t>
+      </w:r>
+      <w:r>
+        <w:rPr>
+          <w:lang w:val="hu-HU"/>
+        </w:rPr>
+        <w:br/>
+      </w:r>
+      <w:r>
+        <w:rPr>
+          <w:b/>
+          <w:bCs/>
+          <w:lang w:val="hu-HU"/>
+        </w:rPr>
+        <w:t>Példa válasz:</w:t>
+      </w:r>
+      <w:r>
+        <w:rPr>
+          <w:b/>
+          <w:bCs/>
+          <w:lang w:val="hu-HU"/>
+        </w:rPr>
+        <w:t xml:space="preserve"> </w:t>
+      </w:r>
+      <w:r>
+        <w:rPr>
+          <w:lang w:val="hu-HU"/>
+        </w:rPr>
+        <w:t>(200 OK)</w:t>
+      </w:r>
+    </w:p>
+    <w:p>
+      <w:pPr>
+        <w:pStyle w:val="Kdblokk"/>
+      </w:pPr>
+      <w:r>
+        <w:t>{</w:t>
+      </w:r>
+    </w:p>
+    <w:p>
+      <w:pPr>
+        <w:pStyle w:val="Kdblokk"/>
+      </w:pPr>
+      <w:r>
+        <w:t xml:space="preserve">  "id": </w:t>
+      </w:r>
+      <w:r>
+        <w:t>1</w:t>
+      </w:r>
+      <w:r>
+        <w:t>,</w:t>
+      </w:r>
+    </w:p>
+    <w:p>
+      <w:pPr>
+        <w:pStyle w:val="Kdblokk"/>
+      </w:pPr>
+      <w:r>
         <w:t xml:space="preserve">  "name": "string",</w:t>
       </w:r>
     </w:p>
     <w:p>
       <w:pPr>
         <w:pStyle w:val="Kdblokk"/>
-        <w:rPr>
-          <w:lang w:val="hu-HU"/>
-        </w:rPr>
-      </w:pPr>
-      <w:r>
-        <w:rPr>
-          <w:lang w:val="hu-HU"/>
-        </w:rPr>
-        <w:t xml:space="preserve">  "email": "user@example.com",</w:t>
-      </w:r>
-    </w:p>
-    <w:p>
-      <w:pPr>
-        <w:pStyle w:val="Kdblokk"/>
-        <w:rPr>
-          <w:lang w:val="hu-HU"/>
-        </w:rPr>
-      </w:pPr>
-      <w:r>
-        <w:rPr>
-          <w:lang w:val="hu-HU"/>
-        </w:rPr>
+      </w:pPr>
+      <w:r>
+        <w:t xml:space="preserve">  "email": "string",</w:t>
+      </w:r>
+    </w:p>
+    <w:p>
+      <w:pPr>
+        <w:pStyle w:val="Kdblokk"/>
+      </w:pPr>
+      <w:r>
+        <w:t xml:space="preserve">  "</w:t>
+      </w:r>
+      <w:proofErr w:type="spellStart"/>
+      <w:r>
+        <w:t>image_url</w:t>
+      </w:r>
+      <w:proofErr w:type="spellEnd"/>
+      <w:r>
+        <w:t>": "string",</w:t>
+      </w:r>
+    </w:p>
+    <w:p>
+      <w:pPr>
+        <w:pStyle w:val="Kdblokk"/>
+      </w:pPr>
+      <w:r>
         <w:t xml:space="preserve">  "bio": "string"</w:t>
       </w:r>
-    </w:p>
-    <w:p>
-      <w:pPr>
-        <w:pStyle w:val="Kdblokk"/>
-        <w:rPr>
-          <w:lang w:val="hu-HU"/>
-        </w:rPr>
-      </w:pPr>
-      <w:r>
-        <w:rPr>
-          <w:lang w:val="hu-HU"/>
-        </w:rPr>
+      <w:r>
+        <w:t>,</w:t>
+      </w:r>
+    </w:p>
+    <w:p>
+      <w:pPr>
+        <w:pStyle w:val="Kdblokk"/>
+      </w:pPr>
+      <w:r>
+        <w:t xml:space="preserve">  </w:t>
+      </w:r>
+      <w:r>
+        <w:t>"</w:t>
+      </w:r>
+      <w:proofErr w:type="spellStart"/>
+      <w:r>
+        <w:t>post_karma</w:t>
+      </w:r>
+      <w:proofErr w:type="spellEnd"/>
+      <w:r>
+        <w:t>": 0</w:t>
+      </w:r>
+    </w:p>
+    <w:p>
+      <w:pPr>
+        <w:pStyle w:val="Kdblokk"/>
+      </w:pPr>
+      <w:r>
         <w:t>}</w:t>
       </w:r>
     </w:p>
     <w:p>
       <w:pPr>
+        <w:pStyle w:val="Alcm"/>
+        <w:rPr>
+          <w:lang w:val="hu-HU"/>
+        </w:rPr>
+      </w:pPr>
+      <w:r>
+        <w:rPr>
+          <w:lang w:val="hu-HU"/>
+        </w:rPr>
+        <w:t>1.2.</w:t>
+      </w:r>
+      <w:r>
+        <w:rPr>
+          <w:lang w:val="hu-HU"/>
+        </w:rPr>
+        <w:t>2Thread</w:t>
+      </w:r>
+      <w:r>
+        <w:rPr>
+          <w:lang w:val="hu-HU"/>
+        </w:rPr>
+        <w:t xml:space="preserve"> kontroller</w:t>
+      </w:r>
+    </w:p>
+    <w:p>
+      <w:pPr>
+        <w:rPr>
+          <w:b/>
+          <w:bCs/>
+          <w:lang w:val="hu-HU"/>
+        </w:rPr>
+      </w:pPr>
+      <w:r>
+        <w:rPr>
+          <w:b/>
+          <w:bCs/>
+          <w:lang w:val="hu-HU"/>
+        </w:rPr>
+        <w:t>GET</w:t>
+      </w:r>
+      <w:r>
+        <w:rPr>
+          <w:b/>
+          <w:bCs/>
+          <w:lang w:val="hu-HU"/>
+        </w:rPr>
+        <w:t xml:space="preserve"> </w:t>
+      </w:r>
+      <w:proofErr w:type="spellStart"/>
+      <w:r>
+        <w:rPr>
+          <w:lang w:val="hu-HU"/>
+        </w:rPr>
+        <w:t>Th</w:t>
+      </w:r>
+      <w:r>
+        <w:rPr>
+          <w:lang w:val="hu-HU"/>
+        </w:rPr>
+        <w:t>reads</w:t>
+      </w:r>
+      <w:proofErr w:type="spellEnd"/>
+      <w:r>
+        <w:rPr>
+          <w:lang w:val="hu-HU"/>
+        </w:rPr>
+        <w:t xml:space="preserve"> (</w:t>
+      </w:r>
+      <w:proofErr w:type="spellStart"/>
+      <w:r>
+        <w:rPr>
+          <w:lang w:val="hu-HU"/>
+        </w:rPr>
+        <w:t>All</w:t>
+      </w:r>
+      <w:proofErr w:type="spellEnd"/>
+      <w:r>
+        <w:rPr>
+          <w:lang w:val="hu-HU"/>
+        </w:rPr>
+        <w:t>)</w:t>
+      </w:r>
+    </w:p>
+    <w:p>
+      <w:pPr>
+        <w:rPr>
+          <w:lang w:val="hu-HU"/>
+        </w:rPr>
+      </w:pPr>
+      <w:r>
+        <w:rPr>
+          <w:noProof/>
+          <w:lang w:val="hu-HU"/>
+        </w:rPr>
+        <w:lastRenderedPageBreak/>
+        <w:drawing>
+          <wp:inline distT="0" distB="0" distL="0" distR="0" wp14:anchorId="27043539" wp14:editId="4C003433">
+            <wp:extent cx="5715798" cy="371527"/>
+            <wp:effectExtent l="0" t="0" r="0" b="9525"/>
+            <wp:docPr id="1106090357" name="Kép 1"/>
+            <wp:cNvGraphicFramePr>
+              <a:graphicFrameLocks xmlns:a="http://schemas.openxmlformats.org/drawingml/2006/main" noChangeAspect="1"/>
+            </wp:cNvGraphicFramePr>
+            <a:graphic xmlns:a="http://schemas.openxmlformats.org/drawingml/2006/main">
+              <a:graphicData uri="http://schemas.openxmlformats.org/drawingml/2006/picture">
+                <pic:pic xmlns:pic="http://schemas.openxmlformats.org/drawingml/2006/picture">
+                  <pic:nvPicPr>
+                    <pic:cNvPr id="1106090357" name="Kép 1106090357"/>
+                    <pic:cNvPicPr/>
+                  </pic:nvPicPr>
+                  <pic:blipFill>
+                    <a:blip r:embed="rId16">
+                      <a:extLst>
+                        <a:ext uri="{28A0092B-C50C-407E-A947-70E740481C1C}">
+                          <a14:useLocalDpi xmlns:a14="http://schemas.microsoft.com/office/drawing/2010/main" val="0"/>
+                        </a:ext>
+                      </a:extLst>
+                    </a:blip>
+                    <a:stretch>
+                      <a:fillRect/>
+                    </a:stretch>
+                  </pic:blipFill>
+                  <pic:spPr>
+                    <a:xfrm>
+                      <a:off x="0" y="0"/>
+                      <a:ext cx="5715798" cy="371527"/>
+                    </a:xfrm>
+                    <a:prstGeom prst="rect">
+                      <a:avLst/>
+                    </a:prstGeom>
+                  </pic:spPr>
+                </pic:pic>
+              </a:graphicData>
+            </a:graphic>
+          </wp:inline>
+        </w:drawing>
+      </w:r>
+    </w:p>
+    <w:p>
+      <w:pPr>
         <w:jc w:val="left"/>
         <w:rPr>
-          <w:b/>
-          <w:bCs/>
-          <w:lang w:val="hu-HU"/>
-        </w:rPr>
-      </w:pPr>
+          <w:lang w:val="hu-HU"/>
+        </w:rPr>
+      </w:pPr>
+      <w:r>
+        <w:rPr>
+          <w:b/>
+          <w:bCs/>
+          <w:lang w:val="hu-HU"/>
+        </w:rPr>
+        <w:t>Példa kérés:</w:t>
+      </w:r>
+      <w:r>
+        <w:rPr>
+          <w:lang w:val="hu-HU"/>
+        </w:rPr>
+        <w:t xml:space="preserve"> </w:t>
+      </w:r>
+      <w:r>
+        <w:rPr>
+          <w:rFonts w:ascii="Courier New" w:hAnsi="Courier New" w:cs="Courier New"/>
+          <w:lang w:val="hu-HU"/>
+        </w:rPr>
+        <w:t>GET | /</w:t>
+      </w:r>
+      <w:proofErr w:type="spellStart"/>
+      <w:r>
+        <w:rPr>
+          <w:rFonts w:ascii="Courier New" w:hAnsi="Courier New" w:cs="Courier New"/>
+          <w:lang w:val="hu-HU"/>
+        </w:rPr>
+        <w:t>api</w:t>
+      </w:r>
+      <w:proofErr w:type="spellEnd"/>
+      <w:r>
+        <w:rPr>
+          <w:rFonts w:ascii="Courier New" w:hAnsi="Courier New" w:cs="Courier New"/>
+          <w:lang w:val="hu-HU"/>
+        </w:rPr>
+        <w:t>/</w:t>
+      </w:r>
+      <w:proofErr w:type="spellStart"/>
+      <w:r>
+        <w:rPr>
+          <w:rFonts w:ascii="Courier New" w:hAnsi="Courier New" w:cs="Courier New"/>
+          <w:lang w:val="hu-HU"/>
+        </w:rPr>
+        <w:t>threads</w:t>
+      </w:r>
+      <w:proofErr w:type="spellEnd"/>
+      <w:r>
+        <w:rPr>
+          <w:lang w:val="hu-HU"/>
+        </w:rPr>
+        <w:br/>
+      </w:r>
+      <w:r>
+        <w:rPr>
+          <w:b/>
+          <w:bCs/>
+          <w:lang w:val="hu-HU"/>
+        </w:rPr>
+        <w:t>Body:</w:t>
+      </w:r>
+      <w:r>
+        <w:rPr>
+          <w:b/>
+          <w:bCs/>
+          <w:lang w:val="hu-HU"/>
+        </w:rPr>
+        <w:t xml:space="preserve"> </w:t>
+      </w:r>
+      <w:r>
+        <w:rPr>
+          <w:lang w:val="hu-HU"/>
+        </w:rPr>
+        <w:t>-</w:t>
+      </w:r>
+      <w:r>
+        <w:rPr>
+          <w:lang w:val="hu-HU"/>
+        </w:rPr>
+        <w:br/>
+      </w:r>
+      <w:r>
+        <w:rPr>
+          <w:b/>
+          <w:bCs/>
+          <w:lang w:val="hu-HU"/>
+        </w:rPr>
+        <w:t>Támogatott paraméterek:</w:t>
+      </w:r>
+      <w:r>
+        <w:rPr>
+          <w:b/>
+          <w:bCs/>
+          <w:lang w:val="hu-HU"/>
+        </w:rPr>
+        <w:t xml:space="preserve"> </w:t>
+      </w:r>
+      <w:r>
+        <w:rPr>
+          <w:rFonts w:ascii="Courier New" w:hAnsi="Courier New" w:cs="Courier New"/>
+          <w:b/>
+          <w:bCs/>
+          <w:lang w:val="hu-HU"/>
+        </w:rPr>
+        <w:t>?</w:t>
+      </w:r>
+      <w:proofErr w:type="spellStart"/>
+      <w:r>
+        <w:rPr>
+          <w:rFonts w:ascii="Courier New" w:hAnsi="Courier New" w:cs="Courier New"/>
+          <w:b/>
+          <w:bCs/>
+          <w:lang w:val="hu-HU"/>
+        </w:rPr>
+        <w:t>search</w:t>
+      </w:r>
+      <w:proofErr w:type="spellEnd"/>
+      <w:r>
+        <w:rPr>
+          <w:rFonts w:ascii="Courier New" w:hAnsi="Courier New" w:cs="Courier New"/>
+          <w:b/>
+          <w:bCs/>
+          <w:lang w:val="hu-HU"/>
+        </w:rPr>
+        <w:t>=</w:t>
+      </w:r>
+      <w:r>
+        <w:rPr>
+          <w:rFonts w:ascii="Courier New" w:hAnsi="Courier New" w:cs="Courier New"/>
+          <w:b/>
+          <w:bCs/>
+          <w:lang w:val="hu-HU"/>
+        </w:rPr>
+        <w:br/>
+      </w:r>
+      <w:r>
+        <w:rPr>
+          <w:lang w:val="hu-HU"/>
+        </w:rPr>
+        <w:t>Támogatja a szűrést a</w:t>
+      </w:r>
+      <w:r>
+        <w:rPr>
+          <w:lang w:val="hu-HU"/>
+        </w:rPr>
+        <w:t xml:space="preserve"> </w:t>
+      </w:r>
+      <w:proofErr w:type="spellStart"/>
+      <w:r>
+        <w:rPr>
+          <w:lang w:val="hu-HU"/>
+        </w:rPr>
+        <w:t>Thread</w:t>
+      </w:r>
+      <w:proofErr w:type="spellEnd"/>
+      <w:r>
+        <w:rPr>
+          <w:lang w:val="hu-HU"/>
+        </w:rPr>
+        <w:t xml:space="preserve"> neve alapján</w:t>
+      </w:r>
+      <w:r>
+        <w:rPr>
+          <w:lang w:val="hu-HU"/>
+        </w:rPr>
+        <w:br/>
+      </w:r>
       <w:r>
         <w:rPr>
           <w:b/>
@@ -2255,17 +3327,9 @@
       </w:r>
       <w:r>
         <w:rPr>
-          <w:b/>
-          <w:bCs/>
-          <w:lang w:val="hu-HU"/>
-        </w:rPr>
-        <w:t xml:space="preserve"> </w:t>
-      </w:r>
-      <w:r>
-        <w:rPr>
-          <w:lang w:val="hu-HU"/>
-        </w:rPr>
-        <w:t xml:space="preserve">Bejelentkezett felhasználóknak elérhető </w:t>
+          <w:lang w:val="hu-HU"/>
+        </w:rPr>
+        <w:t xml:space="preserve"> Minden felhasználónak elérhető </w:t>
       </w:r>
       <w:r>
         <w:rPr>
@@ -2301,6 +3365,441 @@
         <w:pStyle w:val="Kdblokk"/>
       </w:pPr>
       <w:r>
+        <w:t>[</w:t>
+      </w:r>
+    </w:p>
+    <w:p>
+      <w:pPr>
+        <w:pStyle w:val="Kdblokk"/>
+      </w:pPr>
+      <w:r>
+        <w:t xml:space="preserve">  </w:t>
+      </w:r>
+      <w:r>
+        <w:t>…</w:t>
+      </w:r>
+    </w:p>
+    <w:p>
+      <w:pPr>
+        <w:pStyle w:val="Kdblokk"/>
+      </w:pPr>
+      <w:r>
+        <w:t xml:space="preserve">  {</w:t>
+      </w:r>
+    </w:p>
+    <w:p>
+      <w:pPr>
+        <w:pStyle w:val="Kdblokk"/>
+      </w:pPr>
+      <w:r>
+        <w:t xml:space="preserve">    </w:t>
+      </w:r>
+      <w:r>
+        <w:t>"id": 1,</w:t>
+      </w:r>
+    </w:p>
+    <w:p>
+      <w:pPr>
+        <w:pStyle w:val="Kdblokk"/>
+      </w:pPr>
+      <w:r>
+        <w:t xml:space="preserve">    "name": "</w:t>
+      </w:r>
+      <w:proofErr w:type="spellStart"/>
+      <w:r>
+        <w:t>kozosseg</w:t>
+      </w:r>
+      <w:proofErr w:type="spellEnd"/>
+      <w:r>
+        <w:t xml:space="preserve"> 1",</w:t>
+      </w:r>
+    </w:p>
+    <w:p>
+      <w:pPr>
+        <w:pStyle w:val="Kdblokk"/>
+      </w:pPr>
+      <w:r>
+        <w:t xml:space="preserve">    "description": "</w:t>
+      </w:r>
+      <w:proofErr w:type="spellStart"/>
+      <w:r>
+        <w:t>leirasa</w:t>
+      </w:r>
+      <w:proofErr w:type="spellEnd"/>
+      <w:r>
+        <w:t xml:space="preserve"> a </w:t>
+      </w:r>
+      <w:proofErr w:type="spellStart"/>
+      <w:r>
+        <w:t>kozossegemnek</w:t>
+      </w:r>
+      <w:proofErr w:type="spellEnd"/>
+      <w:r>
+        <w:t>",</w:t>
+      </w:r>
+    </w:p>
+    <w:p>
+      <w:pPr>
+        <w:pStyle w:val="Kdblokk"/>
+      </w:pPr>
+      <w:r>
+        <w:t xml:space="preserve">    "rules": "fishermen overlap items he</w:t>
+      </w:r>
+      <w:r>
+        <w:t xml:space="preserve"> …</w:t>
+      </w:r>
+      <w:r>
+        <w:t xml:space="preserve"> ",</w:t>
+      </w:r>
+    </w:p>
+    <w:p>
+      <w:pPr>
+        <w:pStyle w:val="Kdblokk"/>
+      </w:pPr>
+      <w:r>
+        <w:t xml:space="preserve">    "</w:t>
+      </w:r>
+      <w:proofErr w:type="spellStart"/>
+      <w:r>
+        <w:t>users_count</w:t>
+      </w:r>
+      <w:proofErr w:type="spellEnd"/>
+      <w:r>
+        <w:t>": 1,</w:t>
+      </w:r>
+    </w:p>
+    <w:p>
+      <w:pPr>
+        <w:pStyle w:val="Kdblokk"/>
+      </w:pPr>
+      <w:r>
+        <w:t xml:space="preserve">    "image": null,</w:t>
+      </w:r>
+    </w:p>
+    <w:p>
+      <w:pPr>
+        <w:pStyle w:val="Kdblokk"/>
+      </w:pPr>
+      <w:r>
+        <w:t xml:space="preserve">    "header": null</w:t>
+      </w:r>
+    </w:p>
+    <w:p>
+      <w:pPr>
+        <w:pStyle w:val="Kdblokk"/>
+      </w:pPr>
+    </w:p>
+    <w:p>
+      <w:pPr>
+        <w:pStyle w:val="Kdblokk"/>
+      </w:pPr>
+      <w:r>
+        <w:t xml:space="preserve">  },</w:t>
+      </w:r>
+      <w:r>
+        <w:br/>
+        <w:t xml:space="preserve">  …</w:t>
+      </w:r>
+      <w:r>
+        <w:br/>
+      </w:r>
+      <w:r>
+        <w:rPr>
+          <w:lang w:val="hu-HU"/>
+        </w:rPr>
+        <w:t>]</w:t>
+      </w:r>
+    </w:p>
+    <w:p>
+      <w:pPr>
+        <w:rPr>
+          <w:b/>
+          <w:bCs/>
+          <w:lang w:val="hu-HU"/>
+        </w:rPr>
+      </w:pPr>
+      <w:r>
+        <w:rPr>
+          <w:b/>
+          <w:bCs/>
+          <w:lang w:val="hu-HU"/>
+        </w:rPr>
+        <w:t>GET</w:t>
+      </w:r>
+      <w:r>
+        <w:rPr>
+          <w:b/>
+          <w:bCs/>
+          <w:lang w:val="hu-HU"/>
+        </w:rPr>
+        <w:t xml:space="preserve"> </w:t>
+      </w:r>
+      <w:proofErr w:type="spellStart"/>
+      <w:r>
+        <w:rPr>
+          <w:lang w:val="hu-HU"/>
+        </w:rPr>
+        <w:t>Th</w:t>
+      </w:r>
+      <w:r>
+        <w:rPr>
+          <w:lang w:val="hu-HU"/>
+        </w:rPr>
+        <w:t>reads</w:t>
+      </w:r>
+      <w:proofErr w:type="spellEnd"/>
+      <w:r>
+        <w:rPr>
+          <w:lang w:val="hu-HU"/>
+        </w:rPr>
+        <w:t xml:space="preserve"> (</w:t>
+      </w:r>
+      <w:proofErr w:type="spellStart"/>
+      <w:r>
+        <w:rPr>
+          <w:lang w:val="hu-HU"/>
+        </w:rPr>
+        <w:t>SIngle</w:t>
+      </w:r>
+      <w:proofErr w:type="spellEnd"/>
+      <w:r>
+        <w:rPr>
+          <w:lang w:val="hu-HU"/>
+        </w:rPr>
+        <w:t>)</w:t>
+      </w:r>
+    </w:p>
+    <w:p>
+      <w:pPr>
+        <w:rPr>
+          <w:lang w:val="hu-HU"/>
+        </w:rPr>
+      </w:pPr>
+      <w:r>
+        <w:rPr>
+          <w:noProof/>
+          <w:lang w:val="hu-HU"/>
+        </w:rPr>
+        <w:drawing>
+          <wp:inline distT="0" distB="0" distL="0" distR="0" wp14:anchorId="59281AAA" wp14:editId="7A4FBADF">
+            <wp:extent cx="5971540" cy="324485"/>
+            <wp:effectExtent l="0" t="0" r="0" b="0"/>
+            <wp:docPr id="266175522" name="Kép 2"/>
+            <wp:cNvGraphicFramePr>
+              <a:graphicFrameLocks xmlns:a="http://schemas.openxmlformats.org/drawingml/2006/main" noChangeAspect="1"/>
+            </wp:cNvGraphicFramePr>
+            <a:graphic xmlns:a="http://schemas.openxmlformats.org/drawingml/2006/main">
+              <a:graphicData uri="http://schemas.openxmlformats.org/drawingml/2006/picture">
+                <pic:pic xmlns:pic="http://schemas.openxmlformats.org/drawingml/2006/picture">
+                  <pic:nvPicPr>
+                    <pic:cNvPr id="266175522" name="Kép 266175522"/>
+                    <pic:cNvPicPr/>
+                  </pic:nvPicPr>
+                  <pic:blipFill>
+                    <a:blip r:embed="rId17">
+                      <a:extLst>
+                        <a:ext uri="{28A0092B-C50C-407E-A947-70E740481C1C}">
+                          <a14:useLocalDpi xmlns:a14="http://schemas.microsoft.com/office/drawing/2010/main" val="0"/>
+                        </a:ext>
+                      </a:extLst>
+                    </a:blip>
+                    <a:stretch>
+                      <a:fillRect/>
+                    </a:stretch>
+                  </pic:blipFill>
+                  <pic:spPr>
+                    <a:xfrm>
+                      <a:off x="0" y="0"/>
+                      <a:ext cx="5971540" cy="324485"/>
+                    </a:xfrm>
+                    <a:prstGeom prst="rect">
+                      <a:avLst/>
+                    </a:prstGeom>
+                  </pic:spPr>
+                </pic:pic>
+              </a:graphicData>
+            </a:graphic>
+          </wp:inline>
+        </w:drawing>
+      </w:r>
+    </w:p>
+    <w:p>
+      <w:pPr>
+        <w:jc w:val="left"/>
+        <w:rPr>
+          <w:lang w:val="hu-HU"/>
+        </w:rPr>
+      </w:pPr>
+      <w:r>
+        <w:rPr>
+          <w:b/>
+          <w:bCs/>
+          <w:lang w:val="hu-HU"/>
+        </w:rPr>
+        <w:t>Példa kérés:</w:t>
+      </w:r>
+      <w:r>
+        <w:rPr>
+          <w:lang w:val="hu-HU"/>
+        </w:rPr>
+        <w:t xml:space="preserve"> </w:t>
+      </w:r>
+      <w:r>
+        <w:rPr>
+          <w:rFonts w:ascii="Courier New" w:hAnsi="Courier New" w:cs="Courier New"/>
+          <w:lang w:val="hu-HU"/>
+        </w:rPr>
+        <w:t>GET | /</w:t>
+      </w:r>
+      <w:proofErr w:type="spellStart"/>
+      <w:r>
+        <w:rPr>
+          <w:rFonts w:ascii="Courier New" w:hAnsi="Courier New" w:cs="Courier New"/>
+          <w:lang w:val="hu-HU"/>
+        </w:rPr>
+        <w:t>api</w:t>
+      </w:r>
+      <w:proofErr w:type="spellEnd"/>
+      <w:r>
+        <w:rPr>
+          <w:rFonts w:ascii="Courier New" w:hAnsi="Courier New" w:cs="Courier New"/>
+          <w:lang w:val="hu-HU"/>
+        </w:rPr>
+        <w:t>/</w:t>
+      </w:r>
+      <w:proofErr w:type="spellStart"/>
+      <w:r>
+        <w:rPr>
+          <w:rFonts w:ascii="Courier New" w:hAnsi="Courier New" w:cs="Courier New"/>
+          <w:lang w:val="hu-HU"/>
+        </w:rPr>
+        <w:t>threads</w:t>
+      </w:r>
+      <w:proofErr w:type="spellEnd"/>
+      <w:r>
+        <w:rPr>
+          <w:rFonts w:ascii="Courier New" w:hAnsi="Courier New" w:cs="Courier New"/>
+          <w:lang w:val="hu-HU"/>
+        </w:rPr>
+        <w:t>/1</w:t>
+      </w:r>
+      <w:r>
+        <w:rPr>
+          <w:lang w:val="hu-HU"/>
+        </w:rPr>
+        <w:br/>
+      </w:r>
+      <w:r>
+        <w:rPr>
+          <w:b/>
+          <w:bCs/>
+          <w:lang w:val="hu-HU"/>
+        </w:rPr>
+        <w:t>Body:</w:t>
+      </w:r>
+      <w:r>
+        <w:rPr>
+          <w:b/>
+          <w:bCs/>
+          <w:lang w:val="hu-HU"/>
+        </w:rPr>
+        <w:t xml:space="preserve"> </w:t>
+      </w:r>
+      <w:r>
+        <w:rPr>
+          <w:lang w:val="hu-HU"/>
+        </w:rPr>
+        <w:t>-</w:t>
+      </w:r>
+      <w:r>
+        <w:rPr>
+          <w:lang w:val="hu-HU"/>
+        </w:rPr>
+        <w:br/>
+      </w:r>
+      <w:r>
+        <w:rPr>
+          <w:b/>
+          <w:bCs/>
+          <w:lang w:val="hu-HU"/>
+        </w:rPr>
+        <w:t>Korlátozás:</w:t>
+      </w:r>
+      <w:r>
+        <w:rPr>
+          <w:lang w:val="hu-HU"/>
+        </w:rPr>
+        <w:t xml:space="preserve"> </w:t>
+      </w:r>
+      <w:r>
+        <w:rPr>
+          <w:lang w:val="hu-HU"/>
+        </w:rPr>
+        <w:t>Bejelentkezett felhasználóknak elérhető. Kivéve akiknek „</w:t>
+      </w:r>
+      <w:proofErr w:type="spellStart"/>
+      <w:r>
+        <w:rPr>
+          <w:lang w:val="hu-HU"/>
+        </w:rPr>
+        <w:t>banned</w:t>
+      </w:r>
+      <w:proofErr w:type="spellEnd"/>
+      <w:r>
+        <w:rPr>
+          <w:lang w:val="hu-HU"/>
+        </w:rPr>
+        <w:t xml:space="preserve">”-rangja van az adott </w:t>
+      </w:r>
+      <w:proofErr w:type="spellStart"/>
+      <w:r>
+        <w:rPr>
+          <w:lang w:val="hu-HU"/>
+        </w:rPr>
+        <w:t>thread</w:t>
+      </w:r>
+      <w:proofErr w:type="spellEnd"/>
+      <w:r>
+        <w:rPr>
+          <w:lang w:val="hu-HU"/>
+        </w:rPr>
+        <w:t>-ben</w:t>
+      </w:r>
+      <w:r>
+        <w:rPr>
+          <w:lang w:val="hu-HU"/>
+        </w:rPr>
+        <w:br/>
+      </w:r>
+      <w:r>
+        <w:rPr>
+          <w:b/>
+          <w:bCs/>
+          <w:lang w:val="hu-HU"/>
+        </w:rPr>
+        <w:t>Példa válasz:</w:t>
+      </w:r>
+      <w:r>
+        <w:rPr>
+          <w:b/>
+          <w:bCs/>
+          <w:lang w:val="hu-HU"/>
+        </w:rPr>
+        <w:t xml:space="preserve"> </w:t>
+      </w:r>
+      <w:r>
+        <w:rPr>
+          <w:lang w:val="hu-HU"/>
+        </w:rPr>
+        <w:t>(200 OK)</w:t>
+      </w:r>
+    </w:p>
+    <w:p>
+      <w:pPr>
+        <w:pStyle w:val="Kdblokk"/>
+      </w:pPr>
+      <w:r>
+        <w:lastRenderedPageBreak/>
         <w:t>{</w:t>
       </w:r>
     </w:p>
@@ -2309,6 +3808,2571 @@
         <w:pStyle w:val="Kdblokk"/>
       </w:pPr>
       <w:r>
+        <w:t xml:space="preserve">  "id": 1,</w:t>
+      </w:r>
+    </w:p>
+    <w:p>
+      <w:pPr>
+        <w:pStyle w:val="Kdblokk"/>
+      </w:pPr>
+      <w:r>
+        <w:t xml:space="preserve">  "name": "</w:t>
+      </w:r>
+      <w:proofErr w:type="spellStart"/>
+      <w:r>
+        <w:t>kozosseg</w:t>
+      </w:r>
+      <w:proofErr w:type="spellEnd"/>
+      <w:r>
+        <w:t xml:space="preserve"> 1",</w:t>
+      </w:r>
+    </w:p>
+    <w:p>
+      <w:pPr>
+        <w:pStyle w:val="Kdblokk"/>
+      </w:pPr>
+      <w:r>
+        <w:t xml:space="preserve">  "description": "</w:t>
+      </w:r>
+      <w:proofErr w:type="spellStart"/>
+      <w:r>
+        <w:t>leirasa</w:t>
+      </w:r>
+      <w:proofErr w:type="spellEnd"/>
+      <w:r>
+        <w:t xml:space="preserve"> a </w:t>
+      </w:r>
+      <w:proofErr w:type="spellStart"/>
+      <w:r>
+        <w:t>kozossegemnek</w:t>
+      </w:r>
+      <w:proofErr w:type="spellEnd"/>
+      <w:r>
+        <w:t>",</w:t>
+      </w:r>
+    </w:p>
+    <w:p>
+      <w:pPr>
+        <w:pStyle w:val="Kdblokk"/>
+      </w:pPr>
+      <w:r>
+        <w:t xml:space="preserve">  "rules": "fishermen overlap items he</w:t>
+      </w:r>
+      <w:r>
+        <w:t xml:space="preserve"> …</w:t>
+      </w:r>
+      <w:r>
+        <w:t xml:space="preserve"> </w:t>
+      </w:r>
+      <w:r>
+        <w:t>",</w:t>
+      </w:r>
+    </w:p>
+    <w:p>
+      <w:pPr>
+        <w:pStyle w:val="Kdblokk"/>
+      </w:pPr>
+      <w:r>
+        <w:t xml:space="preserve">  "</w:t>
+      </w:r>
+      <w:proofErr w:type="spellStart"/>
+      <w:r>
+        <w:t>users_count</w:t>
+      </w:r>
+      <w:proofErr w:type="spellEnd"/>
+      <w:r>
+        <w:t>": 1,</w:t>
+      </w:r>
+    </w:p>
+    <w:p>
+      <w:pPr>
+        <w:pStyle w:val="Kdblokk"/>
+      </w:pPr>
+      <w:r>
+        <w:t xml:space="preserve">  "image": null,</w:t>
+      </w:r>
+    </w:p>
+    <w:p>
+      <w:pPr>
+        <w:pStyle w:val="Kdblokk"/>
+      </w:pPr>
+      <w:r>
+        <w:t xml:space="preserve">  "header": null</w:t>
+      </w:r>
+    </w:p>
+    <w:p>
+      <w:pPr>
+        <w:pStyle w:val="Kdblokk"/>
+      </w:pPr>
+      <w:r>
+        <w:t>}</w:t>
+      </w:r>
+    </w:p>
+    <w:p>
+      <w:pPr>
+        <w:rPr>
+          <w:b/>
+          <w:bCs/>
+          <w:lang w:val="hu-HU"/>
+        </w:rPr>
+      </w:pPr>
+      <w:r>
+        <w:rPr>
+          <w:b/>
+          <w:bCs/>
+          <w:lang w:val="hu-HU"/>
+        </w:rPr>
+        <w:t>POST</w:t>
+      </w:r>
+      <w:r>
+        <w:rPr>
+          <w:lang w:val="hu-HU"/>
+        </w:rPr>
+        <w:t xml:space="preserve"> </w:t>
+      </w:r>
+      <w:proofErr w:type="spellStart"/>
+      <w:r>
+        <w:rPr>
+          <w:lang w:val="hu-HU"/>
+        </w:rPr>
+        <w:t>Th</w:t>
+      </w:r>
+      <w:r>
+        <w:rPr>
+          <w:lang w:val="hu-HU"/>
+        </w:rPr>
+        <w:t>reads</w:t>
+      </w:r>
+      <w:proofErr w:type="spellEnd"/>
+    </w:p>
+    <w:p>
+      <w:pPr>
+        <w:rPr>
+          <w:lang w:val="hu-HU"/>
+        </w:rPr>
+      </w:pPr>
+      <w:r>
+        <w:rPr>
+          <w:noProof/>
+          <w:lang w:val="hu-HU"/>
+        </w:rPr>
+        <w:drawing>
+          <wp:inline distT="0" distB="0" distL="0" distR="0" wp14:anchorId="6A857C69" wp14:editId="67F89C1A">
+            <wp:extent cx="5734850" cy="381053"/>
+            <wp:effectExtent l="0" t="0" r="0" b="0"/>
+            <wp:docPr id="1944680298" name="Kép 3"/>
+            <wp:cNvGraphicFramePr>
+              <a:graphicFrameLocks xmlns:a="http://schemas.openxmlformats.org/drawingml/2006/main" noChangeAspect="1"/>
+            </wp:cNvGraphicFramePr>
+            <a:graphic xmlns:a="http://schemas.openxmlformats.org/drawingml/2006/main">
+              <a:graphicData uri="http://schemas.openxmlformats.org/drawingml/2006/picture">
+                <pic:pic xmlns:pic="http://schemas.openxmlformats.org/drawingml/2006/picture">
+                  <pic:nvPicPr>
+                    <pic:cNvPr id="1944680298" name="Kép 1944680298"/>
+                    <pic:cNvPicPr/>
+                  </pic:nvPicPr>
+                  <pic:blipFill>
+                    <a:blip r:embed="rId18">
+                      <a:extLst>
+                        <a:ext uri="{28A0092B-C50C-407E-A947-70E740481C1C}">
+                          <a14:useLocalDpi xmlns:a14="http://schemas.microsoft.com/office/drawing/2010/main" val="0"/>
+                        </a:ext>
+                      </a:extLst>
+                    </a:blip>
+                    <a:stretch>
+                      <a:fillRect/>
+                    </a:stretch>
+                  </pic:blipFill>
+                  <pic:spPr>
+                    <a:xfrm>
+                      <a:off x="0" y="0"/>
+                      <a:ext cx="5734850" cy="381053"/>
+                    </a:xfrm>
+                    <a:prstGeom prst="rect">
+                      <a:avLst/>
+                    </a:prstGeom>
+                  </pic:spPr>
+                </pic:pic>
+              </a:graphicData>
+            </a:graphic>
+          </wp:inline>
+        </w:drawing>
+      </w:r>
+    </w:p>
+    <w:p>
+      <w:pPr>
+        <w:jc w:val="left"/>
+        <w:rPr>
+          <w:lang w:val="hu-HU"/>
+        </w:rPr>
+      </w:pPr>
+      <w:r>
+        <w:rPr>
+          <w:b/>
+          <w:bCs/>
+          <w:lang w:val="hu-HU"/>
+        </w:rPr>
+        <w:t>Példa kérés:</w:t>
+      </w:r>
+      <w:r>
+        <w:rPr>
+          <w:b/>
+          <w:bCs/>
+          <w:lang w:val="hu-HU"/>
+        </w:rPr>
+        <w:t xml:space="preserve"> </w:t>
+      </w:r>
+      <w:r>
+        <w:rPr>
+          <w:rFonts w:ascii="Courier New" w:hAnsi="Courier New" w:cs="Courier New"/>
+          <w:lang w:val="hu-HU"/>
+        </w:rPr>
+        <w:t>POST</w:t>
+      </w:r>
+      <w:r>
+        <w:rPr>
+          <w:rFonts w:ascii="Courier New" w:hAnsi="Courier New" w:cs="Courier New"/>
+          <w:lang w:val="hu-HU"/>
+        </w:rPr>
+        <w:t xml:space="preserve"> | /</w:t>
+      </w:r>
+      <w:proofErr w:type="spellStart"/>
+      <w:r>
+        <w:rPr>
+          <w:rFonts w:ascii="Courier New" w:hAnsi="Courier New" w:cs="Courier New"/>
+          <w:lang w:val="hu-HU"/>
+        </w:rPr>
+        <w:t>api</w:t>
+      </w:r>
+      <w:proofErr w:type="spellEnd"/>
+      <w:r>
+        <w:rPr>
+          <w:rFonts w:ascii="Courier New" w:hAnsi="Courier New" w:cs="Courier New"/>
+          <w:lang w:val="hu-HU"/>
+        </w:rPr>
+        <w:t>/</w:t>
+      </w:r>
+      <w:proofErr w:type="spellStart"/>
+      <w:r>
+        <w:rPr>
+          <w:rFonts w:ascii="Courier New" w:hAnsi="Courier New" w:cs="Courier New"/>
+          <w:lang w:val="hu-HU"/>
+        </w:rPr>
+        <w:t>threads</w:t>
+      </w:r>
+      <w:proofErr w:type="spellEnd"/>
+      <w:r>
+        <w:rPr>
+          <w:lang w:val="hu-HU"/>
+        </w:rPr>
+        <w:br/>
+      </w:r>
+      <w:r>
+        <w:rPr>
+          <w:b/>
+          <w:bCs/>
+          <w:lang w:val="hu-HU"/>
+        </w:rPr>
+        <w:t>Body:</w:t>
+      </w:r>
+      <w:r>
+        <w:rPr>
+          <w:b/>
+          <w:bCs/>
+          <w:lang w:val="hu-HU"/>
+        </w:rPr>
+        <w:t xml:space="preserve"> </w:t>
+      </w:r>
+    </w:p>
+    <w:p>
+      <w:pPr>
+        <w:pStyle w:val="Kdblokk"/>
+        <w:rPr>
+          <w:lang w:val="hu-HU"/>
+        </w:rPr>
+      </w:pPr>
+      <w:r>
+        <w:rPr>
+          <w:lang w:val="hu-HU"/>
+        </w:rPr>
+        <w:t>{</w:t>
+      </w:r>
+    </w:p>
+    <w:p>
+      <w:pPr>
+        <w:pStyle w:val="Kdblokk"/>
+        <w:rPr>
+          <w:lang w:val="hu-HU"/>
+        </w:rPr>
+      </w:pPr>
+      <w:r>
+        <w:rPr>
+          <w:lang w:val="hu-HU"/>
+        </w:rPr>
+        <w:t xml:space="preserve">  "</w:t>
+      </w:r>
+      <w:proofErr w:type="spellStart"/>
+      <w:r>
+        <w:rPr>
+          <w:lang w:val="hu-HU"/>
+        </w:rPr>
+        <w:t>name</w:t>
+      </w:r>
+      <w:proofErr w:type="spellEnd"/>
+      <w:r>
+        <w:rPr>
+          <w:lang w:val="hu-HU"/>
+        </w:rPr>
+        <w:t>": "</w:t>
+      </w:r>
+      <w:proofErr w:type="spellStart"/>
+      <w:r>
+        <w:rPr>
+          <w:lang w:val="hu-HU"/>
+        </w:rPr>
+        <w:t>string</w:t>
+      </w:r>
+      <w:proofErr w:type="spellEnd"/>
+      <w:r>
+        <w:rPr>
+          <w:lang w:val="hu-HU"/>
+        </w:rPr>
+        <w:t>",</w:t>
+      </w:r>
+    </w:p>
+    <w:p>
+      <w:pPr>
+        <w:pStyle w:val="Kdblokk"/>
+        <w:rPr>
+          <w:lang w:val="hu-HU"/>
+        </w:rPr>
+      </w:pPr>
+      <w:r>
+        <w:rPr>
+          <w:lang w:val="hu-HU"/>
+        </w:rPr>
+        <w:t xml:space="preserve">  "</w:t>
+      </w:r>
+      <w:proofErr w:type="spellStart"/>
+      <w:r>
+        <w:rPr>
+          <w:lang w:val="hu-HU"/>
+        </w:rPr>
+        <w:t>description</w:t>
+      </w:r>
+      <w:proofErr w:type="spellEnd"/>
+      <w:r>
+        <w:rPr>
+          <w:lang w:val="hu-HU"/>
+        </w:rPr>
+        <w:t>": "</w:t>
+      </w:r>
+      <w:proofErr w:type="spellStart"/>
+      <w:r>
+        <w:rPr>
+          <w:lang w:val="hu-HU"/>
+        </w:rPr>
+        <w:t>string</w:t>
+      </w:r>
+      <w:proofErr w:type="spellEnd"/>
+      <w:r>
+        <w:rPr>
+          <w:lang w:val="hu-HU"/>
+        </w:rPr>
+        <w:t>",</w:t>
+      </w:r>
+    </w:p>
+    <w:p>
+      <w:pPr>
+        <w:pStyle w:val="Kdblokk"/>
+        <w:rPr>
+          <w:lang w:val="hu-HU"/>
+        </w:rPr>
+      </w:pPr>
+      <w:r>
+        <w:rPr>
+          <w:lang w:val="hu-HU"/>
+        </w:rPr>
+        <w:t xml:space="preserve">  "</w:t>
+      </w:r>
+      <w:proofErr w:type="spellStart"/>
+      <w:r>
+        <w:rPr>
+          <w:lang w:val="hu-HU"/>
+        </w:rPr>
+        <w:t>rules</w:t>
+      </w:r>
+      <w:proofErr w:type="spellEnd"/>
+      <w:r>
+        <w:rPr>
+          <w:lang w:val="hu-HU"/>
+        </w:rPr>
+        <w:t>": "</w:t>
+      </w:r>
+      <w:proofErr w:type="spellStart"/>
+      <w:r>
+        <w:rPr>
+          <w:lang w:val="hu-HU"/>
+        </w:rPr>
+        <w:t>string</w:t>
+      </w:r>
+      <w:proofErr w:type="spellEnd"/>
+      <w:r>
+        <w:rPr>
+          <w:lang w:val="hu-HU"/>
+        </w:rPr>
+        <w:t>"</w:t>
+      </w:r>
+    </w:p>
+    <w:p>
+      <w:pPr>
+        <w:pStyle w:val="Kdblokk"/>
+        <w:rPr>
+          <w:lang w:val="hu-HU"/>
+        </w:rPr>
+      </w:pPr>
+      <w:r>
+        <w:rPr>
+          <w:lang w:val="hu-HU"/>
+        </w:rPr>
+        <w:t>}</w:t>
+      </w:r>
+    </w:p>
+    <w:p>
+      <w:pPr>
+        <w:jc w:val="left"/>
+        <w:rPr>
+          <w:lang w:val="hu-HU"/>
+        </w:rPr>
+      </w:pPr>
+      <w:r>
+        <w:rPr>
+          <w:b/>
+          <w:bCs/>
+          <w:lang w:val="hu-HU"/>
+        </w:rPr>
+        <w:t>Korlátozás:</w:t>
+      </w:r>
+      <w:r>
+        <w:rPr>
+          <w:lang w:val="hu-HU"/>
+        </w:rPr>
+        <w:t xml:space="preserve"> Bejelentkezett felhasználóknak elérhető.</w:t>
+      </w:r>
+      <w:r>
+        <w:rPr>
+          <w:lang w:val="hu-HU"/>
+        </w:rPr>
+        <w:br/>
+      </w:r>
+      <w:r>
+        <w:rPr>
+          <w:b/>
+          <w:bCs/>
+          <w:lang w:val="hu-HU"/>
+        </w:rPr>
+        <w:t>Példa válasz:</w:t>
+      </w:r>
+      <w:r>
+        <w:rPr>
+          <w:b/>
+          <w:bCs/>
+          <w:lang w:val="hu-HU"/>
+        </w:rPr>
+        <w:t xml:space="preserve"> </w:t>
+      </w:r>
+      <w:r>
+        <w:rPr>
+          <w:lang w:val="hu-HU"/>
+        </w:rPr>
+        <w:t>(20</w:t>
+      </w:r>
+      <w:r>
+        <w:rPr>
+          <w:lang w:val="hu-HU"/>
+        </w:rPr>
+        <w:t xml:space="preserve">1 </w:t>
+      </w:r>
+      <w:proofErr w:type="spellStart"/>
+      <w:r>
+        <w:rPr>
+          <w:lang w:val="hu-HU"/>
+        </w:rPr>
+        <w:t>Created</w:t>
+      </w:r>
+      <w:proofErr w:type="spellEnd"/>
+      <w:r>
+        <w:rPr>
+          <w:lang w:val="hu-HU"/>
+        </w:rPr>
+        <w:t>)</w:t>
+      </w:r>
+    </w:p>
+    <w:p>
+      <w:pPr>
+        <w:pStyle w:val="Kdblokk"/>
+      </w:pPr>
+      <w:r>
+        <w:t>{</w:t>
+      </w:r>
+    </w:p>
+    <w:p>
+      <w:pPr>
+        <w:pStyle w:val="Kdblokk"/>
+      </w:pPr>
+      <w:r>
+        <w:t xml:space="preserve">  "id": 0,</w:t>
+      </w:r>
+    </w:p>
+    <w:p>
+      <w:pPr>
+        <w:pStyle w:val="Kdblokk"/>
+      </w:pPr>
+      <w:r>
+        <w:t xml:space="preserve">  "name": "string",</w:t>
+      </w:r>
+    </w:p>
+    <w:p>
+      <w:pPr>
+        <w:pStyle w:val="Kdblokk"/>
+      </w:pPr>
+      <w:r>
+        <w:t xml:space="preserve">  "description": "string",</w:t>
+      </w:r>
+    </w:p>
+    <w:p>
+      <w:pPr>
+        <w:pStyle w:val="Kdblokk"/>
+      </w:pPr>
+      <w:r>
+        <w:t xml:space="preserve">  "rules": "string",</w:t>
+      </w:r>
+    </w:p>
+    <w:p>
+      <w:pPr>
+        <w:pStyle w:val="Kdblokk"/>
+      </w:pPr>
+      <w:r>
+        <w:t xml:space="preserve">  "</w:t>
+      </w:r>
+      <w:proofErr w:type="spellStart"/>
+      <w:r>
+        <w:t>users_count</w:t>
+      </w:r>
+      <w:proofErr w:type="spellEnd"/>
+      <w:r>
+        <w:t>": 0,</w:t>
+      </w:r>
+    </w:p>
+    <w:p>
+      <w:pPr>
+        <w:pStyle w:val="Kdblokk"/>
+      </w:pPr>
+      <w:r>
+        <w:t xml:space="preserve">  "image": "</w:t>
+      </w:r>
+      <w:r>
+        <w:t>null</w:t>
+      </w:r>
+      <w:r>
+        <w:t>",</w:t>
+      </w:r>
+    </w:p>
+    <w:p>
+      <w:pPr>
+        <w:pStyle w:val="Kdblokk"/>
+      </w:pPr>
+      <w:r>
+        <w:t xml:space="preserve">  "header": "</w:t>
+      </w:r>
+      <w:r>
+        <w:t>null</w:t>
+      </w:r>
+      <w:r>
+        <w:t>"</w:t>
+      </w:r>
+    </w:p>
+    <w:p>
+      <w:pPr>
+        <w:pStyle w:val="Kdblokk"/>
+      </w:pPr>
+      <w:r>
+        <w:lastRenderedPageBreak/>
+        <w:t>}</w:t>
+      </w:r>
+    </w:p>
+    <w:p>
+      <w:pPr>
+        <w:rPr>
+          <w:b/>
+          <w:bCs/>
+          <w:lang w:val="hu-HU"/>
+        </w:rPr>
+      </w:pPr>
+      <w:r>
+        <w:rPr>
+          <w:b/>
+          <w:bCs/>
+          <w:lang w:val="hu-HU"/>
+        </w:rPr>
+        <w:t>POST</w:t>
+      </w:r>
+      <w:r>
+        <w:rPr>
+          <w:lang w:val="hu-HU"/>
+        </w:rPr>
+        <w:t xml:space="preserve"> </w:t>
+      </w:r>
+      <w:proofErr w:type="spellStart"/>
+      <w:r>
+        <w:rPr>
+          <w:lang w:val="hu-HU"/>
+        </w:rPr>
+        <w:t>Th</w:t>
+      </w:r>
+      <w:r>
+        <w:rPr>
+          <w:lang w:val="hu-HU"/>
+        </w:rPr>
+        <w:t>read</w:t>
+      </w:r>
+      <w:proofErr w:type="spellEnd"/>
+      <w:r>
+        <w:rPr>
+          <w:lang w:val="hu-HU"/>
+        </w:rPr>
+        <w:t xml:space="preserve"> image</w:t>
+      </w:r>
+    </w:p>
+    <w:p>
+      <w:pPr>
+        <w:rPr>
+          <w:lang w:val="hu-HU"/>
+        </w:rPr>
+      </w:pPr>
+      <w:r>
+        <w:rPr>
+          <w:noProof/>
+          <w:lang w:val="hu-HU"/>
+        </w:rPr>
+        <w:drawing>
+          <wp:inline distT="0" distB="0" distL="0" distR="0" wp14:anchorId="388BBEF7" wp14:editId="65053D6A">
+            <wp:extent cx="5971540" cy="314325"/>
+            <wp:effectExtent l="0" t="0" r="0" b="9525"/>
+            <wp:docPr id="1138504896" name="Kép 4"/>
+            <wp:cNvGraphicFramePr>
+              <a:graphicFrameLocks xmlns:a="http://schemas.openxmlformats.org/drawingml/2006/main" noChangeAspect="1"/>
+            </wp:cNvGraphicFramePr>
+            <a:graphic xmlns:a="http://schemas.openxmlformats.org/drawingml/2006/main">
+              <a:graphicData uri="http://schemas.openxmlformats.org/drawingml/2006/picture">
+                <pic:pic xmlns:pic="http://schemas.openxmlformats.org/drawingml/2006/picture">
+                  <pic:nvPicPr>
+                    <pic:cNvPr id="1138504896" name="Kép 1138504896"/>
+                    <pic:cNvPicPr/>
+                  </pic:nvPicPr>
+                  <pic:blipFill>
+                    <a:blip r:embed="rId19">
+                      <a:extLst>
+                        <a:ext uri="{28A0092B-C50C-407E-A947-70E740481C1C}">
+                          <a14:useLocalDpi xmlns:a14="http://schemas.microsoft.com/office/drawing/2010/main" val="0"/>
+                        </a:ext>
+                      </a:extLst>
+                    </a:blip>
+                    <a:stretch>
+                      <a:fillRect/>
+                    </a:stretch>
+                  </pic:blipFill>
+                  <pic:spPr>
+                    <a:xfrm>
+                      <a:off x="0" y="0"/>
+                      <a:ext cx="5971540" cy="314325"/>
+                    </a:xfrm>
+                    <a:prstGeom prst="rect">
+                      <a:avLst/>
+                    </a:prstGeom>
+                  </pic:spPr>
+                </pic:pic>
+              </a:graphicData>
+            </a:graphic>
+          </wp:inline>
+        </w:drawing>
+      </w:r>
+    </w:p>
+    <w:p>
+      <w:pPr>
+        <w:jc w:val="left"/>
+        <w:rPr>
+          <w:lang w:val="hu-HU"/>
+        </w:rPr>
+      </w:pPr>
+      <w:r>
+        <w:rPr>
+          <w:b/>
+          <w:bCs/>
+          <w:lang w:val="hu-HU"/>
+        </w:rPr>
+        <w:t>Példa kérés:</w:t>
+      </w:r>
+      <w:r>
+        <w:rPr>
+          <w:b/>
+          <w:bCs/>
+          <w:lang w:val="hu-HU"/>
+        </w:rPr>
+        <w:t xml:space="preserve"> </w:t>
+      </w:r>
+      <w:r>
+        <w:rPr>
+          <w:rFonts w:ascii="Courier New" w:hAnsi="Courier New" w:cs="Courier New"/>
+          <w:lang w:val="hu-HU"/>
+        </w:rPr>
+        <w:t>POST</w:t>
+      </w:r>
+      <w:r>
+        <w:rPr>
+          <w:rFonts w:ascii="Courier New" w:hAnsi="Courier New" w:cs="Courier New"/>
+          <w:lang w:val="hu-HU"/>
+        </w:rPr>
+        <w:t xml:space="preserve"> | /</w:t>
+      </w:r>
+      <w:proofErr w:type="spellStart"/>
+      <w:r>
+        <w:rPr>
+          <w:rFonts w:ascii="Courier New" w:hAnsi="Courier New" w:cs="Courier New"/>
+          <w:lang w:val="hu-HU"/>
+        </w:rPr>
+        <w:t>api</w:t>
+      </w:r>
+      <w:proofErr w:type="spellEnd"/>
+      <w:r>
+        <w:rPr>
+          <w:rFonts w:ascii="Courier New" w:hAnsi="Courier New" w:cs="Courier New"/>
+          <w:lang w:val="hu-HU"/>
+        </w:rPr>
+        <w:t>/</w:t>
+      </w:r>
+      <w:proofErr w:type="spellStart"/>
+      <w:r>
+        <w:rPr>
+          <w:rFonts w:ascii="Courier New" w:hAnsi="Courier New" w:cs="Courier New"/>
+          <w:lang w:val="hu-HU"/>
+        </w:rPr>
+        <w:t>threads</w:t>
+      </w:r>
+      <w:proofErr w:type="spellEnd"/>
+      <w:r>
+        <w:rPr>
+          <w:rFonts w:ascii="Courier New" w:hAnsi="Courier New" w:cs="Courier New"/>
+          <w:lang w:val="hu-HU"/>
+        </w:rPr>
+        <w:t>/1/image</w:t>
+      </w:r>
+      <w:r>
+        <w:rPr>
+          <w:lang w:val="hu-HU"/>
+        </w:rPr>
+        <w:br/>
+      </w:r>
+      <w:r>
+        <w:rPr>
+          <w:b/>
+          <w:bCs/>
+          <w:lang w:val="hu-HU"/>
+        </w:rPr>
+        <w:t>Body:</w:t>
+      </w:r>
+      <w:r>
+        <w:rPr>
+          <w:b/>
+          <w:bCs/>
+          <w:lang w:val="hu-HU"/>
+        </w:rPr>
+        <w:t xml:space="preserve"> </w:t>
+      </w:r>
+    </w:p>
+    <w:p>
+      <w:pPr>
+        <w:pStyle w:val="Kdblokk"/>
+        <w:rPr>
+          <w:lang w:val="hu-HU"/>
+        </w:rPr>
+      </w:pPr>
+      <w:r>
+        <w:rPr>
+          <w:lang w:val="hu-HU"/>
+        </w:rPr>
+        <w:t>{</w:t>
+      </w:r>
+    </w:p>
+    <w:p>
+      <w:pPr>
+        <w:pStyle w:val="Kdblokk"/>
+        <w:rPr>
+          <w:lang w:val="hu-HU"/>
+        </w:rPr>
+      </w:pPr>
+      <w:r>
+        <w:rPr>
+          <w:lang w:val="hu-HU"/>
+        </w:rPr>
+        <w:t xml:space="preserve">  </w:t>
+      </w:r>
+      <w:r>
+        <w:t>"</w:t>
+      </w:r>
+      <w:r>
+        <w:t>image</w:t>
+      </w:r>
+      <w:r>
+        <w:t>"</w:t>
+      </w:r>
+      <w:r>
+        <w:t xml:space="preserve">: </w:t>
+      </w:r>
+      <w:r>
+        <w:t>"</w:t>
+      </w:r>
+      <w:r>
+        <w:t>file</w:t>
+      </w:r>
+      <w:r>
+        <w:t>"</w:t>
+      </w:r>
+    </w:p>
+    <w:p>
+      <w:pPr>
+        <w:pStyle w:val="Kdblokk"/>
+        <w:rPr>
+          <w:lang w:val="hu-HU"/>
+        </w:rPr>
+      </w:pPr>
+      <w:r>
+        <w:rPr>
+          <w:lang w:val="hu-HU"/>
+        </w:rPr>
+        <w:t>}</w:t>
+      </w:r>
+    </w:p>
+    <w:p>
+      <w:pPr>
+        <w:jc w:val="left"/>
+        <w:rPr>
+          <w:lang w:val="hu-HU"/>
+        </w:rPr>
+      </w:pPr>
+      <w:r>
+        <w:rPr>
+          <w:b/>
+          <w:bCs/>
+          <w:lang w:val="hu-HU"/>
+        </w:rPr>
+        <w:t>Korlátozás:</w:t>
+      </w:r>
+      <w:r>
+        <w:rPr>
+          <w:b/>
+          <w:bCs/>
+          <w:lang w:val="hu-HU"/>
+        </w:rPr>
+        <w:t xml:space="preserve"> </w:t>
+      </w:r>
+      <w:r>
+        <w:rPr>
+          <w:lang w:val="hu-HU"/>
+        </w:rPr>
+        <w:t>Csak</w:t>
+      </w:r>
+      <w:r>
+        <w:rPr>
+          <w:lang w:val="hu-HU"/>
+        </w:rPr>
+        <w:t xml:space="preserve"> </w:t>
+      </w:r>
+      <w:r>
+        <w:rPr>
+          <w:lang w:val="hu-HU"/>
+        </w:rPr>
+        <w:t>a</w:t>
+      </w:r>
+      <w:r>
+        <w:rPr>
+          <w:lang w:val="hu-HU"/>
+        </w:rPr>
+        <w:t xml:space="preserve">z adott </w:t>
+      </w:r>
+      <w:proofErr w:type="spellStart"/>
+      <w:r>
+        <w:rPr>
+          <w:lang w:val="hu-HU"/>
+        </w:rPr>
+        <w:t>thread</w:t>
+      </w:r>
+      <w:proofErr w:type="spellEnd"/>
+      <w:r>
+        <w:rPr>
+          <w:lang w:val="hu-HU"/>
+        </w:rPr>
+        <w:t xml:space="preserve"> „</w:t>
+      </w:r>
+      <w:proofErr w:type="spellStart"/>
+      <w:r>
+        <w:rPr>
+          <w:lang w:val="hu-HU"/>
+        </w:rPr>
+        <w:t>admin</w:t>
+      </w:r>
+      <w:proofErr w:type="spellEnd"/>
+      <w:r>
+        <w:rPr>
+          <w:lang w:val="hu-HU"/>
+        </w:rPr>
+        <w:t>” ranggal rendelkező felhasználói számára</w:t>
+      </w:r>
+      <w:r>
+        <w:rPr>
+          <w:lang w:val="hu-HU"/>
+        </w:rPr>
+        <w:t xml:space="preserve"> elérhető.</w:t>
+      </w:r>
+      <w:r>
+        <w:rPr>
+          <w:lang w:val="hu-HU"/>
+        </w:rPr>
+        <w:br/>
+      </w:r>
+      <w:r>
+        <w:rPr>
+          <w:b/>
+          <w:bCs/>
+          <w:lang w:val="hu-HU"/>
+        </w:rPr>
+        <w:t>Példa válasz:</w:t>
+      </w:r>
+      <w:r>
+        <w:rPr>
+          <w:b/>
+          <w:bCs/>
+          <w:lang w:val="hu-HU"/>
+        </w:rPr>
+        <w:t xml:space="preserve"> </w:t>
+      </w:r>
+      <w:r>
+        <w:rPr>
+          <w:lang w:val="hu-HU"/>
+        </w:rPr>
+        <w:t>(200 OK)</w:t>
+      </w:r>
+    </w:p>
+    <w:p>
+      <w:pPr>
+        <w:pStyle w:val="Kdblokk"/>
+      </w:pPr>
+      <w:r>
+        <w:t>{</w:t>
+      </w:r>
+    </w:p>
+    <w:p>
+      <w:pPr>
+        <w:pStyle w:val="Kdblokk"/>
+      </w:pPr>
+      <w:r>
+        <w:t xml:space="preserve">  "message": "Thread header updated successfully",</w:t>
+      </w:r>
+    </w:p>
+    <w:p>
+      <w:pPr>
+        <w:pStyle w:val="Kdblokk"/>
+      </w:pPr>
+      <w:r>
+        <w:t xml:space="preserve">  "thread": {</w:t>
+      </w:r>
+    </w:p>
+    <w:p>
+      <w:pPr>
+        <w:pStyle w:val="Kdblokk"/>
+      </w:pPr>
+      <w:r>
+        <w:t xml:space="preserve">    "id": 0,</w:t>
+      </w:r>
+    </w:p>
+    <w:p>
+      <w:pPr>
+        <w:pStyle w:val="Kdblokk"/>
+      </w:pPr>
+      <w:r>
+        <w:t xml:space="preserve">    "name": "string",</w:t>
+      </w:r>
+    </w:p>
+    <w:p>
+      <w:pPr>
+        <w:pStyle w:val="Kdblokk"/>
+      </w:pPr>
+      <w:r>
+        <w:t xml:space="preserve">    "description": "string",</w:t>
+      </w:r>
+    </w:p>
+    <w:p>
+      <w:pPr>
+        <w:pStyle w:val="Kdblokk"/>
+      </w:pPr>
+      <w:r>
+        <w:t xml:space="preserve">    "rules": "string",</w:t>
+      </w:r>
+    </w:p>
+    <w:p>
+      <w:pPr>
+        <w:pStyle w:val="Kdblokk"/>
+      </w:pPr>
+      <w:r>
+        <w:t xml:space="preserve">    "</w:t>
+      </w:r>
+      <w:proofErr w:type="spellStart"/>
+      <w:r>
+        <w:t>users_count</w:t>
+      </w:r>
+      <w:proofErr w:type="spellEnd"/>
+      <w:r>
+        <w:t>": 0,</w:t>
+      </w:r>
+    </w:p>
+    <w:p>
+      <w:pPr>
+        <w:pStyle w:val="Kdblokk"/>
+      </w:pPr>
+      <w:r>
+        <w:t xml:space="preserve">    "image": "https://jedligrambackend-</w:t>
+      </w:r>
+      <w:r>
+        <w:tab/>
+      </w:r>
+      <w:proofErr w:type="spellStart"/>
+      <w:r>
+        <w:t>gehermarcell.jcloud.jedlik.cloud</w:t>
+      </w:r>
+      <w:proofErr w:type="spellEnd"/>
+      <w:r>
+        <w:t>/storage/</w:t>
+      </w:r>
+      <w:proofErr w:type="spellStart"/>
+      <w:r>
+        <w:t>threadImages</w:t>
+      </w:r>
+      <w:proofErr w:type="spellEnd"/>
+      <w:r>
+        <w:t>/3CkQ2S</w:t>
+      </w:r>
+      <w:r>
+        <w:tab/>
+      </w:r>
+      <w:r>
+        <w:t>ivSzgFpe5pCeafp32PGY2ZqFvpafh9ZqBj.jpg",</w:t>
+      </w:r>
+    </w:p>
+    <w:p>
+      <w:pPr>
+        <w:pStyle w:val="Kdblokk"/>
+      </w:pPr>
+      <w:r>
+        <w:t xml:space="preserve">    "header": "</w:t>
+      </w:r>
+      <w:r>
+        <w:t>null</w:t>
+      </w:r>
+      <w:r>
+        <w:t>"</w:t>
+      </w:r>
+    </w:p>
+    <w:p>
+      <w:pPr>
+        <w:pStyle w:val="Kdblokk"/>
+      </w:pPr>
+      <w:r>
+        <w:t xml:space="preserve">  }</w:t>
+      </w:r>
+    </w:p>
+    <w:p>
+      <w:pPr>
+        <w:pStyle w:val="Kdblokk"/>
+      </w:pPr>
+      <w:r>
+        <w:t>}</w:t>
+      </w:r>
+    </w:p>
+    <w:p>
+      <w:pPr>
+        <w:rPr>
+          <w:b/>
+          <w:bCs/>
+          <w:lang w:val="hu-HU"/>
+        </w:rPr>
+      </w:pPr>
+      <w:r>
+        <w:rPr>
+          <w:b/>
+          <w:bCs/>
+          <w:lang w:val="hu-HU"/>
+        </w:rPr>
+        <w:t>POST</w:t>
+      </w:r>
+      <w:r>
+        <w:rPr>
+          <w:lang w:val="hu-HU"/>
+        </w:rPr>
+        <w:t xml:space="preserve"> </w:t>
+      </w:r>
+      <w:proofErr w:type="spellStart"/>
+      <w:r>
+        <w:rPr>
+          <w:lang w:val="hu-HU"/>
+        </w:rPr>
+        <w:t>Th</w:t>
+      </w:r>
+      <w:r>
+        <w:rPr>
+          <w:lang w:val="hu-HU"/>
+        </w:rPr>
+        <w:t>read</w:t>
+      </w:r>
+      <w:proofErr w:type="spellEnd"/>
+      <w:r>
+        <w:rPr>
+          <w:lang w:val="hu-HU"/>
+        </w:rPr>
+        <w:t xml:space="preserve"> </w:t>
+      </w:r>
+      <w:proofErr w:type="spellStart"/>
+      <w:r>
+        <w:rPr>
+          <w:lang w:val="hu-HU"/>
+        </w:rPr>
+        <w:t>header</w:t>
+      </w:r>
+      <w:proofErr w:type="spellEnd"/>
+    </w:p>
+    <w:p>
+      <w:pPr>
+        <w:rPr>
+          <w:lang w:val="hu-HU"/>
+        </w:rPr>
+      </w:pPr>
+      <w:r>
+        <w:rPr>
+          <w:noProof/>
+          <w:lang w:val="hu-HU"/>
+        </w:rPr>
+        <w:drawing>
+          <wp:inline distT="0" distB="0" distL="0" distR="0" wp14:anchorId="5D0D277F" wp14:editId="651E8495">
+            <wp:extent cx="5971540" cy="287655"/>
+            <wp:effectExtent l="0" t="0" r="0" b="0"/>
+            <wp:docPr id="1131600542" name="Kép 5"/>
+            <wp:cNvGraphicFramePr>
+              <a:graphicFrameLocks xmlns:a="http://schemas.openxmlformats.org/drawingml/2006/main" noChangeAspect="1"/>
+            </wp:cNvGraphicFramePr>
+            <a:graphic xmlns:a="http://schemas.openxmlformats.org/drawingml/2006/main">
+              <a:graphicData uri="http://schemas.openxmlformats.org/drawingml/2006/picture">
+                <pic:pic xmlns:pic="http://schemas.openxmlformats.org/drawingml/2006/picture">
+                  <pic:nvPicPr>
+                    <pic:cNvPr id="1131600542" name="Kép 1131600542"/>
+                    <pic:cNvPicPr/>
+                  </pic:nvPicPr>
+                  <pic:blipFill>
+                    <a:blip r:embed="rId20">
+                      <a:extLst>
+                        <a:ext uri="{28A0092B-C50C-407E-A947-70E740481C1C}">
+                          <a14:useLocalDpi xmlns:a14="http://schemas.microsoft.com/office/drawing/2010/main" val="0"/>
+                        </a:ext>
+                      </a:extLst>
+                    </a:blip>
+                    <a:stretch>
+                      <a:fillRect/>
+                    </a:stretch>
+                  </pic:blipFill>
+                  <pic:spPr>
+                    <a:xfrm>
+                      <a:off x="0" y="0"/>
+                      <a:ext cx="5971540" cy="287655"/>
+                    </a:xfrm>
+                    <a:prstGeom prst="rect">
+                      <a:avLst/>
+                    </a:prstGeom>
+                  </pic:spPr>
+                </pic:pic>
+              </a:graphicData>
+            </a:graphic>
+          </wp:inline>
+        </w:drawing>
+      </w:r>
+    </w:p>
+    <w:p>
+      <w:pPr>
+        <w:jc w:val="left"/>
+        <w:rPr>
+          <w:lang w:val="hu-HU"/>
+        </w:rPr>
+      </w:pPr>
+      <w:r>
+        <w:rPr>
+          <w:b/>
+          <w:bCs/>
+          <w:lang w:val="hu-HU"/>
+        </w:rPr>
+        <w:lastRenderedPageBreak/>
+        <w:t>Példa kérés:</w:t>
+      </w:r>
+      <w:r>
+        <w:rPr>
+          <w:b/>
+          <w:bCs/>
+          <w:lang w:val="hu-HU"/>
+        </w:rPr>
+        <w:t xml:space="preserve"> </w:t>
+      </w:r>
+      <w:r>
+        <w:rPr>
+          <w:rFonts w:ascii="Courier New" w:hAnsi="Courier New" w:cs="Courier New"/>
+          <w:lang w:val="hu-HU"/>
+        </w:rPr>
+        <w:t>POST</w:t>
+      </w:r>
+      <w:r>
+        <w:rPr>
+          <w:rFonts w:ascii="Courier New" w:hAnsi="Courier New" w:cs="Courier New"/>
+          <w:lang w:val="hu-HU"/>
+        </w:rPr>
+        <w:t xml:space="preserve"> | /</w:t>
+      </w:r>
+      <w:proofErr w:type="spellStart"/>
+      <w:r>
+        <w:rPr>
+          <w:rFonts w:ascii="Courier New" w:hAnsi="Courier New" w:cs="Courier New"/>
+          <w:lang w:val="hu-HU"/>
+        </w:rPr>
+        <w:t>api</w:t>
+      </w:r>
+      <w:proofErr w:type="spellEnd"/>
+      <w:r>
+        <w:rPr>
+          <w:rFonts w:ascii="Courier New" w:hAnsi="Courier New" w:cs="Courier New"/>
+          <w:lang w:val="hu-HU"/>
+        </w:rPr>
+        <w:t>/</w:t>
+      </w:r>
+      <w:proofErr w:type="spellStart"/>
+      <w:r>
+        <w:rPr>
+          <w:rFonts w:ascii="Courier New" w:hAnsi="Courier New" w:cs="Courier New"/>
+          <w:lang w:val="hu-HU"/>
+        </w:rPr>
+        <w:t>threads</w:t>
+      </w:r>
+      <w:proofErr w:type="spellEnd"/>
+      <w:r>
+        <w:rPr>
+          <w:rFonts w:ascii="Courier New" w:hAnsi="Courier New" w:cs="Courier New"/>
+          <w:lang w:val="hu-HU"/>
+        </w:rPr>
+        <w:t>/1/</w:t>
+      </w:r>
+      <w:proofErr w:type="spellStart"/>
+      <w:r>
+        <w:rPr>
+          <w:rFonts w:ascii="Courier New" w:hAnsi="Courier New" w:cs="Courier New"/>
+          <w:lang w:val="hu-HU"/>
+        </w:rPr>
+        <w:t>header</w:t>
+      </w:r>
+      <w:proofErr w:type="spellEnd"/>
+      <w:r>
+        <w:rPr>
+          <w:lang w:val="hu-HU"/>
+        </w:rPr>
+        <w:t xml:space="preserve"> </w:t>
+      </w:r>
+      <w:r>
+        <w:rPr>
+          <w:lang w:val="hu-HU"/>
+        </w:rPr>
+        <w:br/>
+      </w:r>
+      <w:r>
+        <w:rPr>
+          <w:b/>
+          <w:bCs/>
+          <w:lang w:val="hu-HU"/>
+        </w:rPr>
+        <w:t>Body:</w:t>
+      </w:r>
+      <w:r>
+        <w:rPr>
+          <w:b/>
+          <w:bCs/>
+          <w:lang w:val="hu-HU"/>
+        </w:rPr>
+        <w:t xml:space="preserve"> </w:t>
+      </w:r>
+    </w:p>
+    <w:p>
+      <w:pPr>
+        <w:pStyle w:val="Kdblokk"/>
+        <w:rPr>
+          <w:lang w:val="hu-HU"/>
+        </w:rPr>
+      </w:pPr>
+      <w:r>
+        <w:rPr>
+          <w:lang w:val="hu-HU"/>
+        </w:rPr>
+        <w:t>{</w:t>
+      </w:r>
+    </w:p>
+    <w:p>
+      <w:pPr>
+        <w:pStyle w:val="Kdblokk"/>
+        <w:rPr>
+          <w:lang w:val="hu-HU"/>
+        </w:rPr>
+      </w:pPr>
+      <w:r>
+        <w:rPr>
+          <w:lang w:val="hu-HU"/>
+        </w:rPr>
+        <w:t xml:space="preserve">  </w:t>
+      </w:r>
+      <w:r>
+        <w:t>"</w:t>
+      </w:r>
+      <w:r>
+        <w:t>header</w:t>
+      </w:r>
+      <w:r>
+        <w:t>"</w:t>
+      </w:r>
+      <w:r>
+        <w:t xml:space="preserve">: </w:t>
+      </w:r>
+      <w:r>
+        <w:t>"</w:t>
+      </w:r>
+      <w:r>
+        <w:t>file</w:t>
+      </w:r>
+      <w:r>
+        <w:t>"</w:t>
+      </w:r>
+    </w:p>
+    <w:p>
+      <w:pPr>
+        <w:pStyle w:val="Kdblokk"/>
+        <w:rPr>
+          <w:lang w:val="hu-HU"/>
+        </w:rPr>
+      </w:pPr>
+      <w:r>
+        <w:rPr>
+          <w:lang w:val="hu-HU"/>
+        </w:rPr>
+        <w:t>}</w:t>
+      </w:r>
+    </w:p>
+    <w:p>
+      <w:pPr>
+        <w:jc w:val="left"/>
+        <w:rPr>
+          <w:lang w:val="hu-HU"/>
+        </w:rPr>
+      </w:pPr>
+      <w:r>
+        <w:rPr>
+          <w:b/>
+          <w:bCs/>
+          <w:lang w:val="hu-HU"/>
+        </w:rPr>
+        <w:t>Korlátozás:</w:t>
+      </w:r>
+      <w:r>
+        <w:rPr>
+          <w:lang w:val="hu-HU"/>
+        </w:rPr>
+        <w:t xml:space="preserve"> </w:t>
+      </w:r>
+      <w:r>
+        <w:rPr>
+          <w:lang w:val="hu-HU"/>
+        </w:rPr>
+        <w:t>Csak a</w:t>
+      </w:r>
+      <w:r>
+        <w:rPr>
+          <w:lang w:val="hu-HU"/>
+        </w:rPr>
+        <w:t xml:space="preserve">z adott </w:t>
+      </w:r>
+      <w:proofErr w:type="spellStart"/>
+      <w:r>
+        <w:rPr>
+          <w:lang w:val="hu-HU"/>
+        </w:rPr>
+        <w:t>thread</w:t>
+      </w:r>
+      <w:proofErr w:type="spellEnd"/>
+      <w:r>
+        <w:rPr>
+          <w:lang w:val="hu-HU"/>
+        </w:rPr>
+        <w:t xml:space="preserve"> „</w:t>
+      </w:r>
+      <w:proofErr w:type="spellStart"/>
+      <w:r>
+        <w:rPr>
+          <w:lang w:val="hu-HU"/>
+        </w:rPr>
+        <w:t>admin</w:t>
+      </w:r>
+      <w:proofErr w:type="spellEnd"/>
+      <w:r>
+        <w:rPr>
+          <w:lang w:val="hu-HU"/>
+        </w:rPr>
+        <w:t>” ranggal rendelkező felhasználói számára</w:t>
+      </w:r>
+      <w:r>
+        <w:rPr>
+          <w:lang w:val="hu-HU"/>
+        </w:rPr>
+        <w:t xml:space="preserve"> elérhető</w:t>
+      </w:r>
+      <w:r>
+        <w:rPr>
+          <w:lang w:val="hu-HU"/>
+        </w:rPr>
+        <w:br/>
+      </w:r>
+      <w:r>
+        <w:rPr>
+          <w:b/>
+          <w:bCs/>
+          <w:lang w:val="hu-HU"/>
+        </w:rPr>
+        <w:t>Példa válasz:</w:t>
+      </w:r>
+      <w:r>
+        <w:rPr>
+          <w:b/>
+          <w:bCs/>
+          <w:lang w:val="hu-HU"/>
+        </w:rPr>
+        <w:t xml:space="preserve"> </w:t>
+      </w:r>
+      <w:r>
+        <w:rPr>
+          <w:lang w:val="hu-HU"/>
+        </w:rPr>
+        <w:t>(200 OK)</w:t>
+      </w:r>
+    </w:p>
+    <w:p>
+      <w:pPr>
+        <w:pStyle w:val="Kdblokk"/>
+      </w:pPr>
+      <w:r>
+        <w:t>{</w:t>
+      </w:r>
+    </w:p>
+    <w:p>
+      <w:pPr>
+        <w:pStyle w:val="Kdblokk"/>
+      </w:pPr>
+      <w:r>
+        <w:t xml:space="preserve">  "message": "Thread header updated successfully",</w:t>
+      </w:r>
+    </w:p>
+    <w:p>
+      <w:pPr>
+        <w:pStyle w:val="Kdblokk"/>
+      </w:pPr>
+      <w:r>
+        <w:t xml:space="preserve">  "thread": {</w:t>
+      </w:r>
+    </w:p>
+    <w:p>
+      <w:pPr>
+        <w:pStyle w:val="Kdblokk"/>
+      </w:pPr>
+      <w:r>
+        <w:t xml:space="preserve">    "id": 0,</w:t>
+      </w:r>
+    </w:p>
+    <w:p>
+      <w:pPr>
+        <w:pStyle w:val="Kdblokk"/>
+      </w:pPr>
+      <w:r>
+        <w:t xml:space="preserve">    "name": "string",</w:t>
+      </w:r>
+    </w:p>
+    <w:p>
+      <w:pPr>
+        <w:pStyle w:val="Kdblokk"/>
+      </w:pPr>
+      <w:r>
+        <w:t xml:space="preserve">    "description": "string",</w:t>
+      </w:r>
+    </w:p>
+    <w:p>
+      <w:pPr>
+        <w:pStyle w:val="Kdblokk"/>
+      </w:pPr>
+      <w:r>
+        <w:t xml:space="preserve">    "rules": "string",</w:t>
+      </w:r>
+    </w:p>
+    <w:p>
+      <w:pPr>
+        <w:pStyle w:val="Kdblokk"/>
+      </w:pPr>
+      <w:r>
+        <w:t xml:space="preserve">    "</w:t>
+      </w:r>
+      <w:proofErr w:type="spellStart"/>
+      <w:r>
+        <w:t>users_count</w:t>
+      </w:r>
+      <w:proofErr w:type="spellEnd"/>
+      <w:r>
+        <w:t>": 0,</w:t>
+      </w:r>
+    </w:p>
+    <w:p>
+      <w:pPr>
+        <w:pStyle w:val="Kdblokk"/>
+      </w:pPr>
+      <w:r>
+        <w:t xml:space="preserve">    "image": "</w:t>
+      </w:r>
+      <w:r>
+        <w:t>null</w:t>
+      </w:r>
+      <w:r>
+        <w:t>",</w:t>
+      </w:r>
+    </w:p>
+    <w:p>
+      <w:pPr>
+        <w:pStyle w:val="Kdblokk"/>
+      </w:pPr>
+      <w:r>
+        <w:t xml:space="preserve">    "header": "</w:t>
+      </w:r>
+      <w:r>
+        <w:t xml:space="preserve"> </w:t>
+      </w:r>
+      <w:r>
+        <w:t>https://jedligrambackend-</w:t>
+      </w:r>
+      <w:r>
+        <w:tab/>
+      </w:r>
+      <w:proofErr w:type="spellStart"/>
+      <w:r>
+        <w:t>gehermarcell.jcloud.jedlik.cloud</w:t>
+      </w:r>
+      <w:proofErr w:type="spellEnd"/>
+      <w:r>
+        <w:t>/storage/</w:t>
+      </w:r>
+      <w:proofErr w:type="spellStart"/>
+      <w:r>
+        <w:t>threadImages</w:t>
+      </w:r>
+      <w:proofErr w:type="spellEnd"/>
+      <w:r>
+        <w:t>/3CkQ2S</w:t>
+      </w:r>
+      <w:r>
+        <w:tab/>
+      </w:r>
+      <w:r>
+        <w:t>ivSzgFpe5pCeafp32PGY2ZqFvpafh9ZqBj.jpg</w:t>
+      </w:r>
+      <w:r>
+        <w:t xml:space="preserve"> </w:t>
+      </w:r>
+      <w:r>
+        <w:t>"</w:t>
+      </w:r>
+    </w:p>
+    <w:p>
+      <w:pPr>
+        <w:pStyle w:val="Kdblokk"/>
+      </w:pPr>
+      <w:r>
+        <w:t xml:space="preserve">  }</w:t>
+      </w:r>
+    </w:p>
+    <w:p>
+      <w:pPr>
+        <w:pStyle w:val="Kdblokk"/>
+      </w:pPr>
+      <w:r>
+        <w:t>}</w:t>
+      </w:r>
+    </w:p>
+    <w:p>
+      <w:pPr>
+        <w:rPr>
+          <w:b/>
+          <w:bCs/>
+          <w:lang w:val="hu-HU"/>
+        </w:rPr>
+      </w:pPr>
+      <w:r>
+        <w:rPr>
+          <w:b/>
+          <w:bCs/>
+          <w:lang w:val="hu-HU"/>
+        </w:rPr>
+        <w:t>GET</w:t>
+      </w:r>
+      <w:r>
+        <w:rPr>
+          <w:b/>
+          <w:bCs/>
+          <w:lang w:val="hu-HU"/>
+        </w:rPr>
+        <w:t xml:space="preserve"> </w:t>
+      </w:r>
+      <w:proofErr w:type="spellStart"/>
+      <w:r>
+        <w:rPr>
+          <w:lang w:val="hu-HU"/>
+        </w:rPr>
+        <w:t>Th</w:t>
+      </w:r>
+      <w:r>
+        <w:rPr>
+          <w:lang w:val="hu-HU"/>
+        </w:rPr>
+        <w:t>read</w:t>
+      </w:r>
+      <w:proofErr w:type="spellEnd"/>
+      <w:r>
+        <w:rPr>
+          <w:lang w:val="hu-HU"/>
+        </w:rPr>
+        <w:t xml:space="preserve"> </w:t>
+      </w:r>
+      <w:proofErr w:type="spellStart"/>
+      <w:r>
+        <w:rPr>
+          <w:lang w:val="hu-HU"/>
+        </w:rPr>
+        <w:t>posts</w:t>
+      </w:r>
+      <w:proofErr w:type="spellEnd"/>
+    </w:p>
+    <w:p>
+      <w:pPr>
+        <w:rPr>
+          <w:lang w:val="hu-HU"/>
+        </w:rPr>
+      </w:pPr>
+      <w:r>
+        <w:rPr>
+          <w:noProof/>
+          <w:lang w:val="hu-HU"/>
+        </w:rPr>
+        <w:drawing>
+          <wp:inline distT="0" distB="0" distL="0" distR="0" wp14:anchorId="41394DE5" wp14:editId="4E6E27B4">
+            <wp:extent cx="5971540" cy="324485"/>
+            <wp:effectExtent l="0" t="0" r="0" b="0"/>
+            <wp:docPr id="1769456846" name="Kép 2"/>
+            <wp:cNvGraphicFramePr>
+              <a:graphicFrameLocks xmlns:a="http://schemas.openxmlformats.org/drawingml/2006/main" noChangeAspect="1"/>
+            </wp:cNvGraphicFramePr>
+            <a:graphic xmlns:a="http://schemas.openxmlformats.org/drawingml/2006/main">
+              <a:graphicData uri="http://schemas.openxmlformats.org/drawingml/2006/picture">
+                <pic:pic xmlns:pic="http://schemas.openxmlformats.org/drawingml/2006/picture">
+                  <pic:nvPicPr>
+                    <pic:cNvPr id="266175522" name="Kép 266175522"/>
+                    <pic:cNvPicPr/>
+                  </pic:nvPicPr>
+                  <pic:blipFill>
+                    <a:blip r:embed="rId17">
+                      <a:extLst>
+                        <a:ext uri="{28A0092B-C50C-407E-A947-70E740481C1C}">
+                          <a14:useLocalDpi xmlns:a14="http://schemas.microsoft.com/office/drawing/2010/main" val="0"/>
+                        </a:ext>
+                      </a:extLst>
+                    </a:blip>
+                    <a:stretch>
+                      <a:fillRect/>
+                    </a:stretch>
+                  </pic:blipFill>
+                  <pic:spPr>
+                    <a:xfrm>
+                      <a:off x="0" y="0"/>
+                      <a:ext cx="5971540" cy="324485"/>
+                    </a:xfrm>
+                    <a:prstGeom prst="rect">
+                      <a:avLst/>
+                    </a:prstGeom>
+                  </pic:spPr>
+                </pic:pic>
+              </a:graphicData>
+            </a:graphic>
+          </wp:inline>
+        </w:drawing>
+      </w:r>
+    </w:p>
+    <w:p>
+      <w:pPr>
+        <w:jc w:val="left"/>
+        <w:rPr>
+          <w:lang w:val="hu-HU"/>
+        </w:rPr>
+      </w:pPr>
+      <w:r>
+        <w:rPr>
+          <w:b/>
+          <w:bCs/>
+          <w:lang w:val="hu-HU"/>
+        </w:rPr>
+        <w:t>Példa kérés:</w:t>
+      </w:r>
+      <w:r>
+        <w:rPr>
+          <w:lang w:val="hu-HU"/>
+        </w:rPr>
+        <w:t xml:space="preserve"> </w:t>
+      </w:r>
+      <w:r>
+        <w:rPr>
+          <w:rFonts w:ascii="Courier New" w:hAnsi="Courier New" w:cs="Courier New"/>
+          <w:lang w:val="hu-HU"/>
+        </w:rPr>
+        <w:t>GET | /</w:t>
+      </w:r>
+      <w:proofErr w:type="spellStart"/>
+      <w:r>
+        <w:rPr>
+          <w:rFonts w:ascii="Courier New" w:hAnsi="Courier New" w:cs="Courier New"/>
+          <w:lang w:val="hu-HU"/>
+        </w:rPr>
+        <w:t>api</w:t>
+      </w:r>
+      <w:proofErr w:type="spellEnd"/>
+      <w:r>
+        <w:rPr>
+          <w:rFonts w:ascii="Courier New" w:hAnsi="Courier New" w:cs="Courier New"/>
+          <w:lang w:val="hu-HU"/>
+        </w:rPr>
+        <w:t>/</w:t>
+      </w:r>
+      <w:proofErr w:type="spellStart"/>
+      <w:r>
+        <w:rPr>
+          <w:rFonts w:ascii="Courier New" w:hAnsi="Courier New" w:cs="Courier New"/>
+          <w:lang w:val="hu-HU"/>
+        </w:rPr>
+        <w:t>threads</w:t>
+      </w:r>
+      <w:proofErr w:type="spellEnd"/>
+      <w:r>
+        <w:rPr>
+          <w:rFonts w:ascii="Courier New" w:hAnsi="Courier New" w:cs="Courier New"/>
+          <w:lang w:val="hu-HU"/>
+        </w:rPr>
+        <w:t>/1</w:t>
+      </w:r>
+      <w:r>
+        <w:rPr>
+          <w:rFonts w:ascii="Courier New" w:hAnsi="Courier New" w:cs="Courier New"/>
+          <w:lang w:val="hu-HU"/>
+        </w:rPr>
+        <w:t>/</w:t>
+      </w:r>
+      <w:proofErr w:type="spellStart"/>
+      <w:r>
+        <w:rPr>
+          <w:rFonts w:ascii="Courier New" w:hAnsi="Courier New" w:cs="Courier New"/>
+          <w:lang w:val="hu-HU"/>
+        </w:rPr>
+        <w:t>posts</w:t>
+      </w:r>
+      <w:proofErr w:type="spellEnd"/>
+      <w:r>
+        <w:rPr>
+          <w:lang w:val="hu-HU"/>
+        </w:rPr>
+        <w:br/>
+      </w:r>
+      <w:r>
+        <w:rPr>
+          <w:b/>
+          <w:bCs/>
+          <w:lang w:val="hu-HU"/>
+        </w:rPr>
+        <w:t>Body:</w:t>
+      </w:r>
+      <w:r>
+        <w:rPr>
+          <w:b/>
+          <w:bCs/>
+          <w:lang w:val="hu-HU"/>
+        </w:rPr>
+        <w:t xml:space="preserve"> </w:t>
+      </w:r>
+      <w:r>
+        <w:rPr>
+          <w:lang w:val="hu-HU"/>
+        </w:rPr>
+        <w:t>-</w:t>
+      </w:r>
+      <w:r>
+        <w:rPr>
+          <w:lang w:val="hu-HU"/>
+        </w:rPr>
+        <w:br/>
+      </w:r>
+      <w:r>
+        <w:rPr>
+          <w:b/>
+          <w:bCs/>
+          <w:lang w:val="hu-HU"/>
+        </w:rPr>
+        <w:t>Korlátozás:</w:t>
+      </w:r>
+      <w:r>
+        <w:rPr>
+          <w:lang w:val="hu-HU"/>
+        </w:rPr>
+        <w:t xml:space="preserve"> Bejelentkezett felhasználóknak elérhető. Kivéve akiknek „</w:t>
+      </w:r>
+      <w:proofErr w:type="spellStart"/>
+      <w:r>
+        <w:rPr>
+          <w:lang w:val="hu-HU"/>
+        </w:rPr>
+        <w:t>banned</w:t>
+      </w:r>
+      <w:proofErr w:type="spellEnd"/>
+      <w:r>
+        <w:rPr>
+          <w:lang w:val="hu-HU"/>
+        </w:rPr>
+        <w:t xml:space="preserve">”-rangja van az adott </w:t>
+      </w:r>
+      <w:proofErr w:type="spellStart"/>
+      <w:r>
+        <w:rPr>
+          <w:lang w:val="hu-HU"/>
+        </w:rPr>
+        <w:t>thread</w:t>
+      </w:r>
+      <w:proofErr w:type="spellEnd"/>
+      <w:r>
+        <w:rPr>
+          <w:lang w:val="hu-HU"/>
+        </w:rPr>
+        <w:t>-ben</w:t>
+      </w:r>
+      <w:r>
+        <w:rPr>
+          <w:lang w:val="hu-HU"/>
+        </w:rPr>
+        <w:br/>
+      </w:r>
+      <w:r>
+        <w:rPr>
+          <w:b/>
+          <w:bCs/>
+          <w:lang w:val="hu-HU"/>
+        </w:rPr>
+        <w:t>Példa válasz:</w:t>
+      </w:r>
+      <w:r>
+        <w:rPr>
+          <w:b/>
+          <w:bCs/>
+          <w:lang w:val="hu-HU"/>
+        </w:rPr>
+        <w:t xml:space="preserve"> </w:t>
+      </w:r>
+      <w:r>
+        <w:rPr>
+          <w:lang w:val="hu-HU"/>
+        </w:rPr>
+        <w:t>(200 OK)</w:t>
+      </w:r>
+    </w:p>
+    <w:p>
+      <w:pPr>
+        <w:pStyle w:val="Kdblokk"/>
+      </w:pPr>
+      <w:r>
+        <w:lastRenderedPageBreak/>
+        <w:t>[</w:t>
+      </w:r>
+    </w:p>
+    <w:p>
+      <w:pPr>
+        <w:pStyle w:val="Kdblokk"/>
+      </w:pPr>
+      <w:r>
+        <w:t>…</w:t>
+      </w:r>
+    </w:p>
+    <w:p>
+      <w:pPr>
+        <w:pStyle w:val="Kdblokk"/>
+      </w:pPr>
+      <w:r>
+        <w:t xml:space="preserve">  {</w:t>
+      </w:r>
+    </w:p>
+    <w:p>
+      <w:pPr>
+        <w:pStyle w:val="Kdblokk"/>
+      </w:pPr>
+      <w:r>
+        <w:t xml:space="preserve">    "id": 1,</w:t>
+      </w:r>
+    </w:p>
+    <w:p>
+      <w:pPr>
+        <w:pStyle w:val="Kdblokk"/>
+      </w:pPr>
+      <w:r>
+        <w:t xml:space="preserve">    "content": "</w:t>
+      </w:r>
+      <w:proofErr w:type="spellStart"/>
+      <w:r>
+        <w:t>birkapasztorok</w:t>
+      </w:r>
+      <w:proofErr w:type="spellEnd"/>
+      <w:r>
+        <w:t>",</w:t>
+      </w:r>
+    </w:p>
+    <w:p>
+      <w:pPr>
+        <w:pStyle w:val="Kdblokk"/>
+      </w:pPr>
+      <w:r>
+        <w:t xml:space="preserve">    "image": null,</w:t>
+      </w:r>
+    </w:p>
+    <w:p>
+      <w:pPr>
+        <w:pStyle w:val="Kdblokk"/>
+      </w:pPr>
+      <w:r>
+        <w:t xml:space="preserve">    "user": {</w:t>
+      </w:r>
+    </w:p>
+    <w:p>
+      <w:pPr>
+        <w:pStyle w:val="Kdblokk"/>
+      </w:pPr>
+      <w:r>
+        <w:t xml:space="preserve">      "id": 2,</w:t>
+      </w:r>
+    </w:p>
+    <w:p>
+      <w:pPr>
+        <w:pStyle w:val="Kdblokk"/>
+      </w:pPr>
+      <w:r>
+        <w:t xml:space="preserve">      "name": "</w:t>
+      </w:r>
+      <w:proofErr w:type="spellStart"/>
+      <w:r>
+        <w:t>Gehér</w:t>
+      </w:r>
+      <w:proofErr w:type="spellEnd"/>
+      <w:r>
+        <w:t xml:space="preserve"> Marcell",</w:t>
+      </w:r>
+    </w:p>
+    <w:p>
+      <w:pPr>
+        <w:pStyle w:val="Kdblokk"/>
+      </w:pPr>
+      <w:r>
+        <w:t xml:space="preserve">      "email": "geher.marcell@students.jedlik.eu",</w:t>
+      </w:r>
+    </w:p>
+    <w:p>
+      <w:pPr>
+        <w:pStyle w:val="Kdblokk"/>
+      </w:pPr>
+      <w:r>
+        <w:t xml:space="preserve">      "</w:t>
+      </w:r>
+      <w:proofErr w:type="spellStart"/>
+      <w:r>
+        <w:t>image_url</w:t>
+      </w:r>
+      <w:proofErr w:type="spellEnd"/>
+      <w:r>
+        <w:t>": "https://jedligrambackend-</w:t>
+      </w:r>
+      <w:r>
+        <w:t xml:space="preserve"> </w:t>
+      </w:r>
+      <w:r>
+        <w:t>…</w:t>
+      </w:r>
+      <w:r>
+        <w:t xml:space="preserve"> </w:t>
+      </w:r>
+      <w:r>
+        <w:t>",</w:t>
+      </w:r>
+    </w:p>
+    <w:p>
+      <w:pPr>
+        <w:pStyle w:val="Kdblokk"/>
+      </w:pPr>
+      <w:r>
+        <w:t xml:space="preserve">      "bio": "</w:t>
+      </w:r>
+      <w:proofErr w:type="spellStart"/>
+      <w:r>
+        <w:t>Csáá</w:t>
+      </w:r>
+      <w:proofErr w:type="spellEnd"/>
+      <w:r>
+        <w:t>",</w:t>
+      </w:r>
+    </w:p>
+    <w:p>
+      <w:pPr>
+        <w:pStyle w:val="Kdblokk"/>
+      </w:pPr>
+      <w:r>
+        <w:t xml:space="preserve">      "</w:t>
+      </w:r>
+      <w:proofErr w:type="spellStart"/>
+      <w:r>
+        <w:t>post_karma</w:t>
+      </w:r>
+      <w:proofErr w:type="spellEnd"/>
+      <w:r>
+        <w:t>": 1</w:t>
+      </w:r>
+    </w:p>
+    <w:p>
+      <w:pPr>
+        <w:pStyle w:val="Kdblokk"/>
+      </w:pPr>
+      <w:r>
+        <w:t xml:space="preserve">    },</w:t>
+      </w:r>
+    </w:p>
+    <w:p>
+      <w:pPr>
+        <w:pStyle w:val="Kdblokk"/>
+      </w:pPr>
+      <w:r>
+        <w:t xml:space="preserve">    "</w:t>
+      </w:r>
+      <w:proofErr w:type="spellStart"/>
+      <w:r>
+        <w:t>thread_id</w:t>
+      </w:r>
+      <w:proofErr w:type="spellEnd"/>
+      <w:r>
+        <w:t>": 1,</w:t>
+      </w:r>
+    </w:p>
+    <w:p>
+      <w:pPr>
+        <w:pStyle w:val="Kdblokk"/>
+      </w:pPr>
+      <w:r>
+        <w:t xml:space="preserve">    "score": 1,</w:t>
+      </w:r>
+    </w:p>
+    <w:p>
+      <w:pPr>
+        <w:pStyle w:val="Kdblokk"/>
+      </w:pPr>
+      <w:r>
+        <w:t xml:space="preserve">    "age": "1 day ago"</w:t>
+      </w:r>
+    </w:p>
+    <w:p>
+      <w:pPr>
+        <w:pStyle w:val="Kdblokk"/>
+      </w:pPr>
+      <w:r>
+        <w:t xml:space="preserve">  }</w:t>
+      </w:r>
+    </w:p>
+    <w:p>
+      <w:pPr>
+        <w:pStyle w:val="Kdblokk"/>
+      </w:pPr>
+      <w:r>
+        <w:t>…</w:t>
+      </w:r>
+    </w:p>
+    <w:p>
+      <w:pPr>
+        <w:pStyle w:val="Kdblokk"/>
+      </w:pPr>
+      <w:r>
+        <w:t>]</w:t>
+      </w:r>
+    </w:p>
+    <w:p>
+      <w:pPr>
+        <w:rPr>
+          <w:b/>
+          <w:bCs/>
+          <w:lang w:val="hu-HU"/>
+        </w:rPr>
+      </w:pPr>
+      <w:r>
+        <w:rPr>
+          <w:b/>
+          <w:bCs/>
+          <w:lang w:val="hu-HU"/>
+        </w:rPr>
+        <w:t>PUT</w:t>
+      </w:r>
+      <w:r>
+        <w:rPr>
+          <w:lang w:val="hu-HU"/>
+        </w:rPr>
+        <w:t xml:space="preserve"> </w:t>
+      </w:r>
+      <w:proofErr w:type="spellStart"/>
+      <w:r>
+        <w:rPr>
+          <w:lang w:val="hu-HU"/>
+        </w:rPr>
+        <w:t>Th</w:t>
+      </w:r>
+      <w:r>
+        <w:rPr>
+          <w:lang w:val="hu-HU"/>
+        </w:rPr>
+        <w:t>reads</w:t>
+      </w:r>
+      <w:proofErr w:type="spellEnd"/>
+    </w:p>
+    <w:p>
+      <w:pPr>
+        <w:rPr>
+          <w:lang w:val="hu-HU"/>
+        </w:rPr>
+      </w:pPr>
+      <w:r>
+        <w:rPr>
+          <w:noProof/>
+          <w:lang w:val="hu-HU"/>
+        </w:rPr>
+        <w:drawing>
+          <wp:inline distT="0" distB="0" distL="0" distR="0" wp14:anchorId="33D48BCD" wp14:editId="3A7D1D95">
+            <wp:extent cx="5971540" cy="327660"/>
+            <wp:effectExtent l="0" t="0" r="0" b="0"/>
+            <wp:docPr id="296512543" name="Kép 6"/>
+            <wp:cNvGraphicFramePr>
+              <a:graphicFrameLocks xmlns:a="http://schemas.openxmlformats.org/drawingml/2006/main" noChangeAspect="1"/>
+            </wp:cNvGraphicFramePr>
+            <a:graphic xmlns:a="http://schemas.openxmlformats.org/drawingml/2006/main">
+              <a:graphicData uri="http://schemas.openxmlformats.org/drawingml/2006/picture">
+                <pic:pic xmlns:pic="http://schemas.openxmlformats.org/drawingml/2006/picture">
+                  <pic:nvPicPr>
+                    <pic:cNvPr id="296512543" name="Kép 296512543"/>
+                    <pic:cNvPicPr/>
+                  </pic:nvPicPr>
+                  <pic:blipFill>
+                    <a:blip r:embed="rId21">
+                      <a:extLst>
+                        <a:ext uri="{28A0092B-C50C-407E-A947-70E740481C1C}">
+                          <a14:useLocalDpi xmlns:a14="http://schemas.microsoft.com/office/drawing/2010/main" val="0"/>
+                        </a:ext>
+                      </a:extLst>
+                    </a:blip>
+                    <a:stretch>
+                      <a:fillRect/>
+                    </a:stretch>
+                  </pic:blipFill>
+                  <pic:spPr>
+                    <a:xfrm>
+                      <a:off x="0" y="0"/>
+                      <a:ext cx="5971540" cy="327660"/>
+                    </a:xfrm>
+                    <a:prstGeom prst="rect">
+                      <a:avLst/>
+                    </a:prstGeom>
+                  </pic:spPr>
+                </pic:pic>
+              </a:graphicData>
+            </a:graphic>
+          </wp:inline>
+        </w:drawing>
+      </w:r>
+    </w:p>
+    <w:p>
+      <w:pPr>
+        <w:jc w:val="left"/>
+        <w:rPr>
+          <w:lang w:val="hu-HU"/>
+        </w:rPr>
+      </w:pPr>
+      <w:r>
+        <w:rPr>
+          <w:b/>
+          <w:bCs/>
+          <w:lang w:val="hu-HU"/>
+        </w:rPr>
+        <w:t>Példa kérés:</w:t>
+      </w:r>
+      <w:r>
+        <w:rPr>
+          <w:b/>
+          <w:bCs/>
+          <w:lang w:val="hu-HU"/>
+        </w:rPr>
+        <w:t xml:space="preserve"> </w:t>
+      </w:r>
+      <w:r>
+        <w:rPr>
+          <w:rFonts w:ascii="Courier New" w:hAnsi="Courier New" w:cs="Courier New"/>
+          <w:lang w:val="hu-HU"/>
+        </w:rPr>
+        <w:t>PUT</w:t>
+      </w:r>
+      <w:r>
+        <w:rPr>
+          <w:rFonts w:ascii="Courier New" w:hAnsi="Courier New" w:cs="Courier New"/>
+          <w:lang w:val="hu-HU"/>
+        </w:rPr>
+        <w:t>| /</w:t>
+      </w:r>
+      <w:proofErr w:type="spellStart"/>
+      <w:r>
+        <w:rPr>
+          <w:rFonts w:ascii="Courier New" w:hAnsi="Courier New" w:cs="Courier New"/>
+          <w:lang w:val="hu-HU"/>
+        </w:rPr>
+        <w:t>api</w:t>
+      </w:r>
+      <w:proofErr w:type="spellEnd"/>
+      <w:r>
+        <w:rPr>
+          <w:rFonts w:ascii="Courier New" w:hAnsi="Courier New" w:cs="Courier New"/>
+          <w:lang w:val="hu-HU"/>
+        </w:rPr>
+        <w:t>/</w:t>
+      </w:r>
+      <w:proofErr w:type="spellStart"/>
+      <w:r>
+        <w:rPr>
+          <w:rFonts w:ascii="Courier New" w:hAnsi="Courier New" w:cs="Courier New"/>
+          <w:lang w:val="hu-HU"/>
+        </w:rPr>
+        <w:t>threads</w:t>
+      </w:r>
+      <w:proofErr w:type="spellEnd"/>
+      <w:r>
+        <w:rPr>
+          <w:rFonts w:ascii="Courier New" w:hAnsi="Courier New" w:cs="Courier New"/>
+          <w:lang w:val="hu-HU"/>
+        </w:rPr>
+        <w:t>/1</w:t>
+      </w:r>
+      <w:r>
+        <w:rPr>
+          <w:lang w:val="hu-HU"/>
+        </w:rPr>
+        <w:br/>
+      </w:r>
+      <w:r>
+        <w:rPr>
+          <w:b/>
+          <w:bCs/>
+          <w:lang w:val="hu-HU"/>
+        </w:rPr>
+        <w:t>Body:</w:t>
+      </w:r>
+      <w:r>
+        <w:rPr>
+          <w:b/>
+          <w:bCs/>
+          <w:lang w:val="hu-HU"/>
+        </w:rPr>
+        <w:t xml:space="preserve"> </w:t>
+      </w:r>
+    </w:p>
+    <w:p>
+      <w:pPr>
+        <w:pStyle w:val="Kdblokk"/>
+        <w:rPr>
+          <w:lang w:val="hu-HU"/>
+        </w:rPr>
+      </w:pPr>
+      <w:r>
+        <w:rPr>
+          <w:lang w:val="hu-HU"/>
+        </w:rPr>
+        <w:t>{</w:t>
+      </w:r>
+    </w:p>
+    <w:p>
+      <w:pPr>
+        <w:pStyle w:val="Kdblokk"/>
+        <w:rPr>
+          <w:lang w:val="hu-HU"/>
+        </w:rPr>
+      </w:pPr>
+      <w:r>
+        <w:rPr>
+          <w:lang w:val="hu-HU"/>
+        </w:rPr>
+        <w:t xml:space="preserve">  "</w:t>
+      </w:r>
+      <w:proofErr w:type="spellStart"/>
+      <w:r>
+        <w:rPr>
+          <w:lang w:val="hu-HU"/>
+        </w:rPr>
+        <w:t>name</w:t>
+      </w:r>
+      <w:proofErr w:type="spellEnd"/>
+      <w:r>
+        <w:rPr>
+          <w:lang w:val="hu-HU"/>
+        </w:rPr>
+        <w:t>": "</w:t>
+      </w:r>
+      <w:proofErr w:type="spellStart"/>
+      <w:r>
+        <w:rPr>
+          <w:lang w:val="hu-HU"/>
+        </w:rPr>
+        <w:t>string</w:t>
+      </w:r>
+      <w:proofErr w:type="spellEnd"/>
+      <w:r>
+        <w:rPr>
+          <w:lang w:val="hu-HU"/>
+        </w:rPr>
+        <w:t>",</w:t>
+      </w:r>
+    </w:p>
+    <w:p>
+      <w:pPr>
+        <w:pStyle w:val="Kdblokk"/>
+        <w:rPr>
+          <w:lang w:val="hu-HU"/>
+        </w:rPr>
+      </w:pPr>
+      <w:r>
+        <w:rPr>
+          <w:lang w:val="hu-HU"/>
+        </w:rPr>
+        <w:t xml:space="preserve">  "</w:t>
+      </w:r>
+      <w:proofErr w:type="spellStart"/>
+      <w:r>
+        <w:rPr>
+          <w:lang w:val="hu-HU"/>
+        </w:rPr>
+        <w:t>description</w:t>
+      </w:r>
+      <w:proofErr w:type="spellEnd"/>
+      <w:r>
+        <w:rPr>
+          <w:lang w:val="hu-HU"/>
+        </w:rPr>
+        <w:t>": "</w:t>
+      </w:r>
+      <w:proofErr w:type="spellStart"/>
+      <w:r>
+        <w:rPr>
+          <w:lang w:val="hu-HU"/>
+        </w:rPr>
+        <w:t>string</w:t>
+      </w:r>
+      <w:proofErr w:type="spellEnd"/>
+      <w:r>
+        <w:rPr>
+          <w:lang w:val="hu-HU"/>
+        </w:rPr>
+        <w:t>",</w:t>
+      </w:r>
+    </w:p>
+    <w:p>
+      <w:pPr>
+        <w:pStyle w:val="Kdblokk"/>
+        <w:rPr>
+          <w:lang w:val="hu-HU"/>
+        </w:rPr>
+      </w:pPr>
+      <w:r>
+        <w:rPr>
+          <w:lang w:val="hu-HU"/>
+        </w:rPr>
+        <w:t xml:space="preserve">  "</w:t>
+      </w:r>
+      <w:proofErr w:type="spellStart"/>
+      <w:r>
+        <w:rPr>
+          <w:lang w:val="hu-HU"/>
+        </w:rPr>
+        <w:t>rules</w:t>
+      </w:r>
+      <w:proofErr w:type="spellEnd"/>
+      <w:r>
+        <w:rPr>
+          <w:lang w:val="hu-HU"/>
+        </w:rPr>
+        <w:t>": "</w:t>
+      </w:r>
+      <w:proofErr w:type="spellStart"/>
+      <w:r>
+        <w:rPr>
+          <w:lang w:val="hu-HU"/>
+        </w:rPr>
+        <w:t>string</w:t>
+      </w:r>
+      <w:proofErr w:type="spellEnd"/>
+      <w:r>
+        <w:rPr>
+          <w:lang w:val="hu-HU"/>
+        </w:rPr>
+        <w:t>"</w:t>
+      </w:r>
+      <w:r>
+        <w:rPr>
+          <w:lang w:val="hu-HU"/>
+        </w:rPr>
+        <w:t xml:space="preserve"> </w:t>
+      </w:r>
+    </w:p>
+    <w:p>
+      <w:pPr>
+        <w:pStyle w:val="Kdblokk"/>
+        <w:rPr>
+          <w:lang w:val="hu-HU"/>
+        </w:rPr>
+      </w:pPr>
+      <w:r>
+        <w:rPr>
+          <w:lang w:val="hu-HU"/>
+        </w:rPr>
+        <w:lastRenderedPageBreak/>
+        <w:t>}</w:t>
+      </w:r>
+    </w:p>
+    <w:p>
+      <w:pPr>
+        <w:jc w:val="left"/>
+        <w:rPr>
+          <w:lang w:val="hu-HU"/>
+        </w:rPr>
+      </w:pPr>
+      <w:r>
+        <w:rPr>
+          <w:b/>
+          <w:bCs/>
+          <w:lang w:val="hu-HU"/>
+        </w:rPr>
+        <w:t>Korlátozás:</w:t>
+      </w:r>
+      <w:r>
+        <w:rPr>
+          <w:lang w:val="hu-HU"/>
+        </w:rPr>
+        <w:t xml:space="preserve"> Csak az adott </w:t>
+      </w:r>
+      <w:proofErr w:type="spellStart"/>
+      <w:r>
+        <w:rPr>
+          <w:lang w:val="hu-HU"/>
+        </w:rPr>
+        <w:t>thread</w:t>
+      </w:r>
+      <w:proofErr w:type="spellEnd"/>
+      <w:r>
+        <w:rPr>
+          <w:lang w:val="hu-HU"/>
+        </w:rPr>
+        <w:t xml:space="preserve"> „</w:t>
+      </w:r>
+      <w:proofErr w:type="spellStart"/>
+      <w:r>
+        <w:rPr>
+          <w:lang w:val="hu-HU"/>
+        </w:rPr>
+        <w:t>admin</w:t>
+      </w:r>
+      <w:proofErr w:type="spellEnd"/>
+      <w:r>
+        <w:rPr>
+          <w:lang w:val="hu-HU"/>
+        </w:rPr>
+        <w:t>” ranggal rendelkező felhasználói számára elérhető.</w:t>
+      </w:r>
+      <w:r>
+        <w:rPr>
+          <w:lang w:val="hu-HU"/>
+        </w:rPr>
+        <w:br/>
+      </w:r>
+      <w:r>
+        <w:rPr>
+          <w:b/>
+          <w:bCs/>
+          <w:lang w:val="hu-HU"/>
+        </w:rPr>
+        <w:t>Példa válasz:</w:t>
+      </w:r>
+      <w:r>
+        <w:rPr>
+          <w:b/>
+          <w:bCs/>
+          <w:lang w:val="hu-HU"/>
+        </w:rPr>
+        <w:t xml:space="preserve"> </w:t>
+      </w:r>
+      <w:r>
+        <w:rPr>
+          <w:lang w:val="hu-HU"/>
+        </w:rPr>
+        <w:t>(20</w:t>
+      </w:r>
+      <w:r>
+        <w:rPr>
+          <w:lang w:val="hu-HU"/>
+        </w:rPr>
+        <w:t>0 OK</w:t>
+      </w:r>
+      <w:r>
+        <w:rPr>
+          <w:lang w:val="hu-HU"/>
+        </w:rPr>
+        <w:t>)</w:t>
+      </w:r>
+    </w:p>
+    <w:p>
+      <w:pPr>
+        <w:pStyle w:val="Kdblokk"/>
+      </w:pPr>
+      <w:r>
+        <w:t>{</w:t>
+      </w:r>
+    </w:p>
+    <w:p>
+      <w:pPr>
+        <w:pStyle w:val="Kdblokk"/>
+      </w:pPr>
+      <w:r>
         <w:t xml:space="preserve">  "id": </w:t>
       </w:r>
       <w:r>
@@ -2331,23 +6395,34 @@
         <w:pStyle w:val="Kdblokk"/>
       </w:pPr>
       <w:r>
-        <w:t xml:space="preserve">  "email": "string",</w:t>
-      </w:r>
-    </w:p>
-    <w:p>
-      <w:pPr>
-        <w:pStyle w:val="Kdblokk"/>
-      </w:pPr>
-      <w:r>
-        <w:t xml:space="preserve">  "image_url": "string",</w:t>
-      </w:r>
-    </w:p>
-    <w:p>
-      <w:pPr>
-        <w:pStyle w:val="Kdblokk"/>
-      </w:pPr>
-      <w:r>
-        <w:t xml:space="preserve">  "bio": "string"</w:t>
+        <w:t xml:space="preserve">  "description": "string",</w:t>
+      </w:r>
+    </w:p>
+    <w:p>
+      <w:pPr>
+        <w:pStyle w:val="Kdblokk"/>
+      </w:pPr>
+      <w:r>
+        <w:t xml:space="preserve">  "rules": "string",</w:t>
+      </w:r>
+    </w:p>
+    <w:p>
+      <w:pPr>
+        <w:pStyle w:val="Kdblokk"/>
+      </w:pPr>
+      <w:r>
+        <w:t xml:space="preserve">  "</w:t>
+      </w:r>
+      <w:proofErr w:type="spellStart"/>
+      <w:r>
+        <w:t>users_count</w:t>
+      </w:r>
+      <w:proofErr w:type="spellEnd"/>
+      <w:r>
+        <w:t xml:space="preserve">": </w:t>
+      </w:r>
+      <w:r>
+        <w:t>1</w:t>
       </w:r>
       <w:r>
         <w:t>,</w:t>
@@ -2358,10 +6433,27 @@
         <w:pStyle w:val="Kdblokk"/>
       </w:pPr>
       <w:r>
-        <w:t xml:space="preserve">  </w:t>
-      </w:r>
-      <w:r>
-        <w:t>"post_karma": 0</w:t>
+        <w:t xml:space="preserve">  "image": "</w:t>
+      </w:r>
+      <w:r>
+        <w:t>null</w:t>
+      </w:r>
+      <w:r>
+        <w:t>",</w:t>
+      </w:r>
+    </w:p>
+    <w:p>
+      <w:pPr>
+        <w:pStyle w:val="Kdblokk"/>
+      </w:pPr>
+      <w:r>
+        <w:t xml:space="preserve">  "header": "</w:t>
+      </w:r>
+      <w:r>
+        <w:t>null</w:t>
+      </w:r>
+      <w:r>
+        <w:t>"</w:t>
       </w:r>
     </w:p>
     <w:p>
@@ -2372,8 +6464,16 @@
         <w:t>}</w:t>
       </w:r>
     </w:p>
+    <w:p>
+      <w:pPr>
+        <w:rPr>
+          <w:b/>
+          <w:bCs/>
+        </w:rPr>
+      </w:pPr>
+    </w:p>
     <w:sectPr>
-      <w:footerReference w:type="default" r:id="rId16"/>
+      <w:footerReference w:type="default" r:id="rId22"/>
       <w:pgSz w:w="12240" w:h="15840"/>
       <w:pgMar w:top="1418" w:right="1418" w:bottom="1418" w:left="1418" w:header="720" w:footer="720" w:gutter="0"/>
       <w:cols w:space="720"/>
@@ -3432,7 +7532,7 @@
   <w:style w:type="paragraph" w:default="1" w:styleId="Norml">
     <w:name w:val="Normal"/>
     <w:qFormat/>
-    <w:rsid w:val="00BA296F"/>
+    <w:rsid w:val="00194026"/>
     <w:pPr>
       <w:spacing w:before="120" w:line="360" w:lineRule="auto"/>
       <w:jc w:val="both"/>

</xml_diff>

<commit_message>
docs: update API documentation for ThreadUsers endpoints
</commit_message>
<xml_diff>
--- a/zarovizsga.docx
+++ b/zarovizsga.docx
@@ -68,7 +68,21 @@
         <w:rPr>
           <w:lang w:val="hu-HU"/>
         </w:rPr>
-        <w:t>Ide majd szöveg arról hogy melyik végpontok milyen jogosultsággal érhetőek el</w:t>
+        <w:t xml:space="preserve">Ide majd szöveg </w:t>
+      </w:r>
+      <w:proofErr w:type="gramStart"/>
+      <w:r>
+        <w:rPr>
+          <w:lang w:val="hu-HU"/>
+        </w:rPr>
+        <w:t>arról</w:t>
+      </w:r>
+      <w:proofErr w:type="gramEnd"/>
+      <w:r>
+        <w:rPr>
+          <w:lang w:val="hu-HU"/>
+        </w:rPr>
+        <w:t xml:space="preserve"> hogy melyik végpontok milyen jogosultsággal érhetőek el</w:t>
       </w:r>
     </w:p>
     <w:p>
@@ -332,7 +346,16 @@
           <w:bCs/>
           <w:lang w:val="hu-HU"/>
         </w:rPr>
-        <w:t>Támogatott paraméterek:</w:t>
+        <w:t>Támogatott paraméterek</w:t>
+      </w:r>
+      <w:proofErr w:type="gramStart"/>
+      <w:r>
+        <w:rPr>
+          <w:b/>
+          <w:bCs/>
+          <w:lang w:val="hu-HU"/>
+        </w:rPr>
+        <w:t>:</w:t>
       </w:r>
       <w:r>
         <w:rPr>
@@ -362,6 +385,7 @@
         <w:t>search</w:t>
       </w:r>
       <w:proofErr w:type="spellEnd"/>
+      <w:proofErr w:type="gramEnd"/>
       <w:r>
         <w:rPr>
           <w:rFonts w:ascii="Courier New" w:hAnsi="Courier New" w:cs="Courier New"/>
@@ -384,7 +408,21 @@
         <w:rPr>
           <w:lang w:val="hu-HU"/>
         </w:rPr>
-        <w:t>Támogatja a szűrést a felhasználó azonosítója, neve, vagy email címe alapján</w:t>
+        <w:t xml:space="preserve">Támogatja a szűrést a felhasználó azonosítója, </w:t>
+      </w:r>
+      <w:proofErr w:type="gramStart"/>
+      <w:r>
+        <w:rPr>
+          <w:lang w:val="hu-HU"/>
+        </w:rPr>
+        <w:t>neve,</w:t>
+      </w:r>
+      <w:proofErr w:type="gramEnd"/>
+      <w:r>
+        <w:rPr>
+          <w:lang w:val="hu-HU"/>
+        </w:rPr>
+        <w:t xml:space="preserve"> vagy email címe alapján</w:t>
       </w:r>
       <w:r>
         <w:rPr>
@@ -494,8 +532,13 @@
         <w:t xml:space="preserve">    "</w:t>
       </w:r>
       <w:proofErr w:type="spellStart"/>
-      <w:r>
-        <w:t>image_url</w:t>
+      <w:proofErr w:type="gramStart"/>
+      <w:r>
+        <w:t>image</w:t>
+      </w:r>
+      <w:proofErr w:type="gramEnd"/>
+      <w:r>
+        <w:t>_url</w:t>
       </w:r>
       <w:proofErr w:type="spellEnd"/>
       <w:r>
@@ -524,8 +567,13 @@
         <w:t>"</w:t>
       </w:r>
       <w:proofErr w:type="spellStart"/>
-      <w:r>
-        <w:t>post_karma</w:t>
+      <w:proofErr w:type="gramStart"/>
+      <w:r>
+        <w:t>post</w:t>
+      </w:r>
+      <w:proofErr w:type="gramEnd"/>
+      <w:r>
+        <w:t>_karma</w:t>
       </w:r>
       <w:proofErr w:type="spellEnd"/>
       <w:r>
@@ -854,8 +902,13 @@
         <w:t xml:space="preserve">    "</w:t>
       </w:r>
       <w:proofErr w:type="spellStart"/>
-      <w:r>
-        <w:t>image_url</w:t>
+      <w:proofErr w:type="gramStart"/>
+      <w:r>
+        <w:t>image</w:t>
+      </w:r>
+      <w:proofErr w:type="gramEnd"/>
+      <w:r>
+        <w:t>_url</w:t>
       </w:r>
       <w:proofErr w:type="spellEnd"/>
       <w:r>
@@ -884,8 +937,13 @@
         <w:t>"</w:t>
       </w:r>
       <w:proofErr w:type="spellStart"/>
-      <w:r>
-        <w:t>post_karma</w:t>
+      <w:proofErr w:type="gramStart"/>
+      <w:r>
+        <w:t>post</w:t>
+      </w:r>
+      <w:proofErr w:type="gramEnd"/>
+      <w:r>
+        <w:t>_karma</w:t>
       </w:r>
       <w:proofErr w:type="spellEnd"/>
       <w:r>
@@ -1325,8 +1383,13 @@
         <w:t xml:space="preserve">    "</w:t>
       </w:r>
       <w:proofErr w:type="spellStart"/>
-      <w:r>
-        <w:t>users_count</w:t>
+      <w:proofErr w:type="gramStart"/>
+      <w:r>
+        <w:t>users</w:t>
+      </w:r>
+      <w:proofErr w:type="gramEnd"/>
+      <w:r>
+        <w:t>_count</w:t>
       </w:r>
       <w:proofErr w:type="spellEnd"/>
       <w:r>
@@ -1703,7 +1766,15 @@
         <w:pStyle w:val="Kdblokk"/>
       </w:pPr>
       <w:r>
-        <w:t xml:space="preserve">  "access_token"</w:t>
+        <w:t xml:space="preserve">  "</w:t>
+      </w:r>
+      <w:proofErr w:type="gramStart"/>
+      <w:r>
+        <w:t>access</w:t>
+      </w:r>
+      <w:proofErr w:type="gramEnd"/>
+      <w:r>
+        <w:t>_token"</w:t>
       </w:r>
       <w:r>
         <w:t>:</w:t>
@@ -1732,8 +1803,13 @@
         <w:t xml:space="preserve">  "</w:t>
       </w:r>
       <w:proofErr w:type="spellStart"/>
-      <w:r>
-        <w:t>token_type</w:t>
+      <w:proofErr w:type="gramStart"/>
+      <w:r>
+        <w:t>token</w:t>
+      </w:r>
+      <w:proofErr w:type="gramEnd"/>
+      <w:r>
+        <w:t>_type</w:t>
       </w:r>
       <w:proofErr w:type="spellEnd"/>
       <w:r>
@@ -1792,8 +1868,13 @@
         <w:t xml:space="preserve">    "</w:t>
       </w:r>
       <w:proofErr w:type="spellStart"/>
-      <w:r>
-        <w:t>image_url</w:t>
+      <w:proofErr w:type="gramStart"/>
+      <w:r>
+        <w:t>image</w:t>
+      </w:r>
+      <w:proofErr w:type="gramEnd"/>
+      <w:r>
+        <w:t>_url</w:t>
       </w:r>
       <w:proofErr w:type="spellEnd"/>
       <w:r>
@@ -1834,8 +1915,13 @@
         <w:t>"</w:t>
       </w:r>
       <w:proofErr w:type="spellStart"/>
-      <w:r>
-        <w:t>post_karma</w:t>
+      <w:proofErr w:type="gramStart"/>
+      <w:r>
+        <w:t>post</w:t>
+      </w:r>
+      <w:proofErr w:type="gramEnd"/>
+      <w:r>
+        <w:t>_karma</w:t>
       </w:r>
       <w:proofErr w:type="spellEnd"/>
       <w:r>
@@ -2464,8 +2550,13 @@
         <w:t xml:space="preserve">    "</w:t>
       </w:r>
       <w:proofErr w:type="spellStart"/>
-      <w:r>
-        <w:t>image_url</w:t>
+      <w:proofErr w:type="gramStart"/>
+      <w:r>
+        <w:t>image</w:t>
+      </w:r>
+      <w:proofErr w:type="gramEnd"/>
+      <w:r>
+        <w:t>_url</w:t>
       </w:r>
       <w:proofErr w:type="spellEnd"/>
       <w:r>
@@ -2475,10 +2566,20 @@
         <w:tab/>
       </w:r>
       <w:proofErr w:type="spellStart"/>
-      <w:r>
-        <w:t>gehermarcell.jcloud.jedlik.cloud</w:t>
-      </w:r>
-      <w:proofErr w:type="spellEnd"/>
+      <w:proofErr w:type="gramStart"/>
+      <w:r>
+        <w:t>gehermarcell.jcloud</w:t>
+      </w:r>
+      <w:proofErr w:type="gramEnd"/>
+      <w:r>
+        <w:t>.</w:t>
+      </w:r>
+      <w:proofErr w:type="gramStart"/>
+      <w:r>
+        <w:t>jedlik.cloud</w:t>
+      </w:r>
+      <w:proofErr w:type="spellEnd"/>
+      <w:proofErr w:type="gramEnd"/>
       <w:r>
         <w:t>/storage/</w:t>
       </w:r>
@@ -2520,8 +2621,13 @@
         <w:t>"</w:t>
       </w:r>
       <w:proofErr w:type="spellStart"/>
-      <w:r>
-        <w:t>post_karma</w:t>
+      <w:proofErr w:type="gramStart"/>
+      <w:r>
+        <w:t>post</w:t>
+      </w:r>
+      <w:proofErr w:type="gramEnd"/>
+      <w:r>
+        <w:t>_karma</w:t>
       </w:r>
       <w:proofErr w:type="spellEnd"/>
       <w:r>
@@ -2958,8 +3064,13 @@
         <w:t xml:space="preserve">  "</w:t>
       </w:r>
       <w:proofErr w:type="spellStart"/>
-      <w:r>
-        <w:t>image_url</w:t>
+      <w:proofErr w:type="gramStart"/>
+      <w:r>
+        <w:t>image</w:t>
+      </w:r>
+      <w:proofErr w:type="gramEnd"/>
+      <w:r>
+        <w:t>_url</w:t>
       </w:r>
       <w:proofErr w:type="spellEnd"/>
       <w:r>
@@ -2988,8 +3099,13 @@
         <w:t>"</w:t>
       </w:r>
       <w:proofErr w:type="spellStart"/>
-      <w:r>
-        <w:t>post_karma</w:t>
+      <w:proofErr w:type="gramStart"/>
+      <w:r>
+        <w:t>post</w:t>
+      </w:r>
+      <w:proofErr w:type="gramEnd"/>
+      <w:r>
+        <w:t>_karma</w:t>
       </w:r>
       <w:proofErr w:type="spellEnd"/>
       <w:r>
@@ -3015,19 +3131,7 @@
         <w:rPr>
           <w:lang w:val="hu-HU"/>
         </w:rPr>
-        <w:t>1.2.</w:t>
-      </w:r>
-      <w:r>
-        <w:rPr>
-          <w:lang w:val="hu-HU"/>
-        </w:rPr>
-        <w:t>2Thread</w:t>
-      </w:r>
-      <w:r>
-        <w:rPr>
-          <w:lang w:val="hu-HU"/>
-        </w:rPr>
-        <w:t xml:space="preserve"> kontroller</w:t>
+        <w:t>1.2.2Thread kontroller</w:t>
       </w:r>
     </w:p>
     <w:p>
@@ -3237,7 +3341,16 @@
           <w:bCs/>
           <w:lang w:val="hu-HU"/>
         </w:rPr>
-        <w:t>Támogatott paraméterek:</w:t>
+        <w:t>Támogatott paraméterek</w:t>
+      </w:r>
+      <w:proofErr w:type="gramStart"/>
+      <w:r>
+        <w:rPr>
+          <w:b/>
+          <w:bCs/>
+          <w:lang w:val="hu-HU"/>
+        </w:rPr>
+        <w:t>:</w:t>
       </w:r>
       <w:r>
         <w:rPr>
@@ -3267,6 +3380,7 @@
         <w:t>search</w:t>
       </w:r>
       <w:proofErr w:type="spellEnd"/>
+      <w:proofErr w:type="gramEnd"/>
       <w:r>
         <w:rPr>
           <w:rFonts w:ascii="Courier New" w:hAnsi="Courier New" w:cs="Courier New"/>
@@ -3289,70 +3403,64 @@
         <w:rPr>
           <w:lang w:val="hu-HU"/>
         </w:rPr>
-        <w:t>Támogatja a szűrést a</w:t>
-      </w:r>
-      <w:r>
-        <w:rPr>
+        <w:t xml:space="preserve">Támogatja a szűrést a </w:t>
+      </w:r>
+      <w:proofErr w:type="spellStart"/>
+      <w:r>
+        <w:rPr>
+          <w:lang w:val="hu-HU"/>
+        </w:rPr>
+        <w:t>Thread</w:t>
+      </w:r>
+      <w:proofErr w:type="spellEnd"/>
+      <w:r>
+        <w:rPr>
+          <w:lang w:val="hu-HU"/>
+        </w:rPr>
+        <w:t xml:space="preserve"> neve alapján</w:t>
+      </w:r>
+      <w:r>
+        <w:rPr>
+          <w:lang w:val="hu-HU"/>
+        </w:rPr>
+        <w:br/>
+      </w:r>
+      <w:r>
+        <w:rPr>
+          <w:b/>
+          <w:bCs/>
+          <w:lang w:val="hu-HU"/>
+        </w:rPr>
+        <w:t>Korlátozás:</w:t>
+      </w:r>
+      <w:r>
+        <w:rPr>
+          <w:lang w:val="hu-HU"/>
+        </w:rPr>
+        <w:t xml:space="preserve"> Minden felhasználónak elérhető </w:t>
+      </w:r>
+      <w:r>
+        <w:rPr>
+          <w:lang w:val="hu-HU"/>
+        </w:rPr>
+        <w:br/>
+      </w:r>
+      <w:r>
+        <w:rPr>
+          <w:b/>
+          <w:bCs/>
+          <w:lang w:val="hu-HU"/>
+        </w:rPr>
+        <w:t>Példa válasz:</w:t>
+      </w:r>
+      <w:r>
+        <w:rPr>
+          <w:b/>
+          <w:bCs/>
           <w:lang w:val="hu-HU"/>
         </w:rPr>
         <w:t xml:space="preserve"> </w:t>
       </w:r>
-      <w:proofErr w:type="spellStart"/>
-      <w:r>
-        <w:rPr>
-          <w:lang w:val="hu-HU"/>
-        </w:rPr>
-        <w:t>Thread</w:t>
-      </w:r>
-      <w:proofErr w:type="spellEnd"/>
-      <w:r>
-        <w:rPr>
-          <w:lang w:val="hu-HU"/>
-        </w:rPr>
-        <w:t xml:space="preserve"> neve alapján</w:t>
-      </w:r>
-      <w:r>
-        <w:rPr>
-          <w:lang w:val="hu-HU"/>
-        </w:rPr>
-        <w:br/>
-      </w:r>
-      <w:r>
-        <w:rPr>
-          <w:b/>
-          <w:bCs/>
-          <w:lang w:val="hu-HU"/>
-        </w:rPr>
-        <w:t>Korlátozás:</w:t>
-      </w:r>
-      <w:r>
-        <w:rPr>
-          <w:lang w:val="hu-HU"/>
-        </w:rPr>
-        <w:t xml:space="preserve"> Minden felhasználónak elérhető </w:t>
-      </w:r>
-      <w:r>
-        <w:rPr>
-          <w:lang w:val="hu-HU"/>
-        </w:rPr>
-        <w:br/>
-      </w:r>
-      <w:r>
-        <w:rPr>
-          <w:b/>
-          <w:bCs/>
-          <w:lang w:val="hu-HU"/>
-        </w:rPr>
-        <w:t>Példa válasz:</w:t>
-      </w:r>
-      <w:r>
-        <w:rPr>
-          <w:b/>
-          <w:bCs/>
-          <w:lang w:val="hu-HU"/>
-        </w:rPr>
-        <w:t xml:space="preserve"> </w:t>
-      </w:r>
       <w:r>
         <w:rPr>
           <w:lang w:val="hu-HU"/>
@@ -3460,8 +3568,13 @@
         <w:t xml:space="preserve">    "</w:t>
       </w:r>
       <w:proofErr w:type="spellStart"/>
-      <w:r>
-        <w:t>users_count</w:t>
+      <w:proofErr w:type="gramStart"/>
+      <w:r>
+        <w:t>users</w:t>
+      </w:r>
+      <w:proofErr w:type="gramEnd"/>
+      <w:r>
+        <w:t>_count</w:t>
       </w:r>
       <w:proofErr w:type="spellEnd"/>
       <w:r>
@@ -3729,15 +3842,10 @@
         <w:rPr>
           <w:lang w:val="hu-HU"/>
         </w:rPr>
-        <w:t xml:space="preserve"> </w:t>
-      </w:r>
-      <w:r>
-        <w:rPr>
-          <w:lang w:val="hu-HU"/>
-        </w:rPr>
-        <w:t>Bejelentkezett felhasználóknak elérhető. Kivéve akiknek „</w:t>
-      </w:r>
-      <w:proofErr w:type="spellStart"/>
+        <w:t xml:space="preserve"> Bejelentkezett felhasználóknak elérhető. Kivéve akiknek „</w:t>
+      </w:r>
+      <w:proofErr w:type="spellStart"/>
+      <w:proofErr w:type="gramStart"/>
       <w:r>
         <w:rPr>
           <w:lang w:val="hu-HU"/>
@@ -3749,7 +3857,14 @@
         <w:rPr>
           <w:lang w:val="hu-HU"/>
         </w:rPr>
-        <w:t xml:space="preserve">”-rangja van az adott </w:t>
+        <w:t>”-</w:t>
+      </w:r>
+      <w:proofErr w:type="gramEnd"/>
+      <w:r>
+        <w:rPr>
+          <w:lang w:val="hu-HU"/>
+        </w:rPr>
+        <w:t xml:space="preserve">rangja van az adott </w:t>
       </w:r>
       <w:proofErr w:type="spellStart"/>
       <w:r>
@@ -3862,10 +3977,7 @@
         <w:t xml:space="preserve"> …</w:t>
       </w:r>
       <w:r>
-        <w:t xml:space="preserve"> </w:t>
-      </w:r>
-      <w:r>
-        <w:t>",</w:t>
+        <w:t xml:space="preserve"> ",</w:t>
       </w:r>
     </w:p>
     <w:p>
@@ -3876,8 +3988,13 @@
         <w:t xml:space="preserve">  "</w:t>
       </w:r>
       <w:proofErr w:type="spellStart"/>
-      <w:r>
-        <w:t>users_count</w:t>
+      <w:proofErr w:type="gramStart"/>
+      <w:r>
+        <w:t>users</w:t>
+      </w:r>
+      <w:proofErr w:type="gramEnd"/>
+      <w:r>
+        <w:t>_count</w:t>
       </w:r>
       <w:proofErr w:type="spellEnd"/>
       <w:r>
@@ -4356,8 +4473,13 @@
         <w:t xml:space="preserve">  "</w:t>
       </w:r>
       <w:proofErr w:type="spellStart"/>
-      <w:r>
-        <w:t>users_count</w:t>
+      <w:proofErr w:type="gramStart"/>
+      <w:r>
+        <w:t>users</w:t>
+      </w:r>
+      <w:proofErr w:type="gramEnd"/>
+      <w:r>
+        <w:t>_count</w:t>
       </w:r>
       <w:proofErr w:type="spellEnd"/>
       <w:r>
@@ -4827,8 +4949,13 @@
         <w:t xml:space="preserve">    "</w:t>
       </w:r>
       <w:proofErr w:type="spellStart"/>
-      <w:r>
-        <w:t>users_count</w:t>
+      <w:proofErr w:type="gramStart"/>
+      <w:r>
+        <w:t>users</w:t>
+      </w:r>
+      <w:proofErr w:type="gramEnd"/>
+      <w:r>
+        <w:t>_count</w:t>
       </w:r>
       <w:proofErr w:type="spellEnd"/>
       <w:r>
@@ -4846,10 +4973,20 @@
         <w:tab/>
       </w:r>
       <w:proofErr w:type="spellStart"/>
-      <w:r>
-        <w:t>gehermarcell.jcloud.jedlik.cloud</w:t>
-      </w:r>
-      <w:proofErr w:type="spellEnd"/>
+      <w:proofErr w:type="gramStart"/>
+      <w:r>
+        <w:t>gehermarcell.jcloud</w:t>
+      </w:r>
+      <w:proofErr w:type="gramEnd"/>
+      <w:r>
+        <w:t>.</w:t>
+      </w:r>
+      <w:proofErr w:type="gramStart"/>
+      <w:r>
+        <w:t>jedlik.cloud</w:t>
+      </w:r>
+      <w:proofErr w:type="spellEnd"/>
+      <w:proofErr w:type="gramEnd"/>
       <w:r>
         <w:t>/storage/</w:t>
       </w:r>
@@ -5334,8 +5471,13 @@
         <w:t xml:space="preserve">    "</w:t>
       </w:r>
       <w:proofErr w:type="spellStart"/>
-      <w:r>
-        <w:t>users_count</w:t>
+      <w:proofErr w:type="gramStart"/>
+      <w:r>
+        <w:t>users</w:t>
+      </w:r>
+      <w:proofErr w:type="gramEnd"/>
+      <w:r>
+        <w:t>_count</w:t>
       </w:r>
       <w:proofErr w:type="spellEnd"/>
       <w:r>
@@ -5361,22 +5503,26 @@
         <w:pStyle w:val="Kdblokk"/>
       </w:pPr>
       <w:r>
-        <w:t xml:space="preserve">    "header": "</w:t>
-      </w:r>
-      <w:r>
-        <w:t xml:space="preserve"> </w:t>
-      </w:r>
-      <w:r>
-        <w:t>https://jedligrambackend-</w:t>
+        <w:t xml:space="preserve">    "header": " https://jedligrambackend-</w:t>
       </w:r>
       <w:r>
         <w:tab/>
       </w:r>
       <w:proofErr w:type="spellStart"/>
-      <w:r>
-        <w:t>gehermarcell.jcloud.jedlik.cloud</w:t>
-      </w:r>
-      <w:proofErr w:type="spellEnd"/>
+      <w:proofErr w:type="gramStart"/>
+      <w:r>
+        <w:t>gehermarcell.jcloud</w:t>
+      </w:r>
+      <w:proofErr w:type="gramEnd"/>
+      <w:r>
+        <w:t>.</w:t>
+      </w:r>
+      <w:proofErr w:type="gramStart"/>
+      <w:r>
+        <w:t>jedlik.cloud</w:t>
+      </w:r>
+      <w:proofErr w:type="spellEnd"/>
+      <w:proofErr w:type="gramEnd"/>
       <w:r>
         <w:t>/storage/</w:t>
       </w:r>
@@ -5392,13 +5538,7 @@
         <w:tab/>
       </w:r>
       <w:r>
-        <w:t>ivSzgFpe5pCeafp32PGY2ZqFvpafh9ZqBj.jpg</w:t>
-      </w:r>
-      <w:r>
-        <w:t xml:space="preserve"> </w:t>
-      </w:r>
-      <w:r>
-        <w:t>"</w:t>
+        <w:t>ivSzgFpe5pCeafp32PGY2ZqFvpafh9ZqBj.jpg "</w:t>
       </w:r>
     </w:p>
     <w:p>
@@ -5582,14 +5722,7 @@
           <w:rFonts w:ascii="Courier New" w:hAnsi="Courier New" w:cs="Courier New"/>
           <w:lang w:val="hu-HU"/>
         </w:rPr>
-        <w:t>/1</w:t>
-      </w:r>
-      <w:r>
-        <w:rPr>
-          <w:rFonts w:ascii="Courier New" w:hAnsi="Courier New" w:cs="Courier New"/>
-          <w:lang w:val="hu-HU"/>
-        </w:rPr>
-        <w:t>/</w:t>
+        <w:t>/1/</w:t>
       </w:r>
       <w:proofErr w:type="spellStart"/>
       <w:r>
@@ -5660,7 +5793,19 @@
         <w:rPr>
           <w:lang w:val="hu-HU"/>
         </w:rPr>
-        <w:t xml:space="preserve">”-rangja van az adott </w:t>
+        <w:t>”</w:t>
+      </w:r>
+      <w:r>
+        <w:rPr>
+          <w:lang w:val="hu-HU"/>
+        </w:rPr>
+        <w:t xml:space="preserve"> </w:t>
+      </w:r>
+      <w:r>
+        <w:rPr>
+          <w:lang w:val="hu-HU"/>
+        </w:rPr>
+        <w:t xml:space="preserve">rangja van az adott </w:t>
       </w:r>
       <w:proofErr w:type="spellStart"/>
       <w:r>
@@ -5810,22 +5955,37 @@
         <w:t xml:space="preserve">      "</w:t>
       </w:r>
       <w:proofErr w:type="spellStart"/>
-      <w:r>
-        <w:t>image_url</w:t>
+      <w:proofErr w:type="gramStart"/>
+      <w:r>
+        <w:t>image</w:t>
+      </w:r>
+      <w:proofErr w:type="gramEnd"/>
+      <w:r>
+        <w:t>_url</w:t>
       </w:r>
       <w:proofErr w:type="spellEnd"/>
       <w:r>
         <w:t>": "https://jedligrambackend-</w:t>
       </w:r>
       <w:r>
-        <w:t xml:space="preserve"> </w:t>
-      </w:r>
-      <w:r>
-        <w:t>…</w:t>
-      </w:r>
-      <w:r>
-        <w:t xml:space="preserve"> </w:t>
-      </w:r>
+        <w:t xml:space="preserve"> …</w:t>
+      </w:r>
+      <w:r>
+        <w:t xml:space="preserve"> ",</w:t>
+      </w:r>
+    </w:p>
+    <w:p>
+      <w:pPr>
+        <w:pStyle w:val="Kdblokk"/>
+      </w:pPr>
+      <w:r>
+        <w:t xml:space="preserve">      "bio": "</w:t>
+      </w:r>
+      <w:proofErr w:type="spellStart"/>
+      <w:r>
+        <w:t>Csáá</w:t>
+      </w:r>
+      <w:proofErr w:type="spellEnd"/>
       <w:r>
         <w:t>",</w:t>
       </w:r>
@@ -5835,27 +5995,16 @@
         <w:pStyle w:val="Kdblokk"/>
       </w:pPr>
       <w:r>
-        <w:t xml:space="preserve">      "bio": "</w:t>
-      </w:r>
-      <w:proofErr w:type="spellStart"/>
-      <w:r>
-        <w:t>Csáá</w:t>
-      </w:r>
-      <w:proofErr w:type="spellEnd"/>
-      <w:r>
-        <w:t>",</w:t>
-      </w:r>
-    </w:p>
-    <w:p>
-      <w:pPr>
-        <w:pStyle w:val="Kdblokk"/>
-      </w:pPr>
-      <w:r>
         <w:t xml:space="preserve">      "</w:t>
       </w:r>
       <w:proofErr w:type="spellStart"/>
-      <w:r>
-        <w:t>post_karma</w:t>
+      <w:proofErr w:type="gramStart"/>
+      <w:r>
+        <w:t>post</w:t>
+      </w:r>
+      <w:proofErr w:type="gramEnd"/>
+      <w:r>
+        <w:t>_karma</w:t>
       </w:r>
       <w:proofErr w:type="spellEnd"/>
       <w:r>
@@ -5878,8 +6027,13 @@
         <w:t xml:space="preserve">    "</w:t>
       </w:r>
       <w:proofErr w:type="spellStart"/>
-      <w:r>
-        <w:t>thread_id</w:t>
+      <w:proofErr w:type="gramStart"/>
+      <w:r>
+        <w:t>thread</w:t>
+      </w:r>
+      <w:proofErr w:type="gramEnd"/>
+      <w:r>
+        <w:t>_id</w:t>
       </w:r>
       <w:proofErr w:type="spellEnd"/>
       <w:r>
@@ -6317,7 +6471,7 @@
         <w:rPr>
           <w:lang w:val="hu-HU"/>
         </w:rPr>
-        <w:t>” ranggal rendelkező felhasználói számára elérhető.</w:t>
+        <w:t>” ranggal rendelkező felhasználói számára elérhető</w:t>
       </w:r>
       <w:r>
         <w:rPr>
@@ -6345,19 +6499,7 @@
         <w:rPr>
           <w:lang w:val="hu-HU"/>
         </w:rPr>
-        <w:t>(20</w:t>
-      </w:r>
-      <w:r>
-        <w:rPr>
-          <w:lang w:val="hu-HU"/>
-        </w:rPr>
-        <w:t>0 OK</w:t>
-      </w:r>
-      <w:r>
-        <w:rPr>
-          <w:lang w:val="hu-HU"/>
-        </w:rPr>
-        <w:t>)</w:t>
+        <w:t>(200 OK)</w:t>
       </w:r>
     </w:p>
     <w:p>
@@ -6414,8 +6556,13 @@
         <w:t xml:space="preserve">  "</w:t>
       </w:r>
       <w:proofErr w:type="spellStart"/>
-      <w:r>
-        <w:t>users_count</w:t>
+      <w:proofErr w:type="gramStart"/>
+      <w:r>
+        <w:t>users</w:t>
+      </w:r>
+      <w:proofErr w:type="gramEnd"/>
+      <w:r>
+        <w:t>_count</w:t>
       </w:r>
       <w:proofErr w:type="spellEnd"/>
       <w:r>
@@ -6466,6 +6613,1832 @@
     </w:p>
     <w:p>
       <w:pPr>
+        <w:pStyle w:val="Alcm"/>
+        <w:rPr>
+          <w:lang w:val="hu-HU"/>
+        </w:rPr>
+      </w:pPr>
+      <w:r>
+        <w:rPr>
+          <w:lang w:val="hu-HU"/>
+        </w:rPr>
+        <w:t>1.2.</w:t>
+      </w:r>
+      <w:r>
+        <w:rPr>
+          <w:lang w:val="hu-HU"/>
+        </w:rPr>
+        <w:t>3</w:t>
+      </w:r>
+      <w:r>
+        <w:rPr>
+          <w:lang w:val="hu-HU"/>
+        </w:rPr>
+        <w:t>Thread</w:t>
+      </w:r>
+      <w:r>
+        <w:rPr>
+          <w:lang w:val="hu-HU"/>
+        </w:rPr>
+        <w:t>User</w:t>
+      </w:r>
+      <w:r>
+        <w:rPr>
+          <w:lang w:val="hu-HU"/>
+        </w:rPr>
+        <w:t xml:space="preserve"> kontroller</w:t>
+      </w:r>
+    </w:p>
+    <w:p>
+      <w:pPr>
+        <w:rPr>
+          <w:b/>
+          <w:bCs/>
+          <w:lang w:val="hu-HU"/>
+        </w:rPr>
+      </w:pPr>
+      <w:r>
+        <w:rPr>
+          <w:b/>
+          <w:bCs/>
+          <w:lang w:val="hu-HU"/>
+        </w:rPr>
+        <w:t>GET</w:t>
+      </w:r>
+      <w:r>
+        <w:rPr>
+          <w:b/>
+          <w:bCs/>
+          <w:lang w:val="hu-HU"/>
+        </w:rPr>
+        <w:t xml:space="preserve"> </w:t>
+      </w:r>
+      <w:proofErr w:type="spellStart"/>
+      <w:r>
+        <w:rPr>
+          <w:lang w:val="hu-HU"/>
+        </w:rPr>
+        <w:t>Th</w:t>
+      </w:r>
+      <w:r>
+        <w:rPr>
+          <w:lang w:val="hu-HU"/>
+        </w:rPr>
+        <w:t>read</w:t>
+      </w:r>
+      <w:proofErr w:type="spellEnd"/>
+      <w:r>
+        <w:rPr>
+          <w:lang w:val="hu-HU"/>
+        </w:rPr>
+        <w:t xml:space="preserve"> </w:t>
+      </w:r>
+      <w:proofErr w:type="spellStart"/>
+      <w:r>
+        <w:rPr>
+          <w:lang w:val="hu-HU"/>
+        </w:rPr>
+        <w:t>members</w:t>
+      </w:r>
+      <w:proofErr w:type="spellEnd"/>
+    </w:p>
+    <w:p>
+      <w:pPr>
+        <w:rPr>
+          <w:lang w:val="hu-HU"/>
+        </w:rPr>
+      </w:pPr>
+      <w:r>
+        <w:rPr>
+          <w:noProof/>
+          <w:lang w:val="hu-HU"/>
+        </w:rPr>
+        <w:drawing>
+          <wp:inline distT="0" distB="0" distL="0" distR="0" wp14:anchorId="08D3B481" wp14:editId="3A23FE8C">
+            <wp:extent cx="5971540" cy="309880"/>
+            <wp:effectExtent l="0" t="0" r="0" b="0"/>
+            <wp:docPr id="819294682" name="Kép 1"/>
+            <wp:cNvGraphicFramePr>
+              <a:graphicFrameLocks xmlns:a="http://schemas.openxmlformats.org/drawingml/2006/main" noChangeAspect="1"/>
+            </wp:cNvGraphicFramePr>
+            <a:graphic xmlns:a="http://schemas.openxmlformats.org/drawingml/2006/main">
+              <a:graphicData uri="http://schemas.openxmlformats.org/drawingml/2006/picture">
+                <pic:pic xmlns:pic="http://schemas.openxmlformats.org/drawingml/2006/picture">
+                  <pic:nvPicPr>
+                    <pic:cNvPr id="819294682" name="Kép 819294682"/>
+                    <pic:cNvPicPr/>
+                  </pic:nvPicPr>
+                  <pic:blipFill>
+                    <a:blip r:embed="rId22">
+                      <a:extLst>
+                        <a:ext uri="{28A0092B-C50C-407E-A947-70E740481C1C}">
+                          <a14:useLocalDpi xmlns:a14="http://schemas.microsoft.com/office/drawing/2010/main" val="0"/>
+                        </a:ext>
+                      </a:extLst>
+                    </a:blip>
+                    <a:stretch>
+                      <a:fillRect/>
+                    </a:stretch>
+                  </pic:blipFill>
+                  <pic:spPr>
+                    <a:xfrm>
+                      <a:off x="0" y="0"/>
+                      <a:ext cx="5971540" cy="309880"/>
+                    </a:xfrm>
+                    <a:prstGeom prst="rect">
+                      <a:avLst/>
+                    </a:prstGeom>
+                  </pic:spPr>
+                </pic:pic>
+              </a:graphicData>
+            </a:graphic>
+          </wp:inline>
+        </w:drawing>
+      </w:r>
+    </w:p>
+    <w:p>
+      <w:pPr>
+        <w:jc w:val="left"/>
+        <w:rPr>
+          <w:lang w:val="hu-HU"/>
+        </w:rPr>
+      </w:pPr>
+      <w:r>
+        <w:rPr>
+          <w:b/>
+          <w:bCs/>
+          <w:lang w:val="hu-HU"/>
+        </w:rPr>
+        <w:t>Példa kérés:</w:t>
+      </w:r>
+      <w:r>
+        <w:rPr>
+          <w:lang w:val="hu-HU"/>
+        </w:rPr>
+        <w:t xml:space="preserve"> </w:t>
+      </w:r>
+      <w:r>
+        <w:rPr>
+          <w:rFonts w:ascii="Courier New" w:hAnsi="Courier New" w:cs="Courier New"/>
+          <w:lang w:val="hu-HU"/>
+        </w:rPr>
+        <w:t>GET | /</w:t>
+      </w:r>
+      <w:proofErr w:type="spellStart"/>
+      <w:r>
+        <w:rPr>
+          <w:rFonts w:ascii="Courier New" w:hAnsi="Courier New" w:cs="Courier New"/>
+          <w:lang w:val="hu-HU"/>
+        </w:rPr>
+        <w:t>api</w:t>
+      </w:r>
+      <w:proofErr w:type="spellEnd"/>
+      <w:r>
+        <w:rPr>
+          <w:rFonts w:ascii="Courier New" w:hAnsi="Courier New" w:cs="Courier New"/>
+          <w:lang w:val="hu-HU"/>
+        </w:rPr>
+        <w:t>/</w:t>
+      </w:r>
+      <w:proofErr w:type="spellStart"/>
+      <w:r>
+        <w:rPr>
+          <w:rFonts w:ascii="Courier New" w:hAnsi="Courier New" w:cs="Courier New"/>
+          <w:lang w:val="hu-HU"/>
+        </w:rPr>
+        <w:t>threads</w:t>
+      </w:r>
+      <w:proofErr w:type="spellEnd"/>
+      <w:r>
+        <w:rPr>
+          <w:rFonts w:ascii="Courier New" w:hAnsi="Courier New" w:cs="Courier New"/>
+          <w:lang w:val="hu-HU"/>
+        </w:rPr>
+        <w:t>/1/</w:t>
+      </w:r>
+      <w:proofErr w:type="spellStart"/>
+      <w:r>
+        <w:rPr>
+          <w:rFonts w:ascii="Courier New" w:hAnsi="Courier New" w:cs="Courier New"/>
+          <w:lang w:val="hu-HU"/>
+        </w:rPr>
+        <w:t>members</w:t>
+      </w:r>
+      <w:proofErr w:type="spellEnd"/>
+      <w:r>
+        <w:rPr>
+          <w:lang w:val="hu-HU"/>
+        </w:rPr>
+        <w:br/>
+      </w:r>
+      <w:r>
+        <w:rPr>
+          <w:b/>
+          <w:bCs/>
+          <w:lang w:val="hu-HU"/>
+        </w:rPr>
+        <w:t>Body:</w:t>
+      </w:r>
+      <w:r>
+        <w:rPr>
+          <w:b/>
+          <w:bCs/>
+          <w:lang w:val="hu-HU"/>
+        </w:rPr>
+        <w:t xml:space="preserve"> </w:t>
+      </w:r>
+      <w:r>
+        <w:rPr>
+          <w:lang w:val="hu-HU"/>
+        </w:rPr>
+        <w:t>-</w:t>
+      </w:r>
+      <w:r>
+        <w:rPr>
+          <w:lang w:val="hu-HU"/>
+        </w:rPr>
+        <w:br/>
+      </w:r>
+      <w:r>
+        <w:rPr>
+          <w:b/>
+          <w:bCs/>
+          <w:lang w:val="hu-HU"/>
+        </w:rPr>
+        <w:t>Korlátozás:</w:t>
+      </w:r>
+      <w:r>
+        <w:rPr>
+          <w:b/>
+          <w:bCs/>
+          <w:lang w:val="hu-HU"/>
+        </w:rPr>
+        <w:t xml:space="preserve"> </w:t>
+      </w:r>
+      <w:r>
+        <w:rPr>
+          <w:lang w:val="hu-HU"/>
+        </w:rPr>
+        <w:t>Csak</w:t>
+      </w:r>
+      <w:r>
+        <w:rPr>
+          <w:lang w:val="hu-HU"/>
+        </w:rPr>
+        <w:t xml:space="preserve"> </w:t>
+      </w:r>
+      <w:r>
+        <w:rPr>
+          <w:lang w:val="hu-HU"/>
+        </w:rPr>
+        <w:t xml:space="preserve">az adott </w:t>
+      </w:r>
+      <w:proofErr w:type="spellStart"/>
+      <w:r>
+        <w:rPr>
+          <w:lang w:val="hu-HU"/>
+        </w:rPr>
+        <w:t>thread</w:t>
+      </w:r>
+      <w:proofErr w:type="spellEnd"/>
+      <w:r>
+        <w:rPr>
+          <w:lang w:val="hu-HU"/>
+        </w:rPr>
+        <w:t xml:space="preserve"> tagjai számára elérhető</w:t>
+      </w:r>
+      <w:r>
+        <w:rPr>
+          <w:lang w:val="hu-HU"/>
+        </w:rPr>
+        <w:br/>
+      </w:r>
+      <w:r>
+        <w:rPr>
+          <w:b/>
+          <w:bCs/>
+          <w:lang w:val="hu-HU"/>
+        </w:rPr>
+        <w:t>Példa válasz:</w:t>
+      </w:r>
+      <w:r>
+        <w:rPr>
+          <w:b/>
+          <w:bCs/>
+          <w:lang w:val="hu-HU"/>
+        </w:rPr>
+        <w:t xml:space="preserve"> </w:t>
+      </w:r>
+      <w:r>
+        <w:rPr>
+          <w:lang w:val="hu-HU"/>
+        </w:rPr>
+        <w:t>(200 OK)</w:t>
+      </w:r>
+    </w:p>
+    <w:p>
+      <w:pPr>
+        <w:pStyle w:val="Kdblokk"/>
+      </w:pPr>
+      <w:r>
+        <w:t>[</w:t>
+      </w:r>
+    </w:p>
+    <w:p>
+      <w:pPr>
+        <w:pStyle w:val="Kdblokk"/>
+      </w:pPr>
+      <w:r>
+        <w:t xml:space="preserve">  </w:t>
+      </w:r>
+      <w:r>
+        <w:t>…</w:t>
+      </w:r>
+    </w:p>
+    <w:p>
+      <w:pPr>
+        <w:pStyle w:val="Kdblokk"/>
+      </w:pPr>
+      <w:r>
+        <w:t xml:space="preserve">  {</w:t>
+      </w:r>
+    </w:p>
+    <w:p>
+      <w:pPr>
+        <w:pStyle w:val="Kdblokk"/>
+      </w:pPr>
+      <w:r>
+        <w:t xml:space="preserve">    "id": 2,</w:t>
+      </w:r>
+    </w:p>
+    <w:p>
+      <w:pPr>
+        <w:pStyle w:val="Kdblokk"/>
+      </w:pPr>
+      <w:r>
+        <w:t xml:space="preserve">    "name": "Johann Schulist",</w:t>
+      </w:r>
+    </w:p>
+    <w:p>
+      <w:pPr>
+        <w:pStyle w:val="Kdblokk"/>
+      </w:pPr>
+      <w:r>
+        <w:t xml:space="preserve">    "email": "vladimir.wisozk@example.com",</w:t>
+      </w:r>
+    </w:p>
+    <w:p>
+      <w:pPr>
+        <w:pStyle w:val="Kdblokk"/>
+      </w:pPr>
+      <w:r>
+        <w:t xml:space="preserve">    "</w:t>
+      </w:r>
+      <w:proofErr w:type="spellStart"/>
+      <w:proofErr w:type="gramStart"/>
+      <w:r>
+        <w:t>image</w:t>
+      </w:r>
+      <w:proofErr w:type="gramEnd"/>
+      <w:r>
+        <w:t>_url</w:t>
+      </w:r>
+      <w:proofErr w:type="spellEnd"/>
+      <w:r>
+        <w:t>": "http://127.0.0.1:8000/images/default_pfp.png",</w:t>
+      </w:r>
+    </w:p>
+    <w:p>
+      <w:pPr>
+        <w:pStyle w:val="Kdblokk"/>
+      </w:pPr>
+      <w:r>
+        <w:t xml:space="preserve">    "bio": null</w:t>
+      </w:r>
+      <w:r>
+        <w:t>,</w:t>
+      </w:r>
+    </w:p>
+    <w:p>
+      <w:pPr>
+        <w:pStyle w:val="Kdblokk"/>
+      </w:pPr>
+      <w:r>
+        <w:lastRenderedPageBreak/>
+        <w:t xml:space="preserve">    </w:t>
+      </w:r>
+      <w:r>
+        <w:t>"</w:t>
+      </w:r>
+      <w:proofErr w:type="spellStart"/>
+      <w:proofErr w:type="gramStart"/>
+      <w:r>
+        <w:t>post</w:t>
+      </w:r>
+      <w:proofErr w:type="gramEnd"/>
+      <w:r>
+        <w:t>_karma</w:t>
+      </w:r>
+      <w:proofErr w:type="spellEnd"/>
+      <w:r>
+        <w:t>": 0</w:t>
+      </w:r>
+      <w:r>
+        <w:t>,</w:t>
+      </w:r>
+    </w:p>
+    <w:p>
+      <w:pPr>
+        <w:pStyle w:val="Kdblokk"/>
+      </w:pPr>
+      <w:r>
+        <w:t xml:space="preserve">    </w:t>
+      </w:r>
+      <w:r>
+        <w:t>"</w:t>
+      </w:r>
+      <w:proofErr w:type="spellStart"/>
+      <w:proofErr w:type="gramStart"/>
+      <w:r>
+        <w:t>role</w:t>
+      </w:r>
+      <w:proofErr w:type="gramEnd"/>
+      <w:r>
+        <w:t>_id</w:t>
+      </w:r>
+      <w:proofErr w:type="spellEnd"/>
+      <w:r>
+        <w:t>"</w:t>
+      </w:r>
+      <w:r>
+        <w:t>: 3</w:t>
+      </w:r>
+    </w:p>
+    <w:p>
+      <w:pPr>
+        <w:pStyle w:val="Kdblokk"/>
+      </w:pPr>
+      <w:r>
+        <w:t xml:space="preserve">  },</w:t>
+      </w:r>
+      <w:r>
+        <w:br/>
+        <w:t xml:space="preserve">  …</w:t>
+      </w:r>
+      <w:r>
+        <w:br/>
+      </w:r>
+      <w:r>
+        <w:rPr>
+          <w:lang w:val="hu-HU"/>
+        </w:rPr>
+        <w:t>]</w:t>
+      </w:r>
+    </w:p>
+    <w:p>
+      <w:pPr>
+        <w:rPr>
+          <w:b/>
+          <w:bCs/>
+          <w:lang w:val="hu-HU"/>
+        </w:rPr>
+      </w:pPr>
+      <w:r>
+        <w:rPr>
+          <w:b/>
+          <w:bCs/>
+          <w:lang w:val="hu-HU"/>
+        </w:rPr>
+        <w:t>POST</w:t>
+      </w:r>
+      <w:r>
+        <w:rPr>
+          <w:lang w:val="hu-HU"/>
+        </w:rPr>
+        <w:t xml:space="preserve"> </w:t>
+      </w:r>
+      <w:proofErr w:type="spellStart"/>
+      <w:r>
+        <w:rPr>
+          <w:lang w:val="hu-HU"/>
+        </w:rPr>
+        <w:t>Th</w:t>
+      </w:r>
+      <w:r>
+        <w:rPr>
+          <w:lang w:val="hu-HU"/>
+        </w:rPr>
+        <w:t>read</w:t>
+      </w:r>
+      <w:r>
+        <w:rPr>
+          <w:lang w:val="hu-HU"/>
+        </w:rPr>
+        <w:t>Users</w:t>
+      </w:r>
+      <w:proofErr w:type="spellEnd"/>
+    </w:p>
+    <w:p>
+      <w:pPr>
+        <w:rPr>
+          <w:lang w:val="hu-HU"/>
+        </w:rPr>
+      </w:pPr>
+      <w:r>
+        <w:rPr>
+          <w:noProof/>
+          <w:lang w:val="hu-HU"/>
+        </w:rPr>
+        <w:drawing>
+          <wp:inline distT="0" distB="0" distL="0" distR="0" wp14:anchorId="5814B61E" wp14:editId="2D21F570">
+            <wp:extent cx="5971540" cy="308610"/>
+            <wp:effectExtent l="0" t="0" r="0" b="0"/>
+            <wp:docPr id="610934638" name="Kép 2"/>
+            <wp:cNvGraphicFramePr>
+              <a:graphicFrameLocks xmlns:a="http://schemas.openxmlformats.org/drawingml/2006/main" noChangeAspect="1"/>
+            </wp:cNvGraphicFramePr>
+            <a:graphic xmlns:a="http://schemas.openxmlformats.org/drawingml/2006/main">
+              <a:graphicData uri="http://schemas.openxmlformats.org/drawingml/2006/picture">
+                <pic:pic xmlns:pic="http://schemas.openxmlformats.org/drawingml/2006/picture">
+                  <pic:nvPicPr>
+                    <pic:cNvPr id="610934638" name="Kép 610934638"/>
+                    <pic:cNvPicPr/>
+                  </pic:nvPicPr>
+                  <pic:blipFill>
+                    <a:blip r:embed="rId23">
+                      <a:extLst>
+                        <a:ext uri="{28A0092B-C50C-407E-A947-70E740481C1C}">
+                          <a14:useLocalDpi xmlns:a14="http://schemas.microsoft.com/office/drawing/2010/main" val="0"/>
+                        </a:ext>
+                      </a:extLst>
+                    </a:blip>
+                    <a:stretch>
+                      <a:fillRect/>
+                    </a:stretch>
+                  </pic:blipFill>
+                  <pic:spPr>
+                    <a:xfrm>
+                      <a:off x="0" y="0"/>
+                      <a:ext cx="5971540" cy="308610"/>
+                    </a:xfrm>
+                    <a:prstGeom prst="rect">
+                      <a:avLst/>
+                    </a:prstGeom>
+                  </pic:spPr>
+                </pic:pic>
+              </a:graphicData>
+            </a:graphic>
+          </wp:inline>
+        </w:drawing>
+      </w:r>
+    </w:p>
+    <w:p>
+      <w:pPr>
+        <w:jc w:val="left"/>
+        <w:rPr>
+          <w:lang w:val="hu-HU"/>
+        </w:rPr>
+      </w:pPr>
+      <w:r>
+        <w:rPr>
+          <w:b/>
+          <w:bCs/>
+          <w:lang w:val="hu-HU"/>
+        </w:rPr>
+        <w:t>Példa kérés:</w:t>
+      </w:r>
+      <w:r>
+        <w:rPr>
+          <w:lang w:val="hu-HU"/>
+        </w:rPr>
+        <w:t xml:space="preserve"> </w:t>
+      </w:r>
+      <w:r>
+        <w:rPr>
+          <w:rFonts w:ascii="Courier New" w:hAnsi="Courier New" w:cs="Courier New"/>
+          <w:lang w:val="hu-HU"/>
+        </w:rPr>
+        <w:t>POST</w:t>
+      </w:r>
+      <w:r>
+        <w:rPr>
+          <w:rFonts w:ascii="Courier New" w:hAnsi="Courier New" w:cs="Courier New"/>
+          <w:lang w:val="hu-HU"/>
+        </w:rPr>
+        <w:t xml:space="preserve"> | /</w:t>
+      </w:r>
+      <w:proofErr w:type="spellStart"/>
+      <w:r>
+        <w:rPr>
+          <w:rFonts w:ascii="Courier New" w:hAnsi="Courier New" w:cs="Courier New"/>
+          <w:lang w:val="hu-HU"/>
+        </w:rPr>
+        <w:t>api</w:t>
+      </w:r>
+      <w:proofErr w:type="spellEnd"/>
+      <w:r>
+        <w:rPr>
+          <w:rFonts w:ascii="Courier New" w:hAnsi="Courier New" w:cs="Courier New"/>
+          <w:lang w:val="hu-HU"/>
+        </w:rPr>
+        <w:t>/</w:t>
+      </w:r>
+      <w:proofErr w:type="spellStart"/>
+      <w:r>
+        <w:rPr>
+          <w:rFonts w:ascii="Courier New" w:hAnsi="Courier New" w:cs="Courier New"/>
+          <w:lang w:val="hu-HU"/>
+        </w:rPr>
+        <w:t>threads</w:t>
+      </w:r>
+      <w:proofErr w:type="spellEnd"/>
+      <w:r>
+        <w:rPr>
+          <w:rFonts w:ascii="Courier New" w:hAnsi="Courier New" w:cs="Courier New"/>
+          <w:lang w:val="hu-HU"/>
+        </w:rPr>
+        <w:t>/1/</w:t>
+      </w:r>
+      <w:proofErr w:type="spellStart"/>
+      <w:r>
+        <w:rPr>
+          <w:rFonts w:ascii="Courier New" w:hAnsi="Courier New" w:cs="Courier New"/>
+          <w:lang w:val="hu-HU"/>
+        </w:rPr>
+        <w:t>join</w:t>
+      </w:r>
+      <w:proofErr w:type="spellEnd"/>
+      <w:r>
+        <w:rPr>
+          <w:lang w:val="hu-HU"/>
+        </w:rPr>
+        <w:t xml:space="preserve"> </w:t>
+      </w:r>
+      <w:r>
+        <w:rPr>
+          <w:lang w:val="hu-HU"/>
+        </w:rPr>
+        <w:br/>
+      </w:r>
+      <w:r>
+        <w:rPr>
+          <w:b/>
+          <w:bCs/>
+          <w:lang w:val="hu-HU"/>
+        </w:rPr>
+        <w:t>Body:</w:t>
+      </w:r>
+      <w:r>
+        <w:rPr>
+          <w:b/>
+          <w:bCs/>
+          <w:lang w:val="hu-HU"/>
+        </w:rPr>
+        <w:t xml:space="preserve"> </w:t>
+      </w:r>
+      <w:r>
+        <w:rPr>
+          <w:lang w:val="hu-HU"/>
+        </w:rPr>
+        <w:t>-</w:t>
+      </w:r>
+      <w:r>
+        <w:rPr>
+          <w:lang w:val="hu-HU"/>
+        </w:rPr>
+        <w:br/>
+      </w:r>
+      <w:r>
+        <w:rPr>
+          <w:b/>
+          <w:bCs/>
+          <w:lang w:val="hu-HU"/>
+        </w:rPr>
+        <w:t>Korlátozás:</w:t>
+      </w:r>
+      <w:r>
+        <w:rPr>
+          <w:b/>
+          <w:bCs/>
+          <w:lang w:val="hu-HU"/>
+        </w:rPr>
+        <w:t xml:space="preserve"> </w:t>
+      </w:r>
+      <w:r>
+        <w:rPr>
+          <w:lang w:val="hu-HU"/>
+        </w:rPr>
+        <w:t xml:space="preserve">Bejelentkezett </w:t>
+      </w:r>
+      <w:proofErr w:type="spellStart"/>
+      <w:r>
+        <w:rPr>
+          <w:lang w:val="hu-HU"/>
+        </w:rPr>
+        <w:t>felhaszhálók</w:t>
+      </w:r>
+      <w:proofErr w:type="spellEnd"/>
+      <w:r>
+        <w:rPr>
+          <w:lang w:val="hu-HU"/>
+        </w:rPr>
+        <w:t xml:space="preserve"> számára </w:t>
+      </w:r>
+      <w:proofErr w:type="spellStart"/>
+      <w:r>
+        <w:rPr>
+          <w:lang w:val="hu-HU"/>
+        </w:rPr>
+        <w:t>elérhatő</w:t>
+      </w:r>
+      <w:proofErr w:type="spellEnd"/>
+    </w:p>
+    <w:p>
+      <w:pPr>
+        <w:pStyle w:val="Kdblokk"/>
+      </w:pPr>
+      <w:r>
+        <w:t>{</w:t>
+      </w:r>
+    </w:p>
+    <w:p>
+      <w:pPr>
+        <w:pStyle w:val="Kdblokk"/>
+      </w:pPr>
+      <w:r>
+        <w:t xml:space="preserve">  "message": "You joined the thread"</w:t>
+      </w:r>
+    </w:p>
+    <w:p>
+      <w:pPr>
+        <w:pStyle w:val="Kdblokk"/>
+      </w:pPr>
+      <w:r>
+        <w:t>}</w:t>
+      </w:r>
+    </w:p>
+    <w:p>
+      <w:pPr>
+        <w:rPr>
+          <w:b/>
+          <w:bCs/>
+          <w:lang w:val="hu-HU"/>
+        </w:rPr>
+      </w:pPr>
+      <w:r>
+        <w:rPr>
+          <w:b/>
+          <w:bCs/>
+          <w:lang w:val="hu-HU"/>
+        </w:rPr>
+        <w:t>DELETE</w:t>
+      </w:r>
+      <w:r>
+        <w:rPr>
+          <w:lang w:val="hu-HU"/>
+        </w:rPr>
+        <w:t xml:space="preserve"> </w:t>
+      </w:r>
+      <w:proofErr w:type="spellStart"/>
+      <w:r>
+        <w:rPr>
+          <w:lang w:val="hu-HU"/>
+        </w:rPr>
+        <w:t>Th</w:t>
+      </w:r>
+      <w:r>
+        <w:rPr>
+          <w:lang w:val="hu-HU"/>
+        </w:rPr>
+        <w:t>readUsers</w:t>
+      </w:r>
+      <w:proofErr w:type="spellEnd"/>
+    </w:p>
+    <w:p>
+      <w:pPr>
+        <w:rPr>
+          <w:lang w:val="hu-HU"/>
+        </w:rPr>
+      </w:pPr>
+      <w:r>
+        <w:rPr>
+          <w:noProof/>
+          <w:lang w:val="hu-HU"/>
+        </w:rPr>
+        <w:drawing>
+          <wp:inline distT="0" distB="0" distL="0" distR="0" wp14:anchorId="58699BDA" wp14:editId="3A827769">
+            <wp:extent cx="5971540" cy="307975"/>
+            <wp:effectExtent l="0" t="0" r="0" b="0"/>
+            <wp:docPr id="1890289512" name="Kép 3"/>
+            <wp:cNvGraphicFramePr>
+              <a:graphicFrameLocks xmlns:a="http://schemas.openxmlformats.org/drawingml/2006/main" noChangeAspect="1"/>
+            </wp:cNvGraphicFramePr>
+            <a:graphic xmlns:a="http://schemas.openxmlformats.org/drawingml/2006/main">
+              <a:graphicData uri="http://schemas.openxmlformats.org/drawingml/2006/picture">
+                <pic:pic xmlns:pic="http://schemas.openxmlformats.org/drawingml/2006/picture">
+                  <pic:nvPicPr>
+                    <pic:cNvPr id="1890289512" name="Kép 1890289512"/>
+                    <pic:cNvPicPr/>
+                  </pic:nvPicPr>
+                  <pic:blipFill>
+                    <a:blip r:embed="rId24">
+                      <a:extLst>
+                        <a:ext uri="{28A0092B-C50C-407E-A947-70E740481C1C}">
+                          <a14:useLocalDpi xmlns:a14="http://schemas.microsoft.com/office/drawing/2010/main" val="0"/>
+                        </a:ext>
+                      </a:extLst>
+                    </a:blip>
+                    <a:stretch>
+                      <a:fillRect/>
+                    </a:stretch>
+                  </pic:blipFill>
+                  <pic:spPr>
+                    <a:xfrm>
+                      <a:off x="0" y="0"/>
+                      <a:ext cx="5971540" cy="307975"/>
+                    </a:xfrm>
+                    <a:prstGeom prst="rect">
+                      <a:avLst/>
+                    </a:prstGeom>
+                  </pic:spPr>
+                </pic:pic>
+              </a:graphicData>
+            </a:graphic>
+          </wp:inline>
+        </w:drawing>
+      </w:r>
+    </w:p>
+    <w:p>
+      <w:pPr>
+        <w:jc w:val="left"/>
+        <w:rPr>
+          <w:lang w:val="hu-HU"/>
+        </w:rPr>
+      </w:pPr>
+      <w:r>
+        <w:rPr>
+          <w:b/>
+          <w:bCs/>
+          <w:lang w:val="hu-HU"/>
+        </w:rPr>
+        <w:t>Példa kérés:</w:t>
+      </w:r>
+      <w:r>
+        <w:rPr>
+          <w:b/>
+          <w:bCs/>
+          <w:lang w:val="hu-HU"/>
+        </w:rPr>
+        <w:t xml:space="preserve"> </w:t>
+      </w:r>
+      <w:r>
+        <w:rPr>
+          <w:rFonts w:ascii="Courier New" w:hAnsi="Courier New" w:cs="Courier New"/>
+          <w:lang w:val="hu-HU"/>
+        </w:rPr>
+        <w:t>DELETE</w:t>
+      </w:r>
+      <w:r>
+        <w:rPr>
+          <w:rFonts w:ascii="Courier New" w:hAnsi="Courier New" w:cs="Courier New"/>
+          <w:lang w:val="hu-HU"/>
+        </w:rPr>
+        <w:t xml:space="preserve"> | /</w:t>
+      </w:r>
+      <w:proofErr w:type="spellStart"/>
+      <w:r>
+        <w:rPr>
+          <w:rFonts w:ascii="Courier New" w:hAnsi="Courier New" w:cs="Courier New"/>
+          <w:lang w:val="hu-HU"/>
+        </w:rPr>
+        <w:t>api</w:t>
+      </w:r>
+      <w:proofErr w:type="spellEnd"/>
+      <w:r>
+        <w:rPr>
+          <w:rFonts w:ascii="Courier New" w:hAnsi="Courier New" w:cs="Courier New"/>
+          <w:lang w:val="hu-HU"/>
+        </w:rPr>
+        <w:t>/</w:t>
+      </w:r>
+      <w:proofErr w:type="spellStart"/>
+      <w:r>
+        <w:rPr>
+          <w:rFonts w:ascii="Courier New" w:hAnsi="Courier New" w:cs="Courier New"/>
+          <w:lang w:val="hu-HU"/>
+        </w:rPr>
+        <w:t>threads</w:t>
+      </w:r>
+      <w:proofErr w:type="spellEnd"/>
+      <w:r>
+        <w:rPr>
+          <w:rFonts w:ascii="Courier New" w:hAnsi="Courier New" w:cs="Courier New"/>
+          <w:lang w:val="hu-HU"/>
+        </w:rPr>
+        <w:t>/1/</w:t>
+      </w:r>
+      <w:proofErr w:type="spellStart"/>
+      <w:r>
+        <w:rPr>
+          <w:rFonts w:ascii="Courier New" w:hAnsi="Courier New" w:cs="Courier New"/>
+          <w:lang w:val="hu-HU"/>
+        </w:rPr>
+        <w:t>leave</w:t>
+      </w:r>
+      <w:proofErr w:type="spellEnd"/>
+      <w:r>
+        <w:rPr>
+          <w:lang w:val="hu-HU"/>
+        </w:rPr>
+        <w:t xml:space="preserve"> </w:t>
+      </w:r>
+      <w:r>
+        <w:rPr>
+          <w:lang w:val="hu-HU"/>
+        </w:rPr>
+        <w:br/>
+      </w:r>
+      <w:r>
+        <w:rPr>
+          <w:b/>
+          <w:bCs/>
+          <w:lang w:val="hu-HU"/>
+        </w:rPr>
+        <w:t>Body:</w:t>
+      </w:r>
+      <w:r>
+        <w:rPr>
+          <w:b/>
+          <w:bCs/>
+          <w:lang w:val="hu-HU"/>
+        </w:rPr>
+        <w:t xml:space="preserve"> </w:t>
+      </w:r>
+      <w:r>
+        <w:rPr>
+          <w:lang w:val="hu-HU"/>
+        </w:rPr>
+        <w:t>-</w:t>
+      </w:r>
+      <w:r>
+        <w:rPr>
+          <w:lang w:val="hu-HU"/>
+        </w:rPr>
+        <w:br/>
+      </w:r>
+      <w:r>
+        <w:rPr>
+          <w:b/>
+          <w:bCs/>
+          <w:lang w:val="hu-HU"/>
+        </w:rPr>
+        <w:t>Korlátozás:</w:t>
+      </w:r>
+      <w:r>
+        <w:rPr>
+          <w:b/>
+          <w:bCs/>
+          <w:lang w:val="hu-HU"/>
+        </w:rPr>
+        <w:t xml:space="preserve"> </w:t>
+      </w:r>
+      <w:r>
+        <w:rPr>
+          <w:lang w:val="hu-HU"/>
+        </w:rPr>
+        <w:t>Csak</w:t>
+      </w:r>
+      <w:r>
+        <w:rPr>
+          <w:lang w:val="hu-HU"/>
+        </w:rPr>
+        <w:t xml:space="preserve"> az adott </w:t>
+      </w:r>
+      <w:proofErr w:type="spellStart"/>
+      <w:r>
+        <w:rPr>
+          <w:lang w:val="hu-HU"/>
+        </w:rPr>
+        <w:t>thread</w:t>
+      </w:r>
+      <w:proofErr w:type="spellEnd"/>
+      <w:r>
+        <w:rPr>
+          <w:lang w:val="hu-HU"/>
+        </w:rPr>
+        <w:t xml:space="preserve"> tagjai számára elérhető. Kivéve a „</w:t>
+      </w:r>
+      <w:proofErr w:type="spellStart"/>
+      <w:r>
+        <w:rPr>
+          <w:lang w:val="hu-HU"/>
+        </w:rPr>
+        <w:t>banned</w:t>
+      </w:r>
+      <w:proofErr w:type="spellEnd"/>
+      <w:r>
+        <w:rPr>
+          <w:lang w:val="hu-HU"/>
+        </w:rPr>
+        <w:t>” ranggal rendelkezők számára</w:t>
+      </w:r>
+    </w:p>
+    <w:p>
+      <w:pPr>
+        <w:pStyle w:val="Kdblokk"/>
+      </w:pPr>
+      <w:r>
+        <w:t>{</w:t>
+      </w:r>
+    </w:p>
+    <w:p>
+      <w:pPr>
+        <w:pStyle w:val="Kdblokk"/>
+      </w:pPr>
+      <w:r>
+        <w:t xml:space="preserve">  "message": "You left the thread"</w:t>
+      </w:r>
+    </w:p>
+    <w:p>
+      <w:pPr>
+        <w:pStyle w:val="Kdblokk"/>
+      </w:pPr>
+      <w:r>
+        <w:t>}</w:t>
+      </w:r>
+    </w:p>
+    <w:p>
+      <w:pPr>
+        <w:rPr>
+          <w:b/>
+          <w:bCs/>
+          <w:lang w:val="hu-HU"/>
+        </w:rPr>
+      </w:pPr>
+      <w:r>
+        <w:rPr>
+          <w:b/>
+          <w:bCs/>
+          <w:lang w:val="hu-HU"/>
+        </w:rPr>
+        <w:t>PATCH</w:t>
+      </w:r>
+      <w:r>
+        <w:rPr>
+          <w:lang w:val="hu-HU"/>
+        </w:rPr>
+        <w:t xml:space="preserve"> </w:t>
+      </w:r>
+      <w:proofErr w:type="spellStart"/>
+      <w:r>
+        <w:rPr>
+          <w:lang w:val="hu-HU"/>
+        </w:rPr>
+        <w:t>Th</w:t>
+      </w:r>
+      <w:r>
+        <w:rPr>
+          <w:lang w:val="hu-HU"/>
+        </w:rPr>
+        <w:t>readUsers</w:t>
+      </w:r>
+      <w:proofErr w:type="spellEnd"/>
+    </w:p>
+    <w:p>
+      <w:pPr>
+        <w:rPr>
+          <w:lang w:val="hu-HU"/>
+        </w:rPr>
+      </w:pPr>
+      <w:r>
+        <w:rPr>
+          <w:noProof/>
+          <w:lang w:val="hu-HU"/>
+        </w:rPr>
+        <w:drawing>
+          <wp:inline distT="0" distB="0" distL="0" distR="0" wp14:anchorId="7121E6F6" wp14:editId="03FD9C27">
+            <wp:extent cx="5971540" cy="292100"/>
+            <wp:effectExtent l="0" t="0" r="0" b="0"/>
+            <wp:docPr id="1252685051" name="Kép 6"/>
+            <wp:cNvGraphicFramePr>
+              <a:graphicFrameLocks xmlns:a="http://schemas.openxmlformats.org/drawingml/2006/main" noChangeAspect="1"/>
+            </wp:cNvGraphicFramePr>
+            <a:graphic xmlns:a="http://schemas.openxmlformats.org/drawingml/2006/main">
+              <a:graphicData uri="http://schemas.openxmlformats.org/drawingml/2006/picture">
+                <pic:pic xmlns:pic="http://schemas.openxmlformats.org/drawingml/2006/picture">
+                  <pic:nvPicPr>
+                    <pic:cNvPr id="1252685051" name="Kép 1252685051"/>
+                    <pic:cNvPicPr/>
+                  </pic:nvPicPr>
+                  <pic:blipFill>
+                    <a:blip r:embed="rId25">
+                      <a:extLst>
+                        <a:ext uri="{28A0092B-C50C-407E-A947-70E740481C1C}">
+                          <a14:useLocalDpi xmlns:a14="http://schemas.microsoft.com/office/drawing/2010/main" val="0"/>
+                        </a:ext>
+                      </a:extLst>
+                    </a:blip>
+                    <a:stretch>
+                      <a:fillRect/>
+                    </a:stretch>
+                  </pic:blipFill>
+                  <pic:spPr>
+                    <a:xfrm>
+                      <a:off x="0" y="0"/>
+                      <a:ext cx="5971540" cy="292100"/>
+                    </a:xfrm>
+                    <a:prstGeom prst="rect">
+                      <a:avLst/>
+                    </a:prstGeom>
+                  </pic:spPr>
+                </pic:pic>
+              </a:graphicData>
+            </a:graphic>
+          </wp:inline>
+        </w:drawing>
+      </w:r>
+    </w:p>
+    <w:p>
+      <w:pPr>
+        <w:jc w:val="left"/>
+        <w:rPr>
+          <w:lang w:val="hu-HU"/>
+        </w:rPr>
+      </w:pPr>
+      <w:r>
+        <w:rPr>
+          <w:b/>
+          <w:bCs/>
+          <w:lang w:val="hu-HU"/>
+        </w:rPr>
+        <w:t>Példa kérés:</w:t>
+      </w:r>
+      <w:r>
+        <w:rPr>
+          <w:b/>
+          <w:bCs/>
+          <w:lang w:val="hu-HU"/>
+        </w:rPr>
+        <w:t xml:space="preserve"> </w:t>
+      </w:r>
+      <w:r>
+        <w:rPr>
+          <w:rFonts w:ascii="Courier New" w:hAnsi="Courier New" w:cs="Courier New"/>
+          <w:lang w:val="hu-HU"/>
+        </w:rPr>
+        <w:t>PATCH</w:t>
+      </w:r>
+      <w:r>
+        <w:rPr>
+          <w:rFonts w:ascii="Courier New" w:hAnsi="Courier New" w:cs="Courier New"/>
+          <w:lang w:val="hu-HU"/>
+        </w:rPr>
+        <w:t xml:space="preserve"> | /</w:t>
+      </w:r>
+      <w:proofErr w:type="spellStart"/>
+      <w:r>
+        <w:rPr>
+          <w:rFonts w:ascii="Courier New" w:hAnsi="Courier New" w:cs="Courier New"/>
+          <w:lang w:val="hu-HU"/>
+        </w:rPr>
+        <w:t>api</w:t>
+      </w:r>
+      <w:proofErr w:type="spellEnd"/>
+      <w:r>
+        <w:rPr>
+          <w:rFonts w:ascii="Courier New" w:hAnsi="Courier New" w:cs="Courier New"/>
+          <w:lang w:val="hu-HU"/>
+        </w:rPr>
+        <w:t>/</w:t>
+      </w:r>
+      <w:proofErr w:type="spellStart"/>
+      <w:r>
+        <w:rPr>
+          <w:rFonts w:ascii="Courier New" w:hAnsi="Courier New" w:cs="Courier New"/>
+          <w:lang w:val="hu-HU"/>
+        </w:rPr>
+        <w:t>threads</w:t>
+      </w:r>
+      <w:proofErr w:type="spellEnd"/>
+      <w:r>
+        <w:rPr>
+          <w:rFonts w:ascii="Courier New" w:hAnsi="Courier New" w:cs="Courier New"/>
+          <w:lang w:val="hu-HU"/>
+        </w:rPr>
+        <w:t>/1/</w:t>
+      </w:r>
+      <w:proofErr w:type="spellStart"/>
+      <w:r>
+        <w:rPr>
+          <w:rFonts w:ascii="Courier New" w:hAnsi="Courier New" w:cs="Courier New"/>
+          <w:lang w:val="hu-HU"/>
+        </w:rPr>
+        <w:t>members</w:t>
+      </w:r>
+      <w:proofErr w:type="spellEnd"/>
+      <w:r>
+        <w:rPr>
+          <w:rFonts w:ascii="Courier New" w:hAnsi="Courier New" w:cs="Courier New"/>
+          <w:lang w:val="hu-HU"/>
+        </w:rPr>
+        <w:t>/1</w:t>
+      </w:r>
+      <w:r>
+        <w:rPr>
+          <w:lang w:val="hu-HU"/>
+        </w:rPr>
+        <w:br/>
+      </w:r>
+      <w:r>
+        <w:rPr>
+          <w:b/>
+          <w:bCs/>
+          <w:lang w:val="hu-HU"/>
+        </w:rPr>
+        <w:t>Body:</w:t>
+      </w:r>
+      <w:r>
+        <w:rPr>
+          <w:b/>
+          <w:bCs/>
+          <w:lang w:val="hu-HU"/>
+        </w:rPr>
+        <w:t xml:space="preserve"> </w:t>
+      </w:r>
+    </w:p>
+    <w:p>
+      <w:pPr>
+        <w:pStyle w:val="Kdblokk"/>
+        <w:rPr>
+          <w:lang w:val="hu-HU"/>
+        </w:rPr>
+      </w:pPr>
+      <w:r>
+        <w:rPr>
+          <w:lang w:val="hu-HU"/>
+        </w:rPr>
+        <w:lastRenderedPageBreak/>
+        <w:t>{</w:t>
+      </w:r>
+    </w:p>
+    <w:p>
+      <w:pPr>
+        <w:pStyle w:val="Kdblokk"/>
+        <w:rPr>
+          <w:lang w:val="hu-HU"/>
+        </w:rPr>
+      </w:pPr>
+      <w:r>
+        <w:rPr>
+          <w:lang w:val="hu-HU"/>
+        </w:rPr>
+        <w:t xml:space="preserve">  "</w:t>
+      </w:r>
+      <w:proofErr w:type="spellStart"/>
+      <w:r>
+        <w:rPr>
+          <w:lang w:val="hu-HU"/>
+        </w:rPr>
+        <w:t>role_id</w:t>
+      </w:r>
+      <w:proofErr w:type="spellEnd"/>
+      <w:r>
+        <w:rPr>
+          <w:lang w:val="hu-HU"/>
+        </w:rPr>
+        <w:t xml:space="preserve">": </w:t>
+      </w:r>
+      <w:r>
+        <w:rPr>
+          <w:lang w:val="hu-HU"/>
+        </w:rPr>
+        <w:t>2</w:t>
+      </w:r>
+    </w:p>
+    <w:p>
+      <w:pPr>
+        <w:pStyle w:val="Kdblokk"/>
+        <w:rPr>
+          <w:lang w:val="hu-HU"/>
+        </w:rPr>
+      </w:pPr>
+      <w:r>
+        <w:rPr>
+          <w:lang w:val="hu-HU"/>
+        </w:rPr>
+        <w:t>}</w:t>
+      </w:r>
+    </w:p>
+    <w:p>
+      <w:pPr>
+        <w:jc w:val="left"/>
+        <w:rPr>
+          <w:lang w:val="hu-HU"/>
+        </w:rPr>
+      </w:pPr>
+      <w:r>
+        <w:rPr>
+          <w:b/>
+          <w:bCs/>
+          <w:lang w:val="hu-HU"/>
+        </w:rPr>
+        <w:t>Korlátozás:</w:t>
+      </w:r>
+      <w:r>
+        <w:rPr>
+          <w:b/>
+          <w:bCs/>
+          <w:lang w:val="hu-HU"/>
+        </w:rPr>
+        <w:t xml:space="preserve"> </w:t>
+      </w:r>
+      <w:r>
+        <w:rPr>
+          <w:lang w:val="hu-HU"/>
+        </w:rPr>
+        <w:t xml:space="preserve">Csak az adott </w:t>
+      </w:r>
+      <w:proofErr w:type="spellStart"/>
+      <w:r>
+        <w:rPr>
+          <w:lang w:val="hu-HU"/>
+        </w:rPr>
+        <w:t>thread</w:t>
+      </w:r>
+      <w:proofErr w:type="spellEnd"/>
+      <w:r>
+        <w:rPr>
+          <w:lang w:val="hu-HU"/>
+        </w:rPr>
+        <w:t xml:space="preserve"> „</w:t>
+      </w:r>
+      <w:proofErr w:type="spellStart"/>
+      <w:r>
+        <w:rPr>
+          <w:lang w:val="hu-HU"/>
+        </w:rPr>
+        <w:t>admin</w:t>
+      </w:r>
+      <w:proofErr w:type="spellEnd"/>
+      <w:r>
+        <w:rPr>
+          <w:lang w:val="hu-HU"/>
+        </w:rPr>
+        <w:t>” ranggal rendelkező tagjai számára. A „</w:t>
+      </w:r>
+      <w:proofErr w:type="spellStart"/>
+      <w:r>
+        <w:rPr>
+          <w:lang w:val="hu-HU"/>
+        </w:rPr>
+        <w:t>banned</w:t>
+      </w:r>
+      <w:proofErr w:type="spellEnd"/>
+      <w:r>
+        <w:rPr>
+          <w:lang w:val="hu-HU"/>
+        </w:rPr>
+        <w:t>” rang adására nem használható a végpont.</w:t>
+      </w:r>
+    </w:p>
+    <w:p>
+      <w:pPr>
+        <w:pStyle w:val="Kdblokk"/>
+      </w:pPr>
+      <w:r>
+        <w:t>{</w:t>
+      </w:r>
+    </w:p>
+    <w:p>
+      <w:pPr>
+        <w:pStyle w:val="Kdblokk"/>
+      </w:pPr>
+      <w:r>
+        <w:t xml:space="preserve">  "message": "Role updated successfully"</w:t>
+      </w:r>
+    </w:p>
+    <w:p>
+      <w:pPr>
+        <w:pStyle w:val="Kdblokk"/>
+      </w:pPr>
+      <w:r>
+        <w:t>}</w:t>
+      </w:r>
+    </w:p>
+    <w:p>
+      <w:pPr>
+        <w:rPr>
+          <w:b/>
+          <w:bCs/>
+          <w:lang w:val="hu-HU"/>
+        </w:rPr>
+      </w:pPr>
+      <w:r>
+        <w:rPr>
+          <w:b/>
+          <w:bCs/>
+          <w:lang w:val="hu-HU"/>
+        </w:rPr>
+        <w:t>PATCH</w:t>
+      </w:r>
+      <w:r>
+        <w:rPr>
+          <w:lang w:val="hu-HU"/>
+        </w:rPr>
+        <w:t xml:space="preserve"> </w:t>
+      </w:r>
+      <w:proofErr w:type="spellStart"/>
+      <w:r>
+        <w:rPr>
+          <w:lang w:val="hu-HU"/>
+        </w:rPr>
+        <w:t>Th</w:t>
+      </w:r>
+      <w:r>
+        <w:rPr>
+          <w:lang w:val="hu-HU"/>
+        </w:rPr>
+        <w:t>readUsers</w:t>
+      </w:r>
+      <w:proofErr w:type="spellEnd"/>
+    </w:p>
+    <w:p>
+      <w:pPr>
+        <w:rPr>
+          <w:lang w:val="hu-HU"/>
+        </w:rPr>
+      </w:pPr>
+      <w:r>
+        <w:rPr>
+          <w:noProof/>
+          <w:lang w:val="hu-HU"/>
+        </w:rPr>
+        <w:drawing>
+          <wp:inline distT="0" distB="0" distL="0" distR="0" wp14:anchorId="31898E9A" wp14:editId="05306598">
+            <wp:extent cx="5971540" cy="292100"/>
+            <wp:effectExtent l="0" t="0" r="0" b="0"/>
+            <wp:docPr id="724664527" name="Kép 6"/>
+            <wp:cNvGraphicFramePr>
+              <a:graphicFrameLocks xmlns:a="http://schemas.openxmlformats.org/drawingml/2006/main" noChangeAspect="1"/>
+            </wp:cNvGraphicFramePr>
+            <a:graphic xmlns:a="http://schemas.openxmlformats.org/drawingml/2006/main">
+              <a:graphicData uri="http://schemas.openxmlformats.org/drawingml/2006/picture">
+                <pic:pic xmlns:pic="http://schemas.openxmlformats.org/drawingml/2006/picture">
+                  <pic:nvPicPr>
+                    <pic:cNvPr id="1252685051" name="Kép 1252685051"/>
+                    <pic:cNvPicPr/>
+                  </pic:nvPicPr>
+                  <pic:blipFill>
+                    <a:blip r:embed="rId25">
+                      <a:extLst>
+                        <a:ext uri="{28A0092B-C50C-407E-A947-70E740481C1C}">
+                          <a14:useLocalDpi xmlns:a14="http://schemas.microsoft.com/office/drawing/2010/main" val="0"/>
+                        </a:ext>
+                      </a:extLst>
+                    </a:blip>
+                    <a:stretch>
+                      <a:fillRect/>
+                    </a:stretch>
+                  </pic:blipFill>
+                  <pic:spPr>
+                    <a:xfrm>
+                      <a:off x="0" y="0"/>
+                      <a:ext cx="5971540" cy="292100"/>
+                    </a:xfrm>
+                    <a:prstGeom prst="rect">
+                      <a:avLst/>
+                    </a:prstGeom>
+                  </pic:spPr>
+                </pic:pic>
+              </a:graphicData>
+            </a:graphic>
+          </wp:inline>
+        </w:drawing>
+      </w:r>
+    </w:p>
+    <w:p>
+      <w:pPr>
+        <w:jc w:val="left"/>
+        <w:rPr>
+          <w:lang w:val="hu-HU"/>
+        </w:rPr>
+      </w:pPr>
+      <w:r>
+        <w:rPr>
+          <w:b/>
+          <w:bCs/>
+          <w:lang w:val="hu-HU"/>
+        </w:rPr>
+        <w:t>Példa kérés:</w:t>
+      </w:r>
+      <w:r>
+        <w:rPr>
+          <w:b/>
+          <w:bCs/>
+          <w:lang w:val="hu-HU"/>
+        </w:rPr>
+        <w:t xml:space="preserve"> </w:t>
+      </w:r>
+      <w:r>
+        <w:rPr>
+          <w:rFonts w:ascii="Courier New" w:hAnsi="Courier New" w:cs="Courier New"/>
+          <w:lang w:val="hu-HU"/>
+        </w:rPr>
+        <w:t>PATCH</w:t>
+      </w:r>
+      <w:r>
+        <w:rPr>
+          <w:rFonts w:ascii="Courier New" w:hAnsi="Courier New" w:cs="Courier New"/>
+          <w:lang w:val="hu-HU"/>
+        </w:rPr>
+        <w:t xml:space="preserve"> | /</w:t>
+      </w:r>
+      <w:proofErr w:type="spellStart"/>
+      <w:r>
+        <w:rPr>
+          <w:rFonts w:ascii="Courier New" w:hAnsi="Courier New" w:cs="Courier New"/>
+          <w:lang w:val="hu-HU"/>
+        </w:rPr>
+        <w:t>api</w:t>
+      </w:r>
+      <w:proofErr w:type="spellEnd"/>
+      <w:r>
+        <w:rPr>
+          <w:rFonts w:ascii="Courier New" w:hAnsi="Courier New" w:cs="Courier New"/>
+          <w:lang w:val="hu-HU"/>
+        </w:rPr>
+        <w:t>/</w:t>
+      </w:r>
+      <w:proofErr w:type="spellStart"/>
+      <w:r>
+        <w:rPr>
+          <w:rFonts w:ascii="Courier New" w:hAnsi="Courier New" w:cs="Courier New"/>
+          <w:lang w:val="hu-HU"/>
+        </w:rPr>
+        <w:t>threads</w:t>
+      </w:r>
+      <w:proofErr w:type="spellEnd"/>
+      <w:r>
+        <w:rPr>
+          <w:rFonts w:ascii="Courier New" w:hAnsi="Courier New" w:cs="Courier New"/>
+          <w:lang w:val="hu-HU"/>
+        </w:rPr>
+        <w:t>/1/</w:t>
+      </w:r>
+      <w:proofErr w:type="spellStart"/>
+      <w:r>
+        <w:rPr>
+          <w:rFonts w:ascii="Courier New" w:hAnsi="Courier New" w:cs="Courier New"/>
+          <w:lang w:val="hu-HU"/>
+        </w:rPr>
+        <w:t>members</w:t>
+      </w:r>
+      <w:proofErr w:type="spellEnd"/>
+      <w:r>
+        <w:rPr>
+          <w:rFonts w:ascii="Courier New" w:hAnsi="Courier New" w:cs="Courier New"/>
+          <w:lang w:val="hu-HU"/>
+        </w:rPr>
+        <w:t>/1</w:t>
+      </w:r>
+      <w:r>
+        <w:rPr>
+          <w:rFonts w:ascii="Courier New" w:hAnsi="Courier New" w:cs="Courier New"/>
+          <w:lang w:val="hu-HU"/>
+        </w:rPr>
+        <w:t>/</w:t>
+      </w:r>
+      <w:proofErr w:type="spellStart"/>
+      <w:r>
+        <w:rPr>
+          <w:rFonts w:ascii="Courier New" w:hAnsi="Courier New" w:cs="Courier New"/>
+          <w:lang w:val="hu-HU"/>
+        </w:rPr>
+        <w:t>ban</w:t>
+      </w:r>
+      <w:proofErr w:type="spellEnd"/>
+      <w:r>
+        <w:rPr>
+          <w:lang w:val="hu-HU"/>
+        </w:rPr>
+        <w:br/>
+      </w:r>
+      <w:r>
+        <w:rPr>
+          <w:b/>
+          <w:bCs/>
+          <w:lang w:val="hu-HU"/>
+        </w:rPr>
+        <w:t>Body:</w:t>
+      </w:r>
+      <w:r>
+        <w:rPr>
+          <w:b/>
+          <w:bCs/>
+          <w:lang w:val="hu-HU"/>
+        </w:rPr>
+        <w:t xml:space="preserve"> </w:t>
+      </w:r>
+    </w:p>
+    <w:p>
+      <w:pPr>
+        <w:pStyle w:val="Kdblokk"/>
+        <w:rPr>
+          <w:lang w:val="hu-HU"/>
+        </w:rPr>
+      </w:pPr>
+      <w:r>
+        <w:rPr>
+          <w:lang w:val="hu-HU"/>
+        </w:rPr>
+        <w:t>{</w:t>
+      </w:r>
+    </w:p>
+    <w:p>
+      <w:pPr>
+        <w:pStyle w:val="Kdblokk"/>
+        <w:rPr>
+          <w:lang w:val="hu-HU"/>
+        </w:rPr>
+      </w:pPr>
+      <w:r>
+        <w:rPr>
+          <w:lang w:val="hu-HU"/>
+        </w:rPr>
+        <w:t xml:space="preserve">  "</w:t>
+      </w:r>
+      <w:proofErr w:type="spellStart"/>
+      <w:r>
+        <w:rPr>
+          <w:lang w:val="hu-HU"/>
+        </w:rPr>
+        <w:t>role_id</w:t>
+      </w:r>
+      <w:proofErr w:type="spellEnd"/>
+      <w:r>
+        <w:rPr>
+          <w:lang w:val="hu-HU"/>
+        </w:rPr>
+        <w:t xml:space="preserve">": </w:t>
+      </w:r>
+      <w:r>
+        <w:rPr>
+          <w:lang w:val="hu-HU"/>
+        </w:rPr>
+        <w:t>4</w:t>
+      </w:r>
+    </w:p>
+    <w:p>
+      <w:pPr>
+        <w:pStyle w:val="Kdblokk"/>
+        <w:rPr>
+          <w:lang w:val="hu-HU"/>
+        </w:rPr>
+      </w:pPr>
+      <w:r>
+        <w:rPr>
+          <w:lang w:val="hu-HU"/>
+        </w:rPr>
+        <w:t>}</w:t>
+      </w:r>
+    </w:p>
+    <w:p>
+      <w:pPr>
+        <w:jc w:val="left"/>
+        <w:rPr>
+          <w:lang w:val="hu-HU"/>
+        </w:rPr>
+      </w:pPr>
+      <w:r>
+        <w:rPr>
+          <w:b/>
+          <w:bCs/>
+          <w:lang w:val="hu-HU"/>
+        </w:rPr>
+        <w:t>Korlátozás:</w:t>
+      </w:r>
+      <w:r>
+        <w:rPr>
+          <w:b/>
+          <w:bCs/>
+          <w:lang w:val="hu-HU"/>
+        </w:rPr>
+        <w:t xml:space="preserve"> </w:t>
+      </w:r>
+      <w:r>
+        <w:rPr>
+          <w:lang w:val="hu-HU"/>
+        </w:rPr>
+        <w:t xml:space="preserve">Csak az adott </w:t>
+      </w:r>
+      <w:proofErr w:type="spellStart"/>
+      <w:r>
+        <w:rPr>
+          <w:lang w:val="hu-HU"/>
+        </w:rPr>
+        <w:t>thread</w:t>
+      </w:r>
+      <w:proofErr w:type="spellEnd"/>
+      <w:r>
+        <w:rPr>
+          <w:lang w:val="hu-HU"/>
+        </w:rPr>
+        <w:t xml:space="preserve"> „</w:t>
+      </w:r>
+      <w:proofErr w:type="spellStart"/>
+      <w:r>
+        <w:rPr>
+          <w:lang w:val="hu-HU"/>
+        </w:rPr>
+        <w:t>admin</w:t>
+      </w:r>
+      <w:proofErr w:type="spellEnd"/>
+      <w:r>
+        <w:rPr>
+          <w:lang w:val="hu-HU"/>
+        </w:rPr>
+        <w:t>”</w:t>
+      </w:r>
+      <w:r>
+        <w:rPr>
+          <w:lang w:val="hu-HU"/>
+        </w:rPr>
+        <w:t xml:space="preserve"> vagy „</w:t>
+      </w:r>
+      <w:proofErr w:type="spellStart"/>
+      <w:r>
+        <w:rPr>
+          <w:lang w:val="hu-HU"/>
+        </w:rPr>
+        <w:t>moderator</w:t>
+      </w:r>
+      <w:proofErr w:type="spellEnd"/>
+      <w:r>
+        <w:rPr>
+          <w:lang w:val="hu-HU"/>
+        </w:rPr>
+        <w:t>”</w:t>
+      </w:r>
+      <w:r>
+        <w:rPr>
+          <w:lang w:val="hu-HU"/>
+        </w:rPr>
+        <w:t xml:space="preserve"> ranggal rendelkező tagjai számára. A „</w:t>
+      </w:r>
+      <w:proofErr w:type="spellStart"/>
+      <w:r>
+        <w:rPr>
+          <w:lang w:val="hu-HU"/>
+        </w:rPr>
+        <w:t>banned</w:t>
+      </w:r>
+      <w:proofErr w:type="spellEnd"/>
+      <w:r>
+        <w:rPr>
+          <w:lang w:val="hu-HU"/>
+        </w:rPr>
+        <w:t>” rang</w:t>
+      </w:r>
+      <w:r>
+        <w:rPr>
+          <w:lang w:val="hu-HU"/>
+        </w:rPr>
+        <w:t>on kívül más rang</w:t>
+      </w:r>
+      <w:r>
+        <w:rPr>
+          <w:lang w:val="hu-HU"/>
+        </w:rPr>
+        <w:t xml:space="preserve"> adására nem használható a végpont.</w:t>
+      </w:r>
+    </w:p>
+    <w:p>
+      <w:pPr>
+        <w:pStyle w:val="Kdblokk"/>
+      </w:pPr>
+      <w:r>
+        <w:t>{</w:t>
+      </w:r>
+    </w:p>
+    <w:p>
+      <w:pPr>
+        <w:pStyle w:val="Kdblokk"/>
+      </w:pPr>
+      <w:r>
+        <w:t xml:space="preserve">  "message": "User banned successfully"</w:t>
+      </w:r>
+    </w:p>
+    <w:p>
+      <w:pPr>
+        <w:pStyle w:val="Kdblokk"/>
+      </w:pPr>
+      <w:r>
+        <w:t>}</w:t>
+      </w:r>
+    </w:p>
+    <w:p>
+      <w:pPr>
+        <w:jc w:val="left"/>
         <w:rPr>
           <w:b/>
           <w:bCs/>
@@ -6473,7 +8446,7 @@
       </w:pPr>
     </w:p>
     <w:sectPr>
-      <w:footerReference w:type="default" r:id="rId22"/>
+      <w:footerReference w:type="default" r:id="rId26"/>
       <w:pgSz w:w="12240" w:h="15840"/>
       <w:pgMar w:top="1418" w:right="1418" w:bottom="1418" w:left="1418" w:header="720" w:footer="720" w:gutter="0"/>
       <w:cols w:space="720"/>
@@ -7532,7 +9505,7 @@
   <w:style w:type="paragraph" w:default="1" w:styleId="Norml">
     <w:name w:val="Normal"/>
     <w:qFormat/>
-    <w:rsid w:val="00194026"/>
+    <w:rsid w:val="00E857A7"/>
     <w:pPr>
       <w:spacing w:before="120" w:line="360" w:lineRule="auto"/>
       <w:jc w:val="both"/>

</xml_diff>

<commit_message>
docs: update API documentation for Threads and Posts controllers
</commit_message>
<xml_diff>
--- a/zarovizsga.docx
+++ b/zarovizsga.docx
@@ -3131,7 +3131,27 @@
         <w:rPr>
           <w:lang w:val="hu-HU"/>
         </w:rPr>
-        <w:t>1.2.2Thread kontroller</w:t>
+        <w:t>1.2.2</w:t>
+      </w:r>
+      <w:r>
+        <w:rPr>
+          <w:lang w:val="hu-HU"/>
+        </w:rPr>
+        <w:t xml:space="preserve"> </w:t>
+      </w:r>
+      <w:proofErr w:type="spellStart"/>
+      <w:r>
+        <w:rPr>
+          <w:lang w:val="hu-HU"/>
+        </w:rPr>
+        <w:t>Thread</w:t>
+      </w:r>
+      <w:proofErr w:type="spellEnd"/>
+      <w:r>
+        <w:rPr>
+          <w:lang w:val="hu-HU"/>
+        </w:rPr>
+        <w:t xml:space="preserve"> kontroller</w:t>
       </w:r>
     </w:p>
     <w:p>
@@ -3866,19 +3886,17 @@
         </w:rPr>
         <w:t xml:space="preserve">rangja van az adott </w:t>
       </w:r>
-      <w:proofErr w:type="spellStart"/>
-      <w:r>
-        <w:rPr>
-          <w:lang w:val="hu-HU"/>
-        </w:rPr>
-        <w:t>thread</w:t>
-      </w:r>
-      <w:proofErr w:type="spellEnd"/>
-      <w:r>
-        <w:rPr>
-          <w:lang w:val="hu-HU"/>
-        </w:rPr>
-        <w:t>-ben</w:t>
+      <w:r>
+        <w:rPr>
+          <w:lang w:val="hu-HU"/>
+        </w:rPr>
+        <w:t>közösség</w:t>
+      </w:r>
+      <w:r>
+        <w:rPr>
+          <w:lang w:val="hu-HU"/>
+        </w:rPr>
+        <w:t>ben</w:t>
       </w:r>
       <w:r>
         <w:rPr>
@@ -4820,16 +4838,14 @@
         <w:rPr>
           <w:lang w:val="hu-HU"/>
         </w:rPr>
-        <w:t xml:space="preserve">z adott </w:t>
-      </w:r>
-      <w:proofErr w:type="spellStart"/>
-      <w:r>
-        <w:rPr>
-          <w:lang w:val="hu-HU"/>
-        </w:rPr>
-        <w:t>thread</w:t>
-      </w:r>
-      <w:proofErr w:type="spellEnd"/>
+        <w:t>z adott</w:t>
+      </w:r>
+      <w:r>
+        <w:rPr>
+          <w:lang w:val="hu-HU"/>
+        </w:rPr>
+        <w:t xml:space="preserve"> közösség</w:t>
+      </w:r>
       <w:r>
         <w:rPr>
           <w:lang w:val="hu-HU"/>
@@ -5342,16 +5358,14 @@
         <w:rPr>
           <w:lang w:val="hu-HU"/>
         </w:rPr>
-        <w:t xml:space="preserve">z adott </w:t>
-      </w:r>
-      <w:proofErr w:type="spellStart"/>
-      <w:r>
-        <w:rPr>
-          <w:lang w:val="hu-HU"/>
-        </w:rPr>
-        <w:t>thread</w:t>
-      </w:r>
-      <w:proofErr w:type="spellEnd"/>
+        <w:t>z adott</w:t>
+      </w:r>
+      <w:r>
+        <w:rPr>
+          <w:lang w:val="hu-HU"/>
+        </w:rPr>
+        <w:t xml:space="preserve"> közösség</w:t>
+      </w:r>
       <w:r>
         <w:rPr>
           <w:lang w:val="hu-HU"/>
@@ -5812,15 +5826,15 @@
         <w:rPr>
           <w:lang w:val="hu-HU"/>
         </w:rPr>
-        <w:t>thread</w:t>
-      </w:r>
-      <w:proofErr w:type="spellEnd"/>
-      <w:r>
-        <w:rPr>
-          <w:lang w:val="hu-HU"/>
-        </w:rPr>
-        <w:t>-ben</w:t>
-      </w:r>
+        <w:t>közösségben</w:t>
+      </w:r>
+      <w:r>
+        <w:rPr>
+          <w:lang w:val="hu-HU"/>
+        </w:rPr>
+        <w:t>en</w:t>
+      </w:r>
+      <w:proofErr w:type="spellEnd"/>
       <w:r>
         <w:rPr>
           <w:lang w:val="hu-HU"/>
@@ -6443,16 +6457,14 @@
         <w:rPr>
           <w:lang w:val="hu-HU"/>
         </w:rPr>
-        <w:t xml:space="preserve"> Csak az adott </w:t>
-      </w:r>
-      <w:proofErr w:type="spellStart"/>
-      <w:r>
-        <w:rPr>
-          <w:lang w:val="hu-HU"/>
-        </w:rPr>
-        <w:t>thread</w:t>
-      </w:r>
-      <w:proofErr w:type="spellEnd"/>
+        <w:t xml:space="preserve"> Csak az adott</w:t>
+      </w:r>
+      <w:r>
+        <w:rPr>
+          <w:lang w:val="hu-HU"/>
+        </w:rPr>
+        <w:t xml:space="preserve"> közösség</w:t>
+      </w:r>
       <w:r>
         <w:rPr>
           <w:lang w:val="hu-HU"/>
@@ -6622,26 +6634,22 @@
         <w:rPr>
           <w:lang w:val="hu-HU"/>
         </w:rPr>
-        <w:t>1.2.</w:t>
-      </w:r>
-      <w:r>
-        <w:rPr>
-          <w:lang w:val="hu-HU"/>
-        </w:rPr>
-        <w:t>3</w:t>
-      </w:r>
-      <w:r>
-        <w:rPr>
-          <w:lang w:val="hu-HU"/>
-        </w:rPr>
-        <w:t>Thread</w:t>
-      </w:r>
-      <w:r>
-        <w:rPr>
-          <w:lang w:val="hu-HU"/>
-        </w:rPr>
-        <w:t>User</w:t>
-      </w:r>
+        <w:t>1.2.3</w:t>
+      </w:r>
+      <w:r>
+        <w:rPr>
+          <w:lang w:val="hu-HU"/>
+        </w:rPr>
+        <w:t xml:space="preserve"> </w:t>
+      </w:r>
+      <w:proofErr w:type="spellStart"/>
+      <w:r>
+        <w:rPr>
+          <w:lang w:val="hu-HU"/>
+        </w:rPr>
+        <w:t>ThreadUser</w:t>
+      </w:r>
+      <w:proofErr w:type="spellEnd"/>
       <w:r>
         <w:rPr>
           <w:lang w:val="hu-HU"/>
@@ -6885,22 +6893,14 @@
         <w:rPr>
           <w:lang w:val="hu-HU"/>
         </w:rPr>
-        <w:t xml:space="preserve"> </w:t>
-      </w:r>
-      <w:r>
-        <w:rPr>
-          <w:lang w:val="hu-HU"/>
-        </w:rPr>
-        <w:t xml:space="preserve">az adott </w:t>
-      </w:r>
-      <w:proofErr w:type="spellStart"/>
-      <w:r>
-        <w:rPr>
-          <w:lang w:val="hu-HU"/>
-        </w:rPr>
-        <w:t>thread</w:t>
-      </w:r>
-      <w:proofErr w:type="spellEnd"/>
+        <w:t xml:space="preserve"> az adott</w:t>
+      </w:r>
+      <w:r>
+        <w:rPr>
+          <w:lang w:val="hu-HU"/>
+        </w:rPr>
+        <w:t xml:space="preserve"> közösség</w:t>
+      </w:r>
       <w:r>
         <w:rPr>
           <w:lang w:val="hu-HU"/>
@@ -7128,13 +7128,7 @@
         <w:rPr>
           <w:lang w:val="hu-HU"/>
         </w:rPr>
-        <w:t>read</w:t>
-      </w:r>
-      <w:r>
-        <w:rPr>
-          <w:lang w:val="hu-HU"/>
-        </w:rPr>
-        <w:t>Users</w:t>
+        <w:t>readUsers</w:t>
       </w:r>
       <w:proofErr w:type="spellEnd"/>
     </w:p>
@@ -7612,16 +7606,14 @@
         <w:rPr>
           <w:lang w:val="hu-HU"/>
         </w:rPr>
-        <w:t xml:space="preserve"> az adott </w:t>
-      </w:r>
-      <w:proofErr w:type="spellStart"/>
-      <w:r>
-        <w:rPr>
-          <w:lang w:val="hu-HU"/>
-        </w:rPr>
-        <w:t>thread</w:t>
-      </w:r>
-      <w:proofErr w:type="spellEnd"/>
+        <w:t xml:space="preserve"> az adott</w:t>
+      </w:r>
+      <w:r>
+        <w:rPr>
+          <w:lang w:val="hu-HU"/>
+        </w:rPr>
+        <w:t xml:space="preserve"> közösség</w:t>
+      </w:r>
       <w:r>
         <w:rPr>
           <w:lang w:val="hu-HU"/>
@@ -7956,16 +7948,14 @@
         <w:rPr>
           <w:lang w:val="hu-HU"/>
         </w:rPr>
-        <w:t xml:space="preserve">Csak az adott </w:t>
-      </w:r>
-      <w:proofErr w:type="spellStart"/>
-      <w:r>
-        <w:rPr>
-          <w:lang w:val="hu-HU"/>
-        </w:rPr>
-        <w:t>thread</w:t>
-      </w:r>
-      <w:proofErr w:type="spellEnd"/>
+        <w:t>Csak az adott</w:t>
+      </w:r>
+      <w:r>
+        <w:rPr>
+          <w:lang w:val="hu-HU"/>
+        </w:rPr>
+        <w:t xml:space="preserve"> közösség</w:t>
+      </w:r>
       <w:r>
         <w:rPr>
           <w:lang w:val="hu-HU"/>
@@ -8199,10 +8189,863 @@
           <w:rFonts w:ascii="Courier New" w:hAnsi="Courier New" w:cs="Courier New"/>
           <w:lang w:val="hu-HU"/>
         </w:rPr>
+        <w:t>/1/</w:t>
+      </w:r>
+      <w:proofErr w:type="spellStart"/>
+      <w:r>
+        <w:rPr>
+          <w:rFonts w:ascii="Courier New" w:hAnsi="Courier New" w:cs="Courier New"/>
+          <w:lang w:val="hu-HU"/>
+        </w:rPr>
+        <w:t>ban</w:t>
+      </w:r>
+      <w:proofErr w:type="spellEnd"/>
+      <w:r>
+        <w:rPr>
+          <w:lang w:val="hu-HU"/>
+        </w:rPr>
+        <w:br/>
+      </w:r>
+      <w:r>
+        <w:rPr>
+          <w:b/>
+          <w:bCs/>
+          <w:lang w:val="hu-HU"/>
+        </w:rPr>
+        <w:t>Body:</w:t>
+      </w:r>
+      <w:r>
+        <w:rPr>
+          <w:b/>
+          <w:bCs/>
+          <w:lang w:val="hu-HU"/>
+        </w:rPr>
+        <w:t xml:space="preserve"> </w:t>
+      </w:r>
+    </w:p>
+    <w:p>
+      <w:pPr>
+        <w:pStyle w:val="Kdblokk"/>
+        <w:rPr>
+          <w:lang w:val="hu-HU"/>
+        </w:rPr>
+      </w:pPr>
+      <w:r>
+        <w:rPr>
+          <w:lang w:val="hu-HU"/>
+        </w:rPr>
+        <w:t>{</w:t>
+      </w:r>
+    </w:p>
+    <w:p>
+      <w:pPr>
+        <w:pStyle w:val="Kdblokk"/>
+        <w:rPr>
+          <w:lang w:val="hu-HU"/>
+        </w:rPr>
+      </w:pPr>
+      <w:r>
+        <w:rPr>
+          <w:lang w:val="hu-HU"/>
+        </w:rPr>
+        <w:t xml:space="preserve">  "</w:t>
+      </w:r>
+      <w:proofErr w:type="spellStart"/>
+      <w:r>
+        <w:rPr>
+          <w:lang w:val="hu-HU"/>
+        </w:rPr>
+        <w:t>role_id</w:t>
+      </w:r>
+      <w:proofErr w:type="spellEnd"/>
+      <w:r>
+        <w:rPr>
+          <w:lang w:val="hu-HU"/>
+        </w:rPr>
+        <w:t xml:space="preserve">": </w:t>
+      </w:r>
+      <w:r>
+        <w:rPr>
+          <w:lang w:val="hu-HU"/>
+        </w:rPr>
+        <w:t>4</w:t>
+      </w:r>
+    </w:p>
+    <w:p>
+      <w:pPr>
+        <w:pStyle w:val="Kdblokk"/>
+        <w:rPr>
+          <w:lang w:val="hu-HU"/>
+        </w:rPr>
+      </w:pPr>
+      <w:r>
+        <w:rPr>
+          <w:lang w:val="hu-HU"/>
+        </w:rPr>
+        <w:t>}</w:t>
+      </w:r>
+    </w:p>
+    <w:p>
+      <w:pPr>
+        <w:jc w:val="left"/>
+        <w:rPr>
+          <w:lang w:val="hu-HU"/>
+        </w:rPr>
+      </w:pPr>
+      <w:r>
+        <w:rPr>
+          <w:b/>
+          <w:bCs/>
+          <w:lang w:val="hu-HU"/>
+        </w:rPr>
+        <w:t>Korlátozás:</w:t>
+      </w:r>
+      <w:r>
+        <w:rPr>
+          <w:b/>
+          <w:bCs/>
+          <w:lang w:val="hu-HU"/>
+        </w:rPr>
+        <w:t xml:space="preserve"> </w:t>
+      </w:r>
+      <w:r>
+        <w:rPr>
+          <w:lang w:val="hu-HU"/>
+        </w:rPr>
+        <w:t>Csak az adott</w:t>
+      </w:r>
+      <w:r>
+        <w:rPr>
+          <w:lang w:val="hu-HU"/>
+        </w:rPr>
+        <w:t xml:space="preserve"> közösség</w:t>
+      </w:r>
+      <w:r>
+        <w:rPr>
+          <w:lang w:val="hu-HU"/>
+        </w:rPr>
+        <w:t xml:space="preserve"> „</w:t>
+      </w:r>
+      <w:proofErr w:type="spellStart"/>
+      <w:r>
+        <w:rPr>
+          <w:lang w:val="hu-HU"/>
+        </w:rPr>
+        <w:t>admin</w:t>
+      </w:r>
+      <w:proofErr w:type="spellEnd"/>
+      <w:r>
+        <w:rPr>
+          <w:lang w:val="hu-HU"/>
+        </w:rPr>
+        <w:t>” vagy „</w:t>
+      </w:r>
+      <w:proofErr w:type="spellStart"/>
+      <w:r>
+        <w:rPr>
+          <w:lang w:val="hu-HU"/>
+        </w:rPr>
+        <w:t>moderator</w:t>
+      </w:r>
+      <w:proofErr w:type="spellEnd"/>
+      <w:r>
+        <w:rPr>
+          <w:lang w:val="hu-HU"/>
+        </w:rPr>
+        <w:t>” ranggal rendelkező tagjai számára. A „</w:t>
+      </w:r>
+      <w:proofErr w:type="spellStart"/>
+      <w:r>
+        <w:rPr>
+          <w:lang w:val="hu-HU"/>
+        </w:rPr>
+        <w:t>banned</w:t>
+      </w:r>
+      <w:proofErr w:type="spellEnd"/>
+      <w:r>
+        <w:rPr>
+          <w:lang w:val="hu-HU"/>
+        </w:rPr>
+        <w:t>” rangon kívül más rang adására nem használható a végpont.</w:t>
+      </w:r>
+    </w:p>
+    <w:p>
+      <w:pPr>
+        <w:pStyle w:val="Kdblokk"/>
+      </w:pPr>
+      <w:r>
+        <w:t>{</w:t>
+      </w:r>
+    </w:p>
+    <w:p>
+      <w:pPr>
+        <w:pStyle w:val="Kdblokk"/>
+      </w:pPr>
+      <w:r>
+        <w:t xml:space="preserve">  "message": "User banned successfully"</w:t>
+      </w:r>
+    </w:p>
+    <w:p>
+      <w:pPr>
+        <w:pStyle w:val="Kdblokk"/>
+      </w:pPr>
+      <w:r>
+        <w:t>}</w:t>
+      </w:r>
+    </w:p>
+    <w:p>
+      <w:pPr>
+        <w:pStyle w:val="Alcm"/>
+        <w:rPr>
+          <w:lang w:val="hu-HU"/>
+        </w:rPr>
+      </w:pPr>
+      <w:r>
+        <w:rPr>
+          <w:lang w:val="hu-HU"/>
+        </w:rPr>
+        <w:t>1.2.</w:t>
+      </w:r>
+      <w:r>
+        <w:rPr>
+          <w:lang w:val="hu-HU"/>
+        </w:rPr>
+        <w:t>4 Post</w:t>
+      </w:r>
+      <w:r>
+        <w:rPr>
+          <w:lang w:val="hu-HU"/>
+        </w:rPr>
+        <w:t xml:space="preserve"> kontroller</w:t>
+      </w:r>
+    </w:p>
+    <w:p>
+      <w:pPr>
+        <w:rPr>
+          <w:lang w:val="hu-HU"/>
+        </w:rPr>
+      </w:pPr>
+      <w:r>
+        <w:rPr>
+          <w:b/>
+          <w:bCs/>
+          <w:lang w:val="hu-HU"/>
+        </w:rPr>
+        <w:t>GET</w:t>
+      </w:r>
+      <w:r>
+        <w:rPr>
+          <w:b/>
+          <w:bCs/>
+          <w:lang w:val="hu-HU"/>
+        </w:rPr>
+        <w:t xml:space="preserve"> </w:t>
+      </w:r>
+      <w:proofErr w:type="spellStart"/>
+      <w:r>
+        <w:rPr>
+          <w:lang w:val="hu-HU"/>
+        </w:rPr>
+        <w:t>Posts</w:t>
+      </w:r>
+      <w:proofErr w:type="spellEnd"/>
+      <w:r>
+        <w:rPr>
+          <w:lang w:val="hu-HU"/>
+        </w:rPr>
+        <w:t xml:space="preserve"> (</w:t>
+      </w:r>
+      <w:proofErr w:type="spellStart"/>
+      <w:r>
+        <w:rPr>
+          <w:lang w:val="hu-HU"/>
+        </w:rPr>
+        <w:t>single</w:t>
+      </w:r>
+      <w:proofErr w:type="spellEnd"/>
+      <w:r>
+        <w:rPr>
+          <w:lang w:val="hu-HU"/>
+        </w:rPr>
+        <w:t>)</w:t>
+      </w:r>
+    </w:p>
+    <w:p>
+      <w:pPr>
+        <w:rPr>
+          <w:lang w:val="hu-HU"/>
+        </w:rPr>
+      </w:pPr>
+      <w:r>
+        <w:rPr>
+          <w:noProof/>
+          <w:lang w:val="hu-HU"/>
+        </w:rPr>
+        <w:drawing>
+          <wp:inline distT="0" distB="0" distL="0" distR="0" wp14:anchorId="15973BD4" wp14:editId="65DEF161">
+            <wp:extent cx="5971540" cy="309880"/>
+            <wp:effectExtent l="0" t="0" r="0" b="0"/>
+            <wp:docPr id="402049916" name="Kép 1"/>
+            <wp:cNvGraphicFramePr>
+              <a:graphicFrameLocks xmlns:a="http://schemas.openxmlformats.org/drawingml/2006/main" noChangeAspect="1"/>
+            </wp:cNvGraphicFramePr>
+            <a:graphic xmlns:a="http://schemas.openxmlformats.org/drawingml/2006/main">
+              <a:graphicData uri="http://schemas.openxmlformats.org/drawingml/2006/picture">
+                <pic:pic xmlns:pic="http://schemas.openxmlformats.org/drawingml/2006/picture">
+                  <pic:nvPicPr>
+                    <pic:cNvPr id="819294682" name="Kép 819294682"/>
+                    <pic:cNvPicPr/>
+                  </pic:nvPicPr>
+                  <pic:blipFill>
+                    <a:blip r:embed="rId22">
+                      <a:extLst>
+                        <a:ext uri="{28A0092B-C50C-407E-A947-70E740481C1C}">
+                          <a14:useLocalDpi xmlns:a14="http://schemas.microsoft.com/office/drawing/2010/main" val="0"/>
+                        </a:ext>
+                      </a:extLst>
+                    </a:blip>
+                    <a:stretch>
+                      <a:fillRect/>
+                    </a:stretch>
+                  </pic:blipFill>
+                  <pic:spPr>
+                    <a:xfrm>
+                      <a:off x="0" y="0"/>
+                      <a:ext cx="5971540" cy="309880"/>
+                    </a:xfrm>
+                    <a:prstGeom prst="rect">
+                      <a:avLst/>
+                    </a:prstGeom>
+                  </pic:spPr>
+                </pic:pic>
+              </a:graphicData>
+            </a:graphic>
+          </wp:inline>
+        </w:drawing>
+      </w:r>
+    </w:p>
+    <w:p>
+      <w:pPr>
+        <w:jc w:val="left"/>
+        <w:rPr>
+          <w:lang w:val="hu-HU"/>
+        </w:rPr>
+      </w:pPr>
+      <w:r>
+        <w:rPr>
+          <w:b/>
+          <w:bCs/>
+          <w:lang w:val="hu-HU"/>
+        </w:rPr>
+        <w:t>Példa kérés:</w:t>
+      </w:r>
+      <w:r>
+        <w:rPr>
+          <w:lang w:val="hu-HU"/>
+        </w:rPr>
+        <w:t xml:space="preserve"> </w:t>
+      </w:r>
+      <w:r>
+        <w:rPr>
+          <w:rFonts w:ascii="Courier New" w:hAnsi="Courier New" w:cs="Courier New"/>
+          <w:lang w:val="hu-HU"/>
+        </w:rPr>
+        <w:t>GET | /</w:t>
+      </w:r>
+      <w:proofErr w:type="spellStart"/>
+      <w:r>
+        <w:rPr>
+          <w:rFonts w:ascii="Courier New" w:hAnsi="Courier New" w:cs="Courier New"/>
+          <w:lang w:val="hu-HU"/>
+        </w:rPr>
+        <w:t>api</w:t>
+      </w:r>
+      <w:proofErr w:type="spellEnd"/>
+      <w:r>
+        <w:rPr>
+          <w:rFonts w:ascii="Courier New" w:hAnsi="Courier New" w:cs="Courier New"/>
+          <w:lang w:val="hu-HU"/>
+        </w:rPr>
+        <w:t>/</w:t>
+      </w:r>
+      <w:proofErr w:type="spellStart"/>
+      <w:r>
+        <w:rPr>
+          <w:rFonts w:ascii="Courier New" w:hAnsi="Courier New" w:cs="Courier New"/>
+          <w:lang w:val="hu-HU"/>
+        </w:rPr>
+        <w:t>posts</w:t>
+      </w:r>
+      <w:proofErr w:type="spellEnd"/>
+      <w:r>
+        <w:rPr>
+          <w:rFonts w:ascii="Courier New" w:hAnsi="Courier New" w:cs="Courier New"/>
+          <w:lang w:val="hu-HU"/>
+        </w:rPr>
         <w:t>/1</w:t>
       </w:r>
       <w:r>
         <w:rPr>
+          <w:lang w:val="hu-HU"/>
+        </w:rPr>
+        <w:br/>
+      </w:r>
+      <w:r>
+        <w:rPr>
+          <w:b/>
+          <w:bCs/>
+          <w:lang w:val="hu-HU"/>
+        </w:rPr>
+        <w:t>Body:</w:t>
+      </w:r>
+      <w:r>
+        <w:rPr>
+          <w:b/>
+          <w:bCs/>
+          <w:lang w:val="hu-HU"/>
+        </w:rPr>
+        <w:t xml:space="preserve"> </w:t>
+      </w:r>
+      <w:r>
+        <w:rPr>
+          <w:lang w:val="hu-HU"/>
+        </w:rPr>
+        <w:t>-</w:t>
+      </w:r>
+      <w:r>
+        <w:rPr>
+          <w:lang w:val="hu-HU"/>
+        </w:rPr>
+        <w:br/>
+      </w:r>
+      <w:r>
+        <w:rPr>
+          <w:b/>
+          <w:bCs/>
+          <w:lang w:val="hu-HU"/>
+        </w:rPr>
+        <w:lastRenderedPageBreak/>
+        <w:t>Korlátozás:</w:t>
+      </w:r>
+      <w:r>
+        <w:rPr>
+          <w:b/>
+          <w:bCs/>
+          <w:lang w:val="hu-HU"/>
+        </w:rPr>
+        <w:t xml:space="preserve"> </w:t>
+      </w:r>
+      <w:r>
+        <w:rPr>
+          <w:lang w:val="hu-HU"/>
+        </w:rPr>
+        <w:t>Csak</w:t>
+      </w:r>
+      <w:r>
+        <w:rPr>
+          <w:lang w:val="hu-HU"/>
+        </w:rPr>
+        <w:t xml:space="preserve"> az</w:t>
+      </w:r>
+      <w:r>
+        <w:rPr>
+          <w:lang w:val="hu-HU"/>
+        </w:rPr>
+        <w:t>on közösség</w:t>
+      </w:r>
+      <w:r>
+        <w:rPr>
+          <w:lang w:val="hu-HU"/>
+        </w:rPr>
+        <w:t xml:space="preserve"> tagjai számára elérhető</w:t>
+      </w:r>
+      <w:r>
+        <w:rPr>
+          <w:lang w:val="hu-HU"/>
+        </w:rPr>
+        <w:t>, amelyikben a poszt található</w:t>
+      </w:r>
+      <w:r>
+        <w:rPr>
+          <w:lang w:val="hu-HU"/>
+        </w:rPr>
+        <w:br/>
+      </w:r>
+      <w:r>
+        <w:rPr>
+          <w:b/>
+          <w:bCs/>
+          <w:lang w:val="hu-HU"/>
+        </w:rPr>
+        <w:t>Példa válasz:</w:t>
+      </w:r>
+      <w:r>
+        <w:rPr>
+          <w:b/>
+          <w:bCs/>
+          <w:lang w:val="hu-HU"/>
+        </w:rPr>
+        <w:t xml:space="preserve"> </w:t>
+      </w:r>
+      <w:r>
+        <w:rPr>
+          <w:lang w:val="hu-HU"/>
+        </w:rPr>
+        <w:t>(200 OK)</w:t>
+      </w:r>
+    </w:p>
+    <w:p>
+      <w:pPr>
+        <w:pStyle w:val="Kdblokk"/>
+      </w:pPr>
+      <w:r>
+        <w:t>[</w:t>
+      </w:r>
+    </w:p>
+    <w:p>
+      <w:pPr>
+        <w:pStyle w:val="Kdblokk"/>
+      </w:pPr>
+      <w:r>
+        <w:t xml:space="preserve">  {</w:t>
+      </w:r>
+    </w:p>
+    <w:p>
+      <w:pPr>
+        <w:pStyle w:val="Kdblokk"/>
+      </w:pPr>
+      <w:r>
+        <w:t xml:space="preserve">    "id": 1,</w:t>
+      </w:r>
+    </w:p>
+    <w:p>
+      <w:pPr>
+        <w:pStyle w:val="Kdblokk"/>
+      </w:pPr>
+      <w:r>
+        <w:t xml:space="preserve">    "content": "</w:t>
+      </w:r>
+      <w:proofErr w:type="spellStart"/>
+      <w:r>
+        <w:t>birkapasztorok</w:t>
+      </w:r>
+      <w:proofErr w:type="spellEnd"/>
+      <w:r>
+        <w:t>",</w:t>
+      </w:r>
+    </w:p>
+    <w:p>
+      <w:pPr>
+        <w:pStyle w:val="Kdblokk"/>
+      </w:pPr>
+      <w:r>
+        <w:t xml:space="preserve">    "image": null,</w:t>
+      </w:r>
+    </w:p>
+    <w:p>
+      <w:pPr>
+        <w:pStyle w:val="Kdblokk"/>
+      </w:pPr>
+      <w:r>
+        <w:t xml:space="preserve">    "user": {</w:t>
+      </w:r>
+    </w:p>
+    <w:p>
+      <w:pPr>
+        <w:pStyle w:val="Kdblokk"/>
+      </w:pPr>
+      <w:r>
+        <w:t xml:space="preserve">      "id": 2,</w:t>
+      </w:r>
+    </w:p>
+    <w:p>
+      <w:pPr>
+        <w:pStyle w:val="Kdblokk"/>
+      </w:pPr>
+      <w:r>
+        <w:t xml:space="preserve">      "name": "</w:t>
+      </w:r>
+      <w:proofErr w:type="spellStart"/>
+      <w:r>
+        <w:t>Gehér</w:t>
+      </w:r>
+      <w:proofErr w:type="spellEnd"/>
+      <w:r>
+        <w:t xml:space="preserve"> Marcell",</w:t>
+      </w:r>
+    </w:p>
+    <w:p>
+      <w:pPr>
+        <w:pStyle w:val="Kdblokk"/>
+      </w:pPr>
+      <w:r>
+        <w:t xml:space="preserve">      "email": "geher.marcell@students.jedlik.eu",</w:t>
+      </w:r>
+    </w:p>
+    <w:p>
+      <w:pPr>
+        <w:pStyle w:val="Kdblokk"/>
+      </w:pPr>
+      <w:r>
+        <w:t xml:space="preserve">      "</w:t>
+      </w:r>
+      <w:proofErr w:type="spellStart"/>
+      <w:proofErr w:type="gramStart"/>
+      <w:r>
+        <w:t>image</w:t>
+      </w:r>
+      <w:proofErr w:type="gramEnd"/>
+      <w:r>
+        <w:t>_url</w:t>
+      </w:r>
+      <w:proofErr w:type="spellEnd"/>
+      <w:r>
+        <w:t>": "https://jedligrambackend-</w:t>
+      </w:r>
+      <w:r>
+        <w:t xml:space="preserve"> …</w:t>
+      </w:r>
+      <w:r>
+        <w:t xml:space="preserve"> ",</w:t>
+      </w:r>
+    </w:p>
+    <w:p>
+      <w:pPr>
+        <w:pStyle w:val="Kdblokk"/>
+      </w:pPr>
+      <w:r>
+        <w:t xml:space="preserve">      "bio": "</w:t>
+      </w:r>
+      <w:proofErr w:type="spellStart"/>
+      <w:r>
+        <w:t>Csáá</w:t>
+      </w:r>
+      <w:proofErr w:type="spellEnd"/>
+      <w:r>
+        <w:t>",</w:t>
+      </w:r>
+    </w:p>
+    <w:p>
+      <w:pPr>
+        <w:pStyle w:val="Kdblokk"/>
+      </w:pPr>
+      <w:r>
+        <w:t xml:space="preserve">      "</w:t>
+      </w:r>
+      <w:proofErr w:type="spellStart"/>
+      <w:proofErr w:type="gramStart"/>
+      <w:r>
+        <w:t>post</w:t>
+      </w:r>
+      <w:proofErr w:type="gramEnd"/>
+      <w:r>
+        <w:t>_karma</w:t>
+      </w:r>
+      <w:proofErr w:type="spellEnd"/>
+      <w:r>
+        <w:t>": 1</w:t>
+      </w:r>
+    </w:p>
+    <w:p>
+      <w:pPr>
+        <w:pStyle w:val="Kdblokk"/>
+      </w:pPr>
+      <w:r>
+        <w:t xml:space="preserve">    },</w:t>
+      </w:r>
+    </w:p>
+    <w:p>
+      <w:pPr>
+        <w:pStyle w:val="Kdblokk"/>
+      </w:pPr>
+      <w:r>
+        <w:t xml:space="preserve">    "</w:t>
+      </w:r>
+      <w:proofErr w:type="spellStart"/>
+      <w:proofErr w:type="gramStart"/>
+      <w:r>
+        <w:t>thread</w:t>
+      </w:r>
+      <w:proofErr w:type="gramEnd"/>
+      <w:r>
+        <w:t>_id</w:t>
+      </w:r>
+      <w:proofErr w:type="spellEnd"/>
+      <w:r>
+        <w:t>": 1,</w:t>
+      </w:r>
+    </w:p>
+    <w:p>
+      <w:pPr>
+        <w:pStyle w:val="Kdblokk"/>
+      </w:pPr>
+      <w:r>
+        <w:t xml:space="preserve">    "score": 1,</w:t>
+      </w:r>
+    </w:p>
+    <w:p>
+      <w:pPr>
+        <w:pStyle w:val="Kdblokk"/>
+      </w:pPr>
+      <w:r>
+        <w:t xml:space="preserve">    "age": "1 day ago"</w:t>
+      </w:r>
+    </w:p>
+    <w:p>
+      <w:pPr>
+        <w:pStyle w:val="Kdblokk"/>
+      </w:pPr>
+      <w:r>
+        <w:t xml:space="preserve">  }</w:t>
+      </w:r>
+    </w:p>
+    <w:p>
+      <w:pPr>
+        <w:pStyle w:val="Kdblokk"/>
+      </w:pPr>
+      <w:r>
+        <w:t>]</w:t>
+      </w:r>
+    </w:p>
+    <w:p>
+      <w:pPr>
+        <w:rPr>
+          <w:lang w:val="hu-HU"/>
+        </w:rPr>
+      </w:pPr>
+      <w:r>
+        <w:rPr>
+          <w:b/>
+          <w:bCs/>
+          <w:lang w:val="hu-HU"/>
+        </w:rPr>
+        <w:t>POST</w:t>
+      </w:r>
+      <w:r>
+        <w:rPr>
+          <w:lang w:val="hu-HU"/>
+        </w:rPr>
+        <w:t xml:space="preserve"> </w:t>
+      </w:r>
+      <w:proofErr w:type="spellStart"/>
+      <w:r>
+        <w:rPr>
+          <w:lang w:val="hu-HU"/>
+        </w:rPr>
+        <w:t>Posts</w:t>
+      </w:r>
+      <w:proofErr w:type="spellEnd"/>
+      <w:r>
+        <w:rPr>
+          <w:lang w:val="hu-HU"/>
+        </w:rPr>
+        <w:t xml:space="preserve"> </w:t>
+      </w:r>
+    </w:p>
+    <w:p>
+      <w:pPr>
+        <w:rPr>
+          <w:lang w:val="hu-HU"/>
+        </w:rPr>
+      </w:pPr>
+      <w:r>
+        <w:rPr>
+          <w:noProof/>
+          <w:lang w:val="hu-HU"/>
+        </w:rPr>
+        <w:drawing>
+          <wp:inline distT="0" distB="0" distL="0" distR="0" wp14:anchorId="23E4166D" wp14:editId="383614C5">
+            <wp:extent cx="5971540" cy="358775"/>
+            <wp:effectExtent l="0" t="0" r="0" b="3175"/>
+            <wp:docPr id="146395808" name="Kép 1"/>
+            <wp:cNvGraphicFramePr>
+              <a:graphicFrameLocks xmlns:a="http://schemas.openxmlformats.org/drawingml/2006/main" noChangeAspect="1"/>
+            </wp:cNvGraphicFramePr>
+            <a:graphic xmlns:a="http://schemas.openxmlformats.org/drawingml/2006/main">
+              <a:graphicData uri="http://schemas.openxmlformats.org/drawingml/2006/picture">
+                <pic:pic xmlns:pic="http://schemas.openxmlformats.org/drawingml/2006/picture">
+                  <pic:nvPicPr>
+                    <pic:cNvPr id="146395808" name="Kép 146395808"/>
+                    <pic:cNvPicPr/>
+                  </pic:nvPicPr>
+                  <pic:blipFill>
+                    <a:blip r:embed="rId26">
+                      <a:extLst>
+                        <a:ext uri="{28A0092B-C50C-407E-A947-70E740481C1C}">
+                          <a14:useLocalDpi xmlns:a14="http://schemas.microsoft.com/office/drawing/2010/main" val="0"/>
+                        </a:ext>
+                      </a:extLst>
+                    </a:blip>
+                    <a:stretch>
+                      <a:fillRect/>
+                    </a:stretch>
+                  </pic:blipFill>
+                  <pic:spPr>
+                    <a:xfrm>
+                      <a:off x="0" y="0"/>
+                      <a:ext cx="5971540" cy="358775"/>
+                    </a:xfrm>
+                    <a:prstGeom prst="rect">
+                      <a:avLst/>
+                    </a:prstGeom>
+                  </pic:spPr>
+                </pic:pic>
+              </a:graphicData>
+            </a:graphic>
+          </wp:inline>
+        </w:drawing>
+      </w:r>
+    </w:p>
+    <w:p>
+      <w:pPr>
+        <w:jc w:val="left"/>
+        <w:rPr>
+          <w:b/>
+          <w:bCs/>
+          <w:lang w:val="hu-HU"/>
+        </w:rPr>
+      </w:pPr>
+      <w:r>
+        <w:rPr>
+          <w:b/>
+          <w:bCs/>
+          <w:lang w:val="hu-HU"/>
+        </w:rPr>
+        <w:t>Példa kérés:</w:t>
+      </w:r>
+      <w:r>
+        <w:rPr>
+          <w:b/>
+          <w:bCs/>
+          <w:lang w:val="hu-HU"/>
+        </w:rPr>
+        <w:t xml:space="preserve"> </w:t>
+      </w:r>
+      <w:r>
+        <w:rPr>
+          <w:rFonts w:ascii="Courier New" w:hAnsi="Courier New" w:cs="Courier New"/>
+          <w:lang w:val="hu-HU"/>
+        </w:rPr>
+        <w:t>POST</w:t>
+      </w:r>
+      <w:r>
+        <w:rPr>
+          <w:rFonts w:ascii="Courier New" w:hAnsi="Courier New" w:cs="Courier New"/>
+          <w:lang w:val="hu-HU"/>
+        </w:rPr>
+        <w:t xml:space="preserve"> | /</w:t>
+      </w:r>
+      <w:proofErr w:type="spellStart"/>
+      <w:r>
+        <w:rPr>
+          <w:rFonts w:ascii="Courier New" w:hAnsi="Courier New" w:cs="Courier New"/>
+          <w:lang w:val="hu-HU"/>
+        </w:rPr>
+        <w:t>api</w:t>
+      </w:r>
+      <w:proofErr w:type="spellEnd"/>
+      <w:r>
+        <w:rPr>
           <w:rFonts w:ascii="Courier New" w:hAnsi="Courier New" w:cs="Courier New"/>
           <w:lang w:val="hu-HU"/>
         </w:rPr>
@@ -8214,9 +9057,23 @@
           <w:rFonts w:ascii="Courier New" w:hAnsi="Courier New" w:cs="Courier New"/>
           <w:lang w:val="hu-HU"/>
         </w:rPr>
-        <w:t>ban</w:t>
-      </w:r>
-      <w:proofErr w:type="spellEnd"/>
+        <w:t>threads</w:t>
+      </w:r>
+      <w:proofErr w:type="spellEnd"/>
+      <w:r>
+        <w:rPr>
+          <w:rFonts w:ascii="Courier New" w:hAnsi="Courier New" w:cs="Courier New"/>
+          <w:lang w:val="hu-HU"/>
+        </w:rPr>
+        <w:t>/1</w:t>
+      </w:r>
+      <w:r>
+        <w:rPr>
+          <w:rFonts w:ascii="Courier New" w:hAnsi="Courier New" w:cs="Courier New"/>
+          <w:lang w:val="hu-HU"/>
+        </w:rPr>
+        <w:t>/post</w:t>
+      </w:r>
       <w:r>
         <w:rPr>
           <w:lang w:val="hu-HU"/>
@@ -8265,27 +9122,74 @@
         <w:rPr>
           <w:lang w:val="hu-HU"/>
         </w:rPr>
-        <w:t xml:space="preserve">  "</w:t>
-      </w:r>
-      <w:proofErr w:type="spellStart"/>
-      <w:r>
-        <w:rPr>
-          <w:lang w:val="hu-HU"/>
-        </w:rPr>
-        <w:t>role_id</w:t>
-      </w:r>
-      <w:proofErr w:type="spellEnd"/>
-      <w:r>
-        <w:rPr>
-          <w:lang w:val="hu-HU"/>
-        </w:rPr>
-        <w:t xml:space="preserve">": </w:t>
-      </w:r>
-      <w:r>
-        <w:rPr>
-          <w:lang w:val="hu-HU"/>
-        </w:rPr>
-        <w:t>4</w:t>
+        <w:t xml:space="preserve">  </w:t>
+      </w:r>
+      <w:r>
+        <w:t>"</w:t>
+      </w:r>
+      <w:r>
+        <w:t>content</w:t>
+      </w:r>
+      <w:r>
+        <w:t>"</w:t>
+      </w:r>
+      <w:r>
+        <w:t xml:space="preserve">: </w:t>
+      </w:r>
+      <w:r>
+        <w:t>"</w:t>
+      </w:r>
+      <w:r>
+        <w:t>string</w:t>
+      </w:r>
+      <w:r>
+        <w:t>"</w:t>
+      </w:r>
+    </w:p>
+    <w:p>
+      <w:pPr>
+        <w:pStyle w:val="Kdblokk"/>
+        <w:rPr>
+          <w:lang w:val="hu-HU"/>
+        </w:rPr>
+      </w:pPr>
+      <w:r>
+        <w:rPr>
+          <w:lang w:val="hu-HU"/>
+        </w:rPr>
+        <w:t xml:space="preserve">  </w:t>
+      </w:r>
+      <w:r>
+        <w:t>"</w:t>
+      </w:r>
+      <w:r>
+        <w:t>image</w:t>
+      </w:r>
+      <w:r>
+        <w:t>"</w:t>
+      </w:r>
+      <w:r>
+        <w:t xml:space="preserve">: </w:t>
+      </w:r>
+      <w:r>
+        <w:t>"</w:t>
+      </w:r>
+      <w:r>
+        <w:t>file</w:t>
+      </w:r>
+      <w:r>
+        <w:t>(</w:t>
+      </w:r>
+      <w:proofErr w:type="spellStart"/>
+      <w:r>
+        <w:t>opcionális</w:t>
+      </w:r>
+      <w:proofErr w:type="spellEnd"/>
+      <w:r>
+        <w:t>)</w:t>
+      </w:r>
+      <w:r>
+        <w:t>"</w:t>
       </w:r>
     </w:p>
     <w:p>
@@ -8306,9 +9210,520 @@
       <w:pPr>
         <w:jc w:val="left"/>
         <w:rPr>
-          <w:lang w:val="hu-HU"/>
-        </w:rPr>
-      </w:pPr>
+          <w:b/>
+          <w:bCs/>
+          <w:lang w:val="hu-HU"/>
+        </w:rPr>
+      </w:pPr>
+      <w:r>
+        <w:rPr>
+          <w:lang w:val="hu-HU"/>
+        </w:rPr>
+        <w:lastRenderedPageBreak/>
+        <w:br/>
+      </w:r>
+      <w:r>
+        <w:rPr>
+          <w:b/>
+          <w:bCs/>
+          <w:lang w:val="hu-HU"/>
+        </w:rPr>
+        <w:t>Korlátozás</w:t>
+      </w:r>
+      <w:r>
+        <w:rPr>
+          <w:lang w:val="hu-HU"/>
+        </w:rPr>
+        <w:t xml:space="preserve"> </w:t>
+      </w:r>
+      <w:r>
+        <w:rPr>
+          <w:lang w:val="hu-HU"/>
+        </w:rPr>
+        <w:t>Csak</w:t>
+      </w:r>
+      <w:r>
+        <w:rPr>
+          <w:lang w:val="hu-HU"/>
+        </w:rPr>
+        <w:t xml:space="preserve"> az adott közösség tagjai számára elérhető. Kivéve a „</w:t>
+      </w:r>
+      <w:proofErr w:type="spellStart"/>
+      <w:r>
+        <w:rPr>
+          <w:lang w:val="hu-HU"/>
+        </w:rPr>
+        <w:t>banned</w:t>
+      </w:r>
+      <w:proofErr w:type="spellEnd"/>
+      <w:r>
+        <w:rPr>
+          <w:lang w:val="hu-HU"/>
+        </w:rPr>
+        <w:t>” ranggal rendelkezők számára</w:t>
+      </w:r>
+      <w:r>
+        <w:rPr>
+          <w:b/>
+          <w:bCs/>
+          <w:lang w:val="hu-HU"/>
+        </w:rPr>
+        <w:t xml:space="preserve"> </w:t>
+      </w:r>
+      <w:r>
+        <w:rPr>
+          <w:b/>
+          <w:bCs/>
+          <w:lang w:val="hu-HU"/>
+        </w:rPr>
+        <w:br/>
+      </w:r>
+      <w:r>
+        <w:rPr>
+          <w:b/>
+          <w:bCs/>
+          <w:lang w:val="hu-HU"/>
+        </w:rPr>
+        <w:t>Példa válasz:</w:t>
+      </w:r>
+      <w:r>
+        <w:rPr>
+          <w:b/>
+          <w:bCs/>
+          <w:lang w:val="hu-HU"/>
+        </w:rPr>
+        <w:t xml:space="preserve"> </w:t>
+      </w:r>
+      <w:r>
+        <w:rPr>
+          <w:lang w:val="hu-HU"/>
+        </w:rPr>
+        <w:t>(20</w:t>
+      </w:r>
+      <w:r>
+        <w:rPr>
+          <w:lang w:val="hu-HU"/>
+        </w:rPr>
+        <w:t xml:space="preserve">1 </w:t>
+      </w:r>
+      <w:proofErr w:type="spellStart"/>
+      <w:r>
+        <w:rPr>
+          <w:lang w:val="hu-HU"/>
+        </w:rPr>
+        <w:t>Created</w:t>
+      </w:r>
+      <w:proofErr w:type="spellEnd"/>
+      <w:r>
+        <w:rPr>
+          <w:lang w:val="hu-HU"/>
+        </w:rPr>
+        <w:t>)</w:t>
+      </w:r>
+    </w:p>
+    <w:p>
+      <w:pPr>
+        <w:pStyle w:val="Kdblokk"/>
+      </w:pPr>
+      <w:r>
+        <w:t>[</w:t>
+      </w:r>
+    </w:p>
+    <w:p>
+      <w:pPr>
+        <w:pStyle w:val="Kdblokk"/>
+      </w:pPr>
+      <w:r>
+        <w:t xml:space="preserve">  {</w:t>
+      </w:r>
+    </w:p>
+    <w:p>
+      <w:pPr>
+        <w:pStyle w:val="Kdblokk"/>
+      </w:pPr>
+      <w:r>
+        <w:t xml:space="preserve">    "id": 1,</w:t>
+      </w:r>
+    </w:p>
+    <w:p>
+      <w:pPr>
+        <w:pStyle w:val="Kdblokk"/>
+      </w:pPr>
+      <w:r>
+        <w:t xml:space="preserve">    "content": "</w:t>
+      </w:r>
+      <w:proofErr w:type="spellStart"/>
+      <w:r>
+        <w:t>birkapasztorok</w:t>
+      </w:r>
+      <w:proofErr w:type="spellEnd"/>
+      <w:r>
+        <w:t>",</w:t>
+      </w:r>
+    </w:p>
+    <w:p>
+      <w:pPr>
+        <w:pStyle w:val="Kdblokk"/>
+      </w:pPr>
+      <w:r>
+        <w:t xml:space="preserve">    "image": null,</w:t>
+      </w:r>
+    </w:p>
+    <w:p>
+      <w:pPr>
+        <w:pStyle w:val="Kdblokk"/>
+      </w:pPr>
+      <w:r>
+        <w:t xml:space="preserve">    "user": {</w:t>
+      </w:r>
+    </w:p>
+    <w:p>
+      <w:pPr>
+        <w:pStyle w:val="Kdblokk"/>
+      </w:pPr>
+      <w:r>
+        <w:t xml:space="preserve">      "id": 2,</w:t>
+      </w:r>
+    </w:p>
+    <w:p>
+      <w:pPr>
+        <w:pStyle w:val="Kdblokk"/>
+      </w:pPr>
+      <w:r>
+        <w:t xml:space="preserve">      "name": "</w:t>
+      </w:r>
+      <w:proofErr w:type="spellStart"/>
+      <w:r>
+        <w:t>Gehér</w:t>
+      </w:r>
+      <w:proofErr w:type="spellEnd"/>
+      <w:r>
+        <w:t xml:space="preserve"> Marcell",</w:t>
+      </w:r>
+    </w:p>
+    <w:p>
+      <w:pPr>
+        <w:pStyle w:val="Kdblokk"/>
+      </w:pPr>
+      <w:r>
+        <w:t xml:space="preserve">      "email": "geher.marcell@students.jedlik.eu",</w:t>
+      </w:r>
+    </w:p>
+    <w:p>
+      <w:pPr>
+        <w:pStyle w:val="Kdblokk"/>
+      </w:pPr>
+      <w:r>
+        <w:t xml:space="preserve">      "</w:t>
+      </w:r>
+      <w:proofErr w:type="spellStart"/>
+      <w:proofErr w:type="gramStart"/>
+      <w:r>
+        <w:t>image</w:t>
+      </w:r>
+      <w:proofErr w:type="gramEnd"/>
+      <w:r>
+        <w:t>_url</w:t>
+      </w:r>
+      <w:proofErr w:type="spellEnd"/>
+      <w:r>
+        <w:t>": "https://jedligrambackend-</w:t>
+      </w:r>
+      <w:r>
+        <w:t xml:space="preserve"> …</w:t>
+      </w:r>
+      <w:r>
+        <w:t xml:space="preserve"> ",</w:t>
+      </w:r>
+    </w:p>
+    <w:p>
+      <w:pPr>
+        <w:pStyle w:val="Kdblokk"/>
+      </w:pPr>
+      <w:r>
+        <w:t xml:space="preserve">      "bio": "</w:t>
+      </w:r>
+      <w:proofErr w:type="spellStart"/>
+      <w:r>
+        <w:t>Csáá</w:t>
+      </w:r>
+      <w:proofErr w:type="spellEnd"/>
+      <w:r>
+        <w:t>",</w:t>
+      </w:r>
+    </w:p>
+    <w:p>
+      <w:pPr>
+        <w:pStyle w:val="Kdblokk"/>
+      </w:pPr>
+      <w:r>
+        <w:t xml:space="preserve">      "</w:t>
+      </w:r>
+      <w:proofErr w:type="spellStart"/>
+      <w:proofErr w:type="gramStart"/>
+      <w:r>
+        <w:t>post</w:t>
+      </w:r>
+      <w:proofErr w:type="gramEnd"/>
+      <w:r>
+        <w:t>_karma</w:t>
+      </w:r>
+      <w:proofErr w:type="spellEnd"/>
+      <w:r>
+        <w:t>": 1</w:t>
+      </w:r>
+    </w:p>
+    <w:p>
+      <w:pPr>
+        <w:pStyle w:val="Kdblokk"/>
+      </w:pPr>
+      <w:r>
+        <w:t xml:space="preserve">    },</w:t>
+      </w:r>
+    </w:p>
+    <w:p>
+      <w:pPr>
+        <w:pStyle w:val="Kdblokk"/>
+      </w:pPr>
+      <w:r>
+        <w:t xml:space="preserve">    "</w:t>
+      </w:r>
+      <w:proofErr w:type="spellStart"/>
+      <w:proofErr w:type="gramStart"/>
+      <w:r>
+        <w:t>thread</w:t>
+      </w:r>
+      <w:proofErr w:type="gramEnd"/>
+      <w:r>
+        <w:t>_id</w:t>
+      </w:r>
+      <w:proofErr w:type="spellEnd"/>
+      <w:r>
+        <w:t>": 1,</w:t>
+      </w:r>
+    </w:p>
+    <w:p>
+      <w:pPr>
+        <w:pStyle w:val="Kdblokk"/>
+      </w:pPr>
+      <w:r>
+        <w:t xml:space="preserve">    "score": 1,</w:t>
+      </w:r>
+    </w:p>
+    <w:p>
+      <w:pPr>
+        <w:pStyle w:val="Kdblokk"/>
+      </w:pPr>
+      <w:r>
+        <w:t xml:space="preserve">    "age": "1 day ago"</w:t>
+      </w:r>
+    </w:p>
+    <w:p>
+      <w:pPr>
+        <w:pStyle w:val="Kdblokk"/>
+      </w:pPr>
+      <w:r>
+        <w:t xml:space="preserve">  }</w:t>
+      </w:r>
+    </w:p>
+    <w:p>
+      <w:pPr>
+        <w:pStyle w:val="Kdblokk"/>
+      </w:pPr>
+      <w:r>
+        <w:t>]</w:t>
+      </w:r>
+    </w:p>
+    <w:p>
+      <w:pPr>
+        <w:rPr>
+          <w:lang w:val="hu-HU"/>
+        </w:rPr>
+      </w:pPr>
+      <w:r>
+        <w:rPr>
+          <w:b/>
+          <w:bCs/>
+          <w:lang w:val="hu-HU"/>
+        </w:rPr>
+        <w:t>DELETE</w:t>
+      </w:r>
+      <w:r>
+        <w:rPr>
+          <w:lang w:val="hu-HU"/>
+        </w:rPr>
+        <w:t xml:space="preserve"> </w:t>
+      </w:r>
+      <w:proofErr w:type="spellStart"/>
+      <w:r>
+        <w:rPr>
+          <w:lang w:val="hu-HU"/>
+        </w:rPr>
+        <w:t>Posts</w:t>
+      </w:r>
+      <w:proofErr w:type="spellEnd"/>
+      <w:r>
+        <w:rPr>
+          <w:lang w:val="hu-HU"/>
+        </w:rPr>
+        <w:t xml:space="preserve"> </w:t>
+      </w:r>
+    </w:p>
+    <w:p>
+      <w:pPr>
+        <w:rPr>
+          <w:lang w:val="hu-HU"/>
+        </w:rPr>
+      </w:pPr>
+      <w:r>
+        <w:rPr>
+          <w:noProof/>
+          <w:lang w:val="hu-HU"/>
+        </w:rPr>
+        <w:drawing>
+          <wp:inline distT="0" distB="0" distL="0" distR="0" wp14:anchorId="0031C377" wp14:editId="755855B3">
+            <wp:extent cx="5971540" cy="327025"/>
+            <wp:effectExtent l="0" t="0" r="0" b="0"/>
+            <wp:docPr id="285406935" name="Kép 2"/>
+            <wp:cNvGraphicFramePr>
+              <a:graphicFrameLocks xmlns:a="http://schemas.openxmlformats.org/drawingml/2006/main" noChangeAspect="1"/>
+            </wp:cNvGraphicFramePr>
+            <a:graphic xmlns:a="http://schemas.openxmlformats.org/drawingml/2006/main">
+              <a:graphicData uri="http://schemas.openxmlformats.org/drawingml/2006/picture">
+                <pic:pic xmlns:pic="http://schemas.openxmlformats.org/drawingml/2006/picture">
+                  <pic:nvPicPr>
+                    <pic:cNvPr id="285406935" name="Kép 285406935"/>
+                    <pic:cNvPicPr/>
+                  </pic:nvPicPr>
+                  <pic:blipFill>
+                    <a:blip r:embed="rId27">
+                      <a:extLst>
+                        <a:ext uri="{28A0092B-C50C-407E-A947-70E740481C1C}">
+                          <a14:useLocalDpi xmlns:a14="http://schemas.microsoft.com/office/drawing/2010/main" val="0"/>
+                        </a:ext>
+                      </a:extLst>
+                    </a:blip>
+                    <a:stretch>
+                      <a:fillRect/>
+                    </a:stretch>
+                  </pic:blipFill>
+                  <pic:spPr>
+                    <a:xfrm>
+                      <a:off x="0" y="0"/>
+                      <a:ext cx="5971540" cy="327025"/>
+                    </a:xfrm>
+                    <a:prstGeom prst="rect">
+                      <a:avLst/>
+                    </a:prstGeom>
+                  </pic:spPr>
+                </pic:pic>
+              </a:graphicData>
+            </a:graphic>
+          </wp:inline>
+        </w:drawing>
+      </w:r>
+    </w:p>
+    <w:p>
+      <w:pPr>
+        <w:jc w:val="left"/>
+        <w:rPr>
+          <w:lang w:val="hu-HU"/>
+        </w:rPr>
+      </w:pPr>
+      <w:r>
+        <w:rPr>
+          <w:b/>
+          <w:bCs/>
+          <w:lang w:val="hu-HU"/>
+        </w:rPr>
+        <w:t>Példa kérés:</w:t>
+      </w:r>
+      <w:r>
+        <w:rPr>
+          <w:lang w:val="hu-HU"/>
+        </w:rPr>
+        <w:t xml:space="preserve"> </w:t>
+      </w:r>
+      <w:r>
+        <w:rPr>
+          <w:rFonts w:ascii="Courier New" w:hAnsi="Courier New" w:cs="Courier New"/>
+          <w:lang w:val="hu-HU"/>
+        </w:rPr>
+        <w:t>DELETE</w:t>
+      </w:r>
+      <w:r>
+        <w:rPr>
+          <w:rFonts w:ascii="Courier New" w:hAnsi="Courier New" w:cs="Courier New"/>
+          <w:lang w:val="hu-HU"/>
+        </w:rPr>
+        <w:t xml:space="preserve"> | /</w:t>
+      </w:r>
+      <w:proofErr w:type="spellStart"/>
+      <w:r>
+        <w:rPr>
+          <w:rFonts w:ascii="Courier New" w:hAnsi="Courier New" w:cs="Courier New"/>
+          <w:lang w:val="hu-HU"/>
+        </w:rPr>
+        <w:t>api</w:t>
+      </w:r>
+      <w:proofErr w:type="spellEnd"/>
+      <w:r>
+        <w:rPr>
+          <w:rFonts w:ascii="Courier New" w:hAnsi="Courier New" w:cs="Courier New"/>
+          <w:lang w:val="hu-HU"/>
+        </w:rPr>
+        <w:t>/</w:t>
+      </w:r>
+      <w:proofErr w:type="spellStart"/>
+      <w:r>
+        <w:rPr>
+          <w:rFonts w:ascii="Courier New" w:hAnsi="Courier New" w:cs="Courier New"/>
+          <w:lang w:val="hu-HU"/>
+        </w:rPr>
+        <w:t>posts</w:t>
+      </w:r>
+      <w:proofErr w:type="spellEnd"/>
+      <w:r>
+        <w:rPr>
+          <w:rFonts w:ascii="Courier New" w:hAnsi="Courier New" w:cs="Courier New"/>
+          <w:lang w:val="hu-HU"/>
+        </w:rPr>
+        <w:t>/1</w:t>
+      </w:r>
+      <w:r>
+        <w:rPr>
+          <w:lang w:val="hu-HU"/>
+        </w:rPr>
+        <w:br/>
+      </w:r>
+      <w:r>
+        <w:rPr>
+          <w:b/>
+          <w:bCs/>
+          <w:lang w:val="hu-HU"/>
+        </w:rPr>
+        <w:t>Body:</w:t>
+      </w:r>
+      <w:r>
+        <w:rPr>
+          <w:b/>
+          <w:bCs/>
+          <w:lang w:val="hu-HU"/>
+        </w:rPr>
+        <w:t xml:space="preserve"> </w:t>
+      </w:r>
+      <w:r>
+        <w:rPr>
+          <w:lang w:val="hu-HU"/>
+        </w:rPr>
+        <w:t>-</w:t>
+      </w:r>
+      <w:r>
+        <w:rPr>
+          <w:lang w:val="hu-HU"/>
+        </w:rPr>
+        <w:br/>
+      </w:r>
       <w:r>
         <w:rPr>
           <w:b/>
@@ -8329,21 +9744,7 @@
         <w:rPr>
           <w:lang w:val="hu-HU"/>
         </w:rPr>
-        <w:t xml:space="preserve">Csak az adott </w:t>
-      </w:r>
-      <w:proofErr w:type="spellStart"/>
-      <w:r>
-        <w:rPr>
-          <w:lang w:val="hu-HU"/>
-        </w:rPr>
-        <w:t>thread</w:t>
-      </w:r>
-      <w:proofErr w:type="spellEnd"/>
-      <w:r>
-        <w:rPr>
-          <w:lang w:val="hu-HU"/>
-        </w:rPr>
-        <w:t xml:space="preserve"> „</w:t>
+        <w:t>Csak a poszt készítője számára elérhető, vagy a posztot tartalmazó közösség „</w:t>
       </w:r>
       <w:proofErr w:type="spellStart"/>
       <w:r>
@@ -8357,13 +9758,7 @@
         <w:rPr>
           <w:lang w:val="hu-HU"/>
         </w:rPr>
-        <w:t>”</w:t>
-      </w:r>
-      <w:r>
-        <w:rPr>
-          <w:lang w:val="hu-HU"/>
-        </w:rPr>
-        <w:t xml:space="preserve"> vagy „</w:t>
+        <w:t>” vagy „</w:t>
       </w:r>
       <w:proofErr w:type="spellStart"/>
       <w:r>
@@ -8377,46 +9772,43 @@
         <w:rPr>
           <w:lang w:val="hu-HU"/>
         </w:rPr>
-        <w:t>”</w:t>
-      </w:r>
-      <w:r>
-        <w:rPr>
-          <w:lang w:val="hu-HU"/>
-        </w:rPr>
-        <w:t xml:space="preserve"> ranggal rendelkező tagjai számára. A „</w:t>
-      </w:r>
-      <w:proofErr w:type="spellStart"/>
-      <w:r>
-        <w:rPr>
-          <w:lang w:val="hu-HU"/>
-        </w:rPr>
-        <w:t>banned</w:t>
-      </w:r>
-      <w:proofErr w:type="spellEnd"/>
-      <w:r>
-        <w:rPr>
-          <w:lang w:val="hu-HU"/>
-        </w:rPr>
-        <w:t>” rang</w:t>
-      </w:r>
-      <w:r>
-        <w:rPr>
-          <w:lang w:val="hu-HU"/>
-        </w:rPr>
-        <w:t>on kívül más rang</w:t>
-      </w:r>
-      <w:r>
-        <w:rPr>
-          <w:lang w:val="hu-HU"/>
-        </w:rPr>
-        <w:t xml:space="preserve"> adására nem használható a végpont.</w:t>
-      </w:r>
-    </w:p>
-    <w:p>
-      <w:pPr>
-        <w:pStyle w:val="Kdblokk"/>
-      </w:pPr>
-      <w:r>
+        <w:t>” ranggal rendelkező felhasználói számára</w:t>
+      </w:r>
+      <w:r>
+        <w:rPr>
+          <w:lang w:val="hu-HU"/>
+        </w:rPr>
+        <w:br/>
+      </w:r>
+      <w:r>
+        <w:rPr>
+          <w:b/>
+          <w:bCs/>
+          <w:lang w:val="hu-HU"/>
+        </w:rPr>
+        <w:t>Példa válasz:</w:t>
+      </w:r>
+      <w:r>
+        <w:rPr>
+          <w:b/>
+          <w:bCs/>
+          <w:lang w:val="hu-HU"/>
+        </w:rPr>
+        <w:t xml:space="preserve"> </w:t>
+      </w:r>
+      <w:r>
+        <w:rPr>
+          <w:lang w:val="hu-HU"/>
+        </w:rPr>
+        <w:t>(200 OK)</w:t>
+      </w:r>
+    </w:p>
+    <w:p>
+      <w:pPr>
+        <w:pStyle w:val="Kdblokk"/>
+      </w:pPr>
+      <w:r>
+        <w:lastRenderedPageBreak/>
         <w:t>{</w:t>
       </w:r>
     </w:p>
@@ -8425,7 +9817,7 @@
         <w:pStyle w:val="Kdblokk"/>
       </w:pPr>
       <w:r>
-        <w:t xml:space="preserve">  "message": "User banned successfully"</w:t>
+        <w:t xml:space="preserve">  "message": "Post removed"</w:t>
       </w:r>
     </w:p>
     <w:p>
@@ -8446,7 +9838,7 @@
       </w:pPr>
     </w:p>
     <w:sectPr>
-      <w:footerReference w:type="default" r:id="rId26"/>
+      <w:footerReference w:type="default" r:id="rId28"/>
       <w:pgSz w:w="12240" w:h="15840"/>
       <w:pgMar w:top="1418" w:right="1418" w:bottom="1418" w:left="1418" w:header="720" w:footer="720" w:gutter="0"/>
       <w:cols w:space="720"/>
@@ -9505,7 +10897,7 @@
   <w:style w:type="paragraph" w:default="1" w:styleId="Norml">
     <w:name w:val="Normal"/>
     <w:qFormat/>
-    <w:rsid w:val="00E857A7"/>
+    <w:rsid w:val="00FC48AD"/>
     <w:pPr>
       <w:spacing w:before="120" w:line="360" w:lineRule="auto"/>
       <w:jc w:val="both"/>

</xml_diff>

<commit_message>
docs: update API documentation for Votes and Comments controllers
</commit_message>
<xml_diff>
--- a/zarovizsga.docx
+++ b/zarovizsga.docx
@@ -3844,12 +3844,13 @@
         </w:rPr>
         <w:t>-</w:t>
       </w:r>
-      <w:r>
-        <w:rPr>
-          <w:lang w:val="hu-HU"/>
-        </w:rPr>
-        <w:br/>
-      </w:r>
+    </w:p>
+    <w:p>
+      <w:pPr>
+        <w:rPr>
+          <w:lang w:val="hu-HU"/>
+        </w:rPr>
+      </w:pPr>
       <w:r>
         <w:rPr>
           <w:b/>
@@ -3898,12 +3899,14 @@
         </w:rPr>
         <w:t>ben</w:t>
       </w:r>
-      <w:r>
-        <w:rPr>
-          <w:lang w:val="hu-HU"/>
-        </w:rPr>
-        <w:br/>
-      </w:r>
+    </w:p>
+    <w:p>
+      <w:pPr>
+        <w:jc w:val="left"/>
+        <w:rPr>
+          <w:lang w:val="hu-HU"/>
+        </w:rPr>
+      </w:pPr>
       <w:r>
         <w:rPr>
           <w:b/>
@@ -4795,7 +4798,6 @@
     </w:p>
     <w:p>
       <w:pPr>
-        <w:jc w:val="left"/>
         <w:rPr>
           <w:lang w:val="hu-HU"/>
         </w:rPr>
@@ -5329,7 +5331,6 @@
     </w:p>
     <w:p>
       <w:pPr>
-        <w:jc w:val="left"/>
         <w:rPr>
           <w:lang w:val="hu-HU"/>
         </w:rPr>
@@ -5775,12 +5776,13 @@
         </w:rPr>
         <w:t>-</w:t>
       </w:r>
-      <w:r>
-        <w:rPr>
-          <w:lang w:val="hu-HU"/>
-        </w:rPr>
-        <w:br/>
-      </w:r>
+    </w:p>
+    <w:p>
+      <w:pPr>
+        <w:rPr>
+          <w:lang w:val="hu-HU"/>
+        </w:rPr>
+      </w:pPr>
       <w:r>
         <w:rPr>
           <w:b/>
@@ -5835,18 +5837,21 @@
         <w:t>en</w:t>
       </w:r>
       <w:proofErr w:type="spellEnd"/>
-      <w:r>
-        <w:rPr>
-          <w:lang w:val="hu-HU"/>
-        </w:rPr>
-        <w:br/>
-      </w:r>
-      <w:r>
-        <w:rPr>
-          <w:b/>
-          <w:bCs/>
-          <w:lang w:val="hu-HU"/>
-        </w:rPr>
+    </w:p>
+    <w:p>
+      <w:pPr>
+        <w:jc w:val="left"/>
+        <w:rPr>
+          <w:lang w:val="hu-HU"/>
+        </w:rPr>
+      </w:pPr>
+      <w:r>
+        <w:rPr>
+          <w:b/>
+          <w:bCs/>
+          <w:lang w:val="hu-HU"/>
+        </w:rPr>
+        <w:lastRenderedPageBreak/>
         <w:t>Példa válasz:</w:t>
       </w:r>
       <w:r>
@@ -5869,7 +5874,6 @@
         <w:pStyle w:val="Kdblokk"/>
       </w:pPr>
       <w:r>
-        <w:lastRenderedPageBreak/>
         <w:t>[</w:t>
       </w:r>
     </w:p>
@@ -6386,6 +6390,7 @@
         <w:rPr>
           <w:lang w:val="hu-HU"/>
         </w:rPr>
+        <w:lastRenderedPageBreak/>
         <w:t xml:space="preserve">  "</w:t>
       </w:r>
       <w:proofErr w:type="spellStart"/>
@@ -6434,13 +6439,11 @@
         <w:rPr>
           <w:lang w:val="hu-HU"/>
         </w:rPr>
-        <w:lastRenderedPageBreak/>
         <w:t>}</w:t>
       </w:r>
     </w:p>
     <w:p>
       <w:pPr>
-        <w:jc w:val="left"/>
         <w:rPr>
           <w:lang w:val="hu-HU"/>
         </w:rPr>
@@ -6893,19 +6896,13 @@
         <w:rPr>
           <w:lang w:val="hu-HU"/>
         </w:rPr>
-        <w:t xml:space="preserve"> az adott</w:t>
-      </w:r>
-      <w:r>
-        <w:rPr>
-          <w:lang w:val="hu-HU"/>
-        </w:rPr>
-        <w:t xml:space="preserve"> közösség</w:t>
-      </w:r>
-      <w:r>
-        <w:rPr>
-          <w:lang w:val="hu-HU"/>
-        </w:rPr>
-        <w:t xml:space="preserve"> tagjai számára elérhető</w:t>
+        <w:t xml:space="preserve"> </w:t>
+      </w:r>
+      <w:r>
+        <w:rPr>
+          <w:lang w:val="hu-HU"/>
+        </w:rPr>
+        <w:t>bejelentkezett felhasználók számára elérhető</w:t>
       </w:r>
       <w:r>
         <w:rPr>
@@ -7013,6 +7010,7 @@
         <w:pStyle w:val="Kdblokk"/>
       </w:pPr>
       <w:r>
+        <w:lastRenderedPageBreak/>
         <w:t xml:space="preserve">    "bio": null</w:t>
       </w:r>
       <w:r>
@@ -7024,7 +7022,6 @@
         <w:pStyle w:val="Kdblokk"/>
       </w:pPr>
       <w:r>
-        <w:lastRenderedPageBreak/>
         <w:t xml:space="preserve">    </w:t>
       </w:r>
       <w:r>
@@ -7574,12 +7571,13 @@
         </w:rPr>
         <w:t>-</w:t>
       </w:r>
-      <w:r>
-        <w:rPr>
-          <w:lang w:val="hu-HU"/>
-        </w:rPr>
-        <w:br/>
-      </w:r>
+    </w:p>
+    <w:p>
+      <w:pPr>
+        <w:rPr>
+          <w:lang w:val="hu-HU"/>
+        </w:rPr>
+      </w:pPr>
       <w:r>
         <w:rPr>
           <w:b/>
@@ -7763,6 +7761,7 @@
           <w:bCs/>
           <w:lang w:val="hu-HU"/>
         </w:rPr>
+        <w:lastRenderedPageBreak/>
         <w:t>Példa kérés:</w:t>
       </w:r>
       <w:r>
@@ -7869,7 +7868,6 @@
         <w:rPr>
           <w:lang w:val="hu-HU"/>
         </w:rPr>
-        <w:lastRenderedPageBreak/>
         <w:t>{</w:t>
       </w:r>
     </w:p>
@@ -8287,7 +8285,6 @@
     </w:p>
     <w:p>
       <w:pPr>
-        <w:jc w:val="left"/>
         <w:rPr>
           <w:lang w:val="hu-HU"/>
         </w:rPr>
@@ -8371,6 +8368,27 @@
     </w:p>
     <w:p>
       <w:pPr>
+        <w:rPr>
+          <w:lang w:val="hu-HU"/>
+        </w:rPr>
+      </w:pPr>
+      <w:r>
+        <w:rPr>
+          <w:b/>
+          <w:bCs/>
+          <w:lang w:val="hu-HU"/>
+        </w:rPr>
+        <w:t xml:space="preserve">Példa válasz </w:t>
+      </w:r>
+      <w:r>
+        <w:rPr>
+          <w:lang w:val="hu-HU"/>
+        </w:rPr>
+        <w:t>(200 OK)</w:t>
+      </w:r>
+    </w:p>
+    <w:p>
+      <w:pPr>
         <w:pStyle w:val="Kdblokk"/>
       </w:pPr>
       <w:r>
@@ -8404,19 +8422,7 @@
         <w:rPr>
           <w:lang w:val="hu-HU"/>
         </w:rPr>
-        <w:t>1.2.</w:t>
-      </w:r>
-      <w:r>
-        <w:rPr>
-          <w:lang w:val="hu-HU"/>
-        </w:rPr>
-        <w:t>4 Post</w:t>
-      </w:r>
-      <w:r>
-        <w:rPr>
-          <w:lang w:val="hu-HU"/>
-        </w:rPr>
-        <w:t xml:space="preserve"> kontroller</w:t>
+        <w:t>1.2.4 Post kontroller</w:t>
       </w:r>
     </w:p>
     <w:p>
@@ -8537,6 +8543,7 @@
           <w:bCs/>
           <w:lang w:val="hu-HU"/>
         </w:rPr>
+        <w:lastRenderedPageBreak/>
         <w:t>Példa kérés:</w:t>
       </w:r>
       <w:r>
@@ -8612,19 +8619,19 @@
         </w:rPr>
         <w:t>-</w:t>
       </w:r>
-      <w:r>
-        <w:rPr>
-          <w:lang w:val="hu-HU"/>
-        </w:rPr>
-        <w:br/>
-      </w:r>
-      <w:r>
-        <w:rPr>
-          <w:b/>
-          <w:bCs/>
-          <w:lang w:val="hu-HU"/>
-        </w:rPr>
-        <w:lastRenderedPageBreak/>
+    </w:p>
+    <w:p>
+      <w:pPr>
+        <w:rPr>
+          <w:lang w:val="hu-HU"/>
+        </w:rPr>
+      </w:pPr>
+      <w:r>
+        <w:rPr>
+          <w:b/>
+          <w:bCs/>
+          <w:lang w:val="hu-HU"/>
+        </w:rPr>
         <w:t>Korlátozás:</w:t>
       </w:r>
       <w:r>
@@ -8645,32 +8652,16 @@
         <w:rPr>
           <w:lang w:val="hu-HU"/>
         </w:rPr>
-        <w:t xml:space="preserve"> az</w:t>
-      </w:r>
-      <w:r>
-        <w:rPr>
-          <w:lang w:val="hu-HU"/>
-        </w:rPr>
-        <w:t>on közösség</w:t>
-      </w:r>
-      <w:r>
-        <w:rPr>
-          <w:lang w:val="hu-HU"/>
-        </w:rPr>
-        <w:t xml:space="preserve"> tagjai számára elérhető</w:t>
-      </w:r>
-      <w:r>
-        <w:rPr>
-          <w:lang w:val="hu-HU"/>
-        </w:rPr>
-        <w:t>, amelyikben a poszt található</w:t>
-      </w:r>
-      <w:r>
-        <w:rPr>
-          <w:lang w:val="hu-HU"/>
-        </w:rPr>
-        <w:br/>
-      </w:r>
+        <w:t xml:space="preserve"> azon közösség tagjai számára elérhető, amelyikben a poszt található</w:t>
+      </w:r>
+    </w:p>
+    <w:p>
+      <w:pPr>
+        <w:jc w:val="left"/>
+        <w:rPr>
+          <w:lang w:val="hu-HU"/>
+        </w:rPr>
+      </w:pPr>
       <w:r>
         <w:rPr>
           <w:b/>
@@ -9122,6 +9113,7 @@
         <w:rPr>
           <w:lang w:val="hu-HU"/>
         </w:rPr>
+        <w:lastRenderedPageBreak/>
         <w:t xml:space="preserve">  </w:t>
       </w:r>
       <w:r>
@@ -9175,10 +9167,7 @@
         <w:t>"</w:t>
       </w:r>
       <w:r>
-        <w:t>file</w:t>
-      </w:r>
-      <w:r>
-        <w:t>(</w:t>
+        <w:t>file(</w:t>
       </w:r>
       <w:proofErr w:type="spellStart"/>
       <w:r>
@@ -9208,6 +9197,69 @@
     </w:p>
     <w:p>
       <w:pPr>
+        <w:rPr>
+          <w:b/>
+          <w:bCs/>
+          <w:lang w:val="hu-HU"/>
+        </w:rPr>
+      </w:pPr>
+      <w:r>
+        <w:rPr>
+          <w:lang w:val="hu-HU"/>
+        </w:rPr>
+        <w:br/>
+      </w:r>
+      <w:r>
+        <w:rPr>
+          <w:b/>
+          <w:bCs/>
+          <w:lang w:val="hu-HU"/>
+        </w:rPr>
+        <w:t>Korlátozás</w:t>
+      </w:r>
+      <w:r>
+        <w:rPr>
+          <w:lang w:val="hu-HU"/>
+        </w:rPr>
+        <w:t xml:space="preserve"> </w:t>
+      </w:r>
+      <w:r>
+        <w:rPr>
+          <w:lang w:val="hu-HU"/>
+        </w:rPr>
+        <w:t>Csak</w:t>
+      </w:r>
+      <w:r>
+        <w:rPr>
+          <w:lang w:val="hu-HU"/>
+        </w:rPr>
+        <w:t xml:space="preserve"> az adott közösség tagjai számára elérhető. Kivéve a „</w:t>
+      </w:r>
+      <w:proofErr w:type="spellStart"/>
+      <w:r>
+        <w:rPr>
+          <w:lang w:val="hu-HU"/>
+        </w:rPr>
+        <w:t>banned</w:t>
+      </w:r>
+      <w:proofErr w:type="spellEnd"/>
+      <w:r>
+        <w:rPr>
+          <w:lang w:val="hu-HU"/>
+        </w:rPr>
+        <w:t>” ranggal rendelkezők számára</w:t>
+      </w:r>
+      <w:r>
+        <w:rPr>
+          <w:b/>
+          <w:bCs/>
+          <w:lang w:val="hu-HU"/>
+        </w:rPr>
+        <w:t xml:space="preserve"> </w:t>
+      </w:r>
+    </w:p>
+    <w:p>
+      <w:pPr>
         <w:jc w:val="left"/>
         <w:rPr>
           <w:b/>
@@ -9217,69 +9269,6 @@
       </w:pPr>
       <w:r>
         <w:rPr>
-          <w:lang w:val="hu-HU"/>
-        </w:rPr>
-        <w:lastRenderedPageBreak/>
-        <w:br/>
-      </w:r>
-      <w:r>
-        <w:rPr>
-          <w:b/>
-          <w:bCs/>
-          <w:lang w:val="hu-HU"/>
-        </w:rPr>
-        <w:t>Korlátozás</w:t>
-      </w:r>
-      <w:r>
-        <w:rPr>
-          <w:lang w:val="hu-HU"/>
-        </w:rPr>
-        <w:t xml:space="preserve"> </w:t>
-      </w:r>
-      <w:r>
-        <w:rPr>
-          <w:lang w:val="hu-HU"/>
-        </w:rPr>
-        <w:t>Csak</w:t>
-      </w:r>
-      <w:r>
-        <w:rPr>
-          <w:lang w:val="hu-HU"/>
-        </w:rPr>
-        <w:t xml:space="preserve"> az adott közösség tagjai számára elérhető. Kivéve a „</w:t>
-      </w:r>
-      <w:proofErr w:type="spellStart"/>
-      <w:r>
-        <w:rPr>
-          <w:lang w:val="hu-HU"/>
-        </w:rPr>
-        <w:t>banned</w:t>
-      </w:r>
-      <w:proofErr w:type="spellEnd"/>
-      <w:r>
-        <w:rPr>
-          <w:lang w:val="hu-HU"/>
-        </w:rPr>
-        <w:t>” ranggal rendelkezők számára</w:t>
-      </w:r>
-      <w:r>
-        <w:rPr>
-          <w:b/>
-          <w:bCs/>
-          <w:lang w:val="hu-HU"/>
-        </w:rPr>
-        <w:t xml:space="preserve"> </w:t>
-      </w:r>
-      <w:r>
-        <w:rPr>
-          <w:b/>
-          <w:bCs/>
-          <w:lang w:val="hu-HU"/>
-        </w:rPr>
-        <w:br/>
-      </w:r>
-      <w:r>
-        <w:rPr>
           <w:b/>
           <w:bCs/>
           <w:lang w:val="hu-HU"/>
@@ -9298,13 +9287,7 @@
         <w:rPr>
           <w:lang w:val="hu-HU"/>
         </w:rPr>
-        <w:t>(20</w:t>
-      </w:r>
-      <w:r>
-        <w:rPr>
-          <w:lang w:val="hu-HU"/>
-        </w:rPr>
-        <w:t xml:space="preserve">1 </w:t>
+        <w:t xml:space="preserve">(201 </w:t>
       </w:r>
       <w:proofErr w:type="spellStart"/>
       <w:r>
@@ -9636,6 +9619,7 @@
           <w:bCs/>
           <w:lang w:val="hu-HU"/>
         </w:rPr>
+        <w:lastRenderedPageBreak/>
         <w:t>Példa kérés:</w:t>
       </w:r>
       <w:r>
@@ -9718,6 +9702,338 @@
         </w:rPr>
         <w:t>-</w:t>
       </w:r>
+    </w:p>
+    <w:p>
+      <w:pPr>
+        <w:rPr>
+          <w:lang w:val="hu-HU"/>
+        </w:rPr>
+      </w:pPr>
+      <w:r>
+        <w:rPr>
+          <w:b/>
+          <w:bCs/>
+          <w:lang w:val="hu-HU"/>
+        </w:rPr>
+        <w:t>Korlátozás:</w:t>
+      </w:r>
+      <w:r>
+        <w:rPr>
+          <w:b/>
+          <w:bCs/>
+          <w:lang w:val="hu-HU"/>
+        </w:rPr>
+        <w:t xml:space="preserve"> </w:t>
+      </w:r>
+      <w:r>
+        <w:rPr>
+          <w:lang w:val="hu-HU"/>
+        </w:rPr>
+        <w:t>Csak a poszt készítője számára elérhető, vagy a posztot tartalmazó közösség „</w:t>
+      </w:r>
+      <w:proofErr w:type="spellStart"/>
+      <w:r>
+        <w:rPr>
+          <w:lang w:val="hu-HU"/>
+        </w:rPr>
+        <w:t>admin</w:t>
+      </w:r>
+      <w:proofErr w:type="spellEnd"/>
+      <w:r>
+        <w:rPr>
+          <w:lang w:val="hu-HU"/>
+        </w:rPr>
+        <w:t>” vagy „</w:t>
+      </w:r>
+      <w:proofErr w:type="spellStart"/>
+      <w:r>
+        <w:rPr>
+          <w:lang w:val="hu-HU"/>
+        </w:rPr>
+        <w:t>moderator</w:t>
+      </w:r>
+      <w:proofErr w:type="spellEnd"/>
+      <w:r>
+        <w:rPr>
+          <w:lang w:val="hu-HU"/>
+        </w:rPr>
+        <w:t>” ranggal rendelkező felhasználói számára</w:t>
+      </w:r>
+    </w:p>
+    <w:p>
+      <w:pPr>
+        <w:rPr>
+          <w:lang w:val="hu-HU"/>
+        </w:rPr>
+      </w:pPr>
+      <w:r>
+        <w:rPr>
+          <w:b/>
+          <w:bCs/>
+          <w:lang w:val="hu-HU"/>
+        </w:rPr>
+        <w:t>Példa válasz:</w:t>
+      </w:r>
+      <w:r>
+        <w:rPr>
+          <w:b/>
+          <w:bCs/>
+          <w:lang w:val="hu-HU"/>
+        </w:rPr>
+        <w:t xml:space="preserve"> </w:t>
+      </w:r>
+      <w:r>
+        <w:rPr>
+          <w:lang w:val="hu-HU"/>
+        </w:rPr>
+        <w:t>(200 OK)</w:t>
+      </w:r>
+    </w:p>
+    <w:p>
+      <w:pPr>
+        <w:pStyle w:val="Kdblokk"/>
+      </w:pPr>
+      <w:r>
+        <w:t>{</w:t>
+      </w:r>
+    </w:p>
+    <w:p>
+      <w:pPr>
+        <w:pStyle w:val="Kdblokk"/>
+      </w:pPr>
+      <w:r>
+        <w:t xml:space="preserve">  "message": "Post removed"</w:t>
+      </w:r>
+    </w:p>
+    <w:p>
+      <w:pPr>
+        <w:pStyle w:val="Kdblokk"/>
+      </w:pPr>
+      <w:r>
+        <w:t>}</w:t>
+      </w:r>
+    </w:p>
+    <w:p>
+      <w:pPr>
+        <w:pStyle w:val="Alcm"/>
+        <w:rPr>
+          <w:lang w:val="hu-HU"/>
+        </w:rPr>
+      </w:pPr>
+      <w:r>
+        <w:rPr>
+          <w:lang w:val="hu-HU"/>
+        </w:rPr>
+        <w:t>1.2.</w:t>
+      </w:r>
+      <w:r>
+        <w:rPr>
+          <w:lang w:val="hu-HU"/>
+        </w:rPr>
+        <w:t xml:space="preserve">5 </w:t>
+      </w:r>
+      <w:proofErr w:type="spellStart"/>
+      <w:r>
+        <w:rPr>
+          <w:lang w:val="hu-HU"/>
+        </w:rPr>
+        <w:t>Vote</w:t>
+      </w:r>
+      <w:proofErr w:type="spellEnd"/>
+      <w:r>
+        <w:rPr>
+          <w:lang w:val="hu-HU"/>
+        </w:rPr>
+        <w:t xml:space="preserve"> kontroller</w:t>
+      </w:r>
+    </w:p>
+    <w:p>
+      <w:pPr>
+        <w:rPr>
+          <w:lang w:val="hu-HU"/>
+        </w:rPr>
+      </w:pPr>
+      <w:r>
+        <w:rPr>
+          <w:b/>
+          <w:bCs/>
+          <w:lang w:val="hu-HU"/>
+        </w:rPr>
+        <w:t>GET</w:t>
+      </w:r>
+      <w:r>
+        <w:rPr>
+          <w:b/>
+          <w:bCs/>
+          <w:lang w:val="hu-HU"/>
+        </w:rPr>
+        <w:t xml:space="preserve"> </w:t>
+      </w:r>
+      <w:proofErr w:type="spellStart"/>
+      <w:r>
+        <w:rPr>
+          <w:lang w:val="hu-HU"/>
+        </w:rPr>
+        <w:t>Vote</w:t>
+      </w:r>
+      <w:r>
+        <w:rPr>
+          <w:lang w:val="hu-HU"/>
+        </w:rPr>
+        <w:t>s</w:t>
+      </w:r>
+      <w:proofErr w:type="spellEnd"/>
+      <w:r>
+        <w:rPr>
+          <w:lang w:val="hu-HU"/>
+        </w:rPr>
+        <w:t xml:space="preserve"> (</w:t>
+      </w:r>
+      <w:proofErr w:type="spellStart"/>
+      <w:r>
+        <w:rPr>
+          <w:lang w:val="hu-HU"/>
+        </w:rPr>
+        <w:t>single</w:t>
+      </w:r>
+      <w:proofErr w:type="spellEnd"/>
+      <w:r>
+        <w:rPr>
+          <w:lang w:val="hu-HU"/>
+        </w:rPr>
+        <w:t>)</w:t>
+      </w:r>
+    </w:p>
+    <w:p>
+      <w:pPr>
+        <w:rPr>
+          <w:lang w:val="hu-HU"/>
+        </w:rPr>
+      </w:pPr>
+      <w:r>
+        <w:rPr>
+          <w:noProof/>
+          <w:lang w:val="hu-HU"/>
+        </w:rPr>
+        <w:drawing>
+          <wp:inline distT="0" distB="0" distL="0" distR="0" wp14:anchorId="2BEDF4D4" wp14:editId="051480D7">
+            <wp:extent cx="5971540" cy="368300"/>
+            <wp:effectExtent l="0" t="0" r="0" b="0"/>
+            <wp:docPr id="1347453589" name="Kép 1"/>
+            <wp:cNvGraphicFramePr>
+              <a:graphicFrameLocks xmlns:a="http://schemas.openxmlformats.org/drawingml/2006/main" noChangeAspect="1"/>
+            </wp:cNvGraphicFramePr>
+            <a:graphic xmlns:a="http://schemas.openxmlformats.org/drawingml/2006/main">
+              <a:graphicData uri="http://schemas.openxmlformats.org/drawingml/2006/picture">
+                <pic:pic xmlns:pic="http://schemas.openxmlformats.org/drawingml/2006/picture">
+                  <pic:nvPicPr>
+                    <pic:cNvPr id="1347453589" name="Kép 1347453589"/>
+                    <pic:cNvPicPr/>
+                  </pic:nvPicPr>
+                  <pic:blipFill>
+                    <a:blip r:embed="rId28">
+                      <a:extLst>
+                        <a:ext uri="{28A0092B-C50C-407E-A947-70E740481C1C}">
+                          <a14:useLocalDpi xmlns:a14="http://schemas.microsoft.com/office/drawing/2010/main" val="0"/>
+                        </a:ext>
+                      </a:extLst>
+                    </a:blip>
+                    <a:stretch>
+                      <a:fillRect/>
+                    </a:stretch>
+                  </pic:blipFill>
+                  <pic:spPr>
+                    <a:xfrm>
+                      <a:off x="0" y="0"/>
+                      <a:ext cx="5971540" cy="368300"/>
+                    </a:xfrm>
+                    <a:prstGeom prst="rect">
+                      <a:avLst/>
+                    </a:prstGeom>
+                  </pic:spPr>
+                </pic:pic>
+              </a:graphicData>
+            </a:graphic>
+          </wp:inline>
+        </w:drawing>
+      </w:r>
+    </w:p>
+    <w:p>
+      <w:pPr>
+        <w:jc w:val="left"/>
+        <w:rPr>
+          <w:lang w:val="hu-HU"/>
+        </w:rPr>
+      </w:pPr>
+      <w:r>
+        <w:rPr>
+          <w:b/>
+          <w:bCs/>
+          <w:lang w:val="hu-HU"/>
+        </w:rPr>
+        <w:t>Példa kérés:</w:t>
+      </w:r>
+      <w:r>
+        <w:rPr>
+          <w:lang w:val="hu-HU"/>
+        </w:rPr>
+        <w:t xml:space="preserve"> </w:t>
+      </w:r>
+      <w:r>
+        <w:rPr>
+          <w:rFonts w:ascii="Courier New" w:hAnsi="Courier New" w:cs="Courier New"/>
+          <w:lang w:val="hu-HU"/>
+        </w:rPr>
+        <w:t>GET | /</w:t>
+      </w:r>
+      <w:proofErr w:type="spellStart"/>
+      <w:r>
+        <w:rPr>
+          <w:rFonts w:ascii="Courier New" w:hAnsi="Courier New" w:cs="Courier New"/>
+          <w:lang w:val="hu-HU"/>
+        </w:rPr>
+        <w:t>api</w:t>
+      </w:r>
+      <w:proofErr w:type="spellEnd"/>
+      <w:r>
+        <w:rPr>
+          <w:rFonts w:ascii="Courier New" w:hAnsi="Courier New" w:cs="Courier New"/>
+          <w:lang w:val="hu-HU"/>
+        </w:rPr>
+        <w:t>/</w:t>
+      </w:r>
+      <w:proofErr w:type="spellStart"/>
+      <w:r>
+        <w:rPr>
+          <w:rFonts w:ascii="Courier New" w:hAnsi="Courier New" w:cs="Courier New"/>
+          <w:lang w:val="hu-HU"/>
+        </w:rPr>
+        <w:t>posts</w:t>
+      </w:r>
+      <w:proofErr w:type="spellEnd"/>
+      <w:r>
+        <w:rPr>
+          <w:rFonts w:ascii="Courier New" w:hAnsi="Courier New" w:cs="Courier New"/>
+          <w:lang w:val="hu-HU"/>
+        </w:rPr>
+        <w:t>/1</w:t>
+      </w:r>
+      <w:r>
+        <w:rPr>
+          <w:rFonts w:ascii="Courier New" w:hAnsi="Courier New" w:cs="Courier New"/>
+          <w:lang w:val="hu-HU"/>
+        </w:rPr>
+        <w:t>/</w:t>
+      </w:r>
+      <w:proofErr w:type="spellStart"/>
+      <w:r>
+        <w:rPr>
+          <w:rFonts w:ascii="Courier New" w:hAnsi="Courier New" w:cs="Courier New"/>
+          <w:lang w:val="hu-HU"/>
+        </w:rPr>
+        <w:t>myvote</w:t>
+      </w:r>
+      <w:proofErr w:type="spellEnd"/>
       <w:r>
         <w:rPr>
           <w:lang w:val="hu-HU"/>
@@ -9730,6 +10046,34 @@
           <w:bCs/>
           <w:lang w:val="hu-HU"/>
         </w:rPr>
+        <w:t>Body:</w:t>
+      </w:r>
+      <w:r>
+        <w:rPr>
+          <w:b/>
+          <w:bCs/>
+          <w:lang w:val="hu-HU"/>
+        </w:rPr>
+        <w:t xml:space="preserve"> </w:t>
+      </w:r>
+      <w:r>
+        <w:rPr>
+          <w:lang w:val="hu-HU"/>
+        </w:rPr>
+        <w:t>-</w:t>
+      </w:r>
+      <w:r>
+        <w:rPr>
+          <w:lang w:val="hu-HU"/>
+        </w:rPr>
+        <w:br/>
+      </w:r>
+      <w:r>
+        <w:rPr>
+          <w:b/>
+          <w:bCs/>
+          <w:lang w:val="hu-HU"/>
+        </w:rPr>
         <w:t>Korlátozás:</w:t>
       </w:r>
       <w:r>
@@ -9744,7 +10088,2747 @@
         <w:rPr>
           <w:lang w:val="hu-HU"/>
         </w:rPr>
-        <w:t>Csak a poszt készítője számára elérhető, vagy a posztot tartalmazó közösség „</w:t>
+        <w:t>Csak</w:t>
+      </w:r>
+      <w:r>
+        <w:rPr>
+          <w:lang w:val="hu-HU"/>
+        </w:rPr>
+        <w:t xml:space="preserve"> a bejelentkezett felhasználók számára elérhető </w:t>
+      </w:r>
+      <w:r>
+        <w:rPr>
+          <w:lang w:val="hu-HU"/>
+        </w:rPr>
+        <w:br/>
+      </w:r>
+      <w:r>
+        <w:rPr>
+          <w:b/>
+          <w:bCs/>
+          <w:lang w:val="hu-HU"/>
+        </w:rPr>
+        <w:t>Példa válasz:</w:t>
+      </w:r>
+      <w:r>
+        <w:rPr>
+          <w:b/>
+          <w:bCs/>
+          <w:lang w:val="hu-HU"/>
+        </w:rPr>
+        <w:t xml:space="preserve"> </w:t>
+      </w:r>
+      <w:r>
+        <w:rPr>
+          <w:lang w:val="hu-HU"/>
+        </w:rPr>
+        <w:t>(200 OK)</w:t>
+      </w:r>
+    </w:p>
+    <w:p>
+      <w:pPr>
+        <w:pStyle w:val="Kdblokk"/>
+      </w:pPr>
+      <w:r>
+        <w:t>{</w:t>
+      </w:r>
+    </w:p>
+    <w:p>
+      <w:pPr>
+        <w:pStyle w:val="Kdblokk"/>
+      </w:pPr>
+      <w:r>
+        <w:t xml:space="preserve">  "</w:t>
+      </w:r>
+      <w:proofErr w:type="spellStart"/>
+      <w:proofErr w:type="gramStart"/>
+      <w:r>
+        <w:t>is</w:t>
+      </w:r>
+      <w:proofErr w:type="gramEnd"/>
+      <w:r>
+        <w:t>_upvote</w:t>
+      </w:r>
+      <w:proofErr w:type="spellEnd"/>
+      <w:r>
+        <w:t>": null</w:t>
+      </w:r>
+    </w:p>
+    <w:p>
+      <w:pPr>
+        <w:pStyle w:val="Kdblokk"/>
+      </w:pPr>
+      <w:r>
+        <w:t>}</w:t>
+      </w:r>
+    </w:p>
+    <w:p>
+      <w:pPr>
+        <w:rPr>
+          <w:lang w:val="hu-HU"/>
+        </w:rPr>
+      </w:pPr>
+      <w:r>
+        <w:rPr>
+          <w:b/>
+          <w:bCs/>
+          <w:lang w:val="hu-HU"/>
+        </w:rPr>
+        <w:t>POST</w:t>
+      </w:r>
+      <w:r>
+        <w:rPr>
+          <w:lang w:val="hu-HU"/>
+        </w:rPr>
+        <w:t xml:space="preserve"> </w:t>
+      </w:r>
+      <w:proofErr w:type="spellStart"/>
+      <w:r>
+        <w:rPr>
+          <w:lang w:val="hu-HU"/>
+        </w:rPr>
+        <w:t>Vote</w:t>
+      </w:r>
+      <w:r>
+        <w:rPr>
+          <w:lang w:val="hu-HU"/>
+        </w:rPr>
+        <w:t>s</w:t>
+      </w:r>
+      <w:proofErr w:type="spellEnd"/>
+    </w:p>
+    <w:p>
+      <w:pPr>
+        <w:rPr>
+          <w:lang w:val="hu-HU"/>
+        </w:rPr>
+      </w:pPr>
+      <w:r>
+        <w:rPr>
+          <w:noProof/>
+          <w:lang w:val="hu-HU"/>
+        </w:rPr>
+        <w:drawing>
+          <wp:inline distT="0" distB="0" distL="0" distR="0" wp14:anchorId="4B210678" wp14:editId="691E4C11">
+            <wp:extent cx="5971540" cy="393065"/>
+            <wp:effectExtent l="0" t="0" r="0" b="6985"/>
+            <wp:docPr id="1498742248" name="Kép 2"/>
+            <wp:cNvGraphicFramePr>
+              <a:graphicFrameLocks xmlns:a="http://schemas.openxmlformats.org/drawingml/2006/main" noChangeAspect="1"/>
+            </wp:cNvGraphicFramePr>
+            <a:graphic xmlns:a="http://schemas.openxmlformats.org/drawingml/2006/main">
+              <a:graphicData uri="http://schemas.openxmlformats.org/drawingml/2006/picture">
+                <pic:pic xmlns:pic="http://schemas.openxmlformats.org/drawingml/2006/picture">
+                  <pic:nvPicPr>
+                    <pic:cNvPr id="1498742248" name="Kép 1498742248"/>
+                    <pic:cNvPicPr/>
+                  </pic:nvPicPr>
+                  <pic:blipFill>
+                    <a:blip r:embed="rId29">
+                      <a:extLst>
+                        <a:ext uri="{28A0092B-C50C-407E-A947-70E740481C1C}">
+                          <a14:useLocalDpi xmlns:a14="http://schemas.microsoft.com/office/drawing/2010/main" val="0"/>
+                        </a:ext>
+                      </a:extLst>
+                    </a:blip>
+                    <a:stretch>
+                      <a:fillRect/>
+                    </a:stretch>
+                  </pic:blipFill>
+                  <pic:spPr>
+                    <a:xfrm>
+                      <a:off x="0" y="0"/>
+                      <a:ext cx="5971540" cy="393065"/>
+                    </a:xfrm>
+                    <a:prstGeom prst="rect">
+                      <a:avLst/>
+                    </a:prstGeom>
+                  </pic:spPr>
+                </pic:pic>
+              </a:graphicData>
+            </a:graphic>
+          </wp:inline>
+        </w:drawing>
+      </w:r>
+    </w:p>
+    <w:p>
+      <w:pPr>
+        <w:jc w:val="left"/>
+        <w:rPr>
+          <w:lang w:val="hu-HU"/>
+        </w:rPr>
+      </w:pPr>
+      <w:r>
+        <w:rPr>
+          <w:b/>
+          <w:bCs/>
+          <w:lang w:val="hu-HU"/>
+        </w:rPr>
+        <w:t>Példa kérés:</w:t>
+      </w:r>
+      <w:r>
+        <w:rPr>
+          <w:lang w:val="hu-HU"/>
+        </w:rPr>
+        <w:t xml:space="preserve"> </w:t>
+      </w:r>
+      <w:r>
+        <w:rPr>
+          <w:rFonts w:ascii="Courier New" w:hAnsi="Courier New" w:cs="Courier New"/>
+          <w:lang w:val="hu-HU"/>
+        </w:rPr>
+        <w:t>POS</w:t>
+      </w:r>
+      <w:r>
+        <w:rPr>
+          <w:rFonts w:ascii="Courier New" w:hAnsi="Courier New" w:cs="Courier New"/>
+          <w:lang w:val="hu-HU"/>
+        </w:rPr>
+        <w:t>T | /</w:t>
+      </w:r>
+      <w:proofErr w:type="spellStart"/>
+      <w:r>
+        <w:rPr>
+          <w:rFonts w:ascii="Courier New" w:hAnsi="Courier New" w:cs="Courier New"/>
+          <w:lang w:val="hu-HU"/>
+        </w:rPr>
+        <w:t>api</w:t>
+      </w:r>
+      <w:proofErr w:type="spellEnd"/>
+      <w:r>
+        <w:rPr>
+          <w:rFonts w:ascii="Courier New" w:hAnsi="Courier New" w:cs="Courier New"/>
+          <w:lang w:val="hu-HU"/>
+        </w:rPr>
+        <w:t>/</w:t>
+      </w:r>
+      <w:proofErr w:type="spellStart"/>
+      <w:r>
+        <w:rPr>
+          <w:rFonts w:ascii="Courier New" w:hAnsi="Courier New" w:cs="Courier New"/>
+          <w:lang w:val="hu-HU"/>
+        </w:rPr>
+        <w:t>posts</w:t>
+      </w:r>
+      <w:proofErr w:type="spellEnd"/>
+      <w:r>
+        <w:rPr>
+          <w:rFonts w:ascii="Courier New" w:hAnsi="Courier New" w:cs="Courier New"/>
+          <w:lang w:val="hu-HU"/>
+        </w:rPr>
+        <w:t>/1/</w:t>
+      </w:r>
+      <w:proofErr w:type="spellStart"/>
+      <w:r>
+        <w:rPr>
+          <w:rFonts w:ascii="Courier New" w:hAnsi="Courier New" w:cs="Courier New"/>
+          <w:lang w:val="hu-HU"/>
+        </w:rPr>
+        <w:t>vote</w:t>
+      </w:r>
+      <w:proofErr w:type="spellEnd"/>
+      <w:r>
+        <w:rPr>
+          <w:lang w:val="hu-HU"/>
+        </w:rPr>
+        <w:br/>
+      </w:r>
+      <w:r>
+        <w:rPr>
+          <w:b/>
+          <w:bCs/>
+          <w:lang w:val="hu-HU"/>
+        </w:rPr>
+        <w:t>Body:</w:t>
+      </w:r>
+      <w:r>
+        <w:rPr>
+          <w:b/>
+          <w:bCs/>
+          <w:lang w:val="hu-HU"/>
+        </w:rPr>
+        <w:t xml:space="preserve"> </w:t>
+      </w:r>
+    </w:p>
+    <w:p>
+      <w:pPr>
+        <w:pStyle w:val="Kdblokk"/>
+        <w:rPr>
+          <w:lang w:val="hu-HU"/>
+        </w:rPr>
+      </w:pPr>
+      <w:r>
+        <w:rPr>
+          <w:lang w:val="hu-HU"/>
+        </w:rPr>
+        <w:t>{</w:t>
+      </w:r>
+    </w:p>
+    <w:p>
+      <w:pPr>
+        <w:pStyle w:val="Kdblokk"/>
+        <w:rPr>
+          <w:lang w:val="hu-HU"/>
+        </w:rPr>
+      </w:pPr>
+      <w:r>
+        <w:rPr>
+          <w:lang w:val="hu-HU"/>
+        </w:rPr>
+        <w:t xml:space="preserve">  "</w:t>
+      </w:r>
+      <w:proofErr w:type="spellStart"/>
+      <w:r>
+        <w:rPr>
+          <w:lang w:val="hu-HU"/>
+        </w:rPr>
+        <w:t>is_upvote</w:t>
+      </w:r>
+      <w:proofErr w:type="spellEnd"/>
+      <w:r>
+        <w:rPr>
+          <w:lang w:val="hu-HU"/>
+        </w:rPr>
+        <w:t>": true</w:t>
+      </w:r>
+    </w:p>
+    <w:p>
+      <w:pPr>
+        <w:pStyle w:val="Kdblokk"/>
+        <w:rPr>
+          <w:lang w:val="hu-HU"/>
+        </w:rPr>
+      </w:pPr>
+      <w:r>
+        <w:rPr>
+          <w:lang w:val="hu-HU"/>
+        </w:rPr>
+        <w:t>}</w:t>
+      </w:r>
+    </w:p>
+    <w:p>
+      <w:pPr>
+        <w:jc w:val="left"/>
+        <w:rPr>
+          <w:lang w:val="hu-HU"/>
+        </w:rPr>
+      </w:pPr>
+      <w:r>
+        <w:rPr>
+          <w:b/>
+          <w:bCs/>
+          <w:lang w:val="hu-HU"/>
+        </w:rPr>
+        <w:lastRenderedPageBreak/>
+        <w:t>Korlátozás:</w:t>
+      </w:r>
+      <w:r>
+        <w:rPr>
+          <w:b/>
+          <w:bCs/>
+          <w:lang w:val="hu-HU"/>
+        </w:rPr>
+        <w:t xml:space="preserve"> </w:t>
+      </w:r>
+      <w:r>
+        <w:rPr>
+          <w:lang w:val="hu-HU"/>
+        </w:rPr>
+        <w:t>Csak</w:t>
+      </w:r>
+      <w:r>
+        <w:rPr>
+          <w:lang w:val="hu-HU"/>
+        </w:rPr>
+        <w:t xml:space="preserve"> a bejelentkezett felhasználók számára elérhető </w:t>
+      </w:r>
+      <w:r>
+        <w:rPr>
+          <w:lang w:val="hu-HU"/>
+        </w:rPr>
+        <w:br/>
+      </w:r>
+      <w:r>
+        <w:rPr>
+          <w:b/>
+          <w:bCs/>
+          <w:lang w:val="hu-HU"/>
+        </w:rPr>
+        <w:t>Példa válasz:</w:t>
+      </w:r>
+      <w:r>
+        <w:rPr>
+          <w:b/>
+          <w:bCs/>
+          <w:lang w:val="hu-HU"/>
+        </w:rPr>
+        <w:t xml:space="preserve"> </w:t>
+      </w:r>
+      <w:r>
+        <w:rPr>
+          <w:lang w:val="hu-HU"/>
+        </w:rPr>
+        <w:t>(20</w:t>
+      </w:r>
+      <w:r>
+        <w:rPr>
+          <w:lang w:val="hu-HU"/>
+        </w:rPr>
+        <w:t xml:space="preserve">1 </w:t>
+      </w:r>
+      <w:proofErr w:type="spellStart"/>
+      <w:r>
+        <w:rPr>
+          <w:lang w:val="hu-HU"/>
+        </w:rPr>
+        <w:t>Created</w:t>
+      </w:r>
+      <w:proofErr w:type="spellEnd"/>
+      <w:r>
+        <w:rPr>
+          <w:lang w:val="hu-HU"/>
+        </w:rPr>
+        <w:t>)</w:t>
+      </w:r>
+    </w:p>
+    <w:p>
+      <w:pPr>
+        <w:pStyle w:val="Kdblokk"/>
+      </w:pPr>
+      <w:r>
+        <w:t>{</w:t>
+      </w:r>
+    </w:p>
+    <w:p>
+      <w:pPr>
+        <w:pStyle w:val="Kdblokk"/>
+      </w:pPr>
+      <w:r>
+        <w:t xml:space="preserve">  "</w:t>
+      </w:r>
+      <w:proofErr w:type="spellStart"/>
+      <w:proofErr w:type="gramStart"/>
+      <w:r>
+        <w:t>post</w:t>
+      </w:r>
+      <w:proofErr w:type="gramEnd"/>
+      <w:r>
+        <w:t>_id</w:t>
+      </w:r>
+      <w:proofErr w:type="spellEnd"/>
+      <w:r>
+        <w:t>": 1,</w:t>
+      </w:r>
+    </w:p>
+    <w:p>
+      <w:pPr>
+        <w:pStyle w:val="Kdblokk"/>
+      </w:pPr>
+      <w:r>
+        <w:t xml:space="preserve">  "</w:t>
+      </w:r>
+      <w:proofErr w:type="spellStart"/>
+      <w:proofErr w:type="gramStart"/>
+      <w:r>
+        <w:t>user</w:t>
+      </w:r>
+      <w:proofErr w:type="gramEnd"/>
+      <w:r>
+        <w:t>_id</w:t>
+      </w:r>
+      <w:proofErr w:type="spellEnd"/>
+      <w:r>
+        <w:t>": 5,</w:t>
+      </w:r>
+    </w:p>
+    <w:p>
+      <w:pPr>
+        <w:pStyle w:val="Kdblokk"/>
+      </w:pPr>
+      <w:r>
+        <w:t xml:space="preserve">  "</w:t>
+      </w:r>
+      <w:proofErr w:type="spellStart"/>
+      <w:proofErr w:type="gramStart"/>
+      <w:r>
+        <w:t>is</w:t>
+      </w:r>
+      <w:proofErr w:type="gramEnd"/>
+      <w:r>
+        <w:t>_upvote</w:t>
+      </w:r>
+      <w:proofErr w:type="spellEnd"/>
+      <w:r>
+        <w:t>": true,</w:t>
+      </w:r>
+    </w:p>
+    <w:p>
+      <w:pPr>
+        <w:pStyle w:val="Kdblokk"/>
+      </w:pPr>
+      <w:r>
+        <w:t xml:space="preserve">  "</w:t>
+      </w:r>
+      <w:proofErr w:type="spellStart"/>
+      <w:proofErr w:type="gramStart"/>
+      <w:r>
+        <w:t>updated</w:t>
+      </w:r>
+      <w:proofErr w:type="gramEnd"/>
+      <w:r>
+        <w:t>_at</w:t>
+      </w:r>
+      <w:proofErr w:type="spellEnd"/>
+      <w:r>
+        <w:t>": "2026-04-07T11:28:42.000000Z",</w:t>
+      </w:r>
+    </w:p>
+    <w:p>
+      <w:pPr>
+        <w:pStyle w:val="Kdblokk"/>
+      </w:pPr>
+      <w:r>
+        <w:t xml:space="preserve">  "</w:t>
+      </w:r>
+      <w:proofErr w:type="spellStart"/>
+      <w:proofErr w:type="gramStart"/>
+      <w:r>
+        <w:t>created</w:t>
+      </w:r>
+      <w:proofErr w:type="gramEnd"/>
+      <w:r>
+        <w:t>_at</w:t>
+      </w:r>
+      <w:proofErr w:type="spellEnd"/>
+      <w:r>
+        <w:t>": "2026-04-07T11:28:42.000000Z",</w:t>
+      </w:r>
+    </w:p>
+    <w:p>
+      <w:pPr>
+        <w:pStyle w:val="Kdblokk"/>
+      </w:pPr>
+      <w:r>
+        <w:t xml:space="preserve">  "id": 7</w:t>
+      </w:r>
+    </w:p>
+    <w:p>
+      <w:pPr>
+        <w:pStyle w:val="Kdblokk"/>
+      </w:pPr>
+      <w:r>
+        <w:t>}</w:t>
+      </w:r>
+    </w:p>
+    <w:p>
+      <w:pPr>
+        <w:pStyle w:val="Alcm"/>
+        <w:rPr>
+          <w:lang w:val="hu-HU"/>
+        </w:rPr>
+      </w:pPr>
+      <w:r>
+        <w:rPr>
+          <w:lang w:val="hu-HU"/>
+        </w:rPr>
+        <w:t>1.2.</w:t>
+      </w:r>
+      <w:r>
+        <w:rPr>
+          <w:lang w:val="hu-HU"/>
+        </w:rPr>
+        <w:t>6 Comment</w:t>
+      </w:r>
+      <w:r>
+        <w:rPr>
+          <w:lang w:val="hu-HU"/>
+        </w:rPr>
+        <w:t xml:space="preserve"> kontroller</w:t>
+      </w:r>
+    </w:p>
+    <w:p>
+      <w:pPr>
+        <w:rPr>
+          <w:lang w:val="hu-HU"/>
+        </w:rPr>
+      </w:pPr>
+      <w:r>
+        <w:rPr>
+          <w:b/>
+          <w:bCs/>
+          <w:lang w:val="hu-HU"/>
+        </w:rPr>
+        <w:t>GET</w:t>
+      </w:r>
+      <w:r>
+        <w:rPr>
+          <w:b/>
+          <w:bCs/>
+          <w:lang w:val="hu-HU"/>
+        </w:rPr>
+        <w:t xml:space="preserve"> </w:t>
+      </w:r>
+      <w:proofErr w:type="spellStart"/>
+      <w:r>
+        <w:rPr>
+          <w:lang w:val="hu-HU"/>
+        </w:rPr>
+        <w:t>Comments</w:t>
+      </w:r>
+      <w:proofErr w:type="spellEnd"/>
+      <w:r>
+        <w:rPr>
+          <w:lang w:val="hu-HU"/>
+        </w:rPr>
+        <w:t xml:space="preserve"> (</w:t>
+      </w:r>
+      <w:proofErr w:type="spellStart"/>
+      <w:r>
+        <w:rPr>
+          <w:lang w:val="hu-HU"/>
+        </w:rPr>
+        <w:t>All</w:t>
+      </w:r>
+      <w:proofErr w:type="spellEnd"/>
+      <w:r>
+        <w:rPr>
+          <w:lang w:val="hu-HU"/>
+        </w:rPr>
+        <w:t>)</w:t>
+      </w:r>
+    </w:p>
+    <w:p>
+      <w:pPr>
+        <w:rPr>
+          <w:lang w:val="hu-HU"/>
+        </w:rPr>
+      </w:pPr>
+      <w:r>
+        <w:rPr>
+          <w:noProof/>
+          <w:lang w:val="hu-HU"/>
+        </w:rPr>
+        <w:drawing>
+          <wp:inline distT="0" distB="0" distL="0" distR="0" wp14:anchorId="2F96D8AF" wp14:editId="1D48649B">
+            <wp:extent cx="5971540" cy="365125"/>
+            <wp:effectExtent l="0" t="0" r="0" b="0"/>
+            <wp:docPr id="814723508" name="Kép 3"/>
+            <wp:cNvGraphicFramePr>
+              <a:graphicFrameLocks xmlns:a="http://schemas.openxmlformats.org/drawingml/2006/main" noChangeAspect="1"/>
+            </wp:cNvGraphicFramePr>
+            <a:graphic xmlns:a="http://schemas.openxmlformats.org/drawingml/2006/main">
+              <a:graphicData uri="http://schemas.openxmlformats.org/drawingml/2006/picture">
+                <pic:pic xmlns:pic="http://schemas.openxmlformats.org/drawingml/2006/picture">
+                  <pic:nvPicPr>
+                    <pic:cNvPr id="814723508" name="Kép 814723508"/>
+                    <pic:cNvPicPr/>
+                  </pic:nvPicPr>
+                  <pic:blipFill>
+                    <a:blip r:embed="rId30">
+                      <a:extLst>
+                        <a:ext uri="{28A0092B-C50C-407E-A947-70E740481C1C}">
+                          <a14:useLocalDpi xmlns:a14="http://schemas.microsoft.com/office/drawing/2010/main" val="0"/>
+                        </a:ext>
+                      </a:extLst>
+                    </a:blip>
+                    <a:stretch>
+                      <a:fillRect/>
+                    </a:stretch>
+                  </pic:blipFill>
+                  <pic:spPr>
+                    <a:xfrm>
+                      <a:off x="0" y="0"/>
+                      <a:ext cx="5971540" cy="365125"/>
+                    </a:xfrm>
+                    <a:prstGeom prst="rect">
+                      <a:avLst/>
+                    </a:prstGeom>
+                  </pic:spPr>
+                </pic:pic>
+              </a:graphicData>
+            </a:graphic>
+          </wp:inline>
+        </w:drawing>
+      </w:r>
+    </w:p>
+    <w:p>
+      <w:pPr>
+        <w:jc w:val="left"/>
+        <w:rPr>
+          <w:lang w:val="hu-HU"/>
+        </w:rPr>
+      </w:pPr>
+      <w:r>
+        <w:rPr>
+          <w:b/>
+          <w:bCs/>
+          <w:lang w:val="hu-HU"/>
+        </w:rPr>
+        <w:t>Példa kérés:</w:t>
+      </w:r>
+      <w:r>
+        <w:rPr>
+          <w:lang w:val="hu-HU"/>
+        </w:rPr>
+        <w:t xml:space="preserve"> </w:t>
+      </w:r>
+      <w:r>
+        <w:rPr>
+          <w:rFonts w:ascii="Courier New" w:hAnsi="Courier New" w:cs="Courier New"/>
+          <w:lang w:val="hu-HU"/>
+        </w:rPr>
+        <w:t>GET | /</w:t>
+      </w:r>
+      <w:proofErr w:type="spellStart"/>
+      <w:r>
+        <w:rPr>
+          <w:rFonts w:ascii="Courier New" w:hAnsi="Courier New" w:cs="Courier New"/>
+          <w:lang w:val="hu-HU"/>
+        </w:rPr>
+        <w:t>api</w:t>
+      </w:r>
+      <w:proofErr w:type="spellEnd"/>
+      <w:r>
+        <w:rPr>
+          <w:rFonts w:ascii="Courier New" w:hAnsi="Courier New" w:cs="Courier New"/>
+          <w:lang w:val="hu-HU"/>
+        </w:rPr>
+        <w:t>/</w:t>
+      </w:r>
+      <w:proofErr w:type="spellStart"/>
+      <w:r>
+        <w:rPr>
+          <w:rFonts w:ascii="Courier New" w:hAnsi="Courier New" w:cs="Courier New"/>
+          <w:lang w:val="hu-HU"/>
+        </w:rPr>
+        <w:t>posts</w:t>
+      </w:r>
+      <w:proofErr w:type="spellEnd"/>
+      <w:r>
+        <w:rPr>
+          <w:rFonts w:ascii="Courier New" w:hAnsi="Courier New" w:cs="Courier New"/>
+          <w:lang w:val="hu-HU"/>
+        </w:rPr>
+        <w:t>/1/</w:t>
+      </w:r>
+      <w:proofErr w:type="spellStart"/>
+      <w:r>
+        <w:rPr>
+          <w:rFonts w:ascii="Courier New" w:hAnsi="Courier New" w:cs="Courier New"/>
+          <w:lang w:val="hu-HU"/>
+        </w:rPr>
+        <w:t>comments</w:t>
+      </w:r>
+      <w:proofErr w:type="spellEnd"/>
+      <w:r>
+        <w:rPr>
+          <w:lang w:val="hu-HU"/>
+        </w:rPr>
+        <w:t xml:space="preserve"> </w:t>
+      </w:r>
+      <w:r>
+        <w:rPr>
+          <w:lang w:val="hu-HU"/>
+        </w:rPr>
+        <w:br/>
+      </w:r>
+      <w:r>
+        <w:rPr>
+          <w:b/>
+          <w:bCs/>
+          <w:lang w:val="hu-HU"/>
+        </w:rPr>
+        <w:t>Body:</w:t>
+      </w:r>
+      <w:r>
+        <w:rPr>
+          <w:b/>
+          <w:bCs/>
+          <w:lang w:val="hu-HU"/>
+        </w:rPr>
+        <w:t xml:space="preserve"> </w:t>
+      </w:r>
+      <w:r>
+        <w:rPr>
+          <w:lang w:val="hu-HU"/>
+        </w:rPr>
+        <w:t>-</w:t>
+      </w:r>
+    </w:p>
+    <w:p>
+      <w:pPr>
+        <w:rPr>
+          <w:lang w:val="hu-HU"/>
+        </w:rPr>
+      </w:pPr>
+      <w:r>
+        <w:rPr>
+          <w:b/>
+          <w:bCs/>
+          <w:lang w:val="hu-HU"/>
+        </w:rPr>
+        <w:t>Korlátozás:</w:t>
+      </w:r>
+      <w:r>
+        <w:rPr>
+          <w:b/>
+          <w:bCs/>
+          <w:lang w:val="hu-HU"/>
+        </w:rPr>
+        <w:t xml:space="preserve"> </w:t>
+      </w:r>
+      <w:r>
+        <w:rPr>
+          <w:lang w:val="hu-HU"/>
+        </w:rPr>
+        <w:t>Csak</w:t>
+      </w:r>
+      <w:r>
+        <w:rPr>
+          <w:lang w:val="hu-HU"/>
+        </w:rPr>
+        <w:t xml:space="preserve"> a bejelentkezett felhasználók számára elérhető</w:t>
+      </w:r>
+      <w:r>
+        <w:rPr>
+          <w:lang w:val="hu-HU"/>
+        </w:rPr>
+        <w:t>. Csak az első három mélységi szintig adja vissza egy komment válaszait</w:t>
+      </w:r>
+    </w:p>
+    <w:p>
+      <w:pPr>
+        <w:jc w:val="left"/>
+        <w:rPr>
+          <w:lang w:val="hu-HU"/>
+        </w:rPr>
+      </w:pPr>
+      <w:r>
+        <w:rPr>
+          <w:b/>
+          <w:bCs/>
+          <w:lang w:val="hu-HU"/>
+        </w:rPr>
+        <w:t>Példa válasz:</w:t>
+      </w:r>
+      <w:r>
+        <w:rPr>
+          <w:b/>
+          <w:bCs/>
+          <w:lang w:val="hu-HU"/>
+        </w:rPr>
+        <w:t xml:space="preserve"> </w:t>
+      </w:r>
+      <w:r>
+        <w:rPr>
+          <w:lang w:val="hu-HU"/>
+        </w:rPr>
+        <w:t>(200 OK)</w:t>
+      </w:r>
+    </w:p>
+    <w:p>
+      <w:pPr>
+        <w:pStyle w:val="Kdblokk"/>
+      </w:pPr>
+      <w:r>
+        <w:t>[</w:t>
+      </w:r>
+    </w:p>
+    <w:p>
+      <w:pPr>
+        <w:pStyle w:val="Kdblokk"/>
+      </w:pPr>
+      <w:r>
+        <w:t xml:space="preserve"> …</w:t>
+      </w:r>
+    </w:p>
+    <w:p>
+      <w:pPr>
+        <w:pStyle w:val="Kdblokk"/>
+      </w:pPr>
+      <w:r>
+        <w:t xml:space="preserve">  {</w:t>
+      </w:r>
+    </w:p>
+    <w:p>
+      <w:pPr>
+        <w:pStyle w:val="Kdblokk"/>
+      </w:pPr>
+      <w:r>
+        <w:t xml:space="preserve">    "id": 1,</w:t>
+      </w:r>
+    </w:p>
+    <w:p>
+      <w:pPr>
+        <w:pStyle w:val="Kdblokk"/>
+      </w:pPr>
+      <w:r>
+        <w:t xml:space="preserve">    "content": "</w:t>
+      </w:r>
+      <w:proofErr w:type="spellStart"/>
+      <w:r>
+        <w:t>hhxn</w:t>
+      </w:r>
+      <w:proofErr w:type="spellEnd"/>
+      <w:r>
+        <w:t>",</w:t>
+      </w:r>
+    </w:p>
+    <w:p>
+      <w:pPr>
+        <w:pStyle w:val="Kdblokk"/>
+      </w:pPr>
+      <w:r>
+        <w:t xml:space="preserve">    "depth": 0,</w:t>
+      </w:r>
+    </w:p>
+    <w:p>
+      <w:pPr>
+        <w:pStyle w:val="Kdblokk"/>
+      </w:pPr>
+      <w:r>
+        <w:t xml:space="preserve">    "user": {</w:t>
+      </w:r>
+    </w:p>
+    <w:p>
+      <w:pPr>
+        <w:pStyle w:val="Kdblokk"/>
+      </w:pPr>
+      <w:r>
+        <w:t xml:space="preserve">      "id": 2,</w:t>
+      </w:r>
+    </w:p>
+    <w:p>
+      <w:pPr>
+        <w:pStyle w:val="Kdblokk"/>
+      </w:pPr>
+      <w:r>
+        <w:t xml:space="preserve">      "name": "</w:t>
+      </w:r>
+      <w:proofErr w:type="spellStart"/>
+      <w:r>
+        <w:t>Gehér</w:t>
+      </w:r>
+      <w:proofErr w:type="spellEnd"/>
+      <w:r>
+        <w:t xml:space="preserve"> Marcell",</w:t>
+      </w:r>
+    </w:p>
+    <w:p>
+      <w:pPr>
+        <w:pStyle w:val="Kdblokk"/>
+      </w:pPr>
+      <w:r>
+        <w:lastRenderedPageBreak/>
+        <w:t xml:space="preserve">      "email": "geher.marcell@students.jedlik.eu",</w:t>
+      </w:r>
+    </w:p>
+    <w:p>
+      <w:pPr>
+        <w:pStyle w:val="Kdblokk"/>
+      </w:pPr>
+      <w:r>
+        <w:t xml:space="preserve">      "</w:t>
+      </w:r>
+      <w:proofErr w:type="spellStart"/>
+      <w:proofErr w:type="gramStart"/>
+      <w:r>
+        <w:t>image</w:t>
+      </w:r>
+      <w:proofErr w:type="gramEnd"/>
+      <w:r>
+        <w:t>_url</w:t>
+      </w:r>
+      <w:proofErr w:type="spellEnd"/>
+      <w:r>
+        <w:t>": "https://jedligrambackend-</w:t>
+      </w:r>
+      <w:r>
+        <w:t xml:space="preserve"> </w:t>
+      </w:r>
+      <w:r>
+        <w:t>…</w:t>
+      </w:r>
+      <w:r>
+        <w:t xml:space="preserve"> </w:t>
+      </w:r>
+      <w:r>
+        <w:t>",</w:t>
+      </w:r>
+    </w:p>
+    <w:p>
+      <w:pPr>
+        <w:pStyle w:val="Kdblokk"/>
+      </w:pPr>
+      <w:r>
+        <w:t xml:space="preserve">      "bio": "</w:t>
+      </w:r>
+      <w:proofErr w:type="spellStart"/>
+      <w:r>
+        <w:t>Csáá</w:t>
+      </w:r>
+      <w:proofErr w:type="spellEnd"/>
+      <w:r>
+        <w:t>",</w:t>
+      </w:r>
+    </w:p>
+    <w:p>
+      <w:pPr>
+        <w:pStyle w:val="Kdblokk"/>
+      </w:pPr>
+      <w:r>
+        <w:t xml:space="preserve">      "</w:t>
+      </w:r>
+      <w:proofErr w:type="spellStart"/>
+      <w:proofErr w:type="gramStart"/>
+      <w:r>
+        <w:t>post</w:t>
+      </w:r>
+      <w:proofErr w:type="gramEnd"/>
+      <w:r>
+        <w:t>_karma</w:t>
+      </w:r>
+      <w:proofErr w:type="spellEnd"/>
+      <w:r>
+        <w:t>": 2</w:t>
+      </w:r>
+    </w:p>
+    <w:p>
+      <w:pPr>
+        <w:pStyle w:val="Kdblokk"/>
+      </w:pPr>
+      <w:r>
+        <w:t xml:space="preserve">    },</w:t>
+      </w:r>
+    </w:p>
+    <w:p>
+      <w:pPr>
+        <w:pStyle w:val="Kdblokk"/>
+      </w:pPr>
+      <w:r>
+        <w:t xml:space="preserve">    "age": "1 day ago",</w:t>
+      </w:r>
+    </w:p>
+    <w:p>
+      <w:pPr>
+        <w:pStyle w:val="Kdblokk"/>
+      </w:pPr>
+      <w:r>
+        <w:t xml:space="preserve">    "</w:t>
+      </w:r>
+      <w:proofErr w:type="spellStart"/>
+      <w:proofErr w:type="gramStart"/>
+      <w:r>
+        <w:t>replies</w:t>
+      </w:r>
+      <w:proofErr w:type="gramEnd"/>
+      <w:r>
+        <w:t>_count</w:t>
+      </w:r>
+      <w:proofErr w:type="spellEnd"/>
+      <w:r>
+        <w:t>": 1,</w:t>
+      </w:r>
+    </w:p>
+    <w:p>
+      <w:pPr>
+        <w:pStyle w:val="Kdblokk"/>
+      </w:pPr>
+      <w:r>
+        <w:t xml:space="preserve">    "replies": [</w:t>
+      </w:r>
+    </w:p>
+    <w:p>
+      <w:pPr>
+        <w:pStyle w:val="Kdblokk"/>
+      </w:pPr>
+      <w:r>
+        <w:t xml:space="preserve">      {</w:t>
+      </w:r>
+    </w:p>
+    <w:p>
+      <w:pPr>
+        <w:pStyle w:val="Kdblokk"/>
+      </w:pPr>
+      <w:r>
+        <w:t xml:space="preserve">        "id": 2,</w:t>
+      </w:r>
+    </w:p>
+    <w:p>
+      <w:pPr>
+        <w:pStyle w:val="Kdblokk"/>
+      </w:pPr>
+      <w:r>
+        <w:t xml:space="preserve">        "content": "</w:t>
+      </w:r>
+      <w:proofErr w:type="spellStart"/>
+      <w:r>
+        <w:t>hdbdb</w:t>
+      </w:r>
+      <w:proofErr w:type="spellEnd"/>
+      <w:r>
+        <w:t>",</w:t>
+      </w:r>
+    </w:p>
+    <w:p>
+      <w:pPr>
+        <w:pStyle w:val="Kdblokk"/>
+      </w:pPr>
+      <w:r>
+        <w:t xml:space="preserve">        "depth": 1,</w:t>
+      </w:r>
+    </w:p>
+    <w:p>
+      <w:pPr>
+        <w:pStyle w:val="Kdblokk"/>
+      </w:pPr>
+      <w:r>
+        <w:t xml:space="preserve">        "user": {</w:t>
+      </w:r>
+    </w:p>
+    <w:p>
+      <w:pPr>
+        <w:pStyle w:val="Kdblokk"/>
+      </w:pPr>
+      <w:r>
+        <w:t xml:space="preserve">          "id": 2,</w:t>
+      </w:r>
+    </w:p>
+    <w:p>
+      <w:pPr>
+        <w:pStyle w:val="Kdblokk"/>
+      </w:pPr>
+      <w:r>
+        <w:t xml:space="preserve">          "name": "</w:t>
+      </w:r>
+      <w:proofErr w:type="spellStart"/>
+      <w:r>
+        <w:t>Gehér</w:t>
+      </w:r>
+      <w:proofErr w:type="spellEnd"/>
+      <w:r>
+        <w:t xml:space="preserve"> Marcell",</w:t>
+      </w:r>
+    </w:p>
+    <w:p>
+      <w:pPr>
+        <w:pStyle w:val="Kdblokk"/>
+      </w:pPr>
+      <w:r>
+        <w:t xml:space="preserve">          "email": "geher.marcell@students.jedlik.eu",</w:t>
+      </w:r>
+    </w:p>
+    <w:p>
+      <w:pPr>
+        <w:pStyle w:val="Kdblokk"/>
+      </w:pPr>
+      <w:r>
+        <w:t xml:space="preserve">          "</w:t>
+      </w:r>
+      <w:proofErr w:type="spellStart"/>
+      <w:proofErr w:type="gramStart"/>
+      <w:r>
+        <w:t>image</w:t>
+      </w:r>
+      <w:proofErr w:type="gramEnd"/>
+      <w:r>
+        <w:t>_url</w:t>
+      </w:r>
+      <w:proofErr w:type="spellEnd"/>
+      <w:r>
+        <w:t>": "https://jedligrambackend-</w:t>
+      </w:r>
+      <w:r>
+        <w:t xml:space="preserve"> </w:t>
+      </w:r>
+      <w:r>
+        <w:t>…</w:t>
+      </w:r>
+      <w:r>
+        <w:t xml:space="preserve"> </w:t>
+      </w:r>
+      <w:r>
+        <w:t>",</w:t>
+      </w:r>
+    </w:p>
+    <w:p>
+      <w:pPr>
+        <w:pStyle w:val="Kdblokk"/>
+      </w:pPr>
+      <w:r>
+        <w:t xml:space="preserve">          "bio": "</w:t>
+      </w:r>
+      <w:proofErr w:type="spellStart"/>
+      <w:r>
+        <w:t>Csáá</w:t>
+      </w:r>
+      <w:proofErr w:type="spellEnd"/>
+      <w:r>
+        <w:t>",</w:t>
+      </w:r>
+    </w:p>
+    <w:p>
+      <w:pPr>
+        <w:pStyle w:val="Kdblokk"/>
+      </w:pPr>
+      <w:r>
+        <w:t xml:space="preserve">          "</w:t>
+      </w:r>
+      <w:proofErr w:type="spellStart"/>
+      <w:proofErr w:type="gramStart"/>
+      <w:r>
+        <w:t>post</w:t>
+      </w:r>
+      <w:proofErr w:type="gramEnd"/>
+      <w:r>
+        <w:t>_karma</w:t>
+      </w:r>
+      <w:proofErr w:type="spellEnd"/>
+      <w:r>
+        <w:t>": 2</w:t>
+      </w:r>
+    </w:p>
+    <w:p>
+      <w:pPr>
+        <w:pStyle w:val="Kdblokk"/>
+      </w:pPr>
+      <w:r>
+        <w:t xml:space="preserve">        }</w:t>
+      </w:r>
+      <w:r>
+        <w:t>,</w:t>
+      </w:r>
+    </w:p>
+    <w:p>
+      <w:pPr>
+        <w:pStyle w:val="Kdblokk"/>
+      </w:pPr>
+      <w:r>
+        <w:t xml:space="preserve">        "age": "1 day ago",</w:t>
+      </w:r>
+    </w:p>
+    <w:p>
+      <w:pPr>
+        <w:pStyle w:val="Kdblokk"/>
+      </w:pPr>
+      <w:r>
+        <w:t xml:space="preserve">        "</w:t>
+      </w:r>
+      <w:proofErr w:type="spellStart"/>
+      <w:proofErr w:type="gramStart"/>
+      <w:r>
+        <w:t>replies</w:t>
+      </w:r>
+      <w:proofErr w:type="gramEnd"/>
+      <w:r>
+        <w:t>_count</w:t>
+      </w:r>
+      <w:proofErr w:type="spellEnd"/>
+      <w:r>
+        <w:t>": 1,</w:t>
+      </w:r>
+    </w:p>
+    <w:p>
+      <w:pPr>
+        <w:pStyle w:val="Kdblokk"/>
+      </w:pPr>
+      <w:r>
+        <w:t xml:space="preserve">        "replies": []</w:t>
+      </w:r>
+    </w:p>
+    <w:p>
+      <w:pPr>
+        <w:pStyle w:val="Kdblokk"/>
+      </w:pPr>
+      <w:r>
+        <w:t xml:space="preserve">      }</w:t>
+      </w:r>
+    </w:p>
+    <w:p>
+      <w:pPr>
+        <w:pStyle w:val="Kdblokk"/>
+      </w:pPr>
+      <w:r>
+        <w:t xml:space="preserve">    ]</w:t>
+      </w:r>
+    </w:p>
+    <w:p>
+      <w:pPr>
+        <w:pStyle w:val="Kdblokk"/>
+      </w:pPr>
+      <w:r>
+        <w:t xml:space="preserve">  }</w:t>
+      </w:r>
+    </w:p>
+    <w:p>
+      <w:pPr>
+        <w:pStyle w:val="Kdblokk"/>
+      </w:pPr>
+      <w:r>
+        <w:t xml:space="preserve"> …</w:t>
+      </w:r>
+    </w:p>
+    <w:p>
+      <w:pPr>
+        <w:pStyle w:val="Kdblokk"/>
+      </w:pPr>
+      <w:r>
+        <w:t>]</w:t>
+      </w:r>
+    </w:p>
+    <w:p>
+      <w:pPr>
+        <w:rPr>
+          <w:lang w:val="hu-HU"/>
+        </w:rPr>
+      </w:pPr>
+      <w:r>
+        <w:rPr>
+          <w:b/>
+          <w:bCs/>
+          <w:lang w:val="hu-HU"/>
+        </w:rPr>
+        <w:t>GET</w:t>
+      </w:r>
+      <w:r>
+        <w:rPr>
+          <w:b/>
+          <w:bCs/>
+          <w:lang w:val="hu-HU"/>
+        </w:rPr>
+        <w:t xml:space="preserve"> </w:t>
+      </w:r>
+      <w:proofErr w:type="spellStart"/>
+      <w:r>
+        <w:rPr>
+          <w:lang w:val="hu-HU"/>
+        </w:rPr>
+        <w:t>Replie</w:t>
+      </w:r>
+      <w:r>
+        <w:rPr>
+          <w:lang w:val="hu-HU"/>
+        </w:rPr>
+        <w:t>s</w:t>
+      </w:r>
+      <w:proofErr w:type="spellEnd"/>
+      <w:r>
+        <w:rPr>
+          <w:lang w:val="hu-HU"/>
+        </w:rPr>
+        <w:t xml:space="preserve"> (</w:t>
+      </w:r>
+      <w:proofErr w:type="spellStart"/>
+      <w:r>
+        <w:rPr>
+          <w:lang w:val="hu-HU"/>
+        </w:rPr>
+        <w:t>All</w:t>
+      </w:r>
+      <w:proofErr w:type="spellEnd"/>
+      <w:r>
+        <w:rPr>
+          <w:lang w:val="hu-HU"/>
+        </w:rPr>
+        <w:t>)</w:t>
+      </w:r>
+    </w:p>
+    <w:p>
+      <w:pPr>
+        <w:rPr>
+          <w:lang w:val="hu-HU"/>
+        </w:rPr>
+      </w:pPr>
+      <w:r>
+        <w:rPr>
+          <w:noProof/>
+          <w:lang w:val="hu-HU"/>
+        </w:rPr>
+        <w:lastRenderedPageBreak/>
+        <w:drawing>
+          <wp:inline distT="0" distB="0" distL="0" distR="0" wp14:anchorId="7D0874BA" wp14:editId="53795175">
+            <wp:extent cx="5971540" cy="295275"/>
+            <wp:effectExtent l="0" t="0" r="0" b="9525"/>
+            <wp:docPr id="1417353589" name="Kép 4"/>
+            <wp:cNvGraphicFramePr>
+              <a:graphicFrameLocks xmlns:a="http://schemas.openxmlformats.org/drawingml/2006/main" noChangeAspect="1"/>
+            </wp:cNvGraphicFramePr>
+            <a:graphic xmlns:a="http://schemas.openxmlformats.org/drawingml/2006/main">
+              <a:graphicData uri="http://schemas.openxmlformats.org/drawingml/2006/picture">
+                <pic:pic xmlns:pic="http://schemas.openxmlformats.org/drawingml/2006/picture">
+                  <pic:nvPicPr>
+                    <pic:cNvPr id="1417353589" name="Kép 1417353589"/>
+                    <pic:cNvPicPr/>
+                  </pic:nvPicPr>
+                  <pic:blipFill>
+                    <a:blip r:embed="rId31">
+                      <a:extLst>
+                        <a:ext uri="{28A0092B-C50C-407E-A947-70E740481C1C}">
+                          <a14:useLocalDpi xmlns:a14="http://schemas.microsoft.com/office/drawing/2010/main" val="0"/>
+                        </a:ext>
+                      </a:extLst>
+                    </a:blip>
+                    <a:stretch>
+                      <a:fillRect/>
+                    </a:stretch>
+                  </pic:blipFill>
+                  <pic:spPr>
+                    <a:xfrm>
+                      <a:off x="0" y="0"/>
+                      <a:ext cx="5971540" cy="295275"/>
+                    </a:xfrm>
+                    <a:prstGeom prst="rect">
+                      <a:avLst/>
+                    </a:prstGeom>
+                  </pic:spPr>
+                </pic:pic>
+              </a:graphicData>
+            </a:graphic>
+          </wp:inline>
+        </w:drawing>
+      </w:r>
+    </w:p>
+    <w:p>
+      <w:pPr>
+        <w:jc w:val="left"/>
+        <w:rPr>
+          <w:lang w:val="hu-HU"/>
+        </w:rPr>
+      </w:pPr>
+      <w:r>
+        <w:rPr>
+          <w:b/>
+          <w:bCs/>
+          <w:lang w:val="hu-HU"/>
+        </w:rPr>
+        <w:t>Példa kérés:</w:t>
+      </w:r>
+      <w:r>
+        <w:rPr>
+          <w:lang w:val="hu-HU"/>
+        </w:rPr>
+        <w:t xml:space="preserve"> </w:t>
+      </w:r>
+      <w:r>
+        <w:rPr>
+          <w:rFonts w:ascii="Courier New" w:hAnsi="Courier New" w:cs="Courier New"/>
+          <w:lang w:val="hu-HU"/>
+        </w:rPr>
+        <w:t>GET | /</w:t>
+      </w:r>
+      <w:proofErr w:type="spellStart"/>
+      <w:r>
+        <w:rPr>
+          <w:rFonts w:ascii="Courier New" w:hAnsi="Courier New" w:cs="Courier New"/>
+          <w:lang w:val="hu-HU"/>
+        </w:rPr>
+        <w:t>api</w:t>
+      </w:r>
+      <w:proofErr w:type="spellEnd"/>
+      <w:r>
+        <w:rPr>
+          <w:rFonts w:ascii="Courier New" w:hAnsi="Courier New" w:cs="Courier New"/>
+          <w:lang w:val="hu-HU"/>
+        </w:rPr>
+        <w:t>/</w:t>
+      </w:r>
+      <w:proofErr w:type="spellStart"/>
+      <w:r>
+        <w:rPr>
+          <w:rFonts w:ascii="Courier New" w:hAnsi="Courier New" w:cs="Courier New"/>
+          <w:lang w:val="hu-HU"/>
+        </w:rPr>
+        <w:t>comments</w:t>
+      </w:r>
+      <w:proofErr w:type="spellEnd"/>
+      <w:r>
+        <w:rPr>
+          <w:rFonts w:ascii="Courier New" w:hAnsi="Courier New" w:cs="Courier New"/>
+          <w:lang w:val="hu-HU"/>
+        </w:rPr>
+        <w:t>/1/</w:t>
+      </w:r>
+      <w:proofErr w:type="spellStart"/>
+      <w:r>
+        <w:rPr>
+          <w:rFonts w:ascii="Courier New" w:hAnsi="Courier New" w:cs="Courier New"/>
+          <w:lang w:val="hu-HU"/>
+        </w:rPr>
+        <w:t>replies</w:t>
+      </w:r>
+      <w:proofErr w:type="spellEnd"/>
+      <w:r>
+        <w:rPr>
+          <w:lang w:val="hu-HU"/>
+        </w:rPr>
+        <w:t xml:space="preserve"> </w:t>
+      </w:r>
+      <w:r>
+        <w:rPr>
+          <w:lang w:val="hu-HU"/>
+        </w:rPr>
+        <w:br/>
+      </w:r>
+      <w:r>
+        <w:rPr>
+          <w:b/>
+          <w:bCs/>
+          <w:lang w:val="hu-HU"/>
+        </w:rPr>
+        <w:t>Body:</w:t>
+      </w:r>
+      <w:r>
+        <w:rPr>
+          <w:b/>
+          <w:bCs/>
+          <w:lang w:val="hu-HU"/>
+        </w:rPr>
+        <w:t xml:space="preserve"> </w:t>
+      </w:r>
+      <w:r>
+        <w:rPr>
+          <w:lang w:val="hu-HU"/>
+        </w:rPr>
+        <w:t>-</w:t>
+      </w:r>
+    </w:p>
+    <w:p>
+      <w:pPr>
+        <w:rPr>
+          <w:lang w:val="hu-HU"/>
+        </w:rPr>
+      </w:pPr>
+      <w:r>
+        <w:rPr>
+          <w:b/>
+          <w:bCs/>
+          <w:lang w:val="hu-HU"/>
+        </w:rPr>
+        <w:t>Korlátozás:</w:t>
+      </w:r>
+      <w:r>
+        <w:rPr>
+          <w:b/>
+          <w:bCs/>
+          <w:lang w:val="hu-HU"/>
+        </w:rPr>
+        <w:t xml:space="preserve"> </w:t>
+      </w:r>
+      <w:r>
+        <w:rPr>
+          <w:lang w:val="hu-HU"/>
+        </w:rPr>
+        <w:t>Csak</w:t>
+      </w:r>
+      <w:r>
+        <w:rPr>
+          <w:lang w:val="hu-HU"/>
+        </w:rPr>
+        <w:t xml:space="preserve"> az adott közösség tagjai</w:t>
+      </w:r>
+      <w:r>
+        <w:rPr>
+          <w:lang w:val="hu-HU"/>
+        </w:rPr>
+        <w:t xml:space="preserve"> számára elérhető</w:t>
+      </w:r>
+      <w:r>
+        <w:rPr>
+          <w:lang w:val="hu-HU"/>
+        </w:rPr>
+        <w:t>, kivéve akik „</w:t>
+      </w:r>
+      <w:proofErr w:type="spellStart"/>
+      <w:r>
+        <w:rPr>
+          <w:lang w:val="hu-HU"/>
+        </w:rPr>
+        <w:t>banned</w:t>
+      </w:r>
+      <w:proofErr w:type="spellEnd"/>
+      <w:r>
+        <w:rPr>
+          <w:lang w:val="hu-HU"/>
+        </w:rPr>
+        <w:t>” ranggal rendelkeznek a kommentet tartalmazó közösségben</w:t>
+      </w:r>
+    </w:p>
+    <w:p>
+      <w:pPr>
+        <w:spacing w:before="0" w:line="278" w:lineRule="auto"/>
+        <w:jc w:val="left"/>
+        <w:rPr>
+          <w:lang w:val="hu-HU"/>
+        </w:rPr>
+      </w:pPr>
+      <w:r>
+        <w:rPr>
+          <w:b/>
+          <w:bCs/>
+          <w:lang w:val="hu-HU"/>
+        </w:rPr>
+        <w:t>Példa válasz:</w:t>
+      </w:r>
+      <w:r>
+        <w:rPr>
+          <w:b/>
+          <w:bCs/>
+          <w:lang w:val="hu-HU"/>
+        </w:rPr>
+        <w:t xml:space="preserve"> </w:t>
+      </w:r>
+      <w:r>
+        <w:rPr>
+          <w:lang w:val="hu-HU"/>
+        </w:rPr>
+        <w:t>(200 OK)</w:t>
+      </w:r>
+    </w:p>
+    <w:p>
+      <w:pPr>
+        <w:pStyle w:val="Kdblokk"/>
+      </w:pPr>
+      <w:r>
+        <w:t>[</w:t>
+      </w:r>
+      <w:r>
+        <w:br/>
+        <w:t xml:space="preserve"> …</w:t>
+      </w:r>
+      <w:r>
+        <w:br/>
+        <w:t xml:space="preserve">  </w:t>
+      </w:r>
+      <w:r>
+        <w:t>{</w:t>
+      </w:r>
+    </w:p>
+    <w:p>
+      <w:pPr>
+        <w:pStyle w:val="Kdblokk"/>
+      </w:pPr>
+      <w:r>
+        <w:t xml:space="preserve">        "id": 2,</w:t>
+      </w:r>
+    </w:p>
+    <w:p>
+      <w:pPr>
+        <w:pStyle w:val="Kdblokk"/>
+      </w:pPr>
+      <w:r>
+        <w:t xml:space="preserve">        "content": "</w:t>
+      </w:r>
+      <w:proofErr w:type="spellStart"/>
+      <w:r>
+        <w:t>hdbdb</w:t>
+      </w:r>
+      <w:proofErr w:type="spellEnd"/>
+      <w:r>
+        <w:t>",</w:t>
+      </w:r>
+    </w:p>
+    <w:p>
+      <w:pPr>
+        <w:pStyle w:val="Kdblokk"/>
+      </w:pPr>
+      <w:r>
+        <w:t xml:space="preserve">        "depth": 1,</w:t>
+      </w:r>
+    </w:p>
+    <w:p>
+      <w:pPr>
+        <w:pStyle w:val="Kdblokk"/>
+      </w:pPr>
+      <w:r>
+        <w:t xml:space="preserve">        "user": {</w:t>
+      </w:r>
+    </w:p>
+    <w:p>
+      <w:pPr>
+        <w:pStyle w:val="Kdblokk"/>
+      </w:pPr>
+      <w:r>
+        <w:t xml:space="preserve">          "id": 2,</w:t>
+      </w:r>
+    </w:p>
+    <w:p>
+      <w:pPr>
+        <w:pStyle w:val="Kdblokk"/>
+      </w:pPr>
+      <w:r>
+        <w:t xml:space="preserve">          "name": "</w:t>
+      </w:r>
+      <w:proofErr w:type="spellStart"/>
+      <w:r>
+        <w:t>Gehér</w:t>
+      </w:r>
+      <w:proofErr w:type="spellEnd"/>
+      <w:r>
+        <w:t xml:space="preserve"> Marcell",</w:t>
+      </w:r>
+    </w:p>
+    <w:p>
+      <w:pPr>
+        <w:pStyle w:val="Kdblokk"/>
+      </w:pPr>
+      <w:r>
+        <w:t xml:space="preserve">          "email": "geher.marcell@students.jedlik.eu",</w:t>
+      </w:r>
+    </w:p>
+    <w:p>
+      <w:pPr>
+        <w:pStyle w:val="Kdblokk"/>
+      </w:pPr>
+      <w:r>
+        <w:t xml:space="preserve">          "</w:t>
+      </w:r>
+      <w:proofErr w:type="spellStart"/>
+      <w:proofErr w:type="gramStart"/>
+      <w:r>
+        <w:t>image</w:t>
+      </w:r>
+      <w:proofErr w:type="gramEnd"/>
+      <w:r>
+        <w:t>_url</w:t>
+      </w:r>
+      <w:proofErr w:type="spellEnd"/>
+      <w:r>
+        <w:t>": "https://jedligrambackend-</w:t>
+      </w:r>
+      <w:r>
+        <w:t xml:space="preserve"> …</w:t>
+      </w:r>
+      <w:r>
+        <w:t xml:space="preserve"> ",</w:t>
+      </w:r>
+    </w:p>
+    <w:p>
+      <w:pPr>
+        <w:pStyle w:val="Kdblokk"/>
+      </w:pPr>
+      <w:r>
+        <w:t xml:space="preserve">          "bio": "</w:t>
+      </w:r>
+      <w:proofErr w:type="spellStart"/>
+      <w:r>
+        <w:t>Csáá</w:t>
+      </w:r>
+      <w:proofErr w:type="spellEnd"/>
+      <w:r>
+        <w:t>",</w:t>
+      </w:r>
+    </w:p>
+    <w:p>
+      <w:pPr>
+        <w:pStyle w:val="Kdblokk"/>
+      </w:pPr>
+      <w:r>
+        <w:t xml:space="preserve">          "</w:t>
+      </w:r>
+      <w:proofErr w:type="spellStart"/>
+      <w:proofErr w:type="gramStart"/>
+      <w:r>
+        <w:t>post</w:t>
+      </w:r>
+      <w:proofErr w:type="gramEnd"/>
+      <w:r>
+        <w:t>_karma</w:t>
+      </w:r>
+      <w:proofErr w:type="spellEnd"/>
+      <w:r>
+        <w:t>": 2</w:t>
+      </w:r>
+    </w:p>
+    <w:p>
+      <w:pPr>
+        <w:pStyle w:val="Kdblokk"/>
+      </w:pPr>
+      <w:r>
+        <w:t xml:space="preserve">        }</w:t>
+      </w:r>
+      <w:r>
+        <w:t>,</w:t>
+      </w:r>
+    </w:p>
+    <w:p>
+      <w:pPr>
+        <w:pStyle w:val="Kdblokk"/>
+      </w:pPr>
+      <w:r>
+        <w:t xml:space="preserve">        "age": "1 day ago",</w:t>
+      </w:r>
+    </w:p>
+    <w:p>
+      <w:pPr>
+        <w:pStyle w:val="Kdblokk"/>
+      </w:pPr>
+      <w:r>
+        <w:t xml:space="preserve">        "</w:t>
+      </w:r>
+      <w:proofErr w:type="spellStart"/>
+      <w:proofErr w:type="gramStart"/>
+      <w:r>
+        <w:t>replies</w:t>
+      </w:r>
+      <w:proofErr w:type="gramEnd"/>
+      <w:r>
+        <w:t>_count</w:t>
+      </w:r>
+      <w:proofErr w:type="spellEnd"/>
+      <w:r>
+        <w:t>": 1,</w:t>
+      </w:r>
+    </w:p>
+    <w:p>
+      <w:pPr>
+        <w:pStyle w:val="Kdblokk"/>
+      </w:pPr>
+      <w:r>
+        <w:t xml:space="preserve">        "replies": [</w:t>
+      </w:r>
+      <w:r>
+        <w:t>…</w:t>
+      </w:r>
+      <w:r>
+        <w:t>]</w:t>
+      </w:r>
+    </w:p>
+    <w:p>
+      <w:pPr>
+        <w:pStyle w:val="Kdblokk"/>
+      </w:pPr>
+      <w:r>
+        <w:t xml:space="preserve">      }</w:t>
+      </w:r>
+    </w:p>
+    <w:p>
+      <w:pPr>
+        <w:pStyle w:val="Kdblokk"/>
+      </w:pPr>
+      <w:r>
+        <w:t xml:space="preserve">    ]</w:t>
+      </w:r>
+    </w:p>
+    <w:p>
+      <w:pPr>
+        <w:pStyle w:val="Kdblokk"/>
+      </w:pPr>
+      <w:r>
+        <w:t xml:space="preserve">  }</w:t>
+      </w:r>
+    </w:p>
+    <w:p>
+      <w:pPr>
+        <w:pStyle w:val="Kdblokk"/>
+      </w:pPr>
+      <w:r>
+        <w:t xml:space="preserve"> …</w:t>
+      </w:r>
+      <w:r>
+        <w:br/>
+        <w:t>]</w:t>
+      </w:r>
+    </w:p>
+    <w:p>
+      <w:pPr>
+        <w:rPr>
+          <w:lang w:val="hu-HU"/>
+        </w:rPr>
+      </w:pPr>
+      <w:r>
+        <w:rPr>
+          <w:b/>
+          <w:bCs/>
+          <w:lang w:val="hu-HU"/>
+        </w:rPr>
+        <w:t>POST</w:t>
+      </w:r>
+      <w:r>
+        <w:rPr>
+          <w:b/>
+          <w:bCs/>
+          <w:lang w:val="hu-HU"/>
+        </w:rPr>
+        <w:t xml:space="preserve"> </w:t>
+      </w:r>
+      <w:proofErr w:type="spellStart"/>
+      <w:r>
+        <w:rPr>
+          <w:lang w:val="hu-HU"/>
+        </w:rPr>
+        <w:t>Comments</w:t>
+      </w:r>
+      <w:proofErr w:type="spellEnd"/>
+    </w:p>
+    <w:p>
+      <w:pPr>
+        <w:rPr>
+          <w:lang w:val="hu-HU"/>
+        </w:rPr>
+      </w:pPr>
+      <w:r>
+        <w:rPr>
+          <w:noProof/>
+          <w:lang w:val="hu-HU"/>
+        </w:rPr>
+        <w:lastRenderedPageBreak/>
+        <w:drawing>
+          <wp:inline distT="0" distB="0" distL="0" distR="0" wp14:anchorId="2CD63931" wp14:editId="6A9AB1CC">
+            <wp:extent cx="5971540" cy="333375"/>
+            <wp:effectExtent l="0" t="0" r="0" b="9525"/>
+            <wp:docPr id="1906886217" name="Kép 5"/>
+            <wp:cNvGraphicFramePr>
+              <a:graphicFrameLocks xmlns:a="http://schemas.openxmlformats.org/drawingml/2006/main" noChangeAspect="1"/>
+            </wp:cNvGraphicFramePr>
+            <a:graphic xmlns:a="http://schemas.openxmlformats.org/drawingml/2006/main">
+              <a:graphicData uri="http://schemas.openxmlformats.org/drawingml/2006/picture">
+                <pic:pic xmlns:pic="http://schemas.openxmlformats.org/drawingml/2006/picture">
+                  <pic:nvPicPr>
+                    <pic:cNvPr id="1906886217" name="Kép 1906886217"/>
+                    <pic:cNvPicPr/>
+                  </pic:nvPicPr>
+                  <pic:blipFill>
+                    <a:blip r:embed="rId32">
+                      <a:extLst>
+                        <a:ext uri="{28A0092B-C50C-407E-A947-70E740481C1C}">
+                          <a14:useLocalDpi xmlns:a14="http://schemas.microsoft.com/office/drawing/2010/main" val="0"/>
+                        </a:ext>
+                      </a:extLst>
+                    </a:blip>
+                    <a:stretch>
+                      <a:fillRect/>
+                    </a:stretch>
+                  </pic:blipFill>
+                  <pic:spPr>
+                    <a:xfrm>
+                      <a:off x="0" y="0"/>
+                      <a:ext cx="5971540" cy="333375"/>
+                    </a:xfrm>
+                    <a:prstGeom prst="rect">
+                      <a:avLst/>
+                    </a:prstGeom>
+                  </pic:spPr>
+                </pic:pic>
+              </a:graphicData>
+            </a:graphic>
+          </wp:inline>
+        </w:drawing>
+      </w:r>
+    </w:p>
+    <w:p>
+      <w:pPr>
+        <w:jc w:val="left"/>
+        <w:rPr>
+          <w:lang w:val="hu-HU"/>
+        </w:rPr>
+      </w:pPr>
+      <w:r>
+        <w:rPr>
+          <w:b/>
+          <w:bCs/>
+          <w:lang w:val="hu-HU"/>
+        </w:rPr>
+        <w:t>Példa kérés:</w:t>
+      </w:r>
+      <w:r>
+        <w:rPr>
+          <w:lang w:val="hu-HU"/>
+        </w:rPr>
+        <w:t xml:space="preserve"> </w:t>
+      </w:r>
+      <w:r>
+        <w:rPr>
+          <w:rFonts w:ascii="Courier New" w:hAnsi="Courier New" w:cs="Courier New"/>
+          <w:lang w:val="hu-HU"/>
+        </w:rPr>
+        <w:t>POST</w:t>
+      </w:r>
+      <w:r>
+        <w:rPr>
+          <w:rFonts w:ascii="Courier New" w:hAnsi="Courier New" w:cs="Courier New"/>
+          <w:lang w:val="hu-HU"/>
+        </w:rPr>
+        <w:t xml:space="preserve"> | /</w:t>
+      </w:r>
+      <w:proofErr w:type="spellStart"/>
+      <w:r>
+        <w:rPr>
+          <w:rFonts w:ascii="Courier New" w:hAnsi="Courier New" w:cs="Courier New"/>
+          <w:lang w:val="hu-HU"/>
+        </w:rPr>
+        <w:t>api</w:t>
+      </w:r>
+      <w:proofErr w:type="spellEnd"/>
+      <w:r>
+        <w:rPr>
+          <w:rFonts w:ascii="Courier New" w:hAnsi="Courier New" w:cs="Courier New"/>
+          <w:lang w:val="hu-HU"/>
+        </w:rPr>
+        <w:t>/</w:t>
+      </w:r>
+      <w:r>
+        <w:rPr>
+          <w:rFonts w:ascii="Courier New" w:hAnsi="Courier New" w:cs="Courier New"/>
+          <w:lang w:val="hu-HU"/>
+        </w:rPr>
+        <w:t>post/1/</w:t>
+      </w:r>
+      <w:proofErr w:type="spellStart"/>
+      <w:r>
+        <w:rPr>
+          <w:rFonts w:ascii="Courier New" w:hAnsi="Courier New" w:cs="Courier New"/>
+          <w:lang w:val="hu-HU"/>
+        </w:rPr>
+        <w:t>comments</w:t>
+      </w:r>
+      <w:proofErr w:type="spellEnd"/>
+      <w:r>
+        <w:rPr>
+          <w:lang w:val="hu-HU"/>
+        </w:rPr>
+        <w:br/>
+      </w:r>
+      <w:r>
+        <w:rPr>
+          <w:b/>
+          <w:bCs/>
+          <w:lang w:val="hu-HU"/>
+        </w:rPr>
+        <w:t>Body:</w:t>
+      </w:r>
+      <w:r>
+        <w:rPr>
+          <w:b/>
+          <w:bCs/>
+          <w:lang w:val="hu-HU"/>
+        </w:rPr>
+        <w:t xml:space="preserve"> </w:t>
+      </w:r>
+    </w:p>
+    <w:p>
+      <w:pPr>
+        <w:pStyle w:val="Kdblokk"/>
+        <w:rPr>
+          <w:lang w:val="hu-HU"/>
+        </w:rPr>
+      </w:pPr>
+      <w:r>
+        <w:rPr>
+          <w:lang w:val="hu-HU"/>
+        </w:rPr>
+        <w:t>{</w:t>
+      </w:r>
+    </w:p>
+    <w:p>
+      <w:pPr>
+        <w:pStyle w:val="Kdblokk"/>
+        <w:rPr>
+          <w:lang w:val="hu-HU"/>
+        </w:rPr>
+      </w:pPr>
+      <w:r>
+        <w:rPr>
+          <w:lang w:val="hu-HU"/>
+        </w:rPr>
+        <w:t xml:space="preserve">  "</w:t>
+      </w:r>
+      <w:proofErr w:type="spellStart"/>
+      <w:r>
+        <w:rPr>
+          <w:lang w:val="hu-HU"/>
+        </w:rPr>
+        <w:t>content</w:t>
+      </w:r>
+      <w:proofErr w:type="spellEnd"/>
+      <w:r>
+        <w:rPr>
+          <w:lang w:val="hu-HU"/>
+        </w:rPr>
+        <w:t>": "</w:t>
+      </w:r>
+      <w:proofErr w:type="spellStart"/>
+      <w:r>
+        <w:rPr>
+          <w:lang w:val="hu-HU"/>
+        </w:rPr>
+        <w:t>string</w:t>
+      </w:r>
+      <w:proofErr w:type="spellEnd"/>
+      <w:r>
+        <w:rPr>
+          <w:lang w:val="hu-HU"/>
+        </w:rPr>
+        <w:t>",</w:t>
+      </w:r>
+    </w:p>
+    <w:p>
+      <w:pPr>
+        <w:pStyle w:val="Kdblokk"/>
+        <w:rPr>
+          <w:lang w:val="hu-HU"/>
+        </w:rPr>
+      </w:pPr>
+      <w:r>
+        <w:rPr>
+          <w:lang w:val="hu-HU"/>
+        </w:rPr>
+        <w:t xml:space="preserve">  "</w:t>
+      </w:r>
+      <w:proofErr w:type="spellStart"/>
+      <w:r>
+        <w:rPr>
+          <w:lang w:val="hu-HU"/>
+        </w:rPr>
+        <w:t>parent_id</w:t>
+      </w:r>
+      <w:proofErr w:type="spellEnd"/>
+      <w:r>
+        <w:rPr>
+          <w:lang w:val="hu-HU"/>
+        </w:rPr>
+        <w:t>": 0</w:t>
+      </w:r>
+    </w:p>
+    <w:p>
+      <w:pPr>
+        <w:pStyle w:val="Kdblokk"/>
+        <w:rPr>
+          <w:lang w:val="hu-HU"/>
+        </w:rPr>
+      </w:pPr>
+      <w:r>
+        <w:rPr>
+          <w:lang w:val="hu-HU"/>
+        </w:rPr>
+        <w:t>}</w:t>
+      </w:r>
+    </w:p>
+    <w:p>
+      <w:pPr>
+        <w:rPr>
+          <w:lang w:val="hu-HU"/>
+        </w:rPr>
+      </w:pPr>
+      <w:r>
+        <w:rPr>
+          <w:lang w:val="hu-HU"/>
+        </w:rPr>
+        <w:t>A „</w:t>
+      </w:r>
+      <w:proofErr w:type="spellStart"/>
+      <w:r>
+        <w:rPr>
+          <w:lang w:val="hu-HU"/>
+        </w:rPr>
+        <w:t>parent_id</w:t>
+      </w:r>
+      <w:proofErr w:type="spellEnd"/>
+      <w:r>
+        <w:rPr>
+          <w:lang w:val="hu-HU"/>
+        </w:rPr>
+        <w:t xml:space="preserve">” mező opcionális, ha az elküldött kérés nem tartalmazza, akkor a komment egy „top </w:t>
+      </w:r>
+      <w:proofErr w:type="spellStart"/>
+      <w:r>
+        <w:rPr>
+          <w:lang w:val="hu-HU"/>
+        </w:rPr>
+        <w:t>level</w:t>
+      </w:r>
+      <w:proofErr w:type="spellEnd"/>
+      <w:r>
+        <w:rPr>
+          <w:lang w:val="hu-HU"/>
+        </w:rPr>
+        <w:t xml:space="preserve">” kommentként tárolódik el. Ha megtalálható a kérésben, akkor </w:t>
+      </w:r>
+      <w:r>
+        <w:rPr>
+          <w:lang w:val="hu-HU"/>
+        </w:rPr>
+        <w:t>az elküldött azonosítóval rendelkező kommentre válaszként tárolódik el a komment.</w:t>
+      </w:r>
+    </w:p>
+    <w:p>
+      <w:pPr>
+        <w:rPr>
+          <w:lang w:val="hu-HU"/>
+        </w:rPr>
+      </w:pPr>
+      <w:r>
+        <w:rPr>
+          <w:b/>
+          <w:bCs/>
+          <w:lang w:val="hu-HU"/>
+        </w:rPr>
+        <w:t>Korlátozás:</w:t>
+      </w:r>
+      <w:r>
+        <w:rPr>
+          <w:b/>
+          <w:bCs/>
+          <w:lang w:val="hu-HU"/>
+        </w:rPr>
+        <w:t xml:space="preserve"> </w:t>
+      </w:r>
+      <w:r>
+        <w:rPr>
+          <w:lang w:val="hu-HU"/>
+        </w:rPr>
+        <w:t>Csak</w:t>
+      </w:r>
+      <w:r>
+        <w:rPr>
+          <w:lang w:val="hu-HU"/>
+        </w:rPr>
+        <w:t xml:space="preserve"> az adott közösség tagjai számára elérhető, kivéve akik „</w:t>
+      </w:r>
+      <w:proofErr w:type="spellStart"/>
+      <w:r>
+        <w:rPr>
+          <w:lang w:val="hu-HU"/>
+        </w:rPr>
+        <w:t>banned</w:t>
+      </w:r>
+      <w:proofErr w:type="spellEnd"/>
+      <w:r>
+        <w:rPr>
+          <w:lang w:val="hu-HU"/>
+        </w:rPr>
+        <w:t>” ranggal rendelkeznek a kommentet tartalmazó közösségben</w:t>
+      </w:r>
+    </w:p>
+    <w:p>
+      <w:pPr>
+        <w:rPr>
+          <w:lang w:val="hu-HU"/>
+        </w:rPr>
+      </w:pPr>
+      <w:r>
+        <w:rPr>
+          <w:b/>
+          <w:bCs/>
+          <w:lang w:val="hu-HU"/>
+        </w:rPr>
+        <w:t>Példa válasz:</w:t>
+      </w:r>
+      <w:r>
+        <w:rPr>
+          <w:b/>
+          <w:bCs/>
+          <w:lang w:val="hu-HU"/>
+        </w:rPr>
+        <w:t xml:space="preserve"> </w:t>
+      </w:r>
+      <w:r>
+        <w:rPr>
+          <w:lang w:val="hu-HU"/>
+        </w:rPr>
+        <w:t>(200 OK)</w:t>
+      </w:r>
+    </w:p>
+    <w:p>
+      <w:pPr>
+        <w:pStyle w:val="Kdblokk"/>
+      </w:pPr>
+      <w:r>
+        <w:t>[</w:t>
+      </w:r>
+      <w:r>
+        <w:br/>
+        <w:t xml:space="preserve"> …</w:t>
+      </w:r>
+      <w:r>
+        <w:br/>
+        <w:t xml:space="preserve">  </w:t>
+      </w:r>
+      <w:r>
+        <w:t>{</w:t>
+      </w:r>
+    </w:p>
+    <w:p>
+      <w:pPr>
+        <w:pStyle w:val="Kdblokk"/>
+      </w:pPr>
+      <w:r>
+        <w:t xml:space="preserve">        "id": 2,</w:t>
+      </w:r>
+    </w:p>
+    <w:p>
+      <w:pPr>
+        <w:pStyle w:val="Kdblokk"/>
+      </w:pPr>
+      <w:r>
+        <w:t xml:space="preserve">        "content": "</w:t>
+      </w:r>
+      <w:proofErr w:type="spellStart"/>
+      <w:r>
+        <w:t>hdbdb</w:t>
+      </w:r>
+      <w:proofErr w:type="spellEnd"/>
+      <w:r>
+        <w:t>",</w:t>
+      </w:r>
+    </w:p>
+    <w:p>
+      <w:pPr>
+        <w:pStyle w:val="Kdblokk"/>
+      </w:pPr>
+      <w:r>
+        <w:t xml:space="preserve">        "depth": 1,</w:t>
+      </w:r>
+    </w:p>
+    <w:p>
+      <w:pPr>
+        <w:pStyle w:val="Kdblokk"/>
+      </w:pPr>
+      <w:r>
+        <w:t xml:space="preserve">        "user": {</w:t>
+      </w:r>
+    </w:p>
+    <w:p>
+      <w:pPr>
+        <w:pStyle w:val="Kdblokk"/>
+      </w:pPr>
+      <w:r>
+        <w:t xml:space="preserve">          "id": 2,</w:t>
+      </w:r>
+    </w:p>
+    <w:p>
+      <w:pPr>
+        <w:pStyle w:val="Kdblokk"/>
+      </w:pPr>
+      <w:r>
+        <w:t xml:space="preserve">          "name": "</w:t>
+      </w:r>
+      <w:proofErr w:type="spellStart"/>
+      <w:r>
+        <w:t>Gehér</w:t>
+      </w:r>
+      <w:proofErr w:type="spellEnd"/>
+      <w:r>
+        <w:t xml:space="preserve"> Marcell",</w:t>
+      </w:r>
+    </w:p>
+    <w:p>
+      <w:pPr>
+        <w:pStyle w:val="Kdblokk"/>
+      </w:pPr>
+      <w:r>
+        <w:t xml:space="preserve">          "email": "geher.marcell@students.jedlik.eu",</w:t>
+      </w:r>
+    </w:p>
+    <w:p>
+      <w:pPr>
+        <w:pStyle w:val="Kdblokk"/>
+      </w:pPr>
+      <w:r>
+        <w:t xml:space="preserve">          "</w:t>
+      </w:r>
+      <w:proofErr w:type="spellStart"/>
+      <w:proofErr w:type="gramStart"/>
+      <w:r>
+        <w:t>image</w:t>
+      </w:r>
+      <w:proofErr w:type="gramEnd"/>
+      <w:r>
+        <w:t>_url</w:t>
+      </w:r>
+      <w:proofErr w:type="spellEnd"/>
+      <w:r>
+        <w:t>": "https://jedligrambackend-</w:t>
+      </w:r>
+      <w:r>
+        <w:t xml:space="preserve"> …</w:t>
+      </w:r>
+      <w:r>
+        <w:t xml:space="preserve"> ",</w:t>
+      </w:r>
+    </w:p>
+    <w:p>
+      <w:pPr>
+        <w:pStyle w:val="Kdblokk"/>
+      </w:pPr>
+      <w:r>
+        <w:t xml:space="preserve">          "bio": "</w:t>
+      </w:r>
+      <w:proofErr w:type="spellStart"/>
+      <w:r>
+        <w:t>Csáá</w:t>
+      </w:r>
+      <w:proofErr w:type="spellEnd"/>
+      <w:r>
+        <w:t>",</w:t>
+      </w:r>
+    </w:p>
+    <w:p>
+      <w:pPr>
+        <w:pStyle w:val="Kdblokk"/>
+      </w:pPr>
+      <w:r>
+        <w:t xml:space="preserve">          "</w:t>
+      </w:r>
+      <w:proofErr w:type="spellStart"/>
+      <w:proofErr w:type="gramStart"/>
+      <w:r>
+        <w:t>post</w:t>
+      </w:r>
+      <w:proofErr w:type="gramEnd"/>
+      <w:r>
+        <w:t>_karma</w:t>
+      </w:r>
+      <w:proofErr w:type="spellEnd"/>
+      <w:r>
+        <w:t>": 2</w:t>
+      </w:r>
+    </w:p>
+    <w:p>
+      <w:pPr>
+        <w:pStyle w:val="Kdblokk"/>
+      </w:pPr>
+      <w:r>
+        <w:t xml:space="preserve">        }</w:t>
+      </w:r>
+      <w:r>
+        <w:t>,</w:t>
+      </w:r>
+    </w:p>
+    <w:p>
+      <w:pPr>
+        <w:pStyle w:val="Kdblokk"/>
+      </w:pPr>
+      <w:r>
+        <w:t xml:space="preserve">        "age": "1 day ago",</w:t>
+      </w:r>
+    </w:p>
+    <w:p>
+      <w:pPr>
+        <w:pStyle w:val="Kdblokk"/>
+      </w:pPr>
+      <w:r>
+        <w:t xml:space="preserve">        "</w:t>
+      </w:r>
+      <w:proofErr w:type="spellStart"/>
+      <w:proofErr w:type="gramStart"/>
+      <w:r>
+        <w:t>replies</w:t>
+      </w:r>
+      <w:proofErr w:type="gramEnd"/>
+      <w:r>
+        <w:t>_count</w:t>
+      </w:r>
+      <w:proofErr w:type="spellEnd"/>
+      <w:r>
+        <w:t>": 1,</w:t>
+      </w:r>
+    </w:p>
+    <w:p>
+      <w:pPr>
+        <w:pStyle w:val="Kdblokk"/>
+      </w:pPr>
+      <w:r>
+        <w:lastRenderedPageBreak/>
+        <w:t xml:space="preserve">        "replies": [</w:t>
+      </w:r>
+      <w:r>
+        <w:t>…</w:t>
+      </w:r>
+      <w:r>
+        <w:t>]</w:t>
+      </w:r>
+    </w:p>
+    <w:p>
+      <w:pPr>
+        <w:pStyle w:val="Kdblokk"/>
+      </w:pPr>
+      <w:r>
+        <w:t xml:space="preserve">      }</w:t>
+      </w:r>
+    </w:p>
+    <w:p>
+      <w:pPr>
+        <w:pStyle w:val="Kdblokk"/>
+      </w:pPr>
+      <w:r>
+        <w:t xml:space="preserve">    ]</w:t>
+      </w:r>
+    </w:p>
+    <w:p>
+      <w:pPr>
+        <w:pStyle w:val="Kdblokk"/>
+      </w:pPr>
+      <w:r>
+        <w:t xml:space="preserve">  }</w:t>
+      </w:r>
+    </w:p>
+    <w:p>
+      <w:pPr>
+        <w:pStyle w:val="Kdblokk"/>
+      </w:pPr>
+      <w:r>
+        <w:t xml:space="preserve"> …</w:t>
+      </w:r>
+      <w:r>
+        <w:br/>
+        <w:t>]</w:t>
+      </w:r>
+    </w:p>
+    <w:p>
+      <w:pPr>
+        <w:rPr>
+          <w:lang w:val="hu-HU"/>
+        </w:rPr>
+      </w:pPr>
+      <w:r>
+        <w:rPr>
+          <w:b/>
+          <w:bCs/>
+          <w:lang w:val="hu-HU"/>
+        </w:rPr>
+        <w:t>DELETE</w:t>
+      </w:r>
+      <w:r>
+        <w:rPr>
+          <w:lang w:val="hu-HU"/>
+        </w:rPr>
+        <w:t xml:space="preserve"> </w:t>
+      </w:r>
+      <w:proofErr w:type="spellStart"/>
+      <w:r>
+        <w:rPr>
+          <w:lang w:val="hu-HU"/>
+        </w:rPr>
+        <w:t>Comments</w:t>
+      </w:r>
+      <w:proofErr w:type="spellEnd"/>
+    </w:p>
+    <w:p>
+      <w:pPr>
+        <w:rPr>
+          <w:lang w:val="hu-HU"/>
+        </w:rPr>
+      </w:pPr>
+      <w:r>
+        <w:rPr>
+          <w:noProof/>
+          <w:lang w:val="hu-HU"/>
+        </w:rPr>
+        <w:drawing>
+          <wp:inline distT="0" distB="0" distL="0" distR="0" wp14:anchorId="2FDFBD6C" wp14:editId="3572996C">
+            <wp:extent cx="5971540" cy="327025"/>
+            <wp:effectExtent l="0" t="0" r="0" b="0"/>
+            <wp:docPr id="982540427" name="Kép 2"/>
+            <wp:cNvGraphicFramePr>
+              <a:graphicFrameLocks xmlns:a="http://schemas.openxmlformats.org/drawingml/2006/main" noChangeAspect="1"/>
+            </wp:cNvGraphicFramePr>
+            <a:graphic xmlns:a="http://schemas.openxmlformats.org/drawingml/2006/main">
+              <a:graphicData uri="http://schemas.openxmlformats.org/drawingml/2006/picture">
+                <pic:pic xmlns:pic="http://schemas.openxmlformats.org/drawingml/2006/picture">
+                  <pic:nvPicPr>
+                    <pic:cNvPr id="285406935" name="Kép 285406935"/>
+                    <pic:cNvPicPr/>
+                  </pic:nvPicPr>
+                  <pic:blipFill>
+                    <a:blip r:embed="rId27">
+                      <a:extLst>
+                        <a:ext uri="{28A0092B-C50C-407E-A947-70E740481C1C}">
+                          <a14:useLocalDpi xmlns:a14="http://schemas.microsoft.com/office/drawing/2010/main" val="0"/>
+                        </a:ext>
+                      </a:extLst>
+                    </a:blip>
+                    <a:stretch>
+                      <a:fillRect/>
+                    </a:stretch>
+                  </pic:blipFill>
+                  <pic:spPr>
+                    <a:xfrm>
+                      <a:off x="0" y="0"/>
+                      <a:ext cx="5971540" cy="327025"/>
+                    </a:xfrm>
+                    <a:prstGeom prst="rect">
+                      <a:avLst/>
+                    </a:prstGeom>
+                  </pic:spPr>
+                </pic:pic>
+              </a:graphicData>
+            </a:graphic>
+          </wp:inline>
+        </w:drawing>
+      </w:r>
+    </w:p>
+    <w:p>
+      <w:pPr>
+        <w:jc w:val="left"/>
+        <w:rPr>
+          <w:lang w:val="hu-HU"/>
+        </w:rPr>
+      </w:pPr>
+      <w:r>
+        <w:rPr>
+          <w:b/>
+          <w:bCs/>
+          <w:lang w:val="hu-HU"/>
+        </w:rPr>
+        <w:t>Példa kérés:</w:t>
+      </w:r>
+      <w:r>
+        <w:rPr>
+          <w:lang w:val="hu-HU"/>
+        </w:rPr>
+        <w:t xml:space="preserve"> </w:t>
+      </w:r>
+      <w:r>
+        <w:rPr>
+          <w:rFonts w:ascii="Courier New" w:hAnsi="Courier New" w:cs="Courier New"/>
+          <w:lang w:val="hu-HU"/>
+        </w:rPr>
+        <w:t>DELETE</w:t>
+      </w:r>
+      <w:r>
+        <w:rPr>
+          <w:rFonts w:ascii="Courier New" w:hAnsi="Courier New" w:cs="Courier New"/>
+          <w:lang w:val="hu-HU"/>
+        </w:rPr>
+        <w:t xml:space="preserve"> | /</w:t>
+      </w:r>
+      <w:proofErr w:type="spellStart"/>
+      <w:r>
+        <w:rPr>
+          <w:rFonts w:ascii="Courier New" w:hAnsi="Courier New" w:cs="Courier New"/>
+          <w:lang w:val="hu-HU"/>
+        </w:rPr>
+        <w:t>api</w:t>
+      </w:r>
+      <w:proofErr w:type="spellEnd"/>
+      <w:r>
+        <w:rPr>
+          <w:rFonts w:ascii="Courier New" w:hAnsi="Courier New" w:cs="Courier New"/>
+          <w:lang w:val="hu-HU"/>
+        </w:rPr>
+        <w:t>/</w:t>
+      </w:r>
+      <w:proofErr w:type="spellStart"/>
+      <w:r>
+        <w:rPr>
+          <w:rFonts w:ascii="Courier New" w:hAnsi="Courier New" w:cs="Courier New"/>
+          <w:lang w:val="hu-HU"/>
+        </w:rPr>
+        <w:t>posts</w:t>
+      </w:r>
+      <w:proofErr w:type="spellEnd"/>
+      <w:r>
+        <w:rPr>
+          <w:rFonts w:ascii="Courier New" w:hAnsi="Courier New" w:cs="Courier New"/>
+          <w:lang w:val="hu-HU"/>
+        </w:rPr>
+        <w:t>/1</w:t>
+      </w:r>
+      <w:r>
+        <w:rPr>
+          <w:rFonts w:ascii="Courier New" w:hAnsi="Courier New" w:cs="Courier New"/>
+          <w:lang w:val="hu-HU"/>
+        </w:rPr>
+        <w:t>/</w:t>
+      </w:r>
+      <w:proofErr w:type="spellStart"/>
+      <w:r>
+        <w:rPr>
+          <w:rFonts w:ascii="Courier New" w:hAnsi="Courier New" w:cs="Courier New"/>
+          <w:lang w:val="hu-HU"/>
+        </w:rPr>
+        <w:t>comments</w:t>
+      </w:r>
+      <w:proofErr w:type="spellEnd"/>
+      <w:r>
+        <w:rPr>
+          <w:rFonts w:ascii="Courier New" w:hAnsi="Courier New" w:cs="Courier New"/>
+          <w:lang w:val="hu-HU"/>
+        </w:rPr>
+        <w:t>/1</w:t>
+      </w:r>
+    </w:p>
+    <w:p>
+      <w:pPr>
+        <w:jc w:val="left"/>
+        <w:rPr>
+          <w:lang w:val="hu-HU"/>
+        </w:rPr>
+      </w:pPr>
+      <w:r>
+        <w:rPr>
+          <w:b/>
+          <w:bCs/>
+          <w:lang w:val="hu-HU"/>
+        </w:rPr>
+        <w:t>Body:</w:t>
+      </w:r>
+      <w:r>
+        <w:rPr>
+          <w:b/>
+          <w:bCs/>
+          <w:lang w:val="hu-HU"/>
+        </w:rPr>
+        <w:t xml:space="preserve"> </w:t>
+      </w:r>
+      <w:r>
+        <w:rPr>
+          <w:lang w:val="hu-HU"/>
+        </w:rPr>
+        <w:t>-</w:t>
+      </w:r>
+    </w:p>
+    <w:p>
+      <w:pPr>
+        <w:rPr>
+          <w:lang w:val="hu-HU"/>
+        </w:rPr>
+      </w:pPr>
+      <w:r>
+        <w:rPr>
+          <w:b/>
+          <w:bCs/>
+          <w:lang w:val="hu-HU"/>
+        </w:rPr>
+        <w:t>Korlátozás:</w:t>
+      </w:r>
+      <w:r>
+        <w:rPr>
+          <w:b/>
+          <w:bCs/>
+          <w:lang w:val="hu-HU"/>
+        </w:rPr>
+        <w:t xml:space="preserve"> </w:t>
+      </w:r>
+      <w:r>
+        <w:rPr>
+          <w:lang w:val="hu-HU"/>
+        </w:rPr>
+        <w:t xml:space="preserve">Csak a </w:t>
+      </w:r>
+      <w:r>
+        <w:rPr>
+          <w:lang w:val="hu-HU"/>
+        </w:rPr>
+        <w:t>kommen</w:t>
+      </w:r>
+      <w:r>
+        <w:rPr>
+          <w:lang w:val="hu-HU"/>
+        </w:rPr>
+        <w:t xml:space="preserve">t készítője számára elérhető, vagy a </w:t>
+      </w:r>
+      <w:r>
+        <w:rPr>
+          <w:lang w:val="hu-HU"/>
+        </w:rPr>
+        <w:t>kommente</w:t>
+      </w:r>
+      <w:r>
+        <w:rPr>
+          <w:lang w:val="hu-HU"/>
+        </w:rPr>
+        <w:t>t tartalmazó közösség „</w:t>
       </w:r>
       <w:proofErr w:type="spellStart"/>
       <w:r>
@@ -9774,12 +12858,14 @@
         </w:rPr>
         <w:t>” ranggal rendelkező felhasználói számára</w:t>
       </w:r>
-      <w:r>
-        <w:rPr>
-          <w:lang w:val="hu-HU"/>
-        </w:rPr>
-        <w:br/>
-      </w:r>
+    </w:p>
+    <w:p>
+      <w:pPr>
+        <w:jc w:val="left"/>
+        <w:rPr>
+          <w:lang w:val="hu-HU"/>
+        </w:rPr>
+      </w:pPr>
       <w:r>
         <w:rPr>
           <w:b/>
@@ -9808,7 +12894,6 @@
         <w:pStyle w:val="Kdblokk"/>
       </w:pPr>
       <w:r>
-        <w:lastRenderedPageBreak/>
         <w:t>{</w:t>
       </w:r>
     </w:p>
@@ -9817,7 +12902,7 @@
         <w:pStyle w:val="Kdblokk"/>
       </w:pPr>
       <w:r>
-        <w:t xml:space="preserve">  "message": "Post removed"</w:t>
+        <w:t xml:space="preserve">  "message": "Comment removed"</w:t>
       </w:r>
     </w:p>
     <w:p>
@@ -9838,7 +12923,7 @@
       </w:pPr>
     </w:p>
     <w:sectPr>
-      <w:footerReference w:type="default" r:id="rId28"/>
+      <w:footerReference w:type="default" r:id="rId33"/>
       <w:pgSz w:w="12240" w:h="15840"/>
       <w:pgMar w:top="1418" w:right="1418" w:bottom="1418" w:left="1418" w:header="720" w:footer="720" w:gutter="0"/>
       <w:cols w:space="720"/>
@@ -10897,7 +13982,7 @@
   <w:style w:type="paragraph" w:default="1" w:styleId="Norml">
     <w:name w:val="Normal"/>
     <w:qFormat/>
-    <w:rsid w:val="00FC48AD"/>
+    <w:rsid w:val="00054C42"/>
     <w:pPr>
       <w:spacing w:before="120" w:line="360" w:lineRule="auto"/>
       <w:jc w:val="both"/>

</xml_diff>